<commit_message>
Episode 1 script: three-beat ending, move Octavian fact before the dance
Co-Authored-By: Claude Sonnet 5.5 <noreply@anthropic.com>
Claude-Session: https://claude.ai/code/session_01S29WeDgsXUpbHNWdisiPFj
</commit_message>
<xml_diff>
--- a/The_Last_Day_of_Ancient_Egypt_Episode_1_GOOGLE_FLOW_FINAL_SCRIPT.docx
+++ b/The_Last_Day_of_Ancient_Egypt_Episode_1_GOOGLE_FLOW_FINAL_SCRIPT.docx
@@ -117,6 +117,11 @@
       </w:r>
     </w:p>
     <w:p>
+      <w:r>
+        <w:t>• EDIT ORDER: play Shot 44 (Octavian took Alexandria) immediately after Shot 25 (Rome arrives), before Shot 26. Roman arrival, then the fact, then the awkward reaction, then the dancing. Ending: Shots 46, 47, 48 deliver one three-beat punchline and cut to black. No call to action, no “next episode”.</w:t>
+      </w:r>
+    </w:p>
+    <w:p>
       <w:pPr>
         <w:pStyle w:val="Heading1"/>
       </w:pPr>
@@ -4959,6 +4964,14 @@
         <w:rPr>
           <w:b/>
         </w:rPr>
+        <w:t>EDIT NOTE: in the final edit, place this clip right after Shot 25 (before Shot 26) so the audience knows why the Romans are there before the dancing. The shot number stays 44; do not regenerate.</w:t>
+      </w:r>
+    </w:p>
+    <w:p>
+      <w:r>
+        <w:rPr>
+          <w:b/>
+        </w:rPr>
         <w:t>REFERENCE IMAGES TO SELECT IN GOOGLE FLOW</w:t>
       </w:r>
     </w:p>
@@ -5204,7 +5217,7 @@
     </w:p>
     <w:p>
       <w:r>
-        <w:t>DURATION: 8 sec (the line needs about 5–6 s of speech; trim the clip in editing)</w:t>
+        <w:t>DURATION: 6 sec</w:t>
       </w:r>
     </w:p>
     <w:p>
@@ -5217,7 +5230,7 @@
     </w:p>
     <w:p>
       <w:r>
-        <w:t>Finally, his bride laughed. Then Senbi. It had been that kind of day.</w:t>
+        <w:t>Senbi thought he was getting married.</w:t>
       </w:r>
     </w:p>
     <w:p>
@@ -5269,7 +5282,7 @@
     </w:p>
     <w:p>
       <w:r>
-        <w:t>2D hand-drawn Stickman animation, clean thin black outlines, large expressive heads, simple readable stickman proportions, flat warm colors, historically inspired ancient Alexandria, playful cinematic documentary-comedy tone, 16:9, no 3D, no photorealism, no modern objects, no subtitles, no captions, no logos, no generated text, NO on-screen character dialogue (only the off-screen narrator speaks). Use the selected reference images as strict continuity anchors. Preserve faces, hair, clothing, colors, proportions and accessories exactly. Characters may move their bodies, arms, eyes and mouths for silent nonverbal acting only. VISUAL STYLE LOCK: 2D hand-drawn stickman animation; clean thin black outlines; large expressive heads; simple readable stickman proportions; flat warm colors; historically inspired ancient Alexandria; playful cinematic documentary-comedy tone; no 3D; no photorealism; no modern objects; no subtitles; no captions; no logos; no text inside the generated scene; 16:9. The bride finally laughs at the absurdity of the situation. Senbi looks at her, then starts laughing too. The tension releases for a warm comedic moment. 2D stickman animation, warm colors, no text, 16:9. Medium two-shot with gentle pullback. AUDIO (generate sound together with the picture): Off-screen male narrator voice-over, warm intelligent British documentary voice with dry comedic timing, the same voice in every clip, begins speaking within the first half second and says exactly: “Finally, his bride laughed. Then Senbi. It had been that kind of day.” The narrator is heard off-screen only; no character lip-syncs to the narrator. Music: warm gentle resolution with the same flute and strings, mixed low under the narrator. Sound effects: bride laughter, Senbi laughter. No subtitles or captions.</w:t>
+        <w:t>2D hand-drawn Stickman animation, clean thin black outlines, large expressive heads, simple readable stickman proportions, flat warm colors, historically inspired ancient Alexandria, playful cinematic documentary-comedy tone, 16:9, no 3D, no photorealism, no modern objects, no subtitles, no captions, no logos, no generated text, NO on-screen character dialogue (only the off-screen narrator speaks). Use the selected reference images as strict continuity anchors. Preserve faces, hair, clothing, colors, proportions and accessories exactly. Characters may move their bodies, arms, eyes and mouths for silent nonverbal acting only. VISUAL STYLE LOCK: 2D hand-drawn stickman animation; clean thin black outlines; large expressive heads; simple readable stickman proportions; flat warm colors; historically inspired ancient Alexandria; playful cinematic documentary-comedy tone; no 3D; no photorealism; no modern objects; no subtitles; no captions; no logos; no text inside the generated scene; 16:9. The bride finally laughs at the absurdity of the situation. Senbi looks at her, then starts laughing too. The tension releases for a warm comedic moment. 2D stickman animation, warm colors, no text, 16:9. Medium two-shot with gentle pullback. AUDIO (generate sound together with the picture): Off-screen male narrator voice-over, warm intelligent British documentary voice with dry comedic timing, the same voice in every clip, begins speaking within the first half second and says exactly: “Senbi thought he was getting married.” The narrator is heard off-screen only; no character lip-syncs to the narrator. Music: warm gentle resolution with the same flute and strings, mixed low under the narrator. Sound effects: bride laughter, Senbi laughter. No subtitles or captions.</w:t>
       </w:r>
     </w:p>
     <w:p>
@@ -5314,7 +5327,7 @@
     </w:p>
     <w:p>
       <w:r>
-        <w:t>DURATION: 8 sec (the line needs about 5–6 s of speech; trim the clip in editing)</w:t>
+        <w:t>DURATION: 4 sec (short beat; leave a pause before and after)</w:t>
       </w:r>
     </w:p>
     <w:p>
@@ -5327,7 +5340,7 @@
     </w:p>
     <w:p>
       <w:r>
-        <w:t>That night, Senbi slept on his headrest, heard marching, and decided: tomorrow's problem.</w:t>
+        <w:t>He was.</w:t>
       </w:r>
     </w:p>
     <w:p>
@@ -5379,7 +5392,7 @@
     </w:p>
     <w:p>
       <w:r>
-        <w:t>2D hand-drawn Stickman animation, clean thin black outlines, large expressive heads, simple readable stickman proportions, flat warm colors, historically inspired ancient Alexandria, playful cinematic documentary-comedy tone, 16:9, no 3D, no photorealism, no modern objects, no subtitles, no captions, no logos, no generated text, NO on-screen character dialogue (only the off-screen narrator speaks). Use the selected reference images as strict continuity anchors. Preserve faces, hair, clothing, colors, proportions and accessories exactly. Characters may move their bodies, arms, eyes and mouths for silent nonverbal acting only. VISUAL STYLE LOCK: 2D hand-drawn stickman animation; clean thin black outlines; large expressive heads; simple readable stickman proportions; flat warm colors; historically inspired ancient Alexandria; playful cinematic documentary-comedy tone; no 3D; no photorealism; no modern objects; no subtitles; no captions; no logos; no text inside the generated scene; 16:9. Senbi tries to sleep awkwardly using the wooden headrest. He opens one eye when distant Roman marching sounds are implied visually by his reaction, then closes it again in exhausted resignation. 2D stickman animation, clean thin lines, deadpan comedy, no text, 16:9. Tiny push toward his exhausted face. AUDIO (generate sound together with the picture): Off-screen male narrator voice-over, warm intelligent British documentary voice with dry comedic timing, the same voice in every clip, begins speaking within the first half second and says exactly: “That night, Senbi slept on his headrest, heard marching, and decided: tomorrow's problem.” The narrator is heard off-screen only; no character lip-syncs to the narrator. Music: warm gentle resolution with the same flute and strings, mixed low under the narrator. Sound effects: distant marching, soft snore. No subtitles or captions.</w:t>
+        <w:t>2D hand-drawn Stickman animation, clean thin black outlines, large expressive heads, simple readable stickman proportions, flat warm colors, historically inspired ancient Alexandria, playful cinematic documentary-comedy tone, 16:9, no 3D, no photorealism, no modern objects, no subtitles, no captions, no logos, no generated text, NO on-screen character dialogue (only the off-screen narrator speaks). Use the selected reference images as strict continuity anchors. Preserve faces, hair, clothing, colors, proportions and accessories exactly. Characters may move their bodies, arms, eyes and mouths for silent nonverbal acting only. VISUAL STYLE LOCK: 2D hand-drawn stickman animation; clean thin black outlines; large expressive heads; simple readable stickman proportions; flat warm colors; historically inspired ancient Alexandria; playful cinematic documentary-comedy tone; no 3D; no photorealism; no modern objects; no subtitles; no captions; no logos; no text inside the generated scene; 16:9. Senbi tries to sleep awkwardly using the wooden headrest. He opens one eye when distant Roman marching sounds are implied visually by his reaction, then closes it again in exhausted resignation. 2D stickman animation, clean thin lines, deadpan comedy, no text, 16:9. Tiny push toward his exhausted face. AUDIO (generate sound together with the picture): Off-screen male narrator voice-over, warm intelligent British documentary voice with dry comedic timing, the same voice in every clip, begins speaking within the first half second and says exactly: “He was.” The narrator is heard off-screen only; no character lip-syncs to the narrator. Music: warm gentle resolution with the same flute and strings, mixed low under the narrator. Sound effects: distant marching, soft snore. No subtitles or captions.</w:t>
       </w:r>
     </w:p>
     <w:p>
@@ -5447,7 +5460,7 @@
     </w:p>
     <w:p>
       <w:r>
-        <w:t>Rome didn't come for the wedding. It came for the bread.</w:t>
+        <w:t>He just hadn't noticed he was also getting a new government.</w:t>
       </w:r>
     </w:p>
     <w:p>
@@ -5499,7 +5512,7 @@
     </w:p>
     <w:p>
       <w:r>
-        <w:t>2D hand-drawn Stickman animation, clean thin black outlines, large expressive heads, simple readable stickman proportions, flat warm colors, historically inspired ancient Alexandria, playful cinematic documentary-comedy tone, 16:9, no 3D, no photorealism, no modern objects, no subtitles, no captions, no logos, no generated text, NO on-screen character dialogue (only the off-screen narrator speaks). Use the selected reference images as strict continuity anchors. Preserve faces, hair, clothing, colors, proportions and accessories exactly. Characters may move their bodies, arms, eyes and mouths for silent nonverbal acting only. VISUAL STYLE LOCK: 2D hand-drawn stickman animation; clean thin black outlines; large expressive heads; simple readable stickman proportions; flat warm colors; historically inspired ancient Alexandria; playful cinematic documentary-comedy tone; no 3D; no photorealism; no modern objects; no subtitles; no captions; no logos; no text inside the generated scene; 16:9. Final cinematic composition: Senbi and bride in the foreground, Alexandria behind them, Roman soldiers visible as small figures in the distant city. The scene should feel like the beginning of a much larger story. 2D hand-drawn stickman animation, warm cinematic palette, clean thin black outlines, no subtitles, no text, 16:9. Slow fade-like camera pullback, leaving visual room for the end card to be added in editing. AUDIO (generate sound together with the picture): Off-screen male narrator voice-over, warm intelligent British documentary voice with dry comedic timing, the same voice in every clip, begins speaking within the first half second and says exactly: “Rome didn't come for the wedding. It came for the bread.” The narrator is heard off-screen only; no character lip-syncs to the narrator. Music: warm gentle resolution with the same flute and strings, mixed low under the narrator. Sound effects: gentle music, silence at the very end. No subtitles or captions.</w:t>
+        <w:t>2D hand-drawn Stickman animation, clean thin black outlines, large expressive heads, simple readable stickman proportions, flat warm colors, historically inspired ancient Alexandria, playful cinematic documentary-comedy tone, 16:9, no 3D, no photorealism, no modern objects, no subtitles, no captions, no logos, no generated text, NO on-screen character dialogue (only the off-screen narrator speaks). Use the selected reference images as strict continuity anchors. Preserve faces, hair, clothing, colors, proportions and accessories exactly. Characters may move their bodies, arms, eyes and mouths for silent nonverbal acting only. VISUAL STYLE LOCK: 2D hand-drawn stickman animation; clean thin black outlines; large expressive heads; simple readable stickman proportions; flat warm colors; historically inspired ancient Alexandria; playful cinematic documentary-comedy tone; no 3D; no photorealism; no modern objects; no subtitles; no captions; no logos; no text inside the generated scene; 16:9. Final cinematic composition: Senbi and bride in the foreground, Alexandria behind them, Roman soldiers visible as small figures in the distant city. The scene should feel like the beginning of a much larger story. 2D hand-drawn stickman animation, warm cinematic palette, clean thin black outlines, no subtitles, no text, 16:9. Slow fade-like camera pullback, leaving visual room for the end card to be added in editing. AUDIO (generate sound together with the picture): Off-screen male narrator voice-over, warm intelligent British documentary voice with dry comedic timing, the same voice in every clip, begins speaking within the first half second and says exactly: “He just hadn't noticed he was also getting a new government.” The narrator is heard off-screen only; no character lip-syncs to the narrator. Music: warm gentle resolution with the same flute and strings, mixed low under the narrator. Sound effects: gentle music, silence at the very end. No subtitles or captions.</w:t>
       </w:r>
     </w:p>
     <w:p>

</xml_diff>

<commit_message>
Episode 1 script: lock camera in every clip (no tilt/pan/orbit/zoom), reframe shot 2
Co-Authored-By: Claude Sonnet 5.5 <noreply@anthropic.com>
Claude-Session: https://claude.ai/code/session_01S29WeDgsXUpbHNWdisiPFj
</commit_message>
<xml_diff>
--- a/The_Last_Day_of_Ancient_Egypt_Episode_1_GOOGLE_FLOW_FINAL_SCRIPT.docx
+++ b/The_Last_Day_of_Ancient_Egypt_Episode_1_GOOGLE_FLOW_FINAL_SCRIPT.docx
@@ -122,6 +122,11 @@
       </w:r>
     </w:p>
     <w:p>
+      <w:r>
+        <w:t>• CAMERA LOCK: every clip uses a locked-off static camera, or only an extremely slow 5% push-in. The camera never tilts, pans, orbits, tracks, zooms, rises or shows the scene from above inside a clip, and the framing stays identical from the first frame to the last. All movement comes from the characters; zooms, cuts and transitions are done in editing. If Flow still moves the camera in a clip, regenerate it.</w:t>
+      </w:r>
+    </w:p>
+    <w:p>
       <w:pPr>
         <w:pStyle w:val="Heading1"/>
       </w:pPr>
@@ -290,7 +295,7 @@
     </w:p>
     <w:p>
       <w:r>
-        <w:t>Close-up of dancing feet on stone. The dancing pauses for half a beat. One guest looks toward the street. All expressions, eye movement and mouth movement are silent nonverbal acting only. No intelligible speech, no lip-sync dialogue.</w:t>
+        <w:t>Eye-level medium-wide shot of the dancers, feet to heads. The dancing pauses for half a beat. One guest turns his head toward the street. All expressions, eye movement and mouth movement are silent nonverbal acting only. No intelligible speech, no lip-sync dialogue.</w:t>
       </w:r>
     </w:p>
     <w:p>
@@ -303,7 +308,7 @@
     </w:p>
     <w:p>
       <w:r>
-        <w:t>Low camera; rhythmic pause.</w:t>
+        <w:t>Static, locked-off: eye-level medium-wide shot, the dancers fully visible from feet to heads (NOT a feet close-up). No tilt, pan, zoom or orbit.</w:t>
       </w:r>
     </w:p>
     <w:p>
@@ -329,7 +334,7 @@
     </w:p>
     <w:p>
       <w:r>
-        <w:t>2D hand-drawn Stickman animation, clean thin black outlines, large expressive heads, simple readable stickman proportions, flat warm colors, historically inspired ancient Alexandria, playful cinematic documentary-comedy tone, 16:9, no 3D, no photorealism, no modern objects, no subtitles, no captions, no logos, no generated text, NO on-screen character dialogue (only the off-screen narrator speaks). Use the selected reference images as strict continuity anchors. Preserve faces, hair, clothing, colors, proportions and accessories exactly. Characters may move their bodies, arms, eyes and mouths for silent nonverbal acting only. VISUAL STYLE LOCK: 2D hand-drawn stickman animation; clean thin black outlines; large expressive heads; simple readable stickman proportions; flat warm colors; historically inspired ancient Alexandria; playful cinematic documentary-comedy tone; no 3D; no photorealism; no modern objects; no subtitles; no captions; no logos; no text inside the generated scene; 16:9. Show the wedding dance continuing. Suddenly several dancing feet pause for a fraction of a second as everyone senses an unfamiliar sound outside. One Egyptian guest slowly turns toward the entrance while the others are still celebrating. Keep the mystery alive; do not reveal the Romans yet. 2D stickman animation, thin black lines, warm Egyptian palette, expressive body language, no subtitles, no text, 16:9. Low camera near the floor, slight vibration and rhythmic pause. AUDIO (generate sound together with the picture): Off-screen male narrator voice-over, warm intelligent British documentary voice with dry comedic timing, the same voice in every clip, begins speaking within the first half second and says exactly: “Then, for half a beat, the dancing stopped. Nobody noticed. Except one guest.” The narrator is heard off-screen only; no character lip-syncs to the narrator. Music: playful ancient-Mediterranean wedding music with frame drums, reed flute and plucked strings, steady upbeat tempo, the same theme in every clip, mixed low under the narrator and a faint uneasy undertone. Sound effects: dancing feet on stone, one tiny pause, faint distant thump. No subtitles or captions.</w:t>
+        <w:t>Locked-off static camera, no camera movement. 2D hand-drawn Stickman animation, clean thin black outlines, large expressive heads, simple readable stickman proportions, flat warm colors, historically inspired ancient Alexandria, playful cinematic documentary-comedy tone, 16:9, no 3D, no photorealism, no modern objects, no subtitles, no captions, no logos, no generated text, NO on-screen character dialogue (only the off-screen narrator speaks). Use the selected reference images as strict continuity anchors. Preserve faces, hair, clothing, colors, proportions and accessories exactly. Characters may move their bodies, arms, eyes and mouths for silent nonverbal acting only. VISUAL STYLE LOCK: 2D hand-drawn stickman animation; clean thin black outlines; large expressive heads; simple readable stickman proportions; flat warm colors; historically inspired ancient Alexandria; playful cinematic documentary-comedy tone; no 3D; no photorealism; no modern objects; no subtitles; no captions; no logos; no text inside the generated scene; 16:9. Show the wedding dance continuing with the dancers fully visible from feet to heads. Suddenly all the dancers pause for a fraction of a second as everyone senses an unfamiliar sound outside. One Egyptian guest slowly turns his head toward the entrance while the others are still celebrating. Keep the mystery alive; do not reveal the Romans yet. 2D stickman animation, thin black lines, warm Egyptian palette, expressive body language, no subtitles, no text, 16:9. CAMERA: locked-off static camera on a tripod, eye-level medium-wide shot, the dancers fully visible from feet to heads (NOT a feet close-up). No camera movement of any kind: no tilt, no pan, no zoom, no push, no pull, no orbit, no tracking, no rising or overhead view. The framing stays identical from the first frame to the last frame; all movement comes from the characters. AUDIO (generate sound together with the picture): Off-screen male narrator voice-over, warm intelligent British documentary voice with dry comedic timing, the same voice in every clip, begins speaking within the first half second and says exactly: “Then, for half a beat, the dancing stopped. Nobody noticed. Except one guest.” The narrator is heard off-screen only; no character lip-syncs to the narrator. Music: playful ancient-Mediterranean wedding music with frame drums, reed flute and plucked strings, steady upbeat tempo, the same theme in every clip, mixed low under the narrator and a faint uneasy undertone. Sound effects: dancing feet on stone, one tiny pause, faint distant thump. No subtitles or captions.</w:t>
       </w:r>
     </w:p>
     <w:p>
@@ -408,7 +413,7 @@
     </w:p>
     <w:p>
       <w:r>
-        <w:t>Smooth aerial-style glide.</w:t>
+        <w:t>Locked camera, extremely slow 5% push-in only: wide establishing shot of the Alexandria harbor and city, horizon level. No tilt, pan or orbit.</w:t>
       </w:r>
     </w:p>
     <w:p>
@@ -434,7 +439,7 @@
     </w:p>
     <w:p>
       <w:r>
-        <w:t>2D hand-drawn Stickman animation, clean thin black outlines, large expressive heads, simple readable stickman proportions, flat warm colors, historically inspired ancient Alexandria, playful cinematic documentary-comedy tone, 16:9, no 3D, no photorealism, no modern objects, no subtitles, no captions, no logos, no generated text, NO on-screen character dialogue (only the off-screen narrator speaks). Use the selected reference images as strict continuity anchors. Preserve faces, hair, clothing, colors, proportions and accessories exactly. Characters may move their bodies, arms, eyes and mouths for silent nonverbal acting only. VISUAL STYLE LOCK: 2D hand-drawn stickman animation; clean thin black outlines; large expressive heads; simple readable stickman proportions; flat warm colors; historically inspired ancient Alexandria; playful cinematic documentary-comedy tone; no 3D; no photorealism; no modern objects; no subtitles; no captions; no logos; no text inside the generated scene; 16:9. Cinematic wide establishing view of ancient Alexandria in 30 BC: harbor, sailing vessels, monumental architecture, palms, busy waterfront and bright Mediterranean sky. Match the exact architectural mood and color language of the reference image. 2D illustrated stickman-world animation, clean linework, warm colors, no modern objects, no text, 16:9. Smooth elevated camera glide toward the city. AUDIO (generate sound together with the picture): Off-screen male narrator voice-over, warm intelligent British documentary voice with dry comedic timing, the same voice in every clip, begins speaking within the first half second and says exactly: “Alexandria, 30 BC. A huge, busy city, about to have a strange evening.” The narrator is heard off-screen only; no character lip-syncs to the narrator. Music: playful ancient-Mediterranean wedding music with frame drums, reed flute and plucked strings, steady upbeat tempo, the same theme in every clip, mixed low under the narrator. Sound effects: gulls, harbor water, distant market noise. No subtitles or captions.</w:t>
+        <w:t>Locked camera, only an extremely slow subtle push-in. 2D hand-drawn Stickman animation, clean thin black outlines, large expressive heads, simple readable stickman proportions, flat warm colors, historically inspired ancient Alexandria, playful cinematic documentary-comedy tone, 16:9, no 3D, no photorealism, no modern objects, no subtitles, no captions, no logos, no generated text, NO on-screen character dialogue (only the off-screen narrator speaks). Use the selected reference images as strict continuity anchors. Preserve faces, hair, clothing, colors, proportions and accessories exactly. Characters may move their bodies, arms, eyes and mouths for silent nonverbal acting only. VISUAL STYLE LOCK: 2D hand-drawn stickman animation; clean thin black outlines; large expressive heads; simple readable stickman proportions; flat warm colors; historically inspired ancient Alexandria; playful cinematic documentary-comedy tone; no 3D; no photorealism; no modern objects; no subtitles; no captions; no logos; no text inside the generated scene; 16:9. Cinematic wide establishing view of ancient Alexandria in 30 BC: harbor, sailing vessels, monumental architecture, palms, busy waterfront and bright Mediterranean sky. Match the exact architectural mood and color language of the reference image. 2D illustrated stickman-world animation, clean linework, warm colors, no modern objects, no text, 16:9. CAMERA: wide establishing shot of the Alexandria harbor and city, horizon level. Locked camera with only an extremely slow, subtle push-in (about 5%) over the whole clip. No tilt, no pan, no orbit, no rising or overhead view; the subject stays in the same position in the frame. AUDIO (generate sound together with the picture): Off-screen male narrator voice-over, warm intelligent British documentary voice with dry comedic timing, the same voice in every clip, begins speaking within the first half second and says exactly: “Alexandria, 30 BC. A huge, busy city, about to have a strange evening.” The narrator is heard off-screen only; no character lip-syncs to the narrator. Music: playful ancient-Mediterranean wedding music with frame drums, reed flute and plucked strings, steady upbeat tempo, the same theme in every clip, mixed low under the narrator. Sound effects: gulls, harbor water, distant market noise. No subtitles or captions.</w:t>
       </w:r>
     </w:p>
     <w:p>
@@ -513,7 +518,7 @@
     </w:p>
     <w:p>
       <w:r>
-        <w:t>Very quick title beat, then back to action.</w:t>
+        <w:t>Static, locked-off: eye-level medium-wide shot of the wedding courtyard. No tilt, pan, zoom or orbit.</w:t>
       </w:r>
     </w:p>
     <w:p>
@@ -539,7 +544,7 @@
     </w:p>
     <w:p>
       <w:r>
-        <w:t>2D hand-drawn Stickman animation, clean thin black outlines, large expressive heads, simple readable stickman proportions, flat warm colors, historically inspired ancient Alexandria, playful cinematic documentary-comedy tone, 16:9, no 3D, no photorealism, no modern objects, no subtitles, no captions, no logos, no generated text, NO on-screen character dialogue (only the off-screen narrator speaks). Use the selected reference images as strict continuity anchors. Preserve faces, hair, clothing, colors, proportions and accessories exactly. Characters may move their bodies, arms, eyes and mouths for silent nonverbal acting only. VISUAL STYLE LOCK: 2D hand-drawn stickman animation; clean thin black outlines; large expressive heads; simple readable stickman proportions; flat warm colors; historically inspired ancient Alexandria; playful cinematic documentary-comedy tone; no 3D; no photorealism; no modern objects; no subtitles; no captions; no logos; no text inside the generated scene; 16:9. Return immediately to the lively wedding courtyard. The celebration continues as if nothing is wrong. The visual should support a quick comedic title-card moment added later in editing; do NOT generate any written title inside the video. 2D stickman animation, thin clean lines, warm colors, festive Alexandria wedding, no text, 16:9. Quick energetic camera move back into the celebration. AUDIO (generate sound together with the picture): Off-screen male narrator voice-over, warm intelligent British documentary voice with dry comedic timing, the same voice in every clip, begins speaking within the first half second and says exactly: ““Last day of Ancient Egypt”? Relax. Egypt survived. Its queen, less so.” The narrator is heard off-screen only; no character lip-syncs to the narrator. Music: playful ancient-Mediterranean wedding music with frame drums, reed flute and plucked strings, steady upbeat tempo, the same theme in every clip, mixed low under the narrator. Sound effects: wedding crowd chatter, one short comic sting. No subtitles or captions.</w:t>
+        <w:t>Locked-off static camera, no camera movement. 2D hand-drawn Stickman animation, clean thin black outlines, large expressive heads, simple readable stickman proportions, flat warm colors, historically inspired ancient Alexandria, playful cinematic documentary-comedy tone, 16:9, no 3D, no photorealism, no modern objects, no subtitles, no captions, no logos, no generated text, NO on-screen character dialogue (only the off-screen narrator speaks). Use the selected reference images as strict continuity anchors. Preserve faces, hair, clothing, colors, proportions and accessories exactly. Characters may move their bodies, arms, eyes and mouths for silent nonverbal acting only. VISUAL STYLE LOCK: 2D hand-drawn stickman animation; clean thin black outlines; large expressive heads; simple readable stickman proportions; flat warm colors; historically inspired ancient Alexandria; playful cinematic documentary-comedy tone; no 3D; no photorealism; no modern objects; no subtitles; no captions; no logos; no text inside the generated scene; 16:9. Return immediately to the lively wedding courtyard. The celebration continues as if nothing is wrong. The visual should support a quick comedic title-card moment added later in editing; do NOT generate any written title inside the video. 2D stickman animation, thin clean lines, warm colors, festive Alexandria wedding, no text, 16:9. CAMERA: locked-off static camera on a tripod, eye-level medium-wide shot of the wedding courtyard. No camera movement of any kind: no tilt, no pan, no zoom, no push, no pull, no orbit, no tracking, no rising or overhead view. The framing stays identical from the first frame to the last frame; all movement comes from the characters. AUDIO (generate sound together with the picture): Off-screen male narrator voice-over, warm intelligent British documentary voice with dry comedic timing, the same voice in every clip, begins speaking within the first half second and says exactly: ““Last day of Ancient Egypt”? Relax. Egypt survived. Its queen, less so.” The narrator is heard off-screen only; no character lip-syncs to the narrator. Music: playful ancient-Mediterranean wedding music with frame drums, reed flute and plucked strings, steady upbeat tempo, the same theme in every clip, mixed low under the narrator. Sound effects: wedding crowd chatter, one short comic sting. No subtitles or captions.</w:t>
       </w:r>
     </w:p>
     <w:p>
@@ -623,7 +628,7 @@
     </w:p>
     <w:p>
       <w:r>
-        <w:t>Medium push-in; he adjusts his sash.</w:t>
+        <w:t>Locked camera, extremely slow 5% push-in only: eye-level medium shot of Senbi at the mirror. No tilt, pan or orbit.</w:t>
       </w:r>
     </w:p>
     <w:p>
@@ -649,7 +654,7 @@
     </w:p>
     <w:p>
       <w:r>
-        <w:t>2D hand-drawn Stickman animation, clean thin black outlines, large expressive heads, simple readable stickman proportions, flat warm colors, historically inspired ancient Alexandria, playful cinematic documentary-comedy tone, 16:9, no 3D, no photorealism, no modern objects, no subtitles, no captions, no logos, no generated text, NO on-screen character dialogue (only the off-screen narrator speaks). Use the selected reference images as strict continuity anchors. Preserve faces, hair, clothing, colors, proportions and accessories exactly. Characters may move their bodies, arms, eyes and mouths for silent nonverbal acting only. VISUAL STYLE LOCK: 2D hand-drawn stickman animation; clean thin black outlines; large expressive heads; simple readable stickman proportions; flat warm colors; historically inspired ancient Alexandria; playful cinematic documentary-comedy tone; no 3D; no photorealism; no modern objects; no subtitles; no captions; no logos; no text inside the generated scene; 16:9. Senbi stands inside the wedding location, proudly checking his appearance before the ceremony. He looks excited and slightly nervous, adjusts his blue-and-gold ceremonial collar and checks his sash. Preserve the exact Senbi character design, hairstyle, face, proportions, clothing and colors from the reference. 2D stickman animation, no subtitles, no text, 16:9. Medium shot with a gentle push-in. AUDIO (generate sound together with the picture): Off-screen male narrator voice-over, warm intelligent British documentary voice with dry comedic timing, the same voice in every clip, begins speaking within the first half second and says exactly: “Meet Senbi. He's getting married today, and has checked the mirror forty times.” The narrator is heard off-screen only; no character lip-syncs to the narrator. Music: playful ancient-Mediterranean wedding music with frame drums, reed flute and plucked strings, steady upbeat tempo, the same theme in every clip, mixed low under the narrator. Sound effects: small fabric rustle, soft room tone. No subtitles or captions.</w:t>
+        <w:t>Locked camera, only an extremely slow subtle push-in. 2D hand-drawn Stickman animation, clean thin black outlines, large expressive heads, simple readable stickman proportions, flat warm colors, historically inspired ancient Alexandria, playful cinematic documentary-comedy tone, 16:9, no 3D, no photorealism, no modern objects, no subtitles, no captions, no logos, no generated text, NO on-screen character dialogue (only the off-screen narrator speaks). Use the selected reference images as strict continuity anchors. Preserve faces, hair, clothing, colors, proportions and accessories exactly. Characters may move their bodies, arms, eyes and mouths for silent nonverbal acting only. VISUAL STYLE LOCK: 2D hand-drawn stickman animation; clean thin black outlines; large expressive heads; simple readable stickman proportions; flat warm colors; historically inspired ancient Alexandria; playful cinematic documentary-comedy tone; no 3D; no photorealism; no modern objects; no subtitles; no captions; no logos; no text inside the generated scene; 16:9. Senbi stands inside the wedding location, proudly checking his appearance before the ceremony. He looks excited and slightly nervous, adjusts his blue-and-gold ceremonial collar and checks his sash. Preserve the exact Senbi character design, hairstyle, face, proportions, clothing and colors from the reference. 2D stickman animation, no subtitles, no text, 16:9. CAMERA: eye-level medium shot of Senbi at the mirror. Locked camera with only an extremely slow, subtle push-in (about 5%) over the whole clip. No tilt, no pan, no orbit, no rising or overhead view; the subject stays in the same position in the frame. AUDIO (generate sound together with the picture): Off-screen male narrator voice-over, warm intelligent British documentary voice with dry comedic timing, the same voice in every clip, begins speaking within the first half second and says exactly: “Meet Senbi. He's getting married today, and has checked the mirror forty times.” The narrator is heard off-screen only; no character lip-syncs to the narrator. Music: playful ancient-Mediterranean wedding music with frame drums, reed flute and plucked strings, steady upbeat tempo, the same theme in every clip, mixed low under the narrator. Sound effects: small fabric rustle, soft room tone. No subtitles or captions.</w:t>
       </w:r>
     </w:p>
     <w:p>
@@ -728,7 +733,7 @@
     </w:p>
     <w:p>
       <w:r>
-        <w:t>Three quick actions; finish with an overconfident pose.</w:t>
+        <w:t>Static, locked-off: eye-level full-body medium shot of Senbi; all three actions happen inside the same frame. No tilt, pan, zoom or orbit.</w:t>
       </w:r>
     </w:p>
     <w:p>
@@ -754,7 +759,7 @@
     </w:p>
     <w:p>
       <w:r>
-        <w:t>2D hand-drawn Stickman animation, clean thin black outlines, large expressive heads, simple readable stickman proportions, flat warm colors, historically inspired ancient Alexandria, playful cinematic documentary-comedy tone, 16:9, no 3D, no photorealism, no modern objects, no subtitles, no captions, no logos, no generated text, NO on-screen character dialogue (only the off-screen narrator speaks). Use the selected reference images as strict continuity anchors. Preserve faces, hair, clothing, colors, proportions and accessories exactly. Characters may move their bodies, arms, eyes and mouths for silent nonverbal acting only. VISUAL STYLE LOCK: 2D hand-drawn stickman animation; clean thin black outlines; large expressive heads; simple readable stickman proportions; flat warm colors; historically inspired ancient Alexandria; playful cinematic documentary-comedy tone; no 3D; no photorealism; no modern objects; no subtitles; no captions; no logos; no text inside the generated scene; 16:9. Senbi performs three quick grooming actions: checks a traditional grooming razor, adjusts his ceremonial hair/headwear, then fixes his collar and sash. Keep everything family-friendly and non-graphic. Preserve his exact appearance and costume. 2D hand-drawn stickman animation, clean thin outlines, warm colors, no modern objects, no text, 16:9. Three short readable actions ending with an overconfident pose. AUDIO (generate sound together with the picture): Off-screen male narrator voice-over, warm intelligent British documentary voice with dry comedic timing, the same voice in every clip, begins speaking within the first half second and says exactly: “Every groom has one job: look incredible, and pretend it took no effort.” The narrator is heard off-screen only; no character lip-syncs to the narrator. Music: playful comic percussion over the wedding rhythm, mixed low under the narrator. Sound effects: light razor scrape, one comic boing. No subtitles or captions.</w:t>
+        <w:t>Locked-off static camera, no camera movement. 2D hand-drawn Stickman animation, clean thin black outlines, large expressive heads, simple readable stickman proportions, flat warm colors, historically inspired ancient Alexandria, playful cinematic documentary-comedy tone, 16:9, no 3D, no photorealism, no modern objects, no subtitles, no captions, no logos, no generated text, NO on-screen character dialogue (only the off-screen narrator speaks). Use the selected reference images as strict continuity anchors. Preserve faces, hair, clothing, colors, proportions and accessories exactly. Characters may move their bodies, arms, eyes and mouths for silent nonverbal acting only. VISUAL STYLE LOCK: 2D hand-drawn stickman animation; clean thin black outlines; large expressive heads; simple readable stickman proportions; flat warm colors; historically inspired ancient Alexandria; playful cinematic documentary-comedy tone; no 3D; no photorealism; no modern objects; no subtitles; no captions; no logos; no text inside the generated scene; 16:9. Senbi performs three quick grooming actions: checks a traditional grooming razor, adjusts his ceremonial hair/headwear, then fixes his collar and sash. Keep everything family-friendly and non-graphic. Preserve his exact appearance and costume. 2D hand-drawn stickman animation, clean thin outlines, warm colors, no modern objects, no text, 16:9. Three short readable actions ending with an overconfident pose. CAMERA: locked-off static camera on a tripod, eye-level full-body medium shot of Senbi; all three actions happen inside the same frame. No camera movement of any kind: no tilt, no pan, no zoom, no push, no pull, no orbit, no tracking, no rising or overhead view. The framing stays identical from the first frame to the last frame; all movement comes from the characters. AUDIO (generate sound together with the picture): Off-screen male narrator voice-over, warm intelligent British documentary voice with dry comedic timing, the same voice in every clip, begins speaking within the first half second and says exactly: “Every groom has one job: look incredible, and pretend it took no effort.” The narrator is heard off-screen only; no character lip-syncs to the narrator. Music: playful comic percussion over the wedding rhythm, mixed low under the narrator. Sound effects: light razor scrape, one comic boing. No subtitles or captions.</w:t>
       </w:r>
     </w:p>
     <w:p>
@@ -838,7 +843,7 @@
     </w:p>
     <w:p>
       <w:r>
-        <w:t>Gentle push-in.</w:t>
+        <w:t>Locked camera, extremely slow 5% push-in only: eye-level medium shot of the bride at the mirror. No tilt, pan or orbit.</w:t>
       </w:r>
     </w:p>
     <w:p>
@@ -864,7 +869,7 @@
     </w:p>
     <w:p>
       <w:r>
-        <w:t>2D hand-drawn Stickman animation, clean thin black outlines, large expressive heads, simple readable stickman proportions, flat warm colors, historically inspired ancient Alexandria, playful cinematic documentary-comedy tone, 16:9, no 3D, no photorealism, no modern objects, no subtitles, no captions, no logos, no generated text, NO on-screen character dialogue (only the off-screen narrator speaks). Use the selected reference images as strict continuity anchors. Preserve faces, hair, clothing, colors, proportions and accessories exactly. Characters may move their bodies, arms, eyes and mouths for silent nonverbal acting only. VISUAL STYLE LOCK: 2D hand-drawn stickman animation; clean thin black outlines; large expressive heads; simple readable stickman proportions; flat warm colors; historically inspired ancient Alexandria; playful cinematic documentary-comedy tone; no 3D; no photorealism; no modern objects; no subtitles; no captions; no logos; no text inside the generated scene; 16:9. The bride prepares inside the wedding location. She checks herself in a mirror, adjusts her gold-and-black headpiece and jewelry, then gives herself a confident, happy look. Preserve her exact hair, face, white linen dress, gold accessories and proportions from the reference. 2D stickman animation, clean linework, warm Egyptian palette, no text, 16:9. Gentle medium push-in. AUDIO (generate sound together with the picture): Off-screen male narrator voice-over, warm intelligent British documentary voice with dry comedic timing, the same voice in every clip, begins speaking within the first half second and says exactly: “His bride had been ready for an hour. She was the calm one.” The narrator is heard off-screen only; no character lip-syncs to the narrator. Music: playful ancient-Mediterranean wedding music with frame drums, reed flute and plucked strings, steady upbeat tempo, the same theme in every clip, mixed low under the narrator. Sound effects: soft jewelry jingle. No subtitles or captions.</w:t>
+        <w:t>Locked camera, only an extremely slow subtle push-in. 2D hand-drawn Stickman animation, clean thin black outlines, large expressive heads, simple readable stickman proportions, flat warm colors, historically inspired ancient Alexandria, playful cinematic documentary-comedy tone, 16:9, no 3D, no photorealism, no modern objects, no subtitles, no captions, no logos, no generated text, NO on-screen character dialogue (only the off-screen narrator speaks). Use the selected reference images as strict continuity anchors. Preserve faces, hair, clothing, colors, proportions and accessories exactly. Characters may move their bodies, arms, eyes and mouths for silent nonverbal acting only. VISUAL STYLE LOCK: 2D hand-drawn stickman animation; clean thin black outlines; large expressive heads; simple readable stickman proportions; flat warm colors; historically inspired ancient Alexandria; playful cinematic documentary-comedy tone; no 3D; no photorealism; no modern objects; no subtitles; no captions; no logos; no text inside the generated scene; 16:9. The bride prepares inside the wedding location. She checks herself in a mirror, adjusts her gold-and-black headpiece and jewelry, then gives herself a confident, happy look. Preserve her exact hair, face, white linen dress, gold accessories and proportions from the reference. 2D stickman animation, clean linework, warm Egyptian palette, no text, 16:9. CAMERA: eye-level medium shot of the bride at the mirror. Locked camera with only an extremely slow, subtle push-in (about 5%) over the whole clip. No tilt, no pan, no orbit, no rising or overhead view; the subject stays in the same position in the frame. AUDIO (generate sound together with the picture): Off-screen male narrator voice-over, warm intelligent British documentary voice with dry comedic timing, the same voice in every clip, begins speaking within the first half second and says exactly: “His bride had been ready for an hour. She was the calm one.” The narrator is heard off-screen only; no character lip-syncs to the narrator. Music: playful ancient-Mediterranean wedding music with frame drums, reed flute and plucked strings, steady upbeat tempo, the same theme in every clip, mixed low under the narrator. Sound effects: soft jewelry jingle. No subtitles or captions.</w:t>
       </w:r>
     </w:p>
     <w:p>
@@ -953,7 +958,7 @@
     </w:p>
     <w:p>
       <w:r>
-        <w:t>Slow push toward papyrus; no readable modern text.</w:t>
+        <w:t>Static, locked-off: eye-level medium two-shot: the scribe, the papyrus and the bride all in the same frame. No tilt, pan, zoom or orbit.</w:t>
       </w:r>
     </w:p>
     <w:p>
@@ -979,7 +984,7 @@
     </w:p>
     <w:p>
       <w:r>
-        <w:t>2D hand-drawn Stickman animation, clean thin black outlines, large expressive heads, simple readable stickman proportions, flat warm colors, historically inspired ancient Alexandria, playful cinematic documentary-comedy tone, 16:9, no 3D, no photorealism, no modern objects, no subtitles, no captions, no logos, no generated text, NO on-screen character dialogue (only the off-screen narrator speaks). Use the selected reference images as strict continuity anchors. Preserve faces, hair, clothing, colors, proportions and accessories exactly. Characters may move their bodies, arms, eyes and mouths for silent nonverbal acting only. VISUAL STYLE LOCK: 2D hand-drawn stickman animation; clean thin black outlines; large expressive heads; simple readable stickman proportions; flat warm colors; historically inspired ancient Alexandria; playful cinematic documentary-comedy tone; no 3D; no photorealism; no modern objects; no subtitles; no captions; no logos; no text inside the generated scene; 16:9. A family member and bride examine a papyrus marriage document while the groom's side waits nearby. The atmosphere is serious for a moment, contrasting with the party. Do not show readable modern writing. Use historically inspired papyrus and clothing. 2D stickman animation, clean thin outlines, no subtitles, no text, 16:9. Slow push toward the papyrus, then a small reaction from the bride. AUDIO (generate sound together with the picture): Off-screen male narrator voice-over, warm intelligent British documentary voice with dry comedic timing, the same voice in every clip, begins speaking within the first half second and says exactly: “Then, paperwork. Real contracts survive: property, money, who owes what. Romance, with receipts.” The narrator is heard off-screen only; no character lip-syncs to the narrator. Music: playful ancient-Mediterranean wedding music with frame drums, reed flute and plucked strings, steady upbeat tempo, the same theme in every clip, mixed low under the narrator. Sound effects: papyrus rustle, quill scratching. No subtitles or captions.</w:t>
+        <w:t>Locked-off static camera, no camera movement. 2D hand-drawn Stickman animation, clean thin black outlines, large expressive heads, simple readable stickman proportions, flat warm colors, historically inspired ancient Alexandria, playful cinematic documentary-comedy tone, 16:9, no 3D, no photorealism, no modern objects, no subtitles, no captions, no logos, no generated text, NO on-screen character dialogue (only the off-screen narrator speaks). Use the selected reference images as strict continuity anchors. Preserve faces, hair, clothing, colors, proportions and accessories exactly. Characters may move their bodies, arms, eyes and mouths for silent nonverbal acting only. VISUAL STYLE LOCK: 2D hand-drawn stickman animation; clean thin black outlines; large expressive heads; simple readable stickman proportions; flat warm colors; historically inspired ancient Alexandria; playful cinematic documentary-comedy tone; no 3D; no photorealism; no modern objects; no subtitles; no captions; no logos; no text inside the generated scene; 16:9. A family member and bride examine a papyrus marriage document while the groom's side waits nearby. The atmosphere is serious for a moment, contrasting with the party. Do not show readable modern writing. Use historically inspired papyrus and clothing. 2D stickman animation, clean thin outlines, no subtitles, no text, 16:9. CAMERA: locked-off static camera on a tripod, eye-level medium two-shot: the scribe, the papyrus and the bride all in the same frame. No camera movement of any kind: no tilt, no pan, no zoom, no push, no pull, no orbit, no tracking, no rising or overhead view. The framing stays identical from the first frame to the last frame; all movement comes from the characters. AUDIO (generate sound together with the picture): Off-screen male narrator voice-over, warm intelligent British documentary voice with dry comedic timing, the same voice in every clip, begins speaking within the first half second and says exactly: “Then, paperwork. Real contracts survive: property, money, who owes what. Romance, with receipts.” The narrator is heard off-screen only; no character lip-syncs to the narrator. Music: playful ancient-Mediterranean wedding music with frame drums, reed flute and plucked strings, steady upbeat tempo, the same theme in every clip, mixed low under the narrator. Sound effects: papyrus rustle, quill scratching. No subtitles or captions.</w:t>
       </w:r>
     </w:p>
     <w:p>
@@ -1068,7 +1073,7 @@
     </w:p>
     <w:p>
       <w:r>
-        <w:t>Track along table and end on the sneaky guest.</w:t>
+        <w:t>Static, locked-off: eye-level wide-medium shot of the whole feast table; the sneaky guest stays in frame. No tilt, pan, zoom or orbit.</w:t>
       </w:r>
     </w:p>
     <w:p>
@@ -1094,7 +1099,7 @@
     </w:p>
     <w:p>
       <w:r>
-        <w:t>2D hand-drawn Stickman animation, clean thin black outlines, large expressive heads, simple readable stickman proportions, flat warm colors, historically inspired ancient Alexandria, playful cinematic documentary-comedy tone, 16:9, no 3D, no photorealism, no modern objects, no subtitles, no captions, no logos, no generated text, NO on-screen character dialogue (only the off-screen narrator speaks). Use the selected reference images as strict continuity anchors. Preserve faces, hair, clothing, colors, proportions and accessories exactly. Characters may move their bodies, arms, eyes and mouths for silent nonverbal acting only. VISUAL STYLE LOCK: 2D hand-drawn stickman animation; clean thin black outlines; large expressive heads; simple readable stickman proportions; flat warm colors; historically inspired ancient Alexandria; playful cinematic documentary-comedy tone; no 3D; no photorealism; no modern objects; no subtitles; no captions; no logos; no text inside the generated scene; 16:9. Show a richly loaded ancient Egyptian wedding feast: flatbread, roasted bird, figs, dates, vegetables, bowls, fruit and traditional beer vessels arranged across a long table. Egyptian guests move around the food and celebrate. Keep food visually abundant but historically inspired. 2D stickman animation, clean thin outlines, warm colors, no modern objects, no text, 16:9. Smooth tracking shot along the feast table. AUDIO (generate sound together with the picture): Off-screen male narrator voice-over, warm intelligent British documentary voice with dry comedic timing, the same voice in every clip, begins speaking within the first half second and says exactly: “Bread, figs, roast goose, and beer, basically a food group. Someone was stealing.” The narrator is heard off-screen only; no character lip-syncs to the narrator. Music: playful ancient-Mediterranean wedding music with frame drums, reed flute and plucked strings, steady upbeat tempo, the same theme in every clip, mixed low under the narrator. Sound effects: plates, cups, cheerful chatter. No subtitles or captions.</w:t>
+        <w:t>Locked-off static camera, no camera movement. 2D hand-drawn Stickman animation, clean thin black outlines, large expressive heads, simple readable stickman proportions, flat warm colors, historically inspired ancient Alexandria, playful cinematic documentary-comedy tone, 16:9, no 3D, no photorealism, no modern objects, no subtitles, no captions, no logos, no generated text, NO on-screen character dialogue (only the off-screen narrator speaks). Use the selected reference images as strict continuity anchors. Preserve faces, hair, clothing, colors, proportions and accessories exactly. Characters may move their bodies, arms, eyes and mouths for silent nonverbal acting only. VISUAL STYLE LOCK: 2D hand-drawn stickman animation; clean thin black outlines; large expressive heads; simple readable stickman proportions; flat warm colors; historically inspired ancient Alexandria; playful cinematic documentary-comedy tone; no 3D; no photorealism; no modern objects; no subtitles; no captions; no logos; no text inside the generated scene; 16:9. Show a richly loaded ancient Egyptian wedding feast: flatbread, roasted bird, figs, dates, vegetables, bowls, fruit and traditional beer vessels arranged across a long table. Egyptian guests move around the food and celebrate. Keep food visually abundant but historically inspired. 2D stickman animation, clean thin outlines, warm colors, no modern objects, no text, 16:9. CAMERA: locked-off static camera on a tripod, eye-level wide-medium shot of the whole feast table; the sneaky guest stays in frame. No camera movement of any kind: no tilt, no pan, no zoom, no push, no pull, no orbit, no tracking, no rising or overhead view. The framing stays identical from the first frame to the last frame; all movement comes from the characters. AUDIO (generate sound together with the picture): Off-screen male narrator voice-over, warm intelligent British documentary voice with dry comedic timing, the same voice in every clip, begins speaking within the first half second and says exactly: “Bread, figs, roast goose, and beer, basically a food group. Someone was stealing.” The narrator is heard off-screen only; no character lip-syncs to the narrator. Music: playful ancient-Mediterranean wedding music with frame drums, reed flute and plucked strings, steady upbeat tempo, the same theme in every clip, mixed low under the narrator. Sound effects: plates, cups, cheerful chatter. No subtitles or captions.</w:t>
       </w:r>
     </w:p>
     <w:p>
@@ -1178,7 +1183,7 @@
     </w:p>
     <w:p>
       <w:r>
-        <w:t>Small bow; cat barely reacts.</w:t>
+        <w:t>Static, locked-off: eye-level medium shot with the cat and the bowing guest both in frame. No tilt, pan, zoom or orbit.</w:t>
       </w:r>
     </w:p>
     <w:p>
@@ -1204,7 +1209,7 @@
     </w:p>
     <w:p>
       <w:r>
-        <w:t>2D hand-drawn Stickman animation, clean thin black outlines, large expressive heads, simple readable stickman proportions, flat warm colors, historically inspired ancient Alexandria, playful cinematic documentary-comedy tone, 16:9, no 3D, no photorealism, no modern objects, no subtitles, no captions, no logos, no generated text, NO on-screen character dialogue (only the off-screen narrator speaks). Use the selected reference images as strict continuity anchors. Preserve faces, hair, clothing, colors, proportions and accessories exactly. Characters may move their bodies, arms, eyes and mouths for silent nonverbal acting only. VISUAL STYLE LOCK: 2D hand-drawn stickman animation; clean thin black outlines; large expressive heads; simple readable stickman proportions; flat warm colors; historically inspired ancient Alexandria; playful cinematic documentary-comedy tone; no 3D; no photorealism; no modern objects; no subtitles; no captions; no logos; no text inside the generated scene; 16:9. A calm black Egyptian cat sits proudly beside the wedding feast while a guest treats it with exaggerated respect. The cat barely reacts. Keep the cat design consistent with the animal reference. 2D stickman animation, clean outlines, playful timing, no text, 16:9. Small comedic push-in toward the cat. AUDIO (generate sound together with the picture): Off-screen male narrator voice-over, warm intelligent British documentary voice with dry comedic timing, the same voice in every clip, begins speaking within the first half second and says exactly: “Egyptians adored cats. This one knew it. A guest bowed. The cat shrugged.” The narrator is heard off-screen only; no character lip-syncs to the narrator. Music: playful comic percussion over the wedding rhythm, mixed low under the narrator. Sound effects: tiny comic sting, soft cat purr. No subtitles or captions.</w:t>
+        <w:t>Locked-off static camera, no camera movement. 2D hand-drawn Stickman animation, clean thin black outlines, large expressive heads, simple readable stickman proportions, flat warm colors, historically inspired ancient Alexandria, playful cinematic documentary-comedy tone, 16:9, no 3D, no photorealism, no modern objects, no subtitles, no captions, no logos, no generated text, NO on-screen character dialogue (only the off-screen narrator speaks). Use the selected reference images as strict continuity anchors. Preserve faces, hair, clothing, colors, proportions and accessories exactly. Characters may move their bodies, arms, eyes and mouths for silent nonverbal acting only. VISUAL STYLE LOCK: 2D hand-drawn stickman animation; clean thin black outlines; large expressive heads; simple readable stickman proportions; flat warm colors; historically inspired ancient Alexandria; playful cinematic documentary-comedy tone; no 3D; no photorealism; no modern objects; no subtitles; no captions; no logos; no text inside the generated scene; 16:9. A calm black Egyptian cat sits proudly beside the wedding feast while a guest treats it with exaggerated respect. The cat barely reacts. Keep the cat design consistent with the animal reference. 2D stickman animation, clean outlines, playful timing, no text, 16:9. CAMERA: locked-off static camera on a tripod, eye-level medium shot with the cat and the bowing guest both in frame. No camera movement of any kind: no tilt, no pan, no zoom, no push, no pull, no orbit, no tracking, no rising or overhead view. The framing stays identical from the first frame to the last frame; all movement comes from the characters. AUDIO (generate sound together with the picture): Off-screen male narrator voice-over, warm intelligent British documentary voice with dry comedic timing, the same voice in every clip, begins speaking within the first half second and says exactly: “Egyptians adored cats. This one knew it. A guest bowed. The cat shrugged.” The narrator is heard off-screen only; no character lip-syncs to the narrator. Music: playful comic percussion over the wedding rhythm, mixed low under the narrator. Sound effects: tiny comic sting, soft cat purr. No subtitles or captions.</w:t>
       </w:r>
     </w:p>
     <w:p>
@@ -1288,7 +1293,7 @@
     </w:p>
     <w:p>
       <w:r>
-        <w:t>Side tracking shot.</w:t>
+        <w:t>Static, locked-off: eye-level wide shot of the musicians and dancers. No tilt, pan, zoom or orbit.</w:t>
       </w:r>
     </w:p>
     <w:p>
@@ -1314,7 +1319,7 @@
     </w:p>
     <w:p>
       <w:r>
-        <w:t>2D hand-drawn Stickman animation, clean thin black outlines, large expressive heads, simple readable stickman proportions, flat warm colors, historically inspired ancient Alexandria, playful cinematic documentary-comedy tone, 16:9, no 3D, no photorealism, no modern objects, no subtitles, no captions, no logos, no generated text, NO on-screen character dialogue (only the off-screen narrator speaks). Use the selected reference images as strict continuity anchors. Preserve faces, hair, clothing, colors, proportions and accessories exactly. Characters may move their bodies, arms, eyes and mouths for silent nonverbal acting only. VISUAL STYLE LOCK: 2D hand-drawn stickman animation; clean thin black outlines; large expressive heads; simple readable stickman proportions; flat warm colors; historically inspired ancient Alexandria; playful cinematic documentary-comedy tone; no 3D; no photorealism; no modern objects; no subtitles; no captions; no logos; no text inside the generated scene; 16:9. Ancient Egyptian musicians play harp/lyre and percussion while wedding guests dance. Keep instruments and clothing consistent with the Egyptian celebration reference. Senbi enters the dancing area with excitement. 2D hand-drawn stickman animation, warm festive palette, no text, 16:9. Side tracking shot following the dancers. AUDIO (generate sound together with the picture): Off-screen male narrator voice-over, warm intelligent British documentary voice with dry comedic timing, the same voice in every clip, begins speaking within the first half second and says exactly: “Then the music began, and Senbi decided this was his moment.” The narrator is heard off-screen only; no character lip-syncs to the narrator. Music: playful ancient-Mediterranean wedding music with frame drums, reed flute and plucked strings, steady upbeat tempo, the same theme in every clip, mixed low under the narrator. Sound effects: harp and drums swelling, clapping. No subtitles or captions.</w:t>
+        <w:t>Locked-off static camera, no camera movement. 2D hand-drawn Stickman animation, clean thin black outlines, large expressive heads, simple readable stickman proportions, flat warm colors, historically inspired ancient Alexandria, playful cinematic documentary-comedy tone, 16:9, no 3D, no photorealism, no modern objects, no subtitles, no captions, no logos, no generated text, NO on-screen character dialogue (only the off-screen narrator speaks). Use the selected reference images as strict continuity anchors. Preserve faces, hair, clothing, colors, proportions and accessories exactly. Characters may move their bodies, arms, eyes and mouths for silent nonverbal acting only. VISUAL STYLE LOCK: 2D hand-drawn stickman animation; clean thin black outlines; large expressive heads; simple readable stickman proportions; flat warm colors; historically inspired ancient Alexandria; playful cinematic documentary-comedy tone; no 3D; no photorealism; no modern objects; no subtitles; no captions; no logos; no text inside the generated scene; 16:9. Ancient Egyptian musicians play harp/lyre and percussion while wedding guests dance. Keep instruments and clothing consistent with the Egyptian celebration reference. Senbi enters the dancing area with excitement. 2D hand-drawn stickman animation, warm festive palette, no text, 16:9. CAMERA: locked-off static camera on a tripod, eye-level wide shot of the musicians and dancers. No camera movement of any kind: no tilt, no pan, no zoom, no push, no pull, no orbit, no tracking, no rising or overhead view. The framing stays identical from the first frame to the last frame; all movement comes from the characters. AUDIO (generate sound together with the picture): Off-screen male narrator voice-over, warm intelligent British documentary voice with dry comedic timing, the same voice in every clip, begins speaking within the first half second and says exactly: “Then the music began, and Senbi decided this was his moment.” The narrator is heard off-screen only; no character lip-syncs to the narrator. Music: playful ancient-Mediterranean wedding music with frame drums, reed flute and plucked strings, steady upbeat tempo, the same theme in every clip, mixed low under the narrator. Sound effects: harp and drums swelling, clapping. No subtitles or captions.</w:t>
       </w:r>
     </w:p>
     <w:p>
@@ -1398,7 +1403,7 @@
     </w:p>
     <w:p>
       <w:r>
-        <w:t>Quick comedic zoom on recovery.</w:t>
+        <w:t>Static, locked-off: eye-level medium shot of Senbi, full body in frame. No tilt, pan, zoom or orbit.</w:t>
       </w:r>
     </w:p>
     <w:p>
@@ -1424,7 +1429,7 @@
     </w:p>
     <w:p>
       <w:r>
-        <w:t>2D hand-drawn Stickman animation, clean thin black outlines, large expressive heads, simple readable stickman proportions, flat warm colors, historically inspired ancient Alexandria, playful cinematic documentary-comedy tone, 16:9, no 3D, no photorealism, no modern objects, no subtitles, no captions, no logos, no generated text, NO on-screen character dialogue (only the off-screen narrator speaks). Use the selected reference images as strict continuity anchors. Preserve faces, hair, clothing, colors, proportions and accessories exactly. Characters may move their bodies, arms, eyes and mouths for silent nonverbal acting only. VISUAL STYLE LOCK: 2D hand-drawn stickman animation; clean thin black outlines; large expressive heads; simple readable stickman proportions; flat warm colors; historically inspired ancient Alexandria; playful cinematic documentary-comedy tone; no 3D; no photorealism; no modern objects; no subtitles; no captions; no logos; no text inside the generated scene; 16:9. Senbi performs an overly confident wedding dance. He almost loses his balance for a moment, quickly recovers, then pretends the stumble was intentional and continues dancing proudly. Preserve his exact appearance. 2D stickman animation, expressive body language, clean thin lines, no text, 16:9. Quick comedic zoom during the recovery. AUDIO (generate sound together with the picture): Off-screen male narrator voice-over, warm intelligent British documentary voice with dry comedic timing, the same voice in every clip, begins speaking within the first half second and says exactly: “Senbi nearly fell, recovered, and pretended that was the choreography. Nobody believed him.” The narrator is heard off-screen only; no character lip-syncs to the narrator. Music: playful comic percussion over the wedding rhythm, mixed low under the narrator. Sound effects: foot scuff, comic wobble, laughter. No subtitles or captions.</w:t>
+        <w:t>Locked-off static camera, no camera movement. 2D hand-drawn Stickman animation, clean thin black outlines, large expressive heads, simple readable stickman proportions, flat warm colors, historically inspired ancient Alexandria, playful cinematic documentary-comedy tone, 16:9, no 3D, no photorealism, no modern objects, no subtitles, no captions, no logos, no generated text, NO on-screen character dialogue (only the off-screen narrator speaks). Use the selected reference images as strict continuity anchors. Preserve faces, hair, clothing, colors, proportions and accessories exactly. Characters may move their bodies, arms, eyes and mouths for silent nonverbal acting only. VISUAL STYLE LOCK: 2D hand-drawn stickman animation; clean thin black outlines; large expressive heads; simple readable stickman proportions; flat warm colors; historically inspired ancient Alexandria; playful cinematic documentary-comedy tone; no 3D; no photorealism; no modern objects; no subtitles; no captions; no logos; no text inside the generated scene; 16:9. Senbi performs an overly confident wedding dance. He almost loses his balance for a moment, quickly recovers, then pretends the stumble was intentional and continues dancing proudly. Preserve his exact appearance. 2D stickman animation, expressive body language, clean thin lines, no text, 16:9. CAMERA: locked-off static camera on a tripod, eye-level medium shot of Senbi, full body in frame. No camera movement of any kind: no tilt, no pan, no zoom, no push, no pull, no orbit, no tracking, no rising or overhead view. The framing stays identical from the first frame to the last frame; all movement comes from the characters. AUDIO (generate sound together with the picture): Off-screen male narrator voice-over, warm intelligent British documentary voice with dry comedic timing, the same voice in every clip, begins speaking within the first half second and says exactly: “Senbi nearly fell, recovered, and pretended that was the choreography. Nobody believed him.” The narrator is heard off-screen only; no character lip-syncs to the narrator. Music: playful comic percussion over the wedding rhythm, mixed low under the narrator. Sound effects: foot scuff, comic wobble, laughter. No subtitles or captions.</w:t>
       </w:r>
     </w:p>
     <w:p>
@@ -1508,7 +1513,7 @@
     </w:p>
     <w:p>
       <w:r>
-        <w:t>Gentle reaction close-up.</w:t>
+        <w:t>Static, locked-off: eye-level close-up of the bride's face. No tilt, pan, zoom or orbit.</w:t>
       </w:r>
     </w:p>
     <w:p>
@@ -1534,7 +1539,7 @@
     </w:p>
     <w:p>
       <w:r>
-        <w:t>2D hand-drawn Stickman animation, clean thin black outlines, large expressive heads, simple readable stickman proportions, flat warm colors, historically inspired ancient Alexandria, playful cinematic documentary-comedy tone, 16:9, no 3D, no photorealism, no modern objects, no subtitles, no captions, no logos, no generated text, NO on-screen character dialogue (only the off-screen narrator speaks). Use the selected reference images as strict continuity anchors. Preserve faces, hair, clothing, colors, proportions and accessories exactly. Characters may move their bodies, arms, eyes and mouths for silent nonverbal acting only. VISUAL STYLE LOCK: 2D hand-drawn stickman animation; clean thin black outlines; large expressive heads; simple readable stickman proportions; flat warm colors; historically inspired ancient Alexandria; playful cinematic documentary-comedy tone; no 3D; no photorealism; no modern objects; no subtitles; no captions; no logos; no text inside the generated scene; 16:9. The bride watches Senbi's exaggerated dancing. She is amused, tries not to laugh, then gives a small knowing smile. Preserve exact bride design. 2D stickman animation, clean outlines, no text, 16:9. Gentle reaction close-up. AUDIO (generate sound together with the picture): Off-screen male narrator voice-over, warm intelligent British documentary voice with dry comedic timing, the same voice in every clip, begins speaking within the first half second and says exactly: “His bride was trying very hard not to laugh. She loved him. Mostly.” The narrator is heard off-screen only; no character lip-syncs to the narrator. Music: playful ancient-Mediterranean wedding music with frame drums, reed flute and plucked strings, steady upbeat tempo, the same theme in every clip, mixed low under the narrator. Sound effects: suppressed giggle. No subtitles or captions.</w:t>
+        <w:t>Locked-off static camera, no camera movement. 2D hand-drawn Stickman animation, clean thin black outlines, large expressive heads, simple readable stickman proportions, flat warm colors, historically inspired ancient Alexandria, playful cinematic documentary-comedy tone, 16:9, no 3D, no photorealism, no modern objects, no subtitles, no captions, no logos, no generated text, NO on-screen character dialogue (only the off-screen narrator speaks). Use the selected reference images as strict continuity anchors. Preserve faces, hair, clothing, colors, proportions and accessories exactly. Characters may move their bodies, arms, eyes and mouths for silent nonverbal acting only. VISUAL STYLE LOCK: 2D hand-drawn stickman animation; clean thin black outlines; large expressive heads; simple readable stickman proportions; flat warm colors; historically inspired ancient Alexandria; playful cinematic documentary-comedy tone; no 3D; no photorealism; no modern objects; no subtitles; no captions; no logos; no text inside the generated scene; 16:9. The bride watches Senbi's exaggerated dancing. She is amused, tries not to laugh, then gives a small knowing smile. Preserve exact bride design. 2D stickman animation, clean outlines, no text, 16:9. CAMERA: locked-off static camera on a tripod, eye-level close-up of the bride's face. No camera movement of any kind: no tilt, no pan, no zoom, no push, no pull, no orbit, no tracking, no rising or overhead view. The framing stays identical from the first frame to the last frame; all movement comes from the characters. AUDIO (generate sound together with the picture): Off-screen male narrator voice-over, warm intelligent British documentary voice with dry comedic timing, the same voice in every clip, begins speaking within the first half second and says exactly: “His bride was trying very hard not to laugh. She loved him. Mostly.” The narrator is heard off-screen only; no character lip-syncs to the narrator. Music: playful ancient-Mediterranean wedding music with frame drums, reed flute and plucked strings, steady upbeat tempo, the same theme in every clip, mixed low under the narrator. Sound effects: suppressed giggle. No subtitles or captions.</w:t>
       </w:r>
     </w:p>
     <w:p>
@@ -1618,7 +1623,7 @@
     </w:p>
     <w:p>
       <w:r>
-        <w:t>Pan across several guests.</w:t>
+        <w:t>Static, locked-off: eye-level wide-medium shot with several guests in frame. No tilt, pan, zoom or orbit.</w:t>
       </w:r>
     </w:p>
     <w:p>
@@ -1644,7 +1649,7 @@
     </w:p>
     <w:p>
       <w:r>
-        <w:t>2D hand-drawn Stickman animation, clean thin black outlines, large expressive heads, simple readable stickman proportions, flat warm colors, historically inspired ancient Alexandria, playful cinematic documentary-comedy tone, 16:9, no 3D, no photorealism, no modern objects, no subtitles, no captions, no logos, no generated text, NO on-screen character dialogue (only the off-screen narrator speaks). Use the selected reference images as strict continuity anchors. Preserve faces, hair, clothing, colors, proportions and accessories exactly. Characters may move their bodies, arms, eyes and mouths for silent nonverbal acting only. VISUAL STYLE LOCK: 2D hand-drawn stickman animation; clean thin black outlines; large expressive heads; simple readable stickman proportions; flat warm colors; historically inspired ancient Alexandria; playful cinematic documentary-comedy tone; no 3D; no photorealism; no modern objects; no subtitles; no captions; no logos; no text inside the generated scene; 16:9. Young and older Egyptian wedding guests clap, dance, raise cups and cheer around the courtyard. Maintain variety of ages and costumes from the reference. 2D stickman animation, joyful warm palette, no text, 16:9. Smooth pan across several guests. AUDIO (generate sound together with the picture): Off-screen male narrator voice-over, warm intelligent British documentary voice with dry comedic timing, the same voice in every clip, begins speaking within the first half second and says exactly: “Everyone danced and raised a cup, the one thing every wedding agrees on.” The narrator is heard off-screen only; no character lip-syncs to the narrator. Music: playful ancient-Mediterranean wedding music with frame drums, reed flute and plucked strings, steady upbeat tempo, the same theme in every clip, mixed low under the narrator. Sound effects: clapping, cups clinking, laughter. No subtitles or captions.</w:t>
+        <w:t>Locked-off static camera, no camera movement. 2D hand-drawn Stickman animation, clean thin black outlines, large expressive heads, simple readable stickman proportions, flat warm colors, historically inspired ancient Alexandria, playful cinematic documentary-comedy tone, 16:9, no 3D, no photorealism, no modern objects, no subtitles, no captions, no logos, no generated text, NO on-screen character dialogue (only the off-screen narrator speaks). Use the selected reference images as strict continuity anchors. Preserve faces, hair, clothing, colors, proportions and accessories exactly. Characters may move their bodies, arms, eyes and mouths for silent nonverbal acting only. VISUAL STYLE LOCK: 2D hand-drawn stickman animation; clean thin black outlines; large expressive heads; simple readable stickman proportions; flat warm colors; historically inspired ancient Alexandria; playful cinematic documentary-comedy tone; no 3D; no photorealism; no modern objects; no subtitles; no captions; no logos; no text inside the generated scene; 16:9. Young and older Egyptian wedding guests clap, dance, raise cups and cheer around the courtyard. Maintain variety of ages and costumes from the reference. 2D stickman animation, joyful warm palette, no text, 16:9. CAMERA: locked-off static camera on a tripod, eye-level wide-medium shot with several guests in frame. No camera movement of any kind: no tilt, no pan, no zoom, no push, no pull, no orbit, no tracking, no rising or overhead view. The framing stays identical from the first frame to the last frame; all movement comes from the characters. AUDIO (generate sound together with the picture): Off-screen male narrator voice-over, warm intelligent British documentary voice with dry comedic timing, the same voice in every clip, begins speaking within the first half second and says exactly: “Everyone danced and raised a cup, the one thing every wedding agrees on.” The narrator is heard off-screen only; no character lip-syncs to the narrator. Music: playful ancient-Mediterranean wedding music with frame drums, reed flute and plucked strings, steady upbeat tempo, the same theme in every clip, mixed low under the narrator. Sound effects: clapping, cups clinking, laughter. No subtitles or captions.</w:t>
       </w:r>
     </w:p>
     <w:p>
@@ -1728,7 +1733,7 @@
     </w:p>
     <w:p>
       <w:r>
-        <w:t>Quick reaction close-up.</w:t>
+        <w:t>Static, locked-off: eye-level close-up of the woman's face and the dish. No tilt, pan, zoom or orbit.</w:t>
       </w:r>
     </w:p>
     <w:p>
@@ -1754,7 +1759,7 @@
     </w:p>
     <w:p>
       <w:r>
-        <w:t>2D hand-drawn Stickman animation, clean thin black outlines, large expressive heads, simple readable stickman proportions, flat warm colors, historically inspired ancient Alexandria, playful cinematic documentary-comedy tone, 16:9, no 3D, no photorealism, no modern objects, no subtitles, no captions, no logos, no generated text, NO on-screen character dialogue (only the off-screen narrator speaks). Use the selected reference images as strict continuity anchors. Preserve faces, hair, clothing, colors, proportions and accessories exactly. Characters may move their bodies, arms, eyes and mouths for silent nonverbal acting only. VISUAL STYLE LOCK: 2D hand-drawn stickman animation; clean thin black outlines; large expressive heads; simple readable stickman proportions; flat warm colors; historically inspired ancient Alexandria; playful cinematic documentary-comedy tone; no 3D; no photorealism; no modern objects; no subtitles; no captions; no logos; no text inside the generated scene; 16:9. A middle-aged Egyptian woman inspects a dish with exaggerated seriousness, tastes it, pauses, and gives a suspiciously critical expression while nearby guests continue celebrating. 2D stickman animation, clean thin lines, comedic timing, no text, 16:9. Quick reaction close-up. AUDIO (generate sound together with the picture): Off-screen male narrator voice-over, warm intelligent British documentary voice with dry comedic timing, the same voice in every clip, begins speaking within the first half second and says exactly: “One aunt inspected the food like a tax auditor. Verdict: suspicious, but edible.” The narrator is heard off-screen only; no character lip-syncs to the narrator. Music: playful comic percussion over the wedding rhythm, mixed low under the narrator. Sound effects: spoon tapping a bowl, suspicious hum. No subtitles or captions.</w:t>
+        <w:t>Locked-off static camera, no camera movement. 2D hand-drawn Stickman animation, clean thin black outlines, large expressive heads, simple readable stickman proportions, flat warm colors, historically inspired ancient Alexandria, playful cinematic documentary-comedy tone, 16:9, no 3D, no photorealism, no modern objects, no subtitles, no captions, no logos, no generated text, NO on-screen character dialogue (only the off-screen narrator speaks). Use the selected reference images as strict continuity anchors. Preserve faces, hair, clothing, colors, proportions and accessories exactly. Characters may move their bodies, arms, eyes and mouths for silent nonverbal acting only. VISUAL STYLE LOCK: 2D hand-drawn stickman animation; clean thin black outlines; large expressive heads; simple readable stickman proportions; flat warm colors; historically inspired ancient Alexandria; playful cinematic documentary-comedy tone; no 3D; no photorealism; no modern objects; no subtitles; no captions; no logos; no text inside the generated scene; 16:9. A middle-aged Egyptian woman inspects a dish with exaggerated seriousness, tastes it, pauses, and gives a suspiciously critical expression while nearby guests continue celebrating. 2D stickman animation, clean thin lines, comedic timing, no text, 16:9. CAMERA: locked-off static camera on a tripod, eye-level close-up of the woman's face and the dish. No camera movement of any kind: no tilt, no pan, no zoom, no push, no pull, no orbit, no tracking, no rising or overhead view. The framing stays identical from the first frame to the last frame; all movement comes from the characters. AUDIO (generate sound together with the picture): Off-screen male narrator voice-over, warm intelligent British documentary voice with dry comedic timing, the same voice in every clip, begins speaking within the first half second and says exactly: “One aunt inspected the food like a tax auditor. Verdict: suspicious, but edible.” The narrator is heard off-screen only; no character lip-syncs to the narrator. Music: playful comic percussion over the wedding rhythm, mixed low under the narrator. Sound effects: spoon tapping a bowl, suspicious hum. No subtitles or captions.</w:t>
       </w:r>
     </w:p>
     <w:p>
@@ -1843,7 +1848,7 @@
     </w:p>
     <w:p>
       <w:r>
-        <w:t>Gift enters frame; smile freezes.</w:t>
+        <w:t>Static, locked-off: eye-level medium two-shot of Senbi and the father. No tilt, pan, zoom or orbit.</w:t>
       </w:r>
     </w:p>
     <w:p>
@@ -1869,7 +1874,7 @@
     </w:p>
     <w:p>
       <w:r>
-        <w:t>2D hand-drawn Stickman animation, clean thin black outlines, large expressive heads, simple readable stickman proportions, flat warm colors, historically inspired ancient Alexandria, playful cinematic documentary-comedy tone, 16:9, no 3D, no photorealism, no modern objects, no subtitles, no captions, no logos, no generated text, NO on-screen character dialogue (only the off-screen narrator speaks). Use the selected reference images as strict continuity anchors. Preserve faces, hair, clothing, colors, proportions and accessories exactly. Characters may move their bodies, arms, eyes and mouths for silent nonverbal acting only. VISUAL STYLE LOCK: 2D hand-drawn stickman animation; clean thin black outlines; large expressive heads; simple readable stickman proportions; flat warm colors; historically inspired ancient Alexandria; playful cinematic documentary-comedy tone; no 3D; no photorealism; no modern objects; no subtitles; no captions; no logos; no text inside the generated scene; 16:9. An older family member proudly presents Senbi with a traditional wooden headrest as a wedding gift. Senbi smiles politely, but his expression slowly becomes concerned as he realizes what the gift is. Preserve the established characters. 2D stickman animation, no text, 16:9. Medium shot; hold on Senbi's awkward smile. AUDIO (generate sound together with the picture): Off-screen male narrator voice-over, warm intelligent British documentary voice with dry comedic timing, the same voice in every clip, begins speaking within the first half second and says exactly: “Then, the gift: a wooden headrest. Egyptians really did sleep on these.” The narrator is heard off-screen only; no character lip-syncs to the narrator. Music: playful ancient-Mediterranean wedding music with frame drums, reed flute and plucked strings, steady upbeat tempo, the same theme in every clip, mixed low under the narrator. Sound effects: one wooden knock. No subtitles or captions.</w:t>
+        <w:t>Locked-off static camera, no camera movement. 2D hand-drawn Stickman animation, clean thin black outlines, large expressive heads, simple readable stickman proportions, flat warm colors, historically inspired ancient Alexandria, playful cinematic documentary-comedy tone, 16:9, no 3D, no photorealism, no modern objects, no subtitles, no captions, no logos, no generated text, NO on-screen character dialogue (only the off-screen narrator speaks). Use the selected reference images as strict continuity anchors. Preserve faces, hair, clothing, colors, proportions and accessories exactly. Characters may move their bodies, arms, eyes and mouths for silent nonverbal acting only. VISUAL STYLE LOCK: 2D hand-drawn stickman animation; clean thin black outlines; large expressive heads; simple readable stickman proportions; flat warm colors; historically inspired ancient Alexandria; playful cinematic documentary-comedy tone; no 3D; no photorealism; no modern objects; no subtitles; no captions; no logos; no text inside the generated scene; 16:9. An older family member proudly presents Senbi with a traditional wooden headrest as a wedding gift. Senbi smiles politely, but his expression slowly becomes concerned as he realizes what the gift is. Preserve the established characters. 2D stickman animation, no text, 16:9. CAMERA: locked-off static camera on a tripod, eye-level medium two-shot of Senbi and the father. No camera movement of any kind: no tilt, no pan, no zoom, no push, no pull, no orbit, no tracking, no rising or overhead view. The framing stays identical from the first frame to the last frame; all movement comes from the characters. AUDIO (generate sound together with the picture): Off-screen male narrator voice-over, warm intelligent British documentary voice with dry comedic timing, the same voice in every clip, begins speaking within the first half second and says exactly: “Then, the gift: a wooden headrest. Egyptians really did sleep on these.” The narrator is heard off-screen only; no character lip-syncs to the narrator. Music: playful ancient-Mediterranean wedding music with frame drums, reed flute and plucked strings, steady upbeat tempo, the same theme in every clip, mixed low under the narrator. Sound effects: one wooden knock. No subtitles or captions.</w:t>
       </w:r>
     </w:p>
     <w:p>
@@ -1948,7 +1953,7 @@
     </w:p>
     <w:p>
       <w:r>
-        <w:t>Hold awkward pose for the joke.</w:t>
+        <w:t>Static, locked-off: eye-level medium shot of Senbi with the headrest. No tilt, pan, zoom or orbit.</w:t>
       </w:r>
     </w:p>
     <w:p>
@@ -1974,7 +1979,7 @@
     </w:p>
     <w:p>
       <w:r>
-        <w:t>2D hand-drawn Stickman animation, clean thin black outlines, large expressive heads, simple readable stickman proportions, flat warm colors, historically inspired ancient Alexandria, playful cinematic documentary-comedy tone, 16:9, no 3D, no photorealism, no modern objects, no subtitles, no captions, no logos, no generated text, NO on-screen character dialogue (only the off-screen narrator speaks). Use the selected reference images as strict continuity anchors. Preserve faces, hair, clothing, colors, proportions and accessories exactly. Characters may move their bodies, arms, eyes and mouths for silent nonverbal acting only. VISUAL STYLE LOCK: 2D hand-drawn stickman animation; clean thin black outlines; large expressive heads; simple readable stickman proportions; flat warm colors; historically inspired ancient Alexandria; playful cinematic documentary-comedy tone; no 3D; no photorealism; no modern objects; no subtitles; no captions; no logos; no text inside the generated scene; 16:9. Senbi tries to lie down using the wooden headrest. He freezes in obvious discomfort, forces a polite smile, and gives a reluctant thumbs-up. Keep the joke visual and family-friendly. Preserve exact Senbi design. 2D stickman animation, clean outlines, no text, 16:9. Hold the awkward pose long enough for the joke. AUDIO (generate sound together with the picture): Off-screen male narrator voice-over, warm intelligent British documentary voice with dry comedic timing, the same voice in every clip, begins speaking within the first half second and says exactly: “Senbi lay down. His neck filed a formal complaint. His thumbs-up said otherwise.” The narrator is heard off-screen only; no character lip-syncs to the narrator. Music: playful comic percussion over the wedding rhythm, mixed low under the narrator. Sound effects: comic wooden creak. No subtitles or captions.</w:t>
+        <w:t>Locked-off static camera, no camera movement. 2D hand-drawn Stickman animation, clean thin black outlines, large expressive heads, simple readable stickman proportions, flat warm colors, historically inspired ancient Alexandria, playful cinematic documentary-comedy tone, 16:9, no 3D, no photorealism, no modern objects, no subtitles, no captions, no logos, no generated text, NO on-screen character dialogue (only the off-screen narrator speaks). Use the selected reference images as strict continuity anchors. Preserve faces, hair, clothing, colors, proportions and accessories exactly. Characters may move their bodies, arms, eyes and mouths for silent nonverbal acting only. VISUAL STYLE LOCK: 2D hand-drawn stickman animation; clean thin black outlines; large expressive heads; simple readable stickman proportions; flat warm colors; historically inspired ancient Alexandria; playful cinematic documentary-comedy tone; no 3D; no photorealism; no modern objects; no subtitles; no captions; no logos; no text inside the generated scene; 16:9. Senbi tries to lie down using the wooden headrest. He freezes in obvious discomfort, forces a polite smile, and gives a reluctant thumbs-up. Keep the joke visual and family-friendly. Preserve exact Senbi design. 2D stickman animation, clean outlines, no text, 16:9. Hold the awkward pose long enough for the joke. CAMERA: locked-off static camera on a tripod, eye-level medium shot of Senbi with the headrest. No camera movement of any kind: no tilt, no pan, no zoom, no push, no pull, no orbit, no tracking, no rising or overhead view. The framing stays identical from the first frame to the last frame; all movement comes from the characters. AUDIO (generate sound together with the picture): Off-screen male narrator voice-over, warm intelligent British documentary voice with dry comedic timing, the same voice in every clip, begins speaking within the first half second and says exactly: “Senbi lay down. His neck filed a formal complaint. His thumbs-up said otherwise.” The narrator is heard off-screen only; no character lip-syncs to the narrator. Music: playful comic percussion over the wedding rhythm, mixed low under the narrator. Sound effects: comic wooden creak. No subtitles or captions.</w:t>
       </w:r>
     </w:p>
     <w:p>
@@ -2068,7 +2073,7 @@
     </w:p>
     <w:p>
       <w:r>
-        <w:t>Slow orbit.</w:t>
+        <w:t>Locked camera, extremely slow 5% push-in only: wide shot of the whole courtyard at eye level. No tilt, pan or orbit.</w:t>
       </w:r>
     </w:p>
     <w:p>
@@ -2094,7 +2099,7 @@
     </w:p>
     <w:p>
       <w:r>
-        <w:t>2D hand-drawn Stickman animation, clean thin black outlines, large expressive heads, simple readable stickman proportions, flat warm colors, historically inspired ancient Alexandria, playful cinematic documentary-comedy tone, 16:9, no 3D, no photorealism, no modern objects, no subtitles, no captions, no logos, no generated text, NO on-screen character dialogue (only the off-screen narrator speaks). Use the selected reference images as strict continuity anchors. Preserve faces, hair, clothing, colors, proportions and accessories exactly. Characters may move their bodies, arms, eyes and mouths for silent nonverbal acting only. VISUAL STYLE LOCK: 2D hand-drawn stickman animation; clean thin black outlines; large expressive heads; simple readable stickman proportions; flat warm colors; historically inspired ancient Alexandria; playful cinematic documentary-comedy tone; no 3D; no photorealism; no modern objects; no subtitles; no captions; no logos; no text inside the generated scene; 16:9. Wide view of the wedding at its happiest moment: Senbi and bride together, musicians playing, guests dancing, decorations, food and warm Alexandria light. Everything feels perfect for a brief moment. 2D stickman animation, cinematic wide composition, warm colors, no text, 16:9. Slow gentle orbit. AUDIO (generate sound together with the picture): Off-screen male narrator voice-over, warm intelligent British documentary voice with dry comedic timing, the same voice in every clip, begins speaking within the first half second and says exactly: “For a few perfect minutes, everything was exactly right. Enjoy this part.” The narrator is heard off-screen only; no character lip-syncs to the narrator. Music: playful ancient-Mediterranean wedding music with frame drums, reed flute and plucked strings, steady upbeat tempo, the same theme in every clip, mixed low under the narrator. Sound effects: applause, drums, wind in the banners. No subtitles or captions.</w:t>
+        <w:t>Locked camera, only an extremely slow subtle push-in. 2D hand-drawn Stickman animation, clean thin black outlines, large expressive heads, simple readable stickman proportions, flat warm colors, historically inspired ancient Alexandria, playful cinematic documentary-comedy tone, 16:9, no 3D, no photorealism, no modern objects, no subtitles, no captions, no logos, no generated text, NO on-screen character dialogue (only the off-screen narrator speaks). Use the selected reference images as strict continuity anchors. Preserve faces, hair, clothing, colors, proportions and accessories exactly. Characters may move their bodies, arms, eyes and mouths for silent nonverbal acting only. VISUAL STYLE LOCK: 2D hand-drawn stickman animation; clean thin black outlines; large expressive heads; simple readable stickman proportions; flat warm colors; historically inspired ancient Alexandria; playful cinematic documentary-comedy tone; no 3D; no photorealism; no modern objects; no subtitles; no captions; no logos; no text inside the generated scene; 16:9. Wide view of the wedding at its happiest moment: Senbi and bride together, musicians playing, guests dancing, decorations, food and warm Alexandria light. Everything feels perfect for a brief moment. 2D stickman animation, cinematic wide composition, warm colors, no text, 16:9. CAMERA: wide shot of the whole courtyard at eye level. Locked camera with only an extremely slow, subtle push-in (about 5%) over the whole clip. No tilt, no pan, no orbit, no rising or overhead view; the subject stays in the same position in the frame. AUDIO (generate sound together with the picture): Off-screen male narrator voice-over, warm intelligent British documentary voice with dry comedic timing, the same voice in every clip, begins speaking within the first half second and says exactly: “For a few perfect minutes, everything was exactly right. Enjoy this part.” The narrator is heard off-screen only; no character lip-syncs to the narrator. Music: playful ancient-Mediterranean wedding music with frame drums, reed flute and plucked strings, steady upbeat tempo, the same theme in every clip, mixed low under the narrator. Sound effects: applause, drums, wind in the banners. No subtitles or captions.</w:t>
       </w:r>
     </w:p>
     <w:p>
@@ -2173,7 +2178,7 @@
     </w:p>
     <w:p>
       <w:r>
-        <w:t>Extreme close-up; tiny vibration.</w:t>
+        <w:t>Static, locked-off: extreme close-up of the cup; only the cup vibrates, the camera does not. No tilt, pan, zoom or orbit.</w:t>
       </w:r>
     </w:p>
     <w:p>
@@ -2199,7 +2204,7 @@
     </w:p>
     <w:p>
       <w:r>
-        <w:t>2D hand-drawn Stickman animation, clean thin black outlines, large expressive heads, simple readable stickman proportions, flat warm colors, historically inspired ancient Alexandria, playful cinematic documentary-comedy tone, 16:9, no 3D, no photorealism, no modern objects, no subtitles, no captions, no logos, no generated text, NO on-screen character dialogue (only the off-screen narrator speaks). Use the selected reference images as strict continuity anchors. Preserve faces, hair, clothing, colors, proportions and accessories exactly. Characters may move their bodies, arms, eyes and mouths for silent nonverbal acting only. VISUAL STYLE LOCK: 2D hand-drawn stickman animation; clean thin black outlines; large expressive heads; simple readable stickman proportions; flat warm colors; historically inspired ancient Alexandria; playful cinematic documentary-comedy tone; no 3D; no photorealism; no modern objects; no subtitles; no captions; no logos; no text inside the generated scene; 16:9. Close-up of a small ceramic cup on a wedding table. It vibrates subtly from a distant disturbance. The guests in the background continue celebrating and do not notice. 2D stickman animation, clean thin outlines, mysterious but playful mood, no text, 16:9. Extreme close-up with tiny vibration. AUDIO (generate sound together with the picture): Off-screen male narrator voice-over, warm intelligent British documentary voice with dry comedic timing, the same voice in every clip, begins speaking within the first half second and says exactly: “Then a small cup on the table began to tremble. Nobody noticed.” The narrator is heard off-screen only; no character lip-syncs to the narrator. Music: playful ancient-Mediterranean wedding music with frame drums, reed flute and plucked strings, steady upbeat tempo, the same theme in every clip, mixed low under the narrator and a faint uneasy undertone. Sound effects: ceramic cup rattling, faint rumble. No subtitles or captions.</w:t>
+        <w:t>Locked-off static camera, no camera movement. 2D hand-drawn Stickman animation, clean thin black outlines, large expressive heads, simple readable stickman proportions, flat warm colors, historically inspired ancient Alexandria, playful cinematic documentary-comedy tone, 16:9, no 3D, no photorealism, no modern objects, no subtitles, no captions, no logos, no generated text, NO on-screen character dialogue (only the off-screen narrator speaks). Use the selected reference images as strict continuity anchors. Preserve faces, hair, clothing, colors, proportions and accessories exactly. Characters may move their bodies, arms, eyes and mouths for silent nonverbal acting only. VISUAL STYLE LOCK: 2D hand-drawn stickman animation; clean thin black outlines; large expressive heads; simple readable stickman proportions; flat warm colors; historically inspired ancient Alexandria; playful cinematic documentary-comedy tone; no 3D; no photorealism; no modern objects; no subtitles; no captions; no logos; no text inside the generated scene; 16:9. Close-up of a small ceramic cup on a wedding table. It vibrates subtly from a distant disturbance. The guests in the background continue celebrating and do not notice. 2D stickman animation, clean thin outlines, mysterious but playful mood, no text, 16:9. CAMERA: locked-off static camera on a tripod, extreme close-up of the cup; only the cup vibrates, the camera does not. No camera movement of any kind: no tilt, no pan, no zoom, no push, no pull, no orbit, no tracking, no rising or overhead view. The framing stays identical from the first frame to the last frame; all movement comes from the characters. AUDIO (generate sound together with the picture): Off-screen male narrator voice-over, warm intelligent British documentary voice with dry comedic timing, the same voice in every clip, begins speaking within the first half second and says exactly: “Then a small cup on the table began to tremble. Nobody noticed.” The narrator is heard off-screen only; no character lip-syncs to the narrator. Music: playful ancient-Mediterranean wedding music with frame drums, reed flute and plucked strings, steady upbeat tempo, the same theme in every clip, mixed low under the narrator and a faint uneasy undertone. Sound effects: ceramic cup rattling, faint rumble. No subtitles or captions.</w:t>
       </w:r>
     </w:p>
     <w:p>
@@ -2283,7 +2288,7 @@
     </w:p>
     <w:p>
       <w:r>
-        <w:t>Shift camera from musician to entrance.</w:t>
+        <w:t>Static, locked-off: eye-level medium shot of the musician with the entrance visible behind him. No tilt, pan, zoom or orbit.</w:t>
       </w:r>
     </w:p>
     <w:p>
@@ -2309,7 +2314,7 @@
     </w:p>
     <w:p>
       <w:r>
-        <w:t>2D hand-drawn Stickman animation, clean thin black outlines, large expressive heads, simple readable stickman proportions, flat warm colors, historically inspired ancient Alexandria, playful cinematic documentary-comedy tone, 16:9, no 3D, no photorealism, no modern objects, no subtitles, no captions, no logos, no generated text, NO on-screen character dialogue (only the off-screen narrator speaks). Use the selected reference images as strict continuity anchors. Preserve faces, hair, clothing, colors, proportions and accessories exactly. Characters may move their bodies, arms, eyes and mouths for silent nonverbal acting only. VISUAL STYLE LOCK: 2D hand-drawn stickman animation; clean thin black outlines; large expressive heads; simple readable stickman proportions; flat warm colors; historically inspired ancient Alexandria; playful cinematic documentary-comedy tone; no 3D; no photorealism; no modern objects; no subtitles; no captions; no logos; no text inside the generated scene; 16:9. An Egyptian musician suddenly stops playing and looks toward the entrance while everyone else continues dancing for one more beat. His expression changes from joyful to alert. 2D stickman animation, no text, 16:9. Camera shifts from the musician toward the entrance. AUDIO (generate sound together with the picture): Off-screen male narrator voice-over, warm intelligent British documentary voice with dry comedic timing, the same voice in every clip, begins speaking within the first half second and says exactly: “The musician noticed. He stopped. Everyone else danced one more beat, blissfully unaware.” The narrator is heard off-screen only; no character lip-syncs to the narrator. Music: music nearly silent. Sound effects: music and drums cut out, one drum stops. No subtitles or captions.</w:t>
+        <w:t>Locked-off static camera, no camera movement. 2D hand-drawn Stickman animation, clean thin black outlines, large expressive heads, simple readable stickman proportions, flat warm colors, historically inspired ancient Alexandria, playful cinematic documentary-comedy tone, 16:9, no 3D, no photorealism, no modern objects, no subtitles, no captions, no logos, no generated text, NO on-screen character dialogue (only the off-screen narrator speaks). Use the selected reference images as strict continuity anchors. Preserve faces, hair, clothing, colors, proportions and accessories exactly. Characters may move their bodies, arms, eyes and mouths for silent nonverbal acting only. VISUAL STYLE LOCK: 2D hand-drawn stickman animation; clean thin black outlines; large expressive heads; simple readable stickman proportions; flat warm colors; historically inspired ancient Alexandria; playful cinematic documentary-comedy tone; no 3D; no photorealism; no modern objects; no subtitles; no captions; no logos; no text inside the generated scene; 16:9. An Egyptian musician suddenly stops playing and looks toward the entrance, which is visible in the background, while everyone else continues dancing for one more beat. His expression changes from joyful to alert. 2D stickman animation, no text, 16:9. CAMERA: locked-off static camera on a tripod, eye-level medium shot of the musician with the entrance visible behind him. No camera movement of any kind: no tilt, no pan, no zoom, no push, no pull, no orbit, no tracking, no rising or overhead view. The framing stays identical from the first frame to the last frame; all movement comes from the characters. AUDIO (generate sound together with the picture): Off-screen male narrator voice-over, warm intelligent British documentary voice with dry comedic timing, the same voice in every clip, begins speaking within the first half second and says exactly: “The musician noticed. He stopped. Everyone else danced one more beat, blissfully unaware.” The narrator is heard off-screen only; no character lip-syncs to the narrator. Music: music nearly silent. Sound effects: music and drums cut out, one drum stops. No subtitles or captions.</w:t>
       </w:r>
     </w:p>
     <w:p>
@@ -2388,7 +2393,7 @@
     </w:p>
     <w:p>
       <w:r>
-        <w:t>Track backward as people clear the road.</w:t>
+        <w:t>Static, locked-off: eye-level wide shot of the street. No tilt, pan, zoom or orbit.</w:t>
       </w:r>
     </w:p>
     <w:p>
@@ -2414,7 +2419,7 @@
     </w:p>
     <w:p>
       <w:r>
-        <w:t>2D hand-drawn Stickman animation, clean thin black outlines, large expressive heads, simple readable stickman proportions, flat warm colors, historically inspired ancient Alexandria, playful cinematic documentary-comedy tone, 16:9, no 3D, no photorealism, no modern objects, no subtitles, no captions, no logos, no generated text, NO on-screen character dialogue (only the off-screen narrator speaks). Use the selected reference images as strict continuity anchors. Preserve faces, hair, clothing, colors, proportions and accessories exactly. Characters may move their bodies, arms, eyes and mouths for silent nonverbal acting only. VISUAL STYLE LOCK: 2D hand-drawn stickman animation; clean thin black outlines; large expressive heads; simple readable stickman proportions; flat warm colors; historically inspired ancient Alexandria; playful cinematic documentary-comedy tone; no 3D; no photorealism; no modern objects; no subtitles; no captions; no logos; no text inside the generated scene; 16:9. Ancient Alexandria street that was previously busy becomes strangely quiet. Civilians notice something approaching and slowly move to the sides of the street. Keep the Roman figures hidden or extremely distant. 2D stickman animation, historically inspired Alexandria, no modern objects, no text, 16:9. Camera tracks backward as the street clears. AUDIO (generate sound together with the picture): Off-screen male narrator voice-over, warm intelligent British documentary voice with dry comedic timing, the same voice in every clip, begins speaking within the first half second and says exactly: “Outside, the street went quiet. In a busy city, that's never good.” The narrator is heard off-screen only; no character lip-syncs to the narrator. Music: music drops to low sustained tension with distant marching drums, almost silent. Sound effects: street ambience fading, distant boots. No subtitles or captions.</w:t>
+        <w:t>Locked-off static camera, no camera movement. 2D hand-drawn Stickman animation, clean thin black outlines, large expressive heads, simple readable stickman proportions, flat warm colors, historically inspired ancient Alexandria, playful cinematic documentary-comedy tone, 16:9, no 3D, no photorealism, no modern objects, no subtitles, no captions, no logos, no generated text, NO on-screen character dialogue (only the off-screen narrator speaks). Use the selected reference images as strict continuity anchors. Preserve faces, hair, clothing, colors, proportions and accessories exactly. Characters may move their bodies, arms, eyes and mouths for silent nonverbal acting only. VISUAL STYLE LOCK: 2D hand-drawn stickman animation; clean thin black outlines; large expressive heads; simple readable stickman proportions; flat warm colors; historically inspired ancient Alexandria; playful cinematic documentary-comedy tone; no 3D; no photorealism; no modern objects; no subtitles; no captions; no logos; no text inside the generated scene; 16:9. Ancient Alexandria street that was previously busy becomes strangely quiet. Civilians notice something approaching and slowly move to the sides of the street. Keep the Roman figures hidden or extremely distant. 2D stickman animation, historically inspired Alexandria, no modern objects, no text, 16:9. CAMERA: locked-off static camera on a tripod, eye-level wide shot of the street. No camera movement of any kind: no tilt, no pan, no zoom, no push, no pull, no orbit, no tracking, no rising or overhead view. The framing stays identical from the first frame to the last frame; all movement comes from the characters. AUDIO (generate sound together with the picture): Off-screen male narrator voice-over, warm intelligent British documentary voice with dry comedic timing, the same voice in every clip, begins speaking within the first half second and says exactly: “Outside, the street went quiet. In a busy city, that's never good.” The narrator is heard off-screen only; no character lip-syncs to the narrator. Music: music drops to low sustained tension with distant marching drums, almost silent. Sound effects: street ambience fading, distant boots. No subtitles or captions.</w:t>
       </w:r>
     </w:p>
     <w:p>
@@ -2485,7 +2490,7 @@
     </w:p>
     <w:p>
       <w:r>
-        <w:t>Low angle: first Roman boot enters frame, then another. All expressions, eye movement and mouth movement are silent nonverbal acting only. No intelligible speech, no lip-sync dialogue.</w:t>
+        <w:t>Fixed ground-level frame: first Roman boot enters from the side, then another. The camera never rises. All expressions, eye movement and mouth movement are silent nonverbal acting only. No intelligible speech, no lip-sync dialogue.</w:t>
       </w:r>
     </w:p>
     <w:p>
@@ -2498,7 +2503,7 @@
     </w:p>
     <w:p>
       <w:r>
-        <w:t>Three rhythmic steps; no full reveal.</w:t>
+        <w:t>Static, locked-off: fixed ground-level frame on the street; the boots step into frame from the side and the camera never rises. No tilt, pan, zoom or orbit.</w:t>
       </w:r>
     </w:p>
     <w:p>
@@ -2524,7 +2529,7 @@
     </w:p>
     <w:p>
       <w:r>
-        <w:t>2D hand-drawn Stickman animation, clean thin black outlines, large expressive heads, simple readable stickman proportions, flat warm colors, historically inspired ancient Alexandria, playful cinematic documentary-comedy tone, 16:9, no 3D, no photorealism, no modern objects, no subtitles, no captions, no logos, no generated text, NO on-screen character dialogue (only the off-screen narrator speaks). Use the selected reference images as strict continuity anchors. Preserve faces, hair, clothing, colors, proportions and accessories exactly. Characters may move their bodies, arms, eyes and mouths for silent nonverbal acting only. VISUAL STYLE LOCK: 2D hand-drawn stickman animation; clean thin black outlines; large expressive heads; simple readable stickman proportions; flat warm colors; historically inspired ancient Alexandria; playful cinematic documentary-comedy tone; no 3D; no photorealism; no modern objects; no subtitles; no captions; no logos; no text inside the generated scene; 16:9. Low-angle shot of a Roman legionary's armored boot stepping onto the Alexandrian street, followed by a second boot. Show only the lower body at first; keep the reveal mysterious. Preserve the Roman armor and red cloak design from the reference. 2D stickman animation, clean lines, no text, 16:9. Three deliberate marching steps. AUDIO (generate sound together with the picture): no narration. Sound effects: heavy boot steps with metal clank. Music: music drops to low sustained tension with distant marching drums, almost silent. No speech of any kind. No subtitles or captions.</w:t>
+        <w:t>Locked-off static camera, no camera movement. 2D hand-drawn Stickman animation, clean thin black outlines, large expressive heads, simple readable stickman proportions, flat warm colors, historically inspired ancient Alexandria, playful cinematic documentary-comedy tone, 16:9, no 3D, no photorealism, no modern objects, no subtitles, no captions, no logos, no generated text, NO on-screen character dialogue (only the off-screen narrator speaks). Use the selected reference images as strict continuity anchors. Preserve faces, hair, clothing, colors, proportions and accessories exactly. Characters may move their bodies, arms, eyes and mouths for silent nonverbal acting only. VISUAL STYLE LOCK: 2D hand-drawn stickman animation; clean thin black outlines; large expressive heads; simple readable stickman proportions; flat warm colors; historically inspired ancient Alexandria; playful cinematic documentary-comedy tone; no 3D; no photorealism; no modern objects; no subtitles; no captions; no logos; no text inside the generated scene; 16:9. Fixed ground-level frame on the Alexandrian street: a Roman legionary's armored boot steps into frame from the side, followed by a second boot. Show only the lower body at first; keep the reveal mysterious. Preserve the Roman armor and red cloak design from the reference. 2D stickman animation, clean lines, no text, 16:9. Three deliberate marching steps. CAMERA: locked-off static camera on a tripod, fixed ground-level frame on the street; the boots step into frame from the side and the camera never rises. No camera movement of any kind: no tilt, no pan, no zoom, no push, no pull, no orbit, no tracking, no rising or overhead view. The framing stays identical from the first frame to the last frame; all movement comes from the characters. AUDIO (generate sound together with the picture): no narration. Sound effects: heavy boot steps with metal clank. Music: music drops to low sustained tension with distant marching drums, almost silent. No speech of any kind. No subtitles or captions.</w:t>
       </w:r>
     </w:p>
     <w:p>
@@ -2608,7 +2613,7 @@
     </w:p>
     <w:p>
       <w:r>
-        <w:t>Slow push-in; keep them small.</w:t>
+        <w:t>Locked camera, extremely slow 5% push-in only: eye-level wide street view. No tilt, pan or orbit.</w:t>
       </w:r>
     </w:p>
     <w:p>
@@ -2634,7 +2639,7 @@
     </w:p>
     <w:p>
       <w:r>
-        <w:t>2D hand-drawn Stickman animation, clean thin black outlines, large expressive heads, simple readable stickman proportions, flat warm colors, historically inspired ancient Alexandria, playful cinematic documentary-comedy tone, 16:9, no 3D, no photorealism, no modern objects, no subtitles, no captions, no logos, no generated text, NO on-screen character dialogue (only the off-screen narrator speaks). Use the selected reference images as strict continuity anchors. Preserve faces, hair, clothing, colors, proportions and accessories exactly. Characters may move their bodies, arms, eyes and mouths for silent nonverbal acting only. VISUAL STYLE LOCK: 2D hand-drawn stickman animation; clean thin black outlines; large expressive heads; simple readable stickman proportions; flat warm colors; historically inspired ancient Alexandria; playful cinematic documentary-comedy tone; no 3D; no photorealism; no modern objects; no subtitles; no captions; no logos; no text inside the generated scene; 16:9. Long street view of several Roman soldiers marching toward camera as distant silhouettes. Their shields, helmets and red accents are recognizable but the group remains far away. 2D stickman animation, cinematic mystery, warm Alexandria environment, no text, 16:9. Slow push toward the approaching formation. AUDIO (generate sound together with the picture): Off-screen male narrator voice-over, warm intelligent British documentary voice with dry comedic timing, the same voice in every clip, begins speaking within the first half second and says exactly: “Clank. Clank. Clank. Marching men. Lots of them.” The narrator is heard off-screen only; no character lip-syncs to the narrator. Music: music drops to low sustained tension with distant marching drums, almost silent. Sound effects: marching boots in rhythm, metal clinks. No subtitles or captions.</w:t>
+        <w:t>Locked camera, only an extremely slow subtle push-in. 2D hand-drawn Stickman animation, clean thin black outlines, large expressive heads, simple readable stickman proportions, flat warm colors, historically inspired ancient Alexandria, playful cinematic documentary-comedy tone, 16:9, no 3D, no photorealism, no modern objects, no subtitles, no captions, no logos, no generated text, NO on-screen character dialogue (only the off-screen narrator speaks). Use the selected reference images as strict continuity anchors. Preserve faces, hair, clothing, colors, proportions and accessories exactly. Characters may move their bodies, arms, eyes and mouths for silent nonverbal acting only. VISUAL STYLE LOCK: 2D hand-drawn stickman animation; clean thin black outlines; large expressive heads; simple readable stickman proportions; flat warm colors; historically inspired ancient Alexandria; playful cinematic documentary-comedy tone; no 3D; no photorealism; no modern objects; no subtitles; no captions; no logos; no text inside the generated scene; 16:9. Long street view of several Roman soldiers marching toward camera as distant silhouettes. Their shields, helmets and red accents are recognizable but the group remains far away. 2D stickman animation, cinematic mystery, warm Alexandria environment, no text, 16:9. CAMERA: eye-level wide street view. Locked camera with only an extremely slow, subtle push-in (about 5%) over the whole clip. No tilt, no pan, no orbit, no rising or overhead view; the subject stays in the same position in the frame. AUDIO (generate sound together with the picture): Off-screen male narrator voice-over, warm intelligent British documentary voice with dry comedic timing, the same voice in every clip, begins speaking within the first half second and says exactly: “Clank. Clank. Clank. Marching men. Lots of them.” The narrator is heard off-screen only; no character lip-syncs to the narrator. Music: music drops to low sustained tension with distant marching drums, almost silent. Sound effects: marching boots in rhythm, metal clinks. No subtitles or captions.</w:t>
       </w:r>
     </w:p>
     <w:p>
@@ -2723,7 +2728,7 @@
     </w:p>
     <w:p>
       <w:r>
-        <w:t>Hold on happy faces.</w:t>
+        <w:t>Static, locked-off: eye-level medium-wide shot of the courtyard. No tilt, pan, zoom or orbit.</w:t>
       </w:r>
     </w:p>
     <w:p>
@@ -2749,7 +2754,7 @@
     </w:p>
     <w:p>
       <w:r>
-        <w:t>2D hand-drawn Stickman animation, clean thin black outlines, large expressive heads, simple readable stickman proportions, flat warm colors, historically inspired ancient Alexandria, playful cinematic documentary-comedy tone, 16:9, no 3D, no photorealism, no modern objects, no subtitles, no captions, no logos, no generated text, NO on-screen character dialogue (only the off-screen narrator speaks). Use the selected reference images as strict continuity anchors. Preserve faces, hair, clothing, colors, proportions and accessories exactly. Characters may move their bodies, arms, eyes and mouths for silent nonverbal acting only. VISUAL STYLE LOCK: 2D hand-drawn stickman animation; clean thin black outlines; large expressive heads; simple readable stickman proportions; flat warm colors; historically inspired ancient Alexandria; playful cinematic documentary-comedy tone; no 3D; no photorealism; no modern objects; no subtitles; no captions; no logos; no text inside the generated scene; 16:9. Cut back inside the wedding. Guests are still dancing and Senbi is still celebrating, completely unaware of the approaching Romans. Bride is also still focused on the celebration. 2D stickman animation, warm colors, no text, 16:9. Hold on the happy celebration for comedic contrast. AUDIO (generate sound together with the picture): Off-screen male narrator voice-over, warm intelligent British documentary voice with dry comedic timing, the same voice in every clip, begins speaking within the first half second and says exactly: “Inside, nobody had a clue. Senbi was busy spinning.” The narrator is heard off-screen only; no character lip-syncs to the narrator. Music: playful ancient-Mediterranean wedding music with frame drums, reed flute and plucked strings, steady upbeat tempo, the same theme in every clip, mixed low under the narrator and a faint uneasy undertone. Sound effects: wedding music muffled, faint thump. No subtitles or captions.</w:t>
+        <w:t>Locked-off static camera, no camera movement. 2D hand-drawn Stickman animation, clean thin black outlines, large expressive heads, simple readable stickman proportions, flat warm colors, historically inspired ancient Alexandria, playful cinematic documentary-comedy tone, 16:9, no 3D, no photorealism, no modern objects, no subtitles, no captions, no logos, no generated text, NO on-screen character dialogue (only the off-screen narrator speaks). Use the selected reference images as strict continuity anchors. Preserve faces, hair, clothing, colors, proportions and accessories exactly. Characters may move their bodies, arms, eyes and mouths for silent nonverbal acting only. VISUAL STYLE LOCK: 2D hand-drawn stickman animation; clean thin black outlines; large expressive heads; simple readable stickman proportions; flat warm colors; historically inspired ancient Alexandria; playful cinematic documentary-comedy tone; no 3D; no photorealism; no modern objects; no subtitles; no captions; no logos; no text inside the generated scene; 16:9. Cut back inside the wedding. Guests are still dancing and Senbi is still celebrating, completely unaware of the approaching Romans. Bride is also still focused on the celebration. 2D stickman animation, warm colors, no text, 16:9. Hold on the happy celebration for comedic contrast. CAMERA: locked-off static camera on a tripod, eye-level medium-wide shot of the courtyard. No camera movement of any kind: no tilt, no pan, no zoom, no push, no pull, no orbit, no tracking, no rising or overhead view. The framing stays identical from the first frame to the last frame; all movement comes from the characters. AUDIO (generate sound together with the picture): Off-screen male narrator voice-over, warm intelligent British documentary voice with dry comedic timing, the same voice in every clip, begins speaking within the first half second and says exactly: “Inside, nobody had a clue. Senbi was busy spinning.” The narrator is heard off-screen only; no character lip-syncs to the narrator. Music: playful ancient-Mediterranean wedding music with frame drums, reed flute and plucked strings, steady upbeat tempo, the same theme in every clip, mixed low under the narrator and a faint uneasy undertone. Sound effects: wedding music muffled, faint thump. No subtitles or captions.</w:t>
       </w:r>
     </w:p>
     <w:p>
@@ -2833,7 +2838,7 @@
     </w:p>
     <w:p>
       <w:r>
-        <w:t>Medium-wide reveal.</w:t>
+        <w:t>Static, locked-off: eye-level medium-wide shot of the street; the soldiers walk into the frame. No tilt, pan, zoom or orbit.</w:t>
       </w:r>
     </w:p>
     <w:p>
@@ -2859,7 +2864,7 @@
     </w:p>
     <w:p>
       <w:r>
-        <w:t>2D hand-drawn Stickman animation, clean thin black outlines, large expressive heads, simple readable stickman proportions, flat warm colors, historically inspired ancient Alexandria, playful cinematic documentary-comedy tone, 16:9, no 3D, no photorealism, no modern objects, no subtitles, no captions, no logos, no generated text, NO on-screen character dialogue (only the off-screen narrator speaks). Use the selected reference images as strict continuity anchors. Preserve faces, hair, clothing, colors, proportions and accessories exactly. Characters may move their bodies, arms, eyes and mouths for silent nonverbal acting only. VISUAL STYLE LOCK: 2D hand-drawn stickman animation; clean thin black outlines; large expressive heads; simple readable stickman proportions; flat warm colors; historically inspired ancient Alexandria; playful cinematic documentary-comedy tone; no 3D; no photorealism; no modern objects; no subtitles; no captions; no logos; no text inside the generated scene; 16:9. Two Roman legionaries clearly enter the Alexandrian street near the wedding district. They wear historically inspired Roman armor, helmets, red cloaks and carry shields and spears. They look tired and confused rather than cartoonishly evil. 2D stickman animation, exact Roman reference design, no text, 16:9. Medium-wide reveal. AUDIO (generate sound together with the picture): Off-screen male narrator voice-over, warm intelligent British documentary voice with dry comedic timing, the same voice in every clip, begins speaking within the first half second and says exactly: “And then Rome arrived. Tired, dusty, and looking for the right address.” The narrator is heard off-screen only; no character lip-syncs to the narrator. Music: music drops to low sustained tension with distant marching drums, almost silent. Sound effects: armor clank, dust, a tired sigh. No subtitles or captions.</w:t>
+        <w:t>Locked-off static camera, no camera movement. 2D hand-drawn Stickman animation, clean thin black outlines, large expressive heads, simple readable stickman proportions, flat warm colors, historically inspired ancient Alexandria, playful cinematic documentary-comedy tone, 16:9, no 3D, no photorealism, no modern objects, no subtitles, no captions, no logos, no generated text, NO on-screen character dialogue (only the off-screen narrator speaks). Use the selected reference images as strict continuity anchors. Preserve faces, hair, clothing, colors, proportions and accessories exactly. Characters may move their bodies, arms, eyes and mouths for silent nonverbal acting only. VISUAL STYLE LOCK: 2D hand-drawn stickman animation; clean thin black outlines; large expressive heads; simple readable stickman proportions; flat warm colors; historically inspired ancient Alexandria; playful cinematic documentary-comedy tone; no 3D; no photorealism; no modern objects; no subtitles; no captions; no logos; no text inside the generated scene; 16:9. Two Roman legionaries clearly enter the Alexandrian street near the wedding district. They wear historically inspired Roman armor, helmets, red cloaks and carry shields and spears. They look tired and confused rather than cartoonishly evil. 2D stickman animation, exact Roman reference design, no text, 16:9. CAMERA: locked-off static camera on a tripod, eye-level medium-wide shot of the street; the soldiers walk into the frame. No camera movement of any kind: no tilt, no pan, no zoom, no push, no pull, no orbit, no tracking, no rising or overhead view. The framing stays identical from the first frame to the last frame; all movement comes from the characters. AUDIO (generate sound together with the picture): Off-screen male narrator voice-over, warm intelligent British documentary voice with dry comedic timing, the same voice in every clip, begins speaking within the first half second and says exactly: “And then Rome arrived. Tired, dusty, and looking for the right address.” The narrator is heard off-screen only; no character lip-syncs to the narrator. Music: music drops to low sustained tension with distant marching drums, almost silent. Sound effects: armor clank, dust, a tired sigh. No subtitles or captions.</w:t>
       </w:r>
     </w:p>
     <w:p>
@@ -2948,7 +2953,7 @@
     </w:p>
     <w:p>
       <w:r>
-        <w:t>Fast reaction beats.</w:t>
+        <w:t>Static, locked-off: eye-level medium-wide shot of the doorway with all three guests peeking in the same frame. No tilt, pan, zoom or orbit.</w:t>
       </w:r>
     </w:p>
     <w:p>
@@ -2974,7 +2979,7 @@
     </w:p>
     <w:p>
       <w:r>
-        <w:t>2D hand-drawn Stickman animation, clean thin black outlines, large expressive heads, simple readable stickman proportions, flat warm colors, historically inspired ancient Alexandria, playful cinematic documentary-comedy tone, 16:9, no 3D, no photorealism, no modern objects, no subtitles, no captions, no logos, no generated text, NO on-screen character dialogue (only the off-screen narrator speaks). Use the selected reference images as strict continuity anchors. Preserve faces, hair, clothing, colors, proportions and accessories exactly. Characters may move their bodies, arms, eyes and mouths for silent nonverbal acting only. VISUAL STYLE LOCK: 2D hand-drawn stickman animation; clean thin black outlines; large expressive heads; simple readable stickman proportions; flat warm colors; historically inspired ancient Alexandria; playful cinematic documentary-comedy tone; no 3D; no photorealism; no modern objects; no subtitles; no captions; no logos; no text inside the generated scene; 16:9. Several Egyptian wedding guests peek toward the entrance. One looks frightened, one confused, and one looks as if he thinks the armored newcomers might be performers. Keep reactions readable through body language. 2D stickman animation, no text, 16:9. Fast reaction beats between three faces. AUDIO (generate sound together with the picture): Off-screen male narrator voice-over, warm intelligent British documentary voice with dry comedic timing, the same voice in every clip, begins speaking within the first half second and says exactly: “The guests peeked out. One terrified. One confused. One assumed it was entertainment.” The narrator is heard off-screen only; no character lip-syncs to the narrator. Music: music nearly silent. Sound effects: murmurs, nervous cough. No subtitles or captions.</w:t>
+        <w:t>Locked-off static camera, no camera movement. 2D hand-drawn Stickman animation, clean thin black outlines, large expressive heads, simple readable stickman proportions, flat warm colors, historically inspired ancient Alexandria, playful cinematic documentary-comedy tone, 16:9, no 3D, no photorealism, no modern objects, no subtitles, no captions, no logos, no generated text, NO on-screen character dialogue (only the off-screen narrator speaks). Use the selected reference images as strict continuity anchors. Preserve faces, hair, clothing, colors, proportions and accessories exactly. Characters may move their bodies, arms, eyes and mouths for silent nonverbal acting only. VISUAL STYLE LOCK: 2D hand-drawn stickman animation; clean thin black outlines; large expressive heads; simple readable stickman proportions; flat warm colors; historically inspired ancient Alexandria; playful cinematic documentary-comedy tone; no 3D; no photorealism; no modern objects; no subtitles; no captions; no logos; no text inside the generated scene; 16:9. Several Egyptian wedding guests peek toward the entrance. One looks frightened, one confused, and one looks as if he thinks the armored newcomers might be performers. Keep reactions readable through body language. 2D stickman animation, no text, 16:9. CAMERA: locked-off static camera on a tripod, eye-level medium-wide shot of the doorway with all three guests peeking in the same frame. No camera movement of any kind: no tilt, no pan, no zoom, no push, no pull, no orbit, no tracking, no rising or overhead view. The framing stays identical from the first frame to the last frame; all movement comes from the characters. AUDIO (generate sound together with the picture): Off-screen male narrator voice-over, warm intelligent British documentary voice with dry comedic timing, the same voice in every clip, begins speaking within the first half second and says exactly: “The guests peeked out. One terrified. One confused. One assumed it was entertainment.” The narrator is heard off-screen only; no character lip-syncs to the narrator. Music: music nearly silent. Sound effects: murmurs, nervous cough. No subtitles or captions.</w:t>
       </w:r>
     </w:p>
     <w:p>
@@ -3063,7 +3068,7 @@
     </w:p>
     <w:p>
       <w:r>
-        <w:t>Track with him.</w:t>
+        <w:t>Static, locked-off: eye-level medium-wide shot; the uncle walks across the frame. No tilt, pan, zoom or orbit.</w:t>
       </w:r>
     </w:p>
     <w:p>
@@ -3089,7 +3094,7 @@
     </w:p>
     <w:p>
       <w:r>
-        <w:t>2D hand-drawn Stickman animation, clean thin black outlines, large expressive heads, simple readable stickman proportions, flat warm colors, historically inspired ancient Alexandria, playful cinematic documentary-comedy tone, 16:9, no 3D, no photorealism, no modern objects, no subtitles, no captions, no logos, no generated text, NO on-screen character dialogue (only the off-screen narrator speaks). Use the selected reference images as strict continuity anchors. Preserve faces, hair, clothing, colors, proportions and accessories exactly. Characters may move their bodies, arms, eyes and mouths for silent nonverbal acting only. VISUAL STYLE LOCK: 2D hand-drawn stickman animation; clean thin black outlines; large expressive heads; simple readable stickman proportions; flat warm colors; historically inspired ancient Alexandria; playful cinematic documentary-comedy tone; no 3D; no photorealism; no modern objects; no subtitles; no captions; no logos; no text inside the generated scene; 16:9. A cheerful older Egyptian relative grabs a traditional beer cup and confidently walks toward the Roman soldiers as if greeting ordinary wedding guests. He is friendly and slightly tipsy. 2D stickman animation, clean outlines, no text, 16:9. Tracking shot following him. AUDIO (generate sound together with the picture): Off-screen male narrator voice-over, warm intelligent British documentary voice with dry comedic timing, the same voice in every clip, begins speaking within the first half second and says exactly: “Then one uncle, a man with absolutely no fear, grabbed a beer.” The narrator is heard off-screen only; no character lip-syncs to the narrator. Music: playful comic percussion over the wedding rhythm, mixed low under the narrator. Sound effects: cup clink. No subtitles or captions.</w:t>
+        <w:t>Locked-off static camera, no camera movement. 2D hand-drawn Stickman animation, clean thin black outlines, large expressive heads, simple readable stickman proportions, flat warm colors, historically inspired ancient Alexandria, playful cinematic documentary-comedy tone, 16:9, no 3D, no photorealism, no modern objects, no subtitles, no captions, no logos, no generated text, NO on-screen character dialogue (only the off-screen narrator speaks). Use the selected reference images as strict continuity anchors. Preserve faces, hair, clothing, colors, proportions and accessories exactly. Characters may move their bodies, arms, eyes and mouths for silent nonverbal acting only. VISUAL STYLE LOCK: 2D hand-drawn stickman animation; clean thin black outlines; large expressive heads; simple readable stickman proportions; flat warm colors; historically inspired ancient Alexandria; playful cinematic documentary-comedy tone; no 3D; no photorealism; no modern objects; no subtitles; no captions; no logos; no text inside the generated scene; 16:9. A cheerful older Egyptian relative grabs a traditional beer cup and confidently walks toward the Roman soldiers as if greeting ordinary wedding guests. He is friendly and slightly tipsy. 2D stickman animation, clean outlines, no text, 16:9. CAMERA: locked-off static camera on a tripod, eye-level medium-wide shot; the uncle walks across the frame. No camera movement of any kind: no tilt, no pan, no zoom, no push, no pull, no orbit, no tracking, no rising or overhead view. The framing stays identical from the first frame to the last frame; all movement comes from the characters. AUDIO (generate sound together with the picture): Off-screen male narrator voice-over, warm intelligent British documentary voice with dry comedic timing, the same voice in every clip, begins speaking within the first half second and says exactly: “Then one uncle, a man with absolutely no fear, grabbed a beer.” The narrator is heard off-screen only; no character lip-syncs to the narrator. Music: playful comic percussion over the wedding rhythm, mixed low under the narrator. Sound effects: cup clink. No subtitles or captions.</w:t>
       </w:r>
     </w:p>
     <w:p>
@@ -3173,7 +3178,7 @@
     </w:p>
     <w:p>
       <w:r>
-        <w:t>Pause between offer and reaction.</w:t>
+        <w:t>Static, locked-off: eye-level medium two-shot. No tilt, pan, zoom or orbit.</w:t>
       </w:r>
     </w:p>
     <w:p>
@@ -3199,7 +3204,7 @@
     </w:p>
     <w:p>
       <w:r>
-        <w:t>2D hand-drawn Stickman animation, clean thin black outlines, large expressive heads, simple readable stickman proportions, flat warm colors, historically inspired ancient Alexandria, playful cinematic documentary-comedy tone, 16:9, no 3D, no photorealism, no modern objects, no subtitles, no captions, no logos, no generated text, NO on-screen character dialogue (only the off-screen narrator speaks). Use the selected reference images as strict continuity anchors. Preserve faces, hair, clothing, colors, proportions and accessories exactly. Characters may move their bodies, arms, eyes and mouths for silent nonverbal acting only. VISUAL STYLE LOCK: 2D hand-drawn stickman animation; clean thin black outlines; large expressive heads; simple readable stickman proportions; flat warm colors; historically inspired ancient Alexandria; playful cinematic documentary-comedy tone; no 3D; no photorealism; no modern objects; no subtitles; no captions; no logos; no text inside the generated scene; 16:9. The Egyptian relative extends the beer cup toward a Roman soldier. The Roman soldier stares at the cup, then looks at the man with complete confusion. Preserve both character designs. 2D stickman animation, comedic pause, no text, 16:9. Medium two-shot. AUDIO (generate sound together with the picture): Off-screen male narrator voice-over, warm intelligent British documentary voice with dry comedic timing, the same voice in every clip, begins speaking within the first half second and says exactly: “He offered it to a Roman. As if it were completely normal.” The narrator is heard off-screen only; no character lip-syncs to the narrator. Music: music nearly silent. Sound effects: cup clink, awkward silence. No subtitles or captions.</w:t>
+        <w:t>Locked-off static camera, no camera movement. 2D hand-drawn Stickman animation, clean thin black outlines, large expressive heads, simple readable stickman proportions, flat warm colors, historically inspired ancient Alexandria, playful cinematic documentary-comedy tone, 16:9, no 3D, no photorealism, no modern objects, no subtitles, no captions, no logos, no generated text, NO on-screen character dialogue (only the off-screen narrator speaks). Use the selected reference images as strict continuity anchors. Preserve faces, hair, clothing, colors, proportions and accessories exactly. Characters may move their bodies, arms, eyes and mouths for silent nonverbal acting only. VISUAL STYLE LOCK: 2D hand-drawn stickman animation; clean thin black outlines; large expressive heads; simple readable stickman proportions; flat warm colors; historically inspired ancient Alexandria; playful cinematic documentary-comedy tone; no 3D; no photorealism; no modern objects; no subtitles; no captions; no logos; no text inside the generated scene; 16:9. The Egyptian relative extends the beer cup toward a Roman soldier. The Roman soldier stares at the cup, then looks at the man with complete confusion. Preserve both character designs. 2D stickman animation, comedic pause, no text, 16:9. CAMERA: locked-off static camera on a tripod, eye-level medium two-shot. No camera movement of any kind: no tilt, no pan, no zoom, no push, no pull, no orbit, no tracking, no rising or overhead view. The framing stays identical from the first frame to the last frame; all movement comes from the characters. AUDIO (generate sound together with the picture): Off-screen male narrator voice-over, warm intelligent British documentary voice with dry comedic timing, the same voice in every clip, begins speaking within the first half second and says exactly: “He offered it to a Roman. As if it were completely normal.” The narrator is heard off-screen only; no character lip-syncs to the narrator. Music: music nearly silent. Sound effects: cup clink, awkward silence. No subtitles or captions.</w:t>
       </w:r>
     </w:p>
     <w:p>
@@ -3278,7 +3283,7 @@
     </w:p>
     <w:p>
       <w:r>
-        <w:t>Slow push on soldier.</w:t>
+        <w:t>Locked camera, extremely slow 5% push-in only: eye-level medium close-up of the soldier. No tilt, pan or orbit.</w:t>
       </w:r>
     </w:p>
     <w:p>
@@ -3304,7 +3309,7 @@
     </w:p>
     <w:p>
       <w:r>
-        <w:t>2D hand-drawn Stickman animation, clean thin black outlines, large expressive heads, simple readable stickman proportions, flat warm colors, historically inspired ancient Alexandria, playful cinematic documentary-comedy tone, 16:9, no 3D, no photorealism, no modern objects, no subtitles, no captions, no logos, no generated text, NO on-screen character dialogue (only the off-screen narrator speaks). Use the selected reference images as strict continuity anchors. Preserve faces, hair, clothing, colors, proportions and accessories exactly. Characters may move their bodies, arms, eyes and mouths for silent nonverbal acting only. VISUAL STYLE LOCK: 2D hand-drawn stickman animation; clean thin black outlines; large expressive heads; simple readable stickman proportions; flat warm colors; historically inspired ancient Alexandria; playful cinematic documentary-comedy tone; no 3D; no photorealism; no modern objects; no subtitles; no captions; no logos; no text inside the generated scene; 16:9. Close-up of the Roman soldier's confused face as he looks from the beer cup to the smiling Egyptian relative. Keep the helmet, face and armor consistent with the Roman reference. 2D stickman animation, no text, 16:9. Slow comedic push-in. AUDIO (generate sound together with the picture): Off-screen male narrator voice-over, warm intelligent British documentary voice with dry comedic timing, the same voice in every clip, begins speaking within the first half second and says exactly: “The soldier stared at the cup, then the uncle. A trap? Or hospitality?” The narrator is heard off-screen only; no character lip-syncs to the narrator. Music: music nearly silent. Sound effects: tiny gulp, uneasy hum. No subtitles or captions.</w:t>
+        <w:t>Locked camera, only an extremely slow subtle push-in. 2D hand-drawn Stickman animation, clean thin black outlines, large expressive heads, simple readable stickman proportions, flat warm colors, historically inspired ancient Alexandria, playful cinematic documentary-comedy tone, 16:9, no 3D, no photorealism, no modern objects, no subtitles, no captions, no logos, no generated text, NO on-screen character dialogue (only the off-screen narrator speaks). Use the selected reference images as strict continuity anchors. Preserve faces, hair, clothing, colors, proportions and accessories exactly. Characters may move their bodies, arms, eyes and mouths for silent nonverbal acting only. VISUAL STYLE LOCK: 2D hand-drawn stickman animation; clean thin black outlines; large expressive heads; simple readable stickman proportions; flat warm colors; historically inspired ancient Alexandria; playful cinematic documentary-comedy tone; no 3D; no photorealism; no modern objects; no subtitles; no captions; no logos; no text inside the generated scene; 16:9. Close-up of the Roman soldier's confused face as he looks from the beer cup to the smiling Egyptian relative. Keep the helmet, face and armor consistent with the Roman reference. 2D stickman animation, no text, 16:9. CAMERA: eye-level medium close-up of the soldier. Locked camera with only an extremely slow, subtle push-in (about 5%) over the whole clip. No tilt, no pan, no orbit, no rising or overhead view; the subject stays in the same position in the frame. AUDIO (generate sound together with the picture): Off-screen male narrator voice-over, warm intelligent British documentary voice with dry comedic timing, the same voice in every clip, begins speaking within the first half second and says exactly: “The soldier stared at the cup, then the uncle. A trap? Or hospitality?” The narrator is heard off-screen only; no character lip-syncs to the narrator. Music: music nearly silent. Sound effects: tiny gulp, uneasy hum. No subtitles or captions.</w:t>
       </w:r>
     </w:p>
     <w:p>
@@ -3393,7 +3398,7 @@
     </w:p>
     <w:p>
       <w:r>
-        <w:t>Pan from faces to feast.</w:t>
+        <w:t>Static, locked-off: eye-level wide-medium shot: the soldiers in the foreground, the feast table behind them; they turn their heads toward it. No tilt, pan, zoom or orbit.</w:t>
       </w:r>
     </w:p>
     <w:p>
@@ -3419,7 +3424,7 @@
     </w:p>
     <w:p>
       <w:r>
-        <w:t>2D hand-drawn Stickman animation, clean thin black outlines, large expressive heads, simple readable stickman proportions, flat warm colors, historically inspired ancient Alexandria, playful cinematic documentary-comedy tone, 16:9, no 3D, no photorealism, no modern objects, no subtitles, no captions, no logos, no generated text, NO on-screen character dialogue (only the off-screen narrator speaks). Use the selected reference images as strict continuity anchors. Preserve faces, hair, clothing, colors, proportions and accessories exactly. Characters may move their bodies, arms, eyes and mouths for silent nonverbal acting only. VISUAL STYLE LOCK: 2D hand-drawn stickman animation; clean thin black outlines; large expressive heads; simple readable stickman proportions; flat warm colors; historically inspired ancient Alexandria; playful cinematic documentary-comedy tone; no 3D; no photorealism; no modern objects; no subtitles; no captions; no logos; no text inside the generated scene; 16:9. The Roman soldiers notice the wedding feast. Their serious expressions soften as they look toward roasted food, bread and fruit. One soldier subtly leans toward the feast with obvious interest. 2D stickman animation, no text, 16:9. Pan from their faces to the feast. AUDIO (generate sound together with the picture): Off-screen male narrator voice-over, warm intelligent British documentary voice with dry comedic timing, the same voice in every clip, begins speaking within the first half second and says exactly: “Then the Romans saw the food. Military discipline lasted about four seconds.” The narrator is heard off-screen only; no character lip-syncs to the narrator. Music: playful comic percussion over the wedding rhythm, mixed low under the narrator. Sound effects: stomach growl, sniff. No subtitles or captions.</w:t>
+        <w:t>Locked-off static camera, no camera movement. 2D hand-drawn Stickman animation, clean thin black outlines, large expressive heads, simple readable stickman proportions, flat warm colors, historically inspired ancient Alexandria, playful cinematic documentary-comedy tone, 16:9, no 3D, no photorealism, no modern objects, no subtitles, no captions, no logos, no generated text, NO on-screen character dialogue (only the off-screen narrator speaks). Use the selected reference images as strict continuity anchors. Preserve faces, hair, clothing, colors, proportions and accessories exactly. Characters may move their bodies, arms, eyes and mouths for silent nonverbal acting only. VISUAL STYLE LOCK: 2D hand-drawn stickman animation; clean thin black outlines; large expressive heads; simple readable stickman proportions; flat warm colors; historically inspired ancient Alexandria; playful cinematic documentary-comedy tone; no 3D; no photorealism; no modern objects; no subtitles; no captions; no logos; no text inside the generated scene; 16:9. The Roman soldiers notice the wedding feast. Their serious expressions soften as they look toward roasted food, bread and fruit. One soldier subtly leans toward the feast with obvious interest. 2D stickman animation, no text, 16:9. CAMERA: locked-off static camera on a tripod, eye-level wide-medium shot: the soldiers in the foreground, the feast table behind them; they turn their heads toward it. No camera movement of any kind: no tilt, no pan, no zoom, no push, no pull, no orbit, no tracking, no rising or overhead view. The framing stays identical from the first frame to the last frame; all movement comes from the characters. AUDIO (generate sound together with the picture): Off-screen male narrator voice-over, warm intelligent British documentary voice with dry comedic timing, the same voice in every clip, begins speaking within the first half second and says exactly: “Then the Romans saw the food. Military discipline lasted about four seconds.” The narrator is heard off-screen only; no character lip-syncs to the narrator. Music: playful comic percussion over the wedding rhythm, mixed low under the narrator. Sound effects: stomach growl, sniff. No subtitles or captions.</w:t>
       </w:r>
     </w:p>
     <w:p>
@@ -3508,7 +3513,7 @@
     </w:p>
     <w:p>
       <w:r>
-        <w:t>Wide shot.</w:t>
+        <w:t>Static, locked-off: eye-level wide shot. No tilt, pan, zoom or orbit.</w:t>
       </w:r>
     </w:p>
     <w:p>
@@ -3534,7 +3539,7 @@
     </w:p>
     <w:p>
       <w:r>
-        <w:t>2D hand-drawn Stickman animation, clean thin black outlines, large expressive heads, simple readable stickman proportions, flat warm colors, historically inspired ancient Alexandria, playful cinematic documentary-comedy tone, 16:9, no 3D, no photorealism, no modern objects, no subtitles, no captions, no logos, no generated text, NO on-screen character dialogue (only the off-screen narrator speaks). Use the selected reference images as strict continuity anchors. Preserve faces, hair, clothing, colors, proportions and accessories exactly. Characters may move their bodies, arms, eyes and mouths for silent nonverbal acting only. VISUAL STYLE LOCK: 2D hand-drawn stickman animation; clean thin black outlines; large expressive heads; simple readable stickman proportions; flat warm colors; historically inspired ancient Alexandria; playful cinematic documentary-comedy tone; no 3D; no photorealism; no modern objects; no subtitles; no captions; no logos; no text inside the generated scene; 16:9. One Roman soldier awkwardly steps into the edge of the Egyptian dance. The Egyptians stare, then one guest copies the soldier's stiff movement. The mood changes from tension to absurd comedy. 2D stickman animation, clean thin lines, no text, 16:9. Wide shot with readable movement. AUDIO (generate sound together with the picture): Off-screen male narrator voice-over, warm intelligent British documentary voice with dry comedic timing, the same voice in every clip, begins speaking within the first half second and says exactly: “One soldier stepped into the dance. Nobody stopped him. Somehow, it worked.” The narrator is heard off-screen only; no character lip-syncs to the narrator. Music: playful comic percussion over the wedding rhythm, mixed low under the narrator. Sound effects: shield tap blending into the rhythm, clapping. No subtitles or captions.</w:t>
+        <w:t>Locked-off static camera, no camera movement. 2D hand-drawn Stickman animation, clean thin black outlines, large expressive heads, simple readable stickman proportions, flat warm colors, historically inspired ancient Alexandria, playful cinematic documentary-comedy tone, 16:9, no 3D, no photorealism, no modern objects, no subtitles, no captions, no logos, no generated text, NO on-screen character dialogue (only the off-screen narrator speaks). Use the selected reference images as strict continuity anchors. Preserve faces, hair, clothing, colors, proportions and accessories exactly. Characters may move their bodies, arms, eyes and mouths for silent nonverbal acting only. VISUAL STYLE LOCK: 2D hand-drawn stickman animation; clean thin black outlines; large expressive heads; simple readable stickman proportions; flat warm colors; historically inspired ancient Alexandria; playful cinematic documentary-comedy tone; no 3D; no photorealism; no modern objects; no subtitles; no captions; no logos; no text inside the generated scene; 16:9. One Roman soldier awkwardly steps into the edge of the Egyptian dance. The Egyptians stare, then one guest copies the soldier's stiff movement. The mood changes from tension to absurd comedy. 2D stickman animation, clean thin lines, no text, 16:9. CAMERA: locked-off static camera on a tripod, eye-level wide shot. No camera movement of any kind: no tilt, no pan, no zoom, no push, no pull, no orbit, no tracking, no rising or overhead view. The framing stays identical from the first frame to the last frame; all movement comes from the characters. AUDIO (generate sound together with the picture): Off-screen male narrator voice-over, warm intelligent British documentary voice with dry comedic timing, the same voice in every clip, begins speaking within the first half second and says exactly: “One soldier stepped into the dance. Nobody stopped him. Somehow, it worked.” The narrator is heard off-screen only; no character lip-syncs to the narrator. Music: playful comic percussion over the wedding rhythm, mixed low under the narrator. Sound effects: shield tap blending into the rhythm, clapping. No subtitles or captions.</w:t>
       </w:r>
     </w:p>
     <w:p>
@@ -3623,7 +3628,7 @@
     </w:p>
     <w:p>
       <w:r>
-        <w:t>Side tracking shot.</w:t>
+        <w:t>Static, locked-off: eye-level wide shot of the dancing Romans. No tilt, pan, zoom or orbit.</w:t>
       </w:r>
     </w:p>
     <w:p>
@@ -3649,7 +3654,7 @@
     </w:p>
     <w:p>
       <w:r>
-        <w:t>2D hand-drawn Stickman animation, clean thin black outlines, large expressive heads, simple readable stickman proportions, flat warm colors, historically inspired ancient Alexandria, playful cinematic documentary-comedy tone, 16:9, no 3D, no photorealism, no modern objects, no subtitles, no captions, no logos, no generated text, NO on-screen character dialogue (only the off-screen narrator speaks). Use the selected reference images as strict continuity anchors. Preserve faces, hair, clothing, colors, proportions and accessories exactly. Characters may move their bodies, arms, eyes and mouths for silent nonverbal acting only. VISUAL STYLE LOCK: 2D hand-drawn stickman animation; clean thin black outlines; large expressive heads; simple readable stickman proportions; flat warm colors; historically inspired ancient Alexandria; playful cinematic documentary-comedy tone; no 3D; no photorealism; no modern objects; no subtitles; no captions; no logos; no text inside the generated scene; 16:9. Several Roman soldiers attempt the Egyptian wedding dance while wearing heavy armor. Their movements are stiff, synchronized and unintentionally hilarious. Egyptian dancers continue beside them. Preserve Roman armor design. 2D stickman animation, no text, 16:9. Side tracking shot. AUDIO (generate sound together with the picture): Off-screen male narrator voice-over, warm intelligent British documentary voice with dry comedic timing, the same voice in every clip, begins speaking within the first half second and says exactly: “Roman engineering changed the world. Roman dancing did not.” The narrator is heard off-screen only; no character lip-syncs to the narrator. Music: playful comic percussion over the wedding rhythm, mixed low under the narrator. Sound effects: armor clanking out of rhythm. No subtitles or captions.</w:t>
+        <w:t>Locked-off static camera, no camera movement. 2D hand-drawn Stickman animation, clean thin black outlines, large expressive heads, simple readable stickman proportions, flat warm colors, historically inspired ancient Alexandria, playful cinematic documentary-comedy tone, 16:9, no 3D, no photorealism, no modern objects, no subtitles, no captions, no logos, no generated text, NO on-screen character dialogue (only the off-screen narrator speaks). Use the selected reference images as strict continuity anchors. Preserve faces, hair, clothing, colors, proportions and accessories exactly. Characters may move their bodies, arms, eyes and mouths for silent nonverbal acting only. VISUAL STYLE LOCK: 2D hand-drawn stickman animation; clean thin black outlines; large expressive heads; simple readable stickman proportions; flat warm colors; historically inspired ancient Alexandria; playful cinematic documentary-comedy tone; no 3D; no photorealism; no modern objects; no subtitles; no captions; no logos; no text inside the generated scene; 16:9. Several Roman soldiers attempt the Egyptian wedding dance while wearing heavy armor. Their movements are stiff, synchronized and unintentionally hilarious. Egyptian dancers continue beside them. Preserve Roman armor design. 2D stickman animation, no text, 16:9. CAMERA: locked-off static camera on a tripod, eye-level wide shot of the dancing Romans. No camera movement of any kind: no tilt, no pan, no zoom, no push, no pull, no orbit, no tracking, no rising or overhead view. The framing stays identical from the first frame to the last frame; all movement comes from the characters. AUDIO (generate sound together with the picture): Off-screen male narrator voice-over, warm intelligent British documentary voice with dry comedic timing, the same voice in every clip, begins speaking within the first half second and says exactly: “Roman engineering changed the world. Roman dancing did not.” The narrator is heard off-screen only; no character lip-syncs to the narrator. Music: playful comic percussion over the wedding rhythm, mixed low under the narrator. Sound effects: armor clanking out of rhythm. No subtitles or captions.</w:t>
       </w:r>
     </w:p>
     <w:p>
@@ -3738,7 +3743,7 @@
     </w:p>
     <w:p>
       <w:r>
-        <w:t>Medium two-shot.</w:t>
+        <w:t>Static, locked-off: eye-level medium two-shot. No tilt, pan, zoom or orbit.</w:t>
       </w:r>
     </w:p>
     <w:p>
@@ -3764,7 +3769,7 @@
     </w:p>
     <w:p>
       <w:r>
-        <w:t>2D hand-drawn Stickman animation, clean thin black outlines, large expressive heads, simple readable stickman proportions, flat warm colors, historically inspired ancient Alexandria, playful cinematic documentary-comedy tone, 16:9, no 3D, no photorealism, no modern objects, no subtitles, no captions, no logos, no generated text, NO on-screen character dialogue (only the off-screen narrator speaks). Use the selected reference images as strict continuity anchors. Preserve faces, hair, clothing, colors, proportions and accessories exactly. Characters may move their bodies, arms, eyes and mouths for silent nonverbal acting only. VISUAL STYLE LOCK: 2D hand-drawn stickman animation; clean thin black outlines; large expressive heads; simple readable stickman proportions; flat warm colors; historically inspired ancient Alexandria; playful cinematic documentary-comedy tone; no 3D; no photorealism; no modern objects; no subtitles; no captions; no logos; no text inside the generated scene; 16:9. Senbi proudly dances beside a Roman soldier and gestures for him to follow the Egyptian dance steps. The Roman tries to imitate him. Preserve exact Senbi and Roman designs. 2D stickman animation, no text, 16:9. Medium two-shot with playful movement. AUDIO (generate sound together with the picture): Off-screen male narrator voice-over, warm intelligent British documentary voice with dry comedic timing, the same voice in every clip, begins speaking within the first half second and says exactly: “Senbi, ever the host, invited one to join. Of course he did.” The narrator is heard off-screen only; no character lip-syncs to the narrator. Music: playful comic percussion over the wedding rhythm, mixed low under the narrator. Sound effects: laughter, hand claps. No subtitles or captions.</w:t>
+        <w:t>Locked-off static camera, no camera movement. 2D hand-drawn Stickman animation, clean thin black outlines, large expressive heads, simple readable stickman proportions, flat warm colors, historically inspired ancient Alexandria, playful cinematic documentary-comedy tone, 16:9, no 3D, no photorealism, no modern objects, no subtitles, no captions, no logos, no generated text, NO on-screen character dialogue (only the off-screen narrator speaks). Use the selected reference images as strict continuity anchors. Preserve faces, hair, clothing, colors, proportions and accessories exactly. Characters may move their bodies, arms, eyes and mouths for silent nonverbal acting only. VISUAL STYLE LOCK: 2D hand-drawn stickman animation; clean thin black outlines; large expressive heads; simple readable stickman proportions; flat warm colors; historically inspired ancient Alexandria; playful cinematic documentary-comedy tone; no 3D; no photorealism; no modern objects; no subtitles; no captions; no logos; no text inside the generated scene; 16:9. Senbi proudly dances beside a Roman soldier and gestures for him to follow the Egyptian dance steps. The Roman tries to imitate him. Preserve exact Senbi and Roman designs. 2D stickman animation, no text, 16:9. CAMERA: locked-off static camera on a tripod, eye-level medium two-shot. No camera movement of any kind: no tilt, no pan, no zoom, no push, no pull, no orbit, no tracking, no rising or overhead view. The framing stays identical from the first frame to the last frame; all movement comes from the characters. AUDIO (generate sound together with the picture): Off-screen male narrator voice-over, warm intelligent British documentary voice with dry comedic timing, the same voice in every clip, begins speaking within the first half second and says exactly: “Senbi, ever the host, invited one to join. Of course he did.” The narrator is heard off-screen only; no character lip-syncs to the narrator. Music: playful comic percussion over the wedding rhythm, mixed low under the narrator. Sound effects: laughter, hand claps. No subtitles or captions.</w:t>
       </w:r>
     </w:p>
     <w:p>
@@ -3853,7 +3858,7 @@
     </w:p>
     <w:p>
       <w:r>
-        <w:t>Slow comedic zoom.</w:t>
+        <w:t>Static, locked-off: eye-level medium close-up of the bride. No tilt, pan, zoom or orbit.</w:t>
       </w:r>
     </w:p>
     <w:p>
@@ -3879,7 +3884,7 @@
     </w:p>
     <w:p>
       <w:r>
-        <w:t>2D hand-drawn Stickman animation, clean thin black outlines, large expressive heads, simple readable stickman proportions, flat warm colors, historically inspired ancient Alexandria, playful cinematic documentary-comedy tone, 16:9, no 3D, no photorealism, no modern objects, no subtitles, no captions, no logos, no generated text, NO on-screen character dialogue (only the off-screen narrator speaks). Use the selected reference images as strict continuity anchors. Preserve faces, hair, clothing, colors, proportions and accessories exactly. Characters may move their bodies, arms, eyes and mouths for silent nonverbal acting only. VISUAL STYLE LOCK: 2D hand-drawn stickman animation; clean thin black outlines; large expressive heads; simple readable stickman proportions; flat warm colors; historically inspired ancient Alexandria; playful cinematic documentary-comedy tone; no 3D; no photorealism; no modern objects; no subtitles; no captions; no logos; no text inside the generated scene; 16:9. The bride watches Senbi happily dancing with Roman soldiers. She slowly raises a hand to her face in disbelief, then looks toward the chaos. 2D stickman animation, clean expressive body language, no text, 16:9. Slow comedic zoom. AUDIO (generate sound together with the picture): Off-screen male narrator voice-over, warm intelligent British documentary voice with dry comedic timing, the same voice in every clip, begins speaking within the first half second and says exactly: “His bride slowly covered her face. This was not in the contract.” The narrator is heard off-screen only; no character lip-syncs to the narrator. Music: playful comic percussion over the wedding rhythm, mixed low under the narrator. Sound effects: gasp, muffled laugh. No subtitles or captions.</w:t>
+        <w:t>Locked-off static camera, no camera movement. 2D hand-drawn Stickman animation, clean thin black outlines, large expressive heads, simple readable stickman proportions, flat warm colors, historically inspired ancient Alexandria, playful cinematic documentary-comedy tone, 16:9, no 3D, no photorealism, no modern objects, no subtitles, no captions, no logos, no generated text, NO on-screen character dialogue (only the off-screen narrator speaks). Use the selected reference images as strict continuity anchors. Preserve faces, hair, clothing, colors, proportions and accessories exactly. Characters may move their bodies, arms, eyes and mouths for silent nonverbal acting only. VISUAL STYLE LOCK: 2D hand-drawn stickman animation; clean thin black outlines; large expressive heads; simple readable stickman proportions; flat warm colors; historically inspired ancient Alexandria; playful cinematic documentary-comedy tone; no 3D; no photorealism; no modern objects; no subtitles; no captions; no logos; no text inside the generated scene; 16:9. The bride watches Senbi happily dancing with Roman soldiers. She slowly raises a hand to her face in disbelief, then looks toward the chaos. 2D stickman animation, clean expressive body language, no text, 16:9. CAMERA: locked-off static camera on a tripod, eye-level medium close-up of the bride. No camera movement of any kind: no tilt, no pan, no zoom, no push, no pull, no orbit, no tracking, no rising or overhead view. The framing stays identical from the first frame to the last frame; all movement comes from the characters. AUDIO (generate sound together with the picture): Off-screen male narrator voice-over, warm intelligent British documentary voice with dry comedic timing, the same voice in every clip, begins speaking within the first half second and says exactly: “His bride slowly covered her face. This was not in the contract.” The narrator is heard off-screen only; no character lip-syncs to the narrator. Music: playful comic percussion over the wedding rhythm, mixed low under the narrator. Sound effects: gasp, muffled laugh. No subtitles or captions.</w:t>
       </w:r>
     </w:p>
     <w:p>
@@ -3978,7 +3983,7 @@
     </w:p>
     <w:p>
       <w:r>
-        <w:t>Fast but readable wide move.</w:t>
+        <w:t>Static, locked-off: eye-level wide shot of the whole courtyard. No tilt, pan, zoom or orbit.</w:t>
       </w:r>
     </w:p>
     <w:p>
@@ -4004,7 +4009,7 @@
     </w:p>
     <w:p>
       <w:r>
-        <w:t>2D hand-drawn Stickman animation, clean thin black outlines, large expressive heads, simple readable stickman proportions, flat warm colors, historically inspired ancient Alexandria, playful cinematic documentary-comedy tone, 16:9, no 3D, no photorealism, no modern objects, no subtitles, no captions, no logos, no generated text, NO on-screen character dialogue (only the off-screen narrator speaks). Use the selected reference images as strict continuity anchors. Preserve faces, hair, clothing, colors, proportions and accessories exactly. Characters may move their bodies, arms, eyes and mouths for silent nonverbal acting only. VISUAL STYLE LOCK: 2D hand-drawn stickman animation; clean thin black outlines; large expressive heads; simple readable stickman proportions; flat warm colors; historically inspired ancient Alexandria; playful cinematic documentary-comedy tone; no 3D; no photorealism; no modern objects; no subtitles; no captions; no logos; no text inside the generated scene; 16:9. Wide wedding courtyard filled with controlled comedic chaos: Egyptians and Romans dance together, musicians struggle to keep the rhythm, food is passed around, Senbi is delighted and the bride looks overwhelmed. 2D stickman animation, clean thin lines, warm colors, no text, 16:9. Energetic but readable wide camera movement. AUDIO (generate sound together with the picture): Off-screen male narrator voice-over, warm intelligent British documentary voice with dry comedic timing, the same voice in every clip, begins speaking within the first half second and says exactly: “Soon, Egyptians and Romans were passing food and stepping on each other's feet.” The narrator is heard off-screen only; no character lip-syncs to the narrator. Music: playful comic percussion over the wedding rhythm, mixed low under the narrator. Sound effects: laughter, plates, music chaos. No subtitles or captions.</w:t>
+        <w:t>Locked-off static camera, no camera movement. 2D hand-drawn Stickman animation, clean thin black outlines, large expressive heads, simple readable stickman proportions, flat warm colors, historically inspired ancient Alexandria, playful cinematic documentary-comedy tone, 16:9, no 3D, no photorealism, no modern objects, no subtitles, no captions, no logos, no generated text, NO on-screen character dialogue (only the off-screen narrator speaks). Use the selected reference images as strict continuity anchors. Preserve faces, hair, clothing, colors, proportions and accessories exactly. Characters may move their bodies, arms, eyes and mouths for silent nonverbal acting only. VISUAL STYLE LOCK: 2D hand-drawn stickman animation; clean thin black outlines; large expressive heads; simple readable stickman proportions; flat warm colors; historically inspired ancient Alexandria; playful cinematic documentary-comedy tone; no 3D; no photorealism; no modern objects; no subtitles; no captions; no logos; no text inside the generated scene; 16:9. Wide wedding courtyard filled with controlled comedic chaos: Egyptians and Romans dance together, musicians struggle to keep the rhythm, food is passed around, Senbi is delighted and the bride looks overwhelmed. 2D stickman animation, clean thin lines, warm colors, no text, 16:9. CAMERA: locked-off static camera on a tripod, eye-level wide shot of the whole courtyard. No camera movement of any kind: no tilt, no pan, no zoom, no push, no pull, no orbit, no tracking, no rising or overhead view. The framing stays identical from the first frame to the last frame; all movement comes from the characters. AUDIO (generate sound together with the picture): Off-screen male narrator voice-over, warm intelligent British documentary voice with dry comedic timing, the same voice in every clip, begins speaking within the first half second and says exactly: “Soon, Egyptians and Romans were passing food and stepping on each other's feet.” The narrator is heard off-screen only; no character lip-syncs to the narrator. Music: playful comic percussion over the wedding rhythm, mixed low under the narrator. Sound effects: laughter, plates, music chaos. No subtitles or captions.</w:t>
       </w:r>
     </w:p>
     <w:p>
@@ -4093,7 +4098,7 @@
     </w:p>
     <w:p>
       <w:r>
-        <w:t>Hard stop.</w:t>
+        <w:t>Static, locked-off: eye-level wide shot. No tilt, pan, zoom or orbit.</w:t>
       </w:r>
     </w:p>
     <w:p>
@@ -4119,7 +4124,7 @@
     </w:p>
     <w:p>
       <w:r>
-        <w:t>2D hand-drawn Stickman animation, clean thin black outlines, large expressive heads, simple readable stickman proportions, flat warm colors, historically inspired ancient Alexandria, playful cinematic documentary-comedy tone, 16:9, no 3D, no photorealism, no modern objects, no subtitles, no captions, no logos, no generated text, NO on-screen character dialogue (only the off-screen narrator speaks). Use the selected reference images as strict continuity anchors. Preserve faces, hair, clothing, colors, proportions and accessories exactly. Characters may move their bodies, arms, eyes and mouths for silent nonverbal acting only. VISUAL STYLE LOCK: 2D hand-drawn stickman animation; clean thin black outlines; large expressive heads; simple readable stickman proportions; flat warm colors; historically inspired ancient Alexandria; playful cinematic documentary-comedy tone; no 3D; no photorealism; no modern objects; no subtitles; no captions; no logos; no text inside the generated scene; 16:9. A sudden authoritative Roman military signal stops the wedding music. Everyone freezes mid-dance: Egyptians, Romans, Senbi and bride. 2D stickman animation, dramatic comedic freeze, no text, 16:9. Hard stop with a quick camera lock. AUDIO (generate sound together with the picture): Off-screen male narrator voice-over, warm intelligent British documentary voice with dry comedic timing, the same voice in every clip, begins speaking within the first half second and says exactly: “Then a horn cut through the music, and everyone froze mid-step.” The narrator is heard off-screen only; no character lip-syncs to the narrator. Music: music nearly silent. Sound effects: sharp military horn, then silence. No subtitles or captions.</w:t>
+        <w:t>Locked-off static camera, no camera movement. 2D hand-drawn Stickman animation, clean thin black outlines, large expressive heads, simple readable stickman proportions, flat warm colors, historically inspired ancient Alexandria, playful cinematic documentary-comedy tone, 16:9, no 3D, no photorealism, no modern objects, no subtitles, no captions, no logos, no generated text, NO on-screen character dialogue (only the off-screen narrator speaks). Use the selected reference images as strict continuity anchors. Preserve faces, hair, clothing, colors, proportions and accessories exactly. Characters may move their bodies, arms, eyes and mouths for silent nonverbal acting only. VISUAL STYLE LOCK: 2D hand-drawn stickman animation; clean thin black outlines; large expressive heads; simple readable stickman proportions; flat warm colors; historically inspired ancient Alexandria; playful cinematic documentary-comedy tone; no 3D; no photorealism; no modern objects; no subtitles; no captions; no logos; no text inside the generated scene; 16:9. A sudden authoritative Roman military signal stops the wedding music. Everyone freezes mid-dance: Egyptians, Romans, Senbi and bride. 2D stickman animation, dramatic comedic freeze, no text, 16:9. CAMERA: locked-off static camera on a tripod, eye-level wide shot. No camera movement of any kind: no tilt, no pan, no zoom, no push, no pull, no orbit, no tracking, no rising or overhead view. The framing stays identical from the first frame to the last frame; all movement comes from the characters. AUDIO (generate sound together with the picture): Off-screen male narrator voice-over, warm intelligent British documentary voice with dry comedic timing, the same voice in every clip, begins speaking within the first half second and says exactly: “Then a horn cut through the music, and everyone froze mid-step.” The narrator is heard off-screen only; no character lip-syncs to the narrator. Music: music nearly silent. Sound effects: sharp military horn, then silence. No subtitles or captions.</w:t>
       </w:r>
     </w:p>
     <w:p>
@@ -4208,7 +4213,7 @@
     </w:p>
     <w:p>
       <w:r>
-        <w:t>Low-angle entrance.</w:t>
+        <w:t>Static, locked-off: fixed, slightly low angle that never tilts, on the commander walking in. No tilt, pan, zoom or orbit.</w:t>
       </w:r>
     </w:p>
     <w:p>
@@ -4234,7 +4239,7 @@
     </w:p>
     <w:p>
       <w:r>
-        <w:t>2D hand-drawn Stickman animation, clean thin black outlines, large expressive heads, simple readable stickman proportions, flat warm colors, historically inspired ancient Alexandria, playful cinematic documentary-comedy tone, 16:9, no 3D, no photorealism, no modern objects, no subtitles, no captions, no logos, no generated text, NO on-screen character dialogue (only the off-screen narrator speaks). Use the selected reference images as strict continuity anchors. Preserve faces, hair, clothing, colors, proportions and accessories exactly. Characters may move their bodies, arms, eyes and mouths for silent nonverbal acting only. VISUAL STYLE LOCK: 2D hand-drawn stickman animation; clean thin black outlines; large expressive heads; simple readable stickman proportions; flat warm colors; historically inspired ancient Alexandria; playful cinematic documentary-comedy tone; no 3D; no photorealism; no modern objects; no subtitles; no captions; no logos; no text inside the generated scene; 16:9. Roman commander enters the wedding courtyard calmly holding a scroll. The soldiers part to let him through. Everyone becomes silent. Preserve exact commander armor, red cloak, laurel crown and facial design. 2D stickman animation, no text, 16:9. Low-angle controlled entrance. AUDIO (generate sound together with the picture): Off-screen male narrator voice-over, warm intelligent British documentary voice with dry comedic timing, the same voice in every clip, begins speaking within the first half second and says exactly: “And in walked the commander. The only adult in the building.” The narrator is heard off-screen only; no character lip-syncs to the narrator. Music: music drops to low sustained tension with distant marching drums, almost silent. Sound effects: slow footsteps, cloak rustle. No subtitles or captions.</w:t>
+        <w:t>Locked-off static camera, no camera movement. 2D hand-drawn Stickman animation, clean thin black outlines, large expressive heads, simple readable stickman proportions, flat warm colors, historically inspired ancient Alexandria, playful cinematic documentary-comedy tone, 16:9, no 3D, no photorealism, no modern objects, no subtitles, no captions, no logos, no generated text, NO on-screen character dialogue (only the off-screen narrator speaks). Use the selected reference images as strict continuity anchors. Preserve faces, hair, clothing, colors, proportions and accessories exactly. Characters may move their bodies, arms, eyes and mouths for silent nonverbal acting only. VISUAL STYLE LOCK: 2D hand-drawn stickman animation; clean thin black outlines; large expressive heads; simple readable stickman proportions; flat warm colors; historically inspired ancient Alexandria; playful cinematic documentary-comedy tone; no 3D; no photorealism; no modern objects; no subtitles; no captions; no logos; no text inside the generated scene; 16:9. Roman commander enters the wedding courtyard calmly holding a scroll. The soldiers part to let him through. Everyone becomes silent. Preserve exact commander armor, red cloak, laurel crown and facial design. 2D stickman animation, no text, 16:9. CAMERA: locked-off static camera on a tripod, fixed, slightly low angle that never tilts, on the commander walking in. No camera movement of any kind: no tilt, no pan, no zoom, no push, no pull, no orbit, no tracking, no rising or overhead view. The framing stays identical from the first frame to the last frame; all movement comes from the characters. AUDIO (generate sound together with the picture): Off-screen male narrator voice-over, warm intelligent British documentary voice with dry comedic timing, the same voice in every clip, begins speaking within the first half second and says exactly: “And in walked the commander. The only adult in the building.” The narrator is heard off-screen only; no character lip-syncs to the narrator. Music: music drops to low sustained tension with distant marching drums, almost silent. Sound effects: slow footsteps, cloak rustle. No subtitles or captions.</w:t>
       </w:r>
     </w:p>
     <w:p>
@@ -4333,7 +4338,7 @@
     </w:p>
     <w:p>
       <w:r>
-        <w:t>Slow pan following gaze.</w:t>
+        <w:t>Static, locked-off: eye-level medium shot of the commander; he turns his head, the camera does not pan. No tilt, pan, zoom or orbit.</w:t>
       </w:r>
     </w:p>
     <w:p>
@@ -4359,7 +4364,7 @@
     </w:p>
     <w:p>
       <w:r>
-        <w:t>2D hand-drawn Stickman animation, clean thin black outlines, large expressive heads, simple readable stickman proportions, flat warm colors, historically inspired ancient Alexandria, playful cinematic documentary-comedy tone, 16:9, no 3D, no photorealism, no modern objects, no subtitles, no captions, no logos, no generated text, NO on-screen character dialogue (only the off-screen narrator speaks). Use the selected reference images as strict continuity anchors. Preserve faces, hair, clothing, colors, proportions and accessories exactly. Characters may move their bodies, arms, eyes and mouths for silent nonverbal acting only. VISUAL STYLE LOCK: 2D hand-drawn stickman animation; clean thin black outlines; large expressive heads; simple readable stickman proportions; flat warm colors; historically inspired ancient Alexandria; playful cinematic documentary-comedy tone; no 3D; no photorealism; no modern objects; no subtitles; no captions; no logos; no text inside the generated scene; 16:9. The Roman commander slowly scans the room: first the soldiers, then the food, then the bride and groom, then the wedding decorations. He remains completely serious while the absurd party surrounds him. 2D stickman animation, no text, 16:9. Slow pan following his gaze. AUDIO (generate sound together with the picture): Off-screen male narrator voice-over, warm intelligent British documentary voice with dry comedic timing, the same voice in every clip, begins speaking within the first half second and says exactly: “He saw his soldiers dancing. The food. The bride. The groom. The cat.” The narrator is heard off-screen only; no character lip-syncs to the narrator. Music: music nearly silent. Sound effects: quiet room tone, fire crackle. No subtitles or captions.</w:t>
+        <w:t>Locked-off static camera, no camera movement. 2D hand-drawn Stickman animation, clean thin black outlines, large expressive heads, simple readable stickman proportions, flat warm colors, historically inspired ancient Alexandria, playful cinematic documentary-comedy tone, 16:9, no 3D, no photorealism, no modern objects, no subtitles, no captions, no logos, no generated text, NO on-screen character dialogue (only the off-screen narrator speaks). Use the selected reference images as strict continuity anchors. Preserve faces, hair, clothing, colors, proportions and accessories exactly. Characters may move their bodies, arms, eyes and mouths for silent nonverbal acting only. VISUAL STYLE LOCK: 2D hand-drawn stickman animation; clean thin black outlines; large expressive heads; simple readable stickman proportions; flat warm colors; historically inspired ancient Alexandria; playful cinematic documentary-comedy tone; no 3D; no photorealism; no modern objects; no subtitles; no captions; no logos; no text inside the generated scene; 16:9. The Roman commander slowly scans the room: first the soldiers, then the food, then the bride and groom, then the wedding decorations. He remains completely serious while the absurd party surrounds him. 2D stickman animation, no text, 16:9. CAMERA: locked-off static camera on a tripod, eye-level medium shot of the commander; he turns his head, the camera does not pan. No camera movement of any kind: no tilt, no pan, no zoom, no push, no pull, no orbit, no tracking, no rising or overhead view. The framing stays identical from the first frame to the last frame; all movement comes from the characters. AUDIO (generate sound together with the picture): Off-screen male narrator voice-over, warm intelligent British documentary voice with dry comedic timing, the same voice in every clip, begins speaking within the first half second and says exactly: “He saw his soldiers dancing. The food. The bride. The groom. The cat.” The narrator is heard off-screen only; no character lip-syncs to the narrator. Music: music nearly silent. Sound effects: quiet room tone, fire crackle. No subtitles or captions.</w:t>
       </w:r>
     </w:p>
     <w:p>
@@ -4443,7 +4448,7 @@
     </w:p>
     <w:p>
       <w:r>
-        <w:t>Close-up stare.</w:t>
+        <w:t>Static, locked-off: eye-level medium two-shot: the commander in the foreground, the cat on the table behind him; no cutting. No tilt, pan, zoom or orbit.</w:t>
       </w:r>
     </w:p>
     <w:p>
@@ -4469,7 +4474,7 @@
     </w:p>
     <w:p>
       <w:r>
-        <w:t>2D hand-drawn Stickman animation, clean thin black outlines, large expressive heads, simple readable stickman proportions, flat warm colors, historically inspired ancient Alexandria, playful cinematic documentary-comedy tone, 16:9, no 3D, no photorealism, no modern objects, no subtitles, no captions, no logos, no generated text, NO on-screen character dialogue (only the off-screen narrator speaks). Use the selected reference images as strict continuity anchors. Preserve faces, hair, clothing, colors, proportions and accessories exactly. Characters may move their bodies, arms, eyes and mouths for silent nonverbal acting only. VISUAL STYLE LOCK: 2D hand-drawn stickman animation; clean thin black outlines; large expressive heads; simple readable stickman proportions; flat warm colors; historically inspired ancient Alexandria; playful cinematic documentary-comedy tone; no 3D; no photorealism; no modern objects; no subtitles; no captions; no logos; no text inside the generated scene; 16:9. The commander's gaze lands on the calm black cat sitting near the feast. The cat stares back without moving. The commander remains serious. 2D stickman animation, clean lines, deadpan comedy, no text, 16:9. Close-up alternating between commander and cat. AUDIO (generate sound together with the picture): Off-screen male narrator voice-over, warm intelligent British documentary voice with dry comedic timing, the same voice in every clip, begins speaking within the first half second and says exactly: “The cat looked back. The cat was not impressed by the Roman Empire.” The narrator is heard off-screen only; no character lip-syncs to the narrator. Music: music nearly silent. Sound effects: cat meow, tiny sting. No subtitles or captions.</w:t>
+        <w:t>Locked-off static camera, no camera movement. 2D hand-drawn Stickman animation, clean thin black outlines, large expressive heads, simple readable stickman proportions, flat warm colors, historically inspired ancient Alexandria, playful cinematic documentary-comedy tone, 16:9, no 3D, no photorealism, no modern objects, no subtitles, no captions, no logos, no generated text, NO on-screen character dialogue (only the off-screen narrator speaks). Use the selected reference images as strict continuity anchors. Preserve faces, hair, clothing, colors, proportions and accessories exactly. Characters may move their bodies, arms, eyes and mouths for silent nonverbal acting only. VISUAL STYLE LOCK: 2D hand-drawn stickman animation; clean thin black outlines; large expressive heads; simple readable stickman proportions; flat warm colors; historically inspired ancient Alexandria; playful cinematic documentary-comedy tone; no 3D; no photorealism; no modern objects; no subtitles; no captions; no logos; no text inside the generated scene; 16:9. The commander's gaze lands on the calm black cat sitting near the feast. The cat stares back without moving. The commander remains serious. 2D stickman animation, clean lines, deadpan comedy, no text, 16:9. CAMERA: locked-off static camera on a tripod, eye-level medium two-shot: the commander in the foreground, the cat on the table behind him; no cutting. No camera movement of any kind: no tilt, no pan, no zoom, no push, no pull, no orbit, no tracking, no rising or overhead view. The framing stays identical from the first frame to the last frame; all movement comes from the characters. AUDIO (generate sound together with the picture): Off-screen male narrator voice-over, warm intelligent British documentary voice with dry comedic timing, the same voice in every clip, begins speaking within the first half second and says exactly: “The cat looked back. The cat was not impressed by the Roman Empire.” The narrator is heard off-screen only; no character lip-syncs to the narrator. Music: music nearly silent. Sound effects: cat meow, tiny sting. No subtitles or captions.</w:t>
       </w:r>
     </w:p>
     <w:p>
@@ -4568,7 +4573,7 @@
     </w:p>
     <w:p>
       <w:r>
-        <w:t>Symmetrical medium-wide.</w:t>
+        <w:t>Static, locked-off: symmetrical eye-level medium-wide shot. No tilt, pan, zoom or orbit.</w:t>
       </w:r>
     </w:p>
     <w:p>
@@ -4594,7 +4599,7 @@
     </w:p>
     <w:p>
       <w:r>
-        <w:t>2D hand-drawn Stickman animation, clean thin black outlines, large expressive heads, simple readable stickman proportions, flat warm colors, historically inspired ancient Alexandria, playful cinematic documentary-comedy tone, 16:9, no 3D, no photorealism, no modern objects, no subtitles, no captions, no logos, no generated text, NO on-screen character dialogue (only the off-screen narrator speaks). Use the selected reference images as strict continuity anchors. Preserve faces, hair, clothing, colors, proportions and accessories exactly. Characters may move their bodies, arms, eyes and mouths for silent nonverbal acting only. VISUAL STYLE LOCK: 2D hand-drawn stickman animation; clean thin black outlines; large expressive heads; simple readable stickman proportions; flat warm colors; historically inspired ancient Alexandria; playful cinematic documentary-comedy tone; no 3D; no photorealism; no modern objects; no subtitles; no captions; no logos; no text inside the generated scene; 16:9. The Roman commander unrolls a papyrus scroll and addresses the gathered crowd with formal authority. Do not generate readable words or subtitles; the meaning will come through voiceover/editing. 2D stickman animation, , no text, 16:9. Symmetrical medium-wide composition. AUDIO (generate sound together with the picture): Off-screen male narrator voice-over, warm intelligent British documentary voice with dry comedic timing, the same voice in every clip, begins speaking within the first half second and says exactly: “He unrolled the scroll. Message received: Egypt has new management.” The narrator is heard off-screen only; no character lip-syncs to the narrator. Music: music drops to low sustained tension with distant marching drums, almost silent. Sound effects: scroll unrolling, one dramatic drum hit. No subtitles or captions.</w:t>
+        <w:t>Locked-off static camera, no camera movement. 2D hand-drawn Stickman animation, clean thin black outlines, large expressive heads, simple readable stickman proportions, flat warm colors, historically inspired ancient Alexandria, playful cinematic documentary-comedy tone, 16:9, no 3D, no photorealism, no modern objects, no subtitles, no captions, no logos, no generated text, NO on-screen character dialogue (only the off-screen narrator speaks). Use the selected reference images as strict continuity anchors. Preserve faces, hair, clothing, colors, proportions and accessories exactly. Characters may move their bodies, arms, eyes and mouths for silent nonverbal acting only. VISUAL STYLE LOCK: 2D hand-drawn stickman animation; clean thin black outlines; large expressive heads; simple readable stickman proportions; flat warm colors; historically inspired ancient Alexandria; playful cinematic documentary-comedy tone; no 3D; no photorealism; no modern objects; no subtitles; no captions; no logos; no text inside the generated scene; 16:9. The Roman commander unrolls a papyrus scroll and addresses the gathered crowd with formal authority. Do not generate readable words or subtitles; the meaning will come through voiceover/editing. 2D stickman animation, , no text, 16:9. CAMERA: locked-off static camera on a tripod, symmetrical eye-level medium-wide shot. No camera movement of any kind: no tilt, no pan, no zoom, no push, no pull, no orbit, no tracking, no rising or overhead view. The framing stays identical from the first frame to the last frame; all movement comes from the characters. AUDIO (generate sound together with the picture): Off-screen male narrator voice-over, warm intelligent British documentary voice with dry comedic timing, the same voice in every clip, begins speaking within the first half second and says exactly: “He unrolled the scroll. Message received: Egypt has new management.” The narrator is heard off-screen only; no character lip-syncs to the narrator. Music: music drops to low sustained tension with distant marching drums, almost silent. Sound effects: scroll unrolling, one dramatic drum hit. No subtitles or captions.</w:t>
       </w:r>
     </w:p>
     <w:p>
@@ -4683,7 +4688,7 @@
     </w:p>
     <w:p>
       <w:r>
-        <w:t>Shot-reverse-shot feeling.</w:t>
+        <w:t>Static, locked-off: eye-level medium two-shot of Senbi and the bride. No tilt, pan, zoom or orbit.</w:t>
       </w:r>
     </w:p>
     <w:p>
@@ -4709,7 +4714,7 @@
     </w:p>
     <w:p>
       <w:r>
-        <w:t>2D hand-drawn Stickman animation, clean thin black outlines, large expressive heads, simple readable stickman proportions, flat warm colors, historically inspired ancient Alexandria, playful cinematic documentary-comedy tone, 16:9, no 3D, no photorealism, no modern objects, no subtitles, no captions, no logos, no generated text, NO on-screen character dialogue (only the off-screen narrator speaks). Use the selected reference images as strict continuity anchors. Preserve faces, hair, clothing, colors, proportions and accessories exactly. Characters may move their bodies, arms, eyes and mouths for silent nonverbal acting only. VISUAL STYLE LOCK: 2D hand-drawn stickman animation; clean thin black outlines; large expressive heads; simple readable stickman proportions; flat warm colors; historically inspired ancient Alexandria; playful cinematic documentary-comedy tone; no 3D; no photorealism; no modern objects; no subtitles; no captions; no logos; no text inside the generated scene; 16:9. After the commander's announcement, Senbi slowly turns toward the bride. The bride looks back at him. Both silently realize that the wedding has taken a very strange turn. 2D stickman animation, expressive body language, no text, 16:9. Quick shot-reverse-shot feeling. AUDIO (generate sound together with the picture): Off-screen male narrator voice-over, warm intelligent British documentary voice with dry comedic timing, the same voice in every clip, begins speaking within the first half second and says exactly: “Senbi looked at his bride. Same question, silently: is the wedding still on?” The narrator is heard off-screen only; no character lip-syncs to the narrator. Music: music drops to low sustained tension with distant marching drums, almost silent. Sound effects: nervous breath, single drum. No subtitles or captions.</w:t>
+        <w:t>Locked-off static camera, no camera movement. 2D hand-drawn Stickman animation, clean thin black outlines, large expressive heads, simple readable stickman proportions, flat warm colors, historically inspired ancient Alexandria, playful cinematic documentary-comedy tone, 16:9, no 3D, no photorealism, no modern objects, no subtitles, no captions, no logos, no generated text, NO on-screen character dialogue (only the off-screen narrator speaks). Use the selected reference images as strict continuity anchors. Preserve faces, hair, clothing, colors, proportions and accessories exactly. Characters may move their bodies, arms, eyes and mouths for silent nonverbal acting only. VISUAL STYLE LOCK: 2D hand-drawn stickman animation; clean thin black outlines; large expressive heads; simple readable stickman proportions; flat warm colors; historically inspired ancient Alexandria; playful cinematic documentary-comedy tone; no 3D; no photorealism; no modern objects; no subtitles; no captions; no logos; no text inside the generated scene; 16:9. After the commander's announcement, Senbi slowly turns toward the bride. The bride looks back at him. Both silently realize that the wedding has taken a very strange turn. 2D stickman animation, expressive body language, no text, 16:9. CAMERA: locked-off static camera on a tripod, eye-level medium two-shot of Senbi and the bride. No camera movement of any kind: no tilt, no pan, no zoom, no push, no pull, no orbit, no tracking, no rising or overhead view. The framing stays identical from the first frame to the last frame; all movement comes from the characters. AUDIO (generate sound together with the picture): Off-screen male narrator voice-over, warm intelligent British documentary voice with dry comedic timing, the same voice in every clip, begins speaking within the first half second and says exactly: “Senbi looked at his bride. Same question, silently: is the wedding still on?” The narrator is heard off-screen only; no character lip-syncs to the narrator. Music: music drops to low sustained tension with distant marching drums, almost silent. Sound effects: nervous breath, single drum. No subtitles or captions.</w:t>
       </w:r>
     </w:p>
     <w:p>
@@ -4780,7 +4785,7 @@
     </w:p>
     <w:p>
       <w:r>
-        <w:t>Pull from wedding to Alexandria harbor and city. Roman authority is now visibly present. All expressions, eye movement and mouth movement are silent nonverbal acting only. No intelligible speech, no lip-sync dialogue.</w:t>
+        <w:t>Wide static view of the Alexandria harbor and city. Roman authority is now visibly present. All expressions, eye movement and mouth movement are silent nonverbal acting only. No intelligible speech, no lip-sync dialogue.</w:t>
       </w:r>
     </w:p>
     <w:p>
@@ -4793,7 +4798,7 @@
     </w:p>
     <w:p>
       <w:r>
-        <w:t>Camera pulls away into wide shot.</w:t>
+        <w:t>Static, locked-off: eye-level wide shot of Alexandria with Roman soldiers in the streets. No tilt, pan, zoom or orbit.</w:t>
       </w:r>
     </w:p>
     <w:p>
@@ -4819,7 +4824,7 @@
     </w:p>
     <w:p>
       <w:r>
-        <w:t>2D hand-drawn Stickman animation, clean thin black outlines, large expressive heads, simple readable stickman proportions, flat warm colors, historically inspired ancient Alexandria, playful cinematic documentary-comedy tone, 16:9, no 3D, no photorealism, no modern objects, no subtitles, no captions, no logos, no generated text, NO on-screen character dialogue (only the off-screen narrator speaks). Use the selected reference images as strict continuity anchors. Preserve faces, hair, clothing, colors, proportions and accessories exactly. Characters may move their bodies, arms, eyes and mouths for silent nonverbal acting only. VISUAL STYLE LOCK: 2D hand-drawn stickman animation; clean thin black outlines; large expressive heads; simple readable stickman proportions; flat warm colors; historically inspired ancient Alexandria; playful cinematic documentary-comedy tone; no 3D; no photorealism; no modern objects; no subtitles; no captions; no logos; no text inside the generated scene; 16:9. Pull away from the wedding area to a wide view of Alexandria. Roman soldiers move through the city while Egyptian civilians watch from a distance. The transition should feel more historical and serious for a moment. 2D stickman animation, cinematic wide composition, no text, 16:9. Slow camera pullback. AUDIO (generate sound together with the picture): Off-screen male narrator voice-over, warm intelligent British documentary voice with dry comedic timing, the same voice in every clip, begins speaking within the first half second and says exactly: “Outside, the city was changing hands. Inside, there was still a wedding.” The narrator is heard off-screen only; no character lip-syncs to the narrator. Music: music nearly silent. Sound effects: harbor ambience, distant boots. No subtitles or captions.</w:t>
+        <w:t>Locked-off static camera, no camera movement. 2D hand-drawn Stickman animation, clean thin black outlines, large expressive heads, simple readable stickman proportions, flat warm colors, historically inspired ancient Alexandria, playful cinematic documentary-comedy tone, 16:9, no 3D, no photorealism, no modern objects, no subtitles, no captions, no logos, no generated text, NO on-screen character dialogue (only the off-screen narrator speaks). Use the selected reference images as strict continuity anchors. Preserve faces, hair, clothing, colors, proportions and accessories exactly. Characters may move their bodies, arms, eyes and mouths for silent nonverbal acting only. VISUAL STYLE LOCK: 2D hand-drawn stickman animation; clean thin black outlines; large expressive heads; simple readable stickman proportions; flat warm colors; historically inspired ancient Alexandria; playful cinematic documentary-comedy tone; no 3D; no photorealism; no modern objects; no subtitles; no captions; no logos; no text inside the generated scene; 16:9. A wide view of Alexandria. Roman soldiers move through the city while Egyptian civilians watch from a distance. The transition should feel more historical and serious for a moment. 2D stickman animation, cinematic wide composition, no text, 16:9. CAMERA: locked-off static camera on a tripod, eye-level wide shot of Alexandria with Roman soldiers in the streets. No camera movement of any kind: no tilt, no pan, no zoom, no push, no pull, no orbit, no tracking, no rising or overhead view. The framing stays identical from the first frame to the last frame; all movement comes from the characters. AUDIO (generate sound together with the picture): Off-screen male narrator voice-over, warm intelligent British documentary voice with dry comedic timing, the same voice in every clip, begins speaking within the first half second and says exactly: “Outside, the city was changing hands. Inside, there was still a wedding.” The narrator is heard off-screen only; no character lip-syncs to the narrator. Music: music nearly silent. Sound effects: harbor ambience, distant boots. No subtitles or captions.</w:t>
       </w:r>
     </w:p>
     <w:p>
@@ -4908,7 +4913,7 @@
     </w:p>
     <w:p>
       <w:r>
-        <w:t>Slow observational pan.</w:t>
+        <w:t>Static, locked-off: eye-level wide observational shot of Alexandria. No tilt, pan, zoom or orbit.</w:t>
       </w:r>
     </w:p>
     <w:p>
@@ -4934,7 +4939,7 @@
     </w:p>
     <w:p>
       <w:r>
-        <w:t>2D hand-drawn Stickman animation, clean thin black outlines, large expressive heads, simple readable stickman proportions, flat warm colors, historically inspired ancient Alexandria, playful cinematic documentary-comedy tone, 16:9, no 3D, no photorealism, no modern objects, no subtitles, no captions, no logos, no generated text, NO on-screen character dialogue (only the off-screen narrator speaks). Use the selected reference images as strict continuity anchors. Preserve faces, hair, clothing, colors, proportions and accessories exactly. Characters may move their bodies, arms, eyes and mouths for silent nonverbal acting only. VISUAL STYLE LOCK: 2D hand-drawn stickman animation; clean thin black outlines; large expressive heads; simple readable stickman proportions; flat warm colors; historically inspired ancient Alexandria; playful cinematic documentary-comedy tone; no 3D; no photorealism; no modern objects; no subtitles; no captions; no logos; no text inside the generated scene; 16:9. Observational view of Alexandria with Roman military presence becoming visible in the city while Egyptian civilians continue their daily life. Do not depict the wedding as a literal documented historical event. The scene should visually signal the distinction between historical context and the fictional wedding comedy. 2D stickman animation, clean linework, no text, 16:9. Slow observational pan. AUDIO (generate sound together with the picture): Off-screen male narrator voice-over, warm intelligent British documentary voice with dry comedic timing, the same voice in every clip, begins speaking within the first half second and says exactly: “To be clear: Senbi and his wedding are fiction. The cat, sadly, too.” The narrator is heard off-screen only; no character lip-syncs to the narrator. Music: music nearly silent. Sound effects: calm city ambience. No subtitles or captions.</w:t>
+        <w:t>Locked-off static camera, no camera movement. 2D hand-drawn Stickman animation, clean thin black outlines, large expressive heads, simple readable stickman proportions, flat warm colors, historically inspired ancient Alexandria, playful cinematic documentary-comedy tone, 16:9, no 3D, no photorealism, no modern objects, no subtitles, no captions, no logos, no generated text, NO on-screen character dialogue (only the off-screen narrator speaks). Use the selected reference images as strict continuity anchors. Preserve faces, hair, clothing, colors, proportions and accessories exactly. Characters may move their bodies, arms, eyes and mouths for silent nonverbal acting only. VISUAL STYLE LOCK: 2D hand-drawn stickman animation; clean thin black outlines; large expressive heads; simple readable stickman proportions; flat warm colors; historically inspired ancient Alexandria; playful cinematic documentary-comedy tone; no 3D; no photorealism; no modern objects; no subtitles; no captions; no logos; no text inside the generated scene; 16:9. Observational view of Alexandria with Roman military presence becoming visible in the city while Egyptian civilians continue their daily life. Do not depict the wedding as a literal documented historical event. The scene should visually signal the distinction between historical context and the fictional wedding comedy. 2D stickman animation, clean linework, no text, 16:9. CAMERA: locked-off static camera on a tripod, eye-level wide observational shot of Alexandria. No camera movement of any kind: no tilt, no pan, no zoom, no push, no pull, no orbit, no tracking, no rising or overhead view. The framing stays identical from the first frame to the last frame; all movement comes from the characters. AUDIO (generate sound together with the picture): Off-screen male narrator voice-over, warm intelligent British documentary voice with dry comedic timing, the same voice in every clip, begins speaking within the first half second and says exactly: “To be clear: Senbi and his wedding are fiction. The cat, sadly, too.” The narrator is heard off-screen only; no character lip-syncs to the narrator. Music: music nearly silent. Sound effects: calm city ambience. No subtitles or captions.</w:t>
       </w:r>
     </w:p>
     <w:p>
@@ -5031,7 +5036,7 @@
     </w:p>
     <w:p>
       <w:r>
-        <w:t>Slow push toward harbor/city.</w:t>
+        <w:t>Locked camera, extremely slow 5% push-in only: wide shot of the Alexandria harbor and city, horizon level. No tilt, pan or orbit.</w:t>
       </w:r>
     </w:p>
     <w:p>
@@ -5057,7 +5062,7 @@
     </w:p>
     <w:p>
       <w:r>
-        <w:t>2D hand-drawn Stickman animation, clean thin black outlines, large expressive heads, simple readable stickman proportions, flat warm colors, historically inspired ancient Alexandria, playful cinematic documentary-comedy tone, 16:9, no 3D, no photorealism, no modern objects, no subtitles, no captions, no logos, no generated text, NO on-screen character dialogue (only the off-screen narrator speaks). Use the selected reference images as strict continuity anchors. Preserve faces, hair, clothing, colors, proportions and accessories exactly. Characters may move their bodies, arms, eyes and mouths for silent nonverbal acting only. VISUAL STYLE LOCK: 2D hand-drawn stickman animation; clean thin black outlines; large expressive heads; simple readable stickman proportions; flat warm colors; historically inspired ancient Alexandria; playful cinematic documentary-comedy tone; no 3D; no photorealism; no modern objects; no subtitles; no captions; no logos; no text inside the generated scene; 16:9. Cinematic historical tableau of Alexandria in 30 BC during the major political transition associated with Octavian. Roman authority is visible in the city while Egyptian life continues around it. Avoid inventing a specific documented street event. 2D stickman animation, historically inspired, no text, 16:9. Slow push toward the harbor and city. AUDIO (generate sound together with the picture): Off-screen male narrator voice-over, warm intelligent British documentary voice with dry comedic timing, the same voice in every clip, begins speaking within the first half second and says exactly: “The setting is real: in 30 BC, Octavian took Alexandria. Egypt became Roman.” The narrator is heard off-screen only; no character lip-syncs to the narrator. Music: music nearly silent. Sound effects: calm city ambience. No subtitles or captions.</w:t>
+        <w:t>Locked camera, only an extremely slow subtle push-in. 2D hand-drawn Stickman animation, clean thin black outlines, large expressive heads, simple readable stickman proportions, flat warm colors, historically inspired ancient Alexandria, playful cinematic documentary-comedy tone, 16:9, no 3D, no photorealism, no modern objects, no subtitles, no captions, no logos, no generated text, NO on-screen character dialogue (only the off-screen narrator speaks). Use the selected reference images as strict continuity anchors. Preserve faces, hair, clothing, colors, proportions and accessories exactly. Characters may move their bodies, arms, eyes and mouths for silent nonverbal acting only. VISUAL STYLE LOCK: 2D hand-drawn stickman animation; clean thin black outlines; large expressive heads; simple readable stickman proportions; flat warm colors; historically inspired ancient Alexandria; playful cinematic documentary-comedy tone; no 3D; no photorealism; no modern objects; no subtitles; no captions; no logos; no text inside the generated scene; 16:9. Cinematic historical tableau of Alexandria in 30 BC during the major political transition associated with Octavian. Roman authority is visible in the city while Egyptian life continues around it. Avoid inventing a specific documented street event. 2D stickman animation, historically inspired, no text, 16:9. CAMERA: wide shot of the Alexandria harbor and city, horizon level. Locked camera with only an extremely slow, subtle push-in (about 5%) over the whole clip. No tilt, no pan, no orbit, no rising or overhead view; the subject stays in the same position in the frame. AUDIO (generate sound together with the picture): Off-screen male narrator voice-over, warm intelligent British documentary voice with dry comedic timing, the same voice in every clip, begins speaking within the first half second and says exactly: “The setting is real: in 30 BC, Octavian took Alexandria. Egypt became Roman.” The narrator is heard off-screen only; no character lip-syncs to the narrator. Music: music nearly silent. Sound effects: calm city ambience. No subtitles or captions.</w:t>
       </w:r>
     </w:p>
     <w:p>
@@ -5141,7 +5146,7 @@
     </w:p>
     <w:p>
       <w:r>
-        <w:t>Close-up on headrest, then deadpan reaction.</w:t>
+        <w:t>Static, locked-off: eye-level medium close-up with the headrest in Senbi's hands and his face both in frame. No tilt, pan, zoom or orbit.</w:t>
       </w:r>
     </w:p>
     <w:p>
@@ -5167,7 +5172,7 @@
     </w:p>
     <w:p>
       <w:r>
-        <w:t>2D hand-drawn Stickman animation, clean thin black outlines, large expressive heads, simple readable stickman proportions, flat warm colors, historically inspired ancient Alexandria, playful cinematic documentary-comedy tone, 16:9, no 3D, no photorealism, no modern objects, no subtitles, no captions, no logos, no generated text, NO on-screen character dialogue (only the off-screen narrator speaks). Use the selected reference images as strict continuity anchors. Preserve faces, hair, clothing, colors, proportions and accessories exactly. Characters may move their bodies, arms, eyes and mouths for silent nonverbal acting only. VISUAL STYLE LOCK: 2D hand-drawn stickman animation; clean thin black outlines; large expressive heads; simple readable stickman proportions; flat warm colors; historically inspired ancient Alexandria; playful cinematic documentary-comedy tone; no 3D; no photorealism; no modern objects; no subtitles; no captions; no logos; no text inside the generated scene; 16:9. Senbi looks down at the wooden headrest wedding gift, then slowly looks toward the Roman commander with a tired expression, as if reconsidering every decision that brought him here. Preserve exact Senbi design. 2D stickman animation, no text, 16:9. Close-up on headrest, then tilt up to Senbi's deadpan face. AUDIO (generate sound together with the picture): Off-screen male narrator voice-over, warm intelligent British documentary voice with dry comedic timing, the same voice in every clip, begins speaking within the first half second and says exactly: “Headrest, then commander. Neither came with a return policy.” The narrator is heard off-screen only; no character lip-syncs to the narrator. Music: playful comic percussion over the wedding rhythm, mixed low under the narrator. Sound effects: wood knock, comic sting. No subtitles or captions.</w:t>
+        <w:t>Locked-off static camera, no camera movement. 2D hand-drawn Stickman animation, clean thin black outlines, large expressive heads, simple readable stickman proportions, flat warm colors, historically inspired ancient Alexandria, playful cinematic documentary-comedy tone, 16:9, no 3D, no photorealism, no modern objects, no subtitles, no captions, no logos, no generated text, NO on-screen character dialogue (only the off-screen narrator speaks). Use the selected reference images as strict continuity anchors. Preserve faces, hair, clothing, colors, proportions and accessories exactly. Characters may move their bodies, arms, eyes and mouths for silent nonverbal acting only. VISUAL STYLE LOCK: 2D hand-drawn stickman animation; clean thin black outlines; large expressive heads; simple readable stickman proportions; flat warm colors; historically inspired ancient Alexandria; playful cinematic documentary-comedy tone; no 3D; no photorealism; no modern objects; no subtitles; no captions; no logos; no text inside the generated scene; 16:9. Senbi looks down at the wooden headrest wedding gift, then slowly looks toward the Roman commander with a tired expression, as if reconsidering every decision that brought him here. Preserve exact Senbi design. 2D stickman animation, no text, 16:9. CAMERA: locked-off static camera on a tripod, eye-level medium close-up with the headrest in Senbi's hands and his face both in frame. No camera movement of any kind: no tilt, no pan, no zoom, no push, no pull, no orbit, no tracking, no rising or overhead view. The framing stays identical from the first frame to the last frame; all movement comes from the characters. AUDIO (generate sound together with the picture): Off-screen male narrator voice-over, warm intelligent British documentary voice with dry comedic timing, the same voice in every clip, begins speaking within the first half second and says exactly: “Headrest, then commander. Neither came with a return policy.” The narrator is heard off-screen only; no character lip-syncs to the narrator. Music: playful comic percussion over the wedding rhythm, mixed low under the narrator. Sound effects: wood knock, comic sting. No subtitles or captions.</w:t>
       </w:r>
     </w:p>
     <w:p>
@@ -5256,7 +5261,7 @@
     </w:p>
     <w:p>
       <w:r>
-        <w:t>Warm medium shot; pull back.</w:t>
+        <w:t>Static, locked-off: eye-level medium two-shot of Senbi and the bride. No tilt, pan, zoom or orbit.</w:t>
       </w:r>
     </w:p>
     <w:p>
@@ -5282,7 +5287,7 @@
     </w:p>
     <w:p>
       <w:r>
-        <w:t>2D hand-drawn Stickman animation, clean thin black outlines, large expressive heads, simple readable stickman proportions, flat warm colors, historically inspired ancient Alexandria, playful cinematic documentary-comedy tone, 16:9, no 3D, no photorealism, no modern objects, no subtitles, no captions, no logos, no generated text, NO on-screen character dialogue (only the off-screen narrator speaks). Use the selected reference images as strict continuity anchors. Preserve faces, hair, clothing, colors, proportions and accessories exactly. Characters may move their bodies, arms, eyes and mouths for silent nonverbal acting only. VISUAL STYLE LOCK: 2D hand-drawn stickman animation; clean thin black outlines; large expressive heads; simple readable stickman proportions; flat warm colors; historically inspired ancient Alexandria; playful cinematic documentary-comedy tone; no 3D; no photorealism; no modern objects; no subtitles; no captions; no logos; no text inside the generated scene; 16:9. The bride finally laughs at the absurdity of the situation. Senbi looks at her, then starts laughing too. The tension releases for a warm comedic moment. 2D stickman animation, warm colors, no text, 16:9. Medium two-shot with gentle pullback. AUDIO (generate sound together with the picture): Off-screen male narrator voice-over, warm intelligent British documentary voice with dry comedic timing, the same voice in every clip, begins speaking within the first half second and says exactly: “Senbi thought he was getting married.” The narrator is heard off-screen only; no character lip-syncs to the narrator. Music: warm gentle resolution with the same flute and strings, mixed low under the narrator. Sound effects: bride laughter, Senbi laughter. No subtitles or captions.</w:t>
+        <w:t>Locked-off static camera, no camera movement. 2D hand-drawn Stickman animation, clean thin black outlines, large expressive heads, simple readable stickman proportions, flat warm colors, historically inspired ancient Alexandria, playful cinematic documentary-comedy tone, 16:9, no 3D, no photorealism, no modern objects, no subtitles, no captions, no logos, no generated text, NO on-screen character dialogue (only the off-screen narrator speaks). Use the selected reference images as strict continuity anchors. Preserve faces, hair, clothing, colors, proportions and accessories exactly. Characters may move their bodies, arms, eyes and mouths for silent nonverbal acting only. VISUAL STYLE LOCK: 2D hand-drawn stickman animation; clean thin black outlines; large expressive heads; simple readable stickman proportions; flat warm colors; historically inspired ancient Alexandria; playful cinematic documentary-comedy tone; no 3D; no photorealism; no modern objects; no subtitles; no captions; no logos; no text inside the generated scene; 16:9. The bride finally laughs at the absurdity of the situation. Senbi looks at her, then starts laughing too. The tension releases for a warm comedic moment. 2D stickman animation, warm colors, no text, 16:9. CAMERA: locked-off static camera on a tripod, eye-level medium two-shot of Senbi and the bride. No camera movement of any kind: no tilt, no pan, no zoom, no push, no pull, no orbit, no tracking, no rising or overhead view. The framing stays identical from the first frame to the last frame; all movement comes from the characters. AUDIO (generate sound together with the picture): Off-screen male narrator voice-over, warm intelligent British documentary voice with dry comedic timing, the same voice in every clip, begins speaking within the first half second and says exactly: “Senbi thought he was getting married.” The narrator is heard off-screen only; no character lip-syncs to the narrator. Music: warm gentle resolution with the same flute and strings, mixed low under the narrator. Sound effects: bride laughter, Senbi laughter. No subtitles or captions.</w:t>
       </w:r>
     </w:p>
     <w:p>
@@ -5366,7 +5371,7 @@
     </w:p>
     <w:p>
       <w:r>
-        <w:t>Tiny push toward exhausted face.</w:t>
+        <w:t>Locked camera, extremely slow 5% push-in only: eye-level medium close-up of Senbi's face. No tilt, pan or orbit.</w:t>
       </w:r>
     </w:p>
     <w:p>
@@ -5392,7 +5397,7 @@
     </w:p>
     <w:p>
       <w:r>
-        <w:t>2D hand-drawn Stickman animation, clean thin black outlines, large expressive heads, simple readable stickman proportions, flat warm colors, historically inspired ancient Alexandria, playful cinematic documentary-comedy tone, 16:9, no 3D, no photorealism, no modern objects, no subtitles, no captions, no logos, no generated text, NO on-screen character dialogue (only the off-screen narrator speaks). Use the selected reference images as strict continuity anchors. Preserve faces, hair, clothing, colors, proportions and accessories exactly. Characters may move their bodies, arms, eyes and mouths for silent nonverbal acting only. VISUAL STYLE LOCK: 2D hand-drawn stickman animation; clean thin black outlines; large expressive heads; simple readable stickman proportions; flat warm colors; historically inspired ancient Alexandria; playful cinematic documentary-comedy tone; no 3D; no photorealism; no modern objects; no subtitles; no captions; no logos; no text inside the generated scene; 16:9. Senbi tries to sleep awkwardly using the wooden headrest. He opens one eye when distant Roman marching sounds are implied visually by his reaction, then closes it again in exhausted resignation. 2D stickman animation, clean thin lines, deadpan comedy, no text, 16:9. Tiny push toward his exhausted face. AUDIO (generate sound together with the picture): Off-screen male narrator voice-over, warm intelligent British documentary voice with dry comedic timing, the same voice in every clip, begins speaking within the first half second and says exactly: “He was.” The narrator is heard off-screen only; no character lip-syncs to the narrator. Music: warm gentle resolution with the same flute and strings, mixed low under the narrator. Sound effects: distant marching, soft snore. No subtitles or captions.</w:t>
+        <w:t>Locked camera, only an extremely slow subtle push-in. 2D hand-drawn Stickman animation, clean thin black outlines, large expressive heads, simple readable stickman proportions, flat warm colors, historically inspired ancient Alexandria, playful cinematic documentary-comedy tone, 16:9, no 3D, no photorealism, no modern objects, no subtitles, no captions, no logos, no generated text, NO on-screen character dialogue (only the off-screen narrator speaks). Use the selected reference images as strict continuity anchors. Preserve faces, hair, clothing, colors, proportions and accessories exactly. Characters may move their bodies, arms, eyes and mouths for silent nonverbal acting only. VISUAL STYLE LOCK: 2D hand-drawn stickman animation; clean thin black outlines; large expressive heads; simple readable stickman proportions; flat warm colors; historically inspired ancient Alexandria; playful cinematic documentary-comedy tone; no 3D; no photorealism; no modern objects; no subtitles; no captions; no logos; no text inside the generated scene; 16:9. Senbi tries to sleep awkwardly using the wooden headrest. He opens one eye when distant Roman marching sounds are implied visually by his reaction, then closes it again in exhausted resignation. 2D stickman animation, clean thin lines, deadpan comedy, no text, 16:9. CAMERA: eye-level medium close-up of Senbi's face. Locked camera with only an extremely slow, subtle push-in (about 5%) over the whole clip. No tilt, no pan, no orbit, no rising or overhead view; the subject stays in the same position in the frame. AUDIO (generate sound together with the picture): Off-screen male narrator voice-over, warm intelligent British documentary voice with dry comedic timing, the same voice in every clip, begins speaking within the first half second and says exactly: “He was.” The narrator is heard off-screen only; no character lip-syncs to the narrator. Music: warm gentle resolution with the same flute and strings, mixed low under the narrator. Sound effects: distant marching, soft snore. No subtitles or captions.</w:t>
       </w:r>
     </w:p>
     <w:p>
@@ -5486,7 +5491,7 @@
     </w:p>
     <w:p>
       <w:r>
-        <w:t>Slow fade out; add branding in editing.</w:t>
+        <w:t>Static, locked-off: wide shot of Senbi and the bride in the foreground with Alexandria behind them. No tilt, pan, zoom or orbit.</w:t>
       </w:r>
     </w:p>
     <w:p>
@@ -5512,7 +5517,7 @@
     </w:p>
     <w:p>
       <w:r>
-        <w:t>2D hand-drawn Stickman animation, clean thin black outlines, large expressive heads, simple readable stickman proportions, flat warm colors, historically inspired ancient Alexandria, playful cinematic documentary-comedy tone, 16:9, no 3D, no photorealism, no modern objects, no subtitles, no captions, no logos, no generated text, NO on-screen character dialogue (only the off-screen narrator speaks). Use the selected reference images as strict continuity anchors. Preserve faces, hair, clothing, colors, proportions and accessories exactly. Characters may move their bodies, arms, eyes and mouths for silent nonverbal acting only. VISUAL STYLE LOCK: 2D hand-drawn stickman animation; clean thin black outlines; large expressive heads; simple readable stickman proportions; flat warm colors; historically inspired ancient Alexandria; playful cinematic documentary-comedy tone; no 3D; no photorealism; no modern objects; no subtitles; no captions; no logos; no text inside the generated scene; 16:9. Final cinematic composition: Senbi and bride in the foreground, Alexandria behind them, Roman soldiers visible as small figures in the distant city. The scene should feel like the beginning of a much larger story. 2D hand-drawn stickman animation, warm cinematic palette, clean thin black outlines, no subtitles, no text, 16:9. Slow fade-like camera pullback, leaving visual room for the end card to be added in editing. AUDIO (generate sound together with the picture): Off-screen male narrator voice-over, warm intelligent British documentary voice with dry comedic timing, the same voice in every clip, begins speaking within the first half second and says exactly: “He just hadn't noticed he was also getting a new government.” The narrator is heard off-screen only; no character lip-syncs to the narrator. Music: warm gentle resolution with the same flute and strings, mixed low under the narrator. Sound effects: gentle music, silence at the very end. No subtitles or captions.</w:t>
+        <w:t>Locked-off static camera, no camera movement. 2D hand-drawn Stickman animation, clean thin black outlines, large expressive heads, simple readable stickman proportions, flat warm colors, historically inspired ancient Alexandria, playful cinematic documentary-comedy tone, 16:9, no 3D, no photorealism, no modern objects, no subtitles, no captions, no logos, no generated text, NO on-screen character dialogue (only the off-screen narrator speaks). Use the selected reference images as strict continuity anchors. Preserve faces, hair, clothing, colors, proportions and accessories exactly. Characters may move their bodies, arms, eyes and mouths for silent nonverbal acting only. VISUAL STYLE LOCK: 2D hand-drawn stickman animation; clean thin black outlines; large expressive heads; simple readable stickman proportions; flat warm colors; historically inspired ancient Alexandria; playful cinematic documentary-comedy tone; no 3D; no photorealism; no modern objects; no subtitles; no captions; no logos; no text inside the generated scene; 16:9. Final cinematic composition: Senbi and bride in the foreground, Alexandria behind them, Roman soldiers visible as small figures in the distant city. The scene should feel like the beginning of a much larger story. 2D hand-drawn stickman animation, warm cinematic palette, clean thin black outlines, no subtitles, no text, 16:9. CAMERA: locked-off static camera on a tripod, wide shot of Senbi and the bride in the foreground with Alexandria behind them. No camera movement of any kind: no tilt, no pan, no zoom, no push, no pull, no orbit, no tracking, no rising or overhead view. The framing stays identical from the first frame to the last frame; all movement comes from the characters. AUDIO (generate sound together with the picture): Off-screen male narrator voice-over, warm intelligent British documentary voice with dry comedic timing, the same voice in every clip, begins speaking within the first half second and says exactly: “He just hadn't noticed he was also getting a new government.” The narrator is heard off-screen only; no character lip-syncs to the narrator. Music: warm gentle resolution with the same flute and strings, mixed low under the narrator. Sound effects: gentle music, silence at the very end. No subtitles or captions.</w:t>
       </w:r>
     </w:p>
     <w:p>

</xml_diff>

<commit_message>
Episode 1 script: director-style prompts, art direction and prompt rules
Co-Authored-By: Claude Sonnet 5.5 <noreply@anthropic.com>
Claude-Session: https://claude.ai/code/session_01S29WeDgsXUpbHNWdisiPFj
</commit_message>
<xml_diff>
--- a/The_Last_Day_of_Ancient_Egypt_Episode_1_GOOGLE_FLOW_FINAL_SCRIPT.docx
+++ b/The_Last_Day_of_Ancient_Egypt_Episode_1_GOOGLE_FLOW_FINAL_SCRIPT.docx
@@ -131,232 +131,83 @@
         <w:pStyle w:val="Heading1"/>
       </w:pPr>
       <w:r>
-        <w:t>SHOT 01 — Cold open</w:t>
-      </w:r>
-    </w:p>
-    <w:p>
-      <w:r>
-        <w:rPr>
-          <w:b/>
-        </w:rPr>
-        <w:t>REFERENCE IMAGES TO SELECT IN GOOGLE FLOW</w:t>
-      </w:r>
-    </w:p>
-    <w:p>
-      <w:r>
-        <w:t>01_Senbi.jpg</w:t>
-      </w:r>
-    </w:p>
-    <w:p>
-      <w:r>
-        <w:t>02_Bride.jpg</w:t>
-      </w:r>
-    </w:p>
-    <w:p>
-      <w:r>
-        <w:t>11_Wedding_Courtyard_Day.jpg</w:t>
-      </w:r>
-    </w:p>
-    <w:p>
-      <w:r>
-        <w:t>DURATION: LOCKED — use the already-approved Shot 1 video; do not regenerate.</w:t>
-      </w:r>
-    </w:p>
-    <w:p>
-      <w:r>
-        <w:rPr>
-          <w:b/>
-        </w:rPr>
-        <w:t>VOICEOVER — NARRATOR ONLY</w:t>
-      </w:r>
-    </w:p>
-    <w:p>
-      <w:r>
-        <w:t>Today is supposed to be the happiest day in Senbi's life.</w:t>
-      </w:r>
-    </w:p>
-    <w:p>
-      <w:r>
-        <w:rPr>
-          <w:b/>
-        </w:rPr>
-        <w:t>CHARACTER ACTION / SILENT ACTING</w:t>
-      </w:r>
-    </w:p>
-    <w:p>
-      <w:r>
-        <w:t>LOCKED APPROVED VIDEO: use the already-generated Shot 1 exactly as approved. Do not regenerate. Preserve the existing camera, composition, Senbi, bride, wedding courtyard and timing. All expressions, eye movement and mouth movement are silent nonverbal acting only. No intelligible speech, no lip-sync dialogue.</w:t>
-      </w:r>
-    </w:p>
-    <w:p>
-      <w:r>
-        <w:rPr>
-          <w:b/>
-        </w:rPr>
-        <w:t>CAMERA / MOTION</w:t>
-      </w:r>
-    </w:p>
-    <w:p>
-      <w:r>
-        <w:t>LOCKED — use the camera movement already present in the approved Shot 1 video.</w:t>
-      </w:r>
-    </w:p>
-    <w:p>
-      <w:r>
-        <w:rPr>
-          <w:b/>
-        </w:rPr>
-        <w:t>MUSIC + SFX</w:t>
-      </w:r>
-    </w:p>
-    <w:p>
-      <w:r>
-        <w:t>Festive ancient-Egyptian wedding music with a subtle mysterious undertone; wedding crowd ambience; faint distant marching texture only if it matches the approved cut.</w:t>
-      </w:r>
-    </w:p>
-    <w:p>
-      <w:r>
-        <w:rPr>
-          <w:b/>
-        </w:rPr>
-        <w:t>GOOGLE FLOW VIDEO PROMPT</w:t>
-      </w:r>
-    </w:p>
-    <w:p>
-      <w:r>
-        <w:t>2D hand-drawn Stickman animation, clean thin black outlines, large expressive heads, simple readable stickman proportions, flat warm colors, historically inspired ancient Alexandria, playful cinematic documentary-comedy tone, 16:9, no 3D, no photorealism, no modern objects, no subtitles, no captions, no logos, no generated text, NO character dialogue. Use the selected reference images as strict continuity anchors. Preserve faces, hair, clothing, colors, proportions and accessories exactly. Characters may move their bodies, arms, eyes and mouths for silent nonverbal acting only. Use the already-approved Shot 1 video as the continuity master. Do not redesign or reinterpret the shot. Preserve the exact existing wedding composition, Senbi and bride appearance, background, framing and motion. No character speech.</w:t>
-      </w:r>
-    </w:p>
-    <w:p>
-      <w:r>
-        <w:rPr>
-          <w:b/>
-        </w:rPr>
-        <w:t>CONTINUITY / NEGATIVE LOCK</w:t>
-      </w:r>
-    </w:p>
-    <w:p>
-      <w:r>
-        <w:t>16:9. Keep exact approved character design, clothing, colors, proportions and environment. No modern objects, modern clothing, modern signs, modern architecture, subtitles, captions, logos, watermarks or written text inside the generated footage. No character dialogue. Do not introduce new character designs. If Flow changes a face, costume, proportions or key prop, regenerate.</w:t>
-      </w:r>
-    </w:p>
-    <w:p/>
+        <w:t>ART DIRECTION</w:t>
+      </w:r>
+    </w:p>
+    <w:p>
+      <w:r>
+        <w:t>• Look: 2D hand-drawn stickman cartoon exactly like the approved Shot 1: thin black outlines, large expressive heads, thin stick arms, flat warm colors. Detailed faces and costumes, simple bodies.</w:t>
+      </w:r>
+    </w:p>
+    <w:p>
+      <w:r>
+        <w:t>• Palette: Egyptians in warm white, gold and turquoise; sandstone and ochre architecture; Alexandria sea blue; Romans in crimson and steel grey; the commander adds gold. The whole wedding is in bright daylight (Shot 48 is warm evening). Reference 12 (interior feast, night) is used for food and props only.</w:t>
+      </w:r>
+    </w:p>
+    <w:p>
+      <w:r>
+        <w:t>• Geography: the courtyard has an open entrance gate at the back-center, feast tables along the side walls, musicians on the left, the dance floor in the center. The gate is the danger: wedding shots face the gate, with no reverse angles, and Romans always come from the gate toward the camera.</w:t>
+      </w:r>
+    </w:p>
+    <w:p>
+      <w:r>
+        <w:t>• Crowds: no more than 5 named characters per shot and no more than 8 characters in any wide shot. Background guests stay simple. Too many characters is the first thing that makes Flow drift.</w:t>
+      </w:r>
+    </w:p>
+    <w:p>
+      <w:r>
+        <w:t>• Shot-size rhythm: wide, then medium, then close-up. Never more than two shots of the same size in a row. Eye level by default; the only low angles are Shot 22 (boots) and Shot 37 (commander), and both stay fixed.</w:t>
+      </w:r>
+    </w:p>
+    <w:p>
+      <w:r>
+        <w:t>• Comedy staging: every gag has three beats: setup, the gag, a held reaction. Leave about one second at the end of every clip to hold the reaction.</w:t>
+      </w:r>
+    </w:p>
+    <w:p>
+      <w:r>
+        <w:t>• Continuity: Senbi, the bride, the Romans and the commander look exactly like the reference images in every clip. If a face, costume or prop changes, regenerate.</w:t>
+      </w:r>
+    </w:p>
     <w:p>
       <w:pPr>
         <w:pStyle w:val="Heading1"/>
       </w:pPr>
       <w:r>
-        <w:t>SHOT 02 — The suspicious sound</w:t>
-      </w:r>
-    </w:p>
-    <w:p>
-      <w:r>
-        <w:rPr>
-          <w:b/>
-        </w:rPr>
-        <w:t>REFERENCE IMAGES TO SELECT IN GOOGLE FLOW</w:t>
-      </w:r>
-    </w:p>
-    <w:p>
-      <w:r>
-        <w:t>11_Wedding_Courtyard_Day.jpg</w:t>
-      </w:r>
-    </w:p>
-    <w:p>
-      <w:r>
-        <w:t>03_Egyptian_Guests.jpg</w:t>
-      </w:r>
-    </w:p>
-    <w:p>
-      <w:r>
-        <w:t>DURATION: 8 sec (the line needs about 5–6 s of speech; trim the clip in editing)</w:t>
-      </w:r>
-    </w:p>
-    <w:p>
-      <w:r>
-        <w:rPr>
-          <w:b/>
-        </w:rPr>
-        <w:t>VOICEOVER — NARRATOR ONLY</w:t>
-      </w:r>
-    </w:p>
-    <w:p>
-      <w:r>
-        <w:t>Then, for half a beat, the dancing stopped. Nobody noticed. Except one guest.</w:t>
-      </w:r>
-    </w:p>
-    <w:p>
-      <w:r>
-        <w:rPr>
-          <w:b/>
-        </w:rPr>
-        <w:t>CHARACTER ACTION / SILENT ACTING</w:t>
-      </w:r>
-    </w:p>
-    <w:p>
-      <w:r>
-        <w:t>Eye-level medium-wide shot of the dancers, feet to heads. The dancing pauses for half a beat. One guest turns his head toward the street. All expressions, eye movement and mouth movement are silent nonverbal acting only. No intelligible speech, no lip-sync dialogue.</w:t>
-      </w:r>
-    </w:p>
-    <w:p>
-      <w:r>
-        <w:rPr>
-          <w:b/>
-        </w:rPr>
-        <w:t>CAMERA / MOTION</w:t>
-      </w:r>
-    </w:p>
-    <w:p>
-      <w:r>
-        <w:t>Static, locked-off: eye-level medium-wide shot, the dancers fully visible from feet to heads (NOT a feet close-up). No tilt, pan, zoom or orbit.</w:t>
-      </w:r>
-    </w:p>
-    <w:p>
-      <w:r>
-        <w:rPr>
-          <w:b/>
-        </w:rPr>
-        <w:t>MUSIC + SFX</w:t>
-      </w:r>
-    </w:p>
-    <w:p>
-      <w:r>
-        <w:t>Music: playful ancient-Mediterranean wedding music with frame drums, reed flute and plucked strings, steady upbeat tempo, the same theme in every clip, mixed low under the narrator and a faint uneasy undertone. SFX: dancing feet on stone, one tiny pause, faint distant thump. All generated inside Flow together with the picture; the narrator stays clearly intelligible.</w:t>
-      </w:r>
-    </w:p>
-    <w:p>
-      <w:r>
-        <w:rPr>
-          <w:b/>
-        </w:rPr>
-        <w:t>GOOGLE FLOW VIDEO PROMPT</w:t>
-      </w:r>
-    </w:p>
-    <w:p>
-      <w:r>
-        <w:t>Locked-off static camera, no camera movement. 2D hand-drawn Stickman animation, clean thin black outlines, large expressive heads, simple readable stickman proportions, flat warm colors, historically inspired ancient Alexandria, playful cinematic documentary-comedy tone, 16:9, no 3D, no photorealism, no modern objects, no subtitles, no captions, no logos, no generated text, NO on-screen character dialogue (only the off-screen narrator speaks). Use the selected reference images as strict continuity anchors. Preserve faces, hair, clothing, colors, proportions and accessories exactly. Characters may move their bodies, arms, eyes and mouths for silent nonverbal acting only. VISUAL STYLE LOCK: 2D hand-drawn stickman animation; clean thin black outlines; large expressive heads; simple readable stickman proportions; flat warm colors; historically inspired ancient Alexandria; playful cinematic documentary-comedy tone; no 3D; no photorealism; no modern objects; no subtitles; no captions; no logos; no text inside the generated scene; 16:9. Show the wedding dance continuing with the dancers fully visible from feet to heads. Suddenly all the dancers pause for a fraction of a second as everyone senses an unfamiliar sound outside. One Egyptian guest slowly turns his head toward the entrance while the others are still celebrating. Keep the mystery alive; do not reveal the Romans yet. 2D stickman animation, thin black lines, warm Egyptian palette, expressive body language, no subtitles, no text, 16:9. CAMERA: locked-off static camera on a tripod, eye-level medium-wide shot, the dancers fully visible from feet to heads (NOT a feet close-up). No camera movement of any kind: no tilt, no pan, no zoom, no push, no pull, no orbit, no tracking, no rising or overhead view. The framing stays identical from the first frame to the last frame; all movement comes from the characters. AUDIO (generate sound together with the picture): Off-screen male narrator voice-over, warm intelligent British documentary voice with dry comedic timing, the same voice in every clip, begins speaking within the first half second and says exactly: “Then, for half a beat, the dancing stopped. Nobody noticed. Except one guest.” The narrator is heard off-screen only; no character lip-syncs to the narrator. Music: playful ancient-Mediterranean wedding music with frame drums, reed flute and plucked strings, steady upbeat tempo, the same theme in every clip, mixed low under the narrator and a faint uneasy undertone. Sound effects: dancing feet on stone, one tiny pause, faint distant thump. No subtitles or captions.</w:t>
-      </w:r>
-    </w:p>
-    <w:p>
-      <w:r>
-        <w:rPr>
-          <w:b/>
-        </w:rPr>
-        <w:t>CONTINUITY / NEGATIVE LOCK</w:t>
-      </w:r>
-    </w:p>
-    <w:p>
-      <w:r>
-        <w:t>16:9. Keep exact approved character design, clothing, colors, proportions and environment. No modern objects, modern clothing, modern signs, modern architecture, subtitles, captions, logos, watermarks or written text inside the generated footage. No character dialogue. Do not introduce new character designs. If Flow changes a face, costume, proportions or key prop, regenerate.</w:t>
-      </w:r>
-    </w:p>
-    <w:p/>
+        <w:t>PROMPT RULES</w:t>
+      </w:r>
+    </w:p>
+    <w:p>
+      <w:r>
+        <w:t>• Template for every prompt: style, setting, action in order, camera, audio, one short constraint line. One main action per clip, and nothing else competes with it.</w:t>
+      </w:r>
+    </w:p>
+    <w:p>
+      <w:r>
+        <w:t>• Keep each prompt around 150 to 200 words (the earlier versions ran 300 to 400). Long lists of “no” words make Flow worse, so the prompts say what the camera and characters do, and keep the constraints to one line.</w:t>
+      </w:r>
+    </w:p>
+    <w:p>
+      <w:r>
+        <w:t>• Attach the reference images listed above the prompt, characters first and location last. If Flow accepts fewer images, drop the location and describe the setting in the prompt.</w:t>
+      </w:r>
+    </w:p>
+    <w:p>
+      <w:r>
+        <w:t>• Check what durations Flow offers for your model and mode. Some modes with reference images only offer 8 seconds. If so, use 8 seconds for every clip and trim in editing.</w:t>
+      </w:r>
+    </w:p>
+    <w:p>
+      <w:r>
+        <w:t>• Generate 2 or 3 takes of the important shots (2, 25, 31, 32, 36, 46, 48) and keep the best. Do not chase small imperfections in secondary movement.</w:t>
+      </w:r>
+    </w:p>
     <w:p>
       <w:pPr>
         <w:pStyle w:val="Heading1"/>
       </w:pPr>
       <w:r>
-        <w:t>SHOT 03 — Alexandria reveal</w:t>
+        <w:t>SHOT 01 — Cold open</w:t>
       </w:r>
     </w:p>
     <w:p>
@@ -369,12 +220,22 @@
     </w:p>
     <w:p>
       <w:r>
-        <w:t>08_Alexandria_City_Overview.jpg</w:t>
-      </w:r>
-    </w:p>
-    <w:p>
-      <w:r>
-        <w:t>DURATION: 8 sec (the line needs about 5–6 s of speech; trim the clip in editing)</w:t>
+        <w:t>01_Senbi.jpg</w:t>
+      </w:r>
+    </w:p>
+    <w:p>
+      <w:r>
+        <w:t>02_Bride.jpg</w:t>
+      </w:r>
+    </w:p>
+    <w:p>
+      <w:r>
+        <w:t>11_Wedding_Courtyard_Day.jpg</w:t>
+      </w:r>
+    </w:p>
+    <w:p>
+      <w:r>
+        <w:t>DURATION: LOCKED — use the already-approved Shot 1 video; do not regenerate.</w:t>
       </w:r>
     </w:p>
     <w:p>
@@ -387,7 +248,7 @@
     </w:p>
     <w:p>
       <w:r>
-        <w:t>Alexandria, 30 BC. A huge, busy city, about to have a strange evening.</w:t>
+        <w:t>Today is supposed to be the happiest day in Senbi's life.</w:t>
       </w:r>
     </w:p>
     <w:p>
@@ -400,7 +261,7 @@
     </w:p>
     <w:p>
       <w:r>
-        <w:t>Wide view of ancient Alexandria: harbor, sails, monumental buildings, palms and busy streets. Camera moves toward the wedding district. All expressions, eye movement and mouth movement are silent nonverbal acting only. No intelligible speech, no lip-sync dialogue.</w:t>
+        <w:t>LOCKED APPROVED VIDEO: use the already-generated Shot 1 exactly as approved. Do not regenerate. Preserve the existing camera, composition, Senbi, bride, wedding courtyard and timing. All expressions, eye movement and mouth movement are silent nonverbal acting only. No intelligible speech, no lip-sync dialogue.</w:t>
       </w:r>
     </w:p>
     <w:p>
@@ -413,7 +274,7 @@
     </w:p>
     <w:p>
       <w:r>
-        <w:t>Locked camera, extremely slow 5% push-in only: wide establishing shot of the Alexandria harbor and city, horizon level. No tilt, pan or orbit.</w:t>
+        <w:t>LOCKED — use the camera movement already present in the approved Shot 1 video.</w:t>
       </w:r>
     </w:p>
     <w:p>
@@ -426,7 +287,7 @@
     </w:p>
     <w:p>
       <w:r>
-        <w:t>Music: playful ancient-Mediterranean wedding music with frame drums, reed flute and plucked strings, steady upbeat tempo, the same theme in every clip, mixed low under the narrator. SFX: gulls, harbor water, distant market noise. All generated inside Flow together with the picture; the narrator stays clearly intelligible.</w:t>
+        <w:t>Festive ancient-Egyptian wedding music with a subtle mysterious undertone; wedding crowd ambience; faint distant marching texture only if it matches the approved cut.</w:t>
       </w:r>
     </w:p>
     <w:p>
@@ -439,7 +300,7 @@
     </w:p>
     <w:p>
       <w:r>
-        <w:t>Locked camera, only an extremely slow subtle push-in. 2D hand-drawn Stickman animation, clean thin black outlines, large expressive heads, simple readable stickman proportions, flat warm colors, historically inspired ancient Alexandria, playful cinematic documentary-comedy tone, 16:9, no 3D, no photorealism, no modern objects, no subtitles, no captions, no logos, no generated text, NO on-screen character dialogue (only the off-screen narrator speaks). Use the selected reference images as strict continuity anchors. Preserve faces, hair, clothing, colors, proportions and accessories exactly. Characters may move their bodies, arms, eyes and mouths for silent nonverbal acting only. VISUAL STYLE LOCK: 2D hand-drawn stickman animation; clean thin black outlines; large expressive heads; simple readable stickman proportions; flat warm colors; historically inspired ancient Alexandria; playful cinematic documentary-comedy tone; no 3D; no photorealism; no modern objects; no subtitles; no captions; no logos; no text inside the generated scene; 16:9. Cinematic wide establishing view of ancient Alexandria in 30 BC: harbor, sailing vessels, monumental architecture, palms, busy waterfront and bright Mediterranean sky. Match the exact architectural mood and color language of the reference image. 2D illustrated stickman-world animation, clean linework, warm colors, no modern objects, no text, 16:9. CAMERA: wide establishing shot of the Alexandria harbor and city, horizon level. Locked camera with only an extremely slow, subtle push-in (about 5%) over the whole clip. No tilt, no pan, no orbit, no rising or overhead view; the subject stays in the same position in the frame. AUDIO (generate sound together with the picture): Off-screen male narrator voice-over, warm intelligent British documentary voice with dry comedic timing, the same voice in every clip, begins speaking within the first half second and says exactly: “Alexandria, 30 BC. A huge, busy city, about to have a strange evening.” The narrator is heard off-screen only; no character lip-syncs to the narrator. Music: playful ancient-Mediterranean wedding music with frame drums, reed flute and plucked strings, steady upbeat tempo, the same theme in every clip, mixed low under the narrator. Sound effects: gulls, harbor water, distant market noise. No subtitles or captions.</w:t>
+        <w:t>2D hand-drawn Stickman animation, clean thin black outlines, large expressive heads, simple readable stickman proportions, flat warm colors, historically inspired ancient Alexandria, playful cinematic documentary-comedy tone, 16:9, no 3D, no photorealism, no modern objects, no subtitles, no captions, no logos, no generated text, NO character dialogue. Use the selected reference images as strict continuity anchors. Preserve faces, hair, clothing, colors, proportions and accessories exactly. Characters may move their bodies, arms, eyes and mouths for silent nonverbal acting only. Use the already-approved Shot 1 video as the continuity master. Do not redesign or reinterpret the shot. Preserve the exact existing wedding composition, Senbi and bride appearance, background, framing and motion. No character speech.</w:t>
       </w:r>
     </w:p>
     <w:p>
@@ -461,7 +322,7 @@
         <w:pStyle w:val="Heading1"/>
       </w:pPr>
       <w:r>
-        <w:t>SHOT 04 — Title joke</w:t>
+        <w:t>SHOT 02 — The suspicious sound</w:t>
       </w:r>
     </w:p>
     <w:p>
@@ -479,6 +340,11 @@
     </w:p>
     <w:p>
       <w:r>
+        <w:t>03_Egyptian_Guests.jpg</w:t>
+      </w:r>
+    </w:p>
+    <w:p>
+      <w:r>
         <w:t>DURATION: 8 sec (the line needs about 5–6 s of speech; trim the clip in editing)</w:t>
       </w:r>
     </w:p>
@@ -492,7 +358,7 @@
     </w:p>
     <w:p>
       <w:r>
-        <w:t>“Last day of Ancient Egypt”? Relax. Egypt survived. Its queen, less so.</w:t>
+        <w:t>Then, for half a beat, the dancing stopped. Nobody noticed. Except one guest.</w:t>
       </w:r>
     </w:p>
     <w:p>
@@ -505,7 +371,7 @@
     </w:p>
     <w:p>
       <w:r>
-        <w:t>Wedding continues while a parchment-style title appears briefly. The narrator immediately undercuts it. All expressions, eye movement and mouth movement are silent nonverbal acting only. No intelligible speech, no lip-sync dialogue.</w:t>
+        <w:t>Dancers fill the floor, fully visible from feet to heads, clapping and spinning. At about 2 seconds every dancer pauses for half a beat. One guest turns his head toward the open gate at the back; the others resume dancing a moment later. All expressions and mouth movement are silent acting only; no one on screen speaks.</w:t>
       </w:r>
     </w:p>
     <w:p>
@@ -518,7 +384,7 @@
     </w:p>
     <w:p>
       <w:r>
-        <w:t>Static, locked-off: eye-level medium-wide shot of the wedding courtyard. No tilt, pan, zoom or orbit.</w:t>
+        <w:t>Static, locked-off: eye-level medium-wide shot, the dancers fully visible from feet to heads (NOT a feet close-up). No tilt, pan, zoom or orbit.</w:t>
       </w:r>
     </w:p>
     <w:p>
@@ -531,7 +397,7 @@
     </w:p>
     <w:p>
       <w:r>
-        <w:t>Music: playful ancient-Mediterranean wedding music with frame drums, reed flute and plucked strings, steady upbeat tempo, the same theme in every clip, mixed low under the narrator. SFX: wedding crowd chatter, one short comic sting. All generated inside Flow together with the picture; the narrator stays clearly intelligible.</w:t>
+        <w:t>Music: playful ancient-Mediterranean wedding music with frame drums, reed flute and plucked strings, steady upbeat tempo, the same theme in every clip, mixed low under the narrator and a faint uneasy undertone. SFX: dancing feet on stone, one tiny pause, faint distant thump. All generated inside Flow together with the picture; the narrator stays clearly intelligible.</w:t>
       </w:r>
     </w:p>
     <w:p>
@@ -544,7 +410,7 @@
     </w:p>
     <w:p>
       <w:r>
-        <w:t>Locked-off static camera, no camera movement. 2D hand-drawn Stickman animation, clean thin black outlines, large expressive heads, simple readable stickman proportions, flat warm colors, historically inspired ancient Alexandria, playful cinematic documentary-comedy tone, 16:9, no 3D, no photorealism, no modern objects, no subtitles, no captions, no logos, no generated text, NO on-screen character dialogue (only the off-screen narrator speaks). Use the selected reference images as strict continuity anchors. Preserve faces, hair, clothing, colors, proportions and accessories exactly. Characters may move their bodies, arms, eyes and mouths for silent nonverbal acting only. VISUAL STYLE LOCK: 2D hand-drawn stickman animation; clean thin black outlines; large expressive heads; simple readable stickman proportions; flat warm colors; historically inspired ancient Alexandria; playful cinematic documentary-comedy tone; no 3D; no photorealism; no modern objects; no subtitles; no captions; no logos; no text inside the generated scene; 16:9. Return immediately to the lively wedding courtyard. The celebration continues as if nothing is wrong. The visual should support a quick comedic title-card moment added later in editing; do NOT generate any written title inside the video. 2D stickman animation, thin clean lines, warm colors, festive Alexandria wedding, no text, 16:9. CAMERA: locked-off static camera on a tripod, eye-level medium-wide shot of the wedding courtyard. No camera movement of any kind: no tilt, no pan, no zoom, no push, no pull, no orbit, no tracking, no rising or overhead view. The framing stays identical from the first frame to the last frame; all movement comes from the characters. AUDIO (generate sound together with the picture): Off-screen male narrator voice-over, warm intelligent British documentary voice with dry comedic timing, the same voice in every clip, begins speaking within the first half second and says exactly: ““Last day of Ancient Egypt”? Relax. Egypt survived. Its queen, less so.” The narrator is heard off-screen only; no character lip-syncs to the narrator. Music: playful ancient-Mediterranean wedding music with frame drums, reed flute and plucked strings, steady upbeat tempo, the same theme in every clip, mixed low under the narrator. Sound effects: wedding crowd chatter, one short comic sting. No subtitles or captions.</w:t>
+        <w:t>2D hand-drawn stickman cartoon in the exact style of the reference images: thin black outlines, large expressive heads, thin stick arms, flat warm colors, playful documentary-comedy tone, 16:9. Setting: sunny daytime wedding courtyard in ancient Alexandria, sandstone columns, striped awnings, feast tables along the side walls, an open entrance gate at the back. Dancers fill the floor, fully visible from feet to heads, clapping and spinning. At about 2 seconds every dancer pauses for half a beat. One guest turns his head toward the open gate at the back; the others resume dancing a moment later. Camera: locked-off and perfectly still, eye-level medium-wide shot, the dancers fully visible from feet to heads (NOT a feet close-up); the framing never changes (no tilt, pan, zoom or rising camera). Audio: off-screen British male narrator, warm and dry, begins speaking within half a second and says: “Then, for half a beat, the dancing stopped. Nobody noticed. Except one guest.” Music: light ancient-Mediterranean wedding music (frame drums, reed flute, plucked strings) with a faint uneasy undertone, same theme in every clip, low under the voice. Sound effects: dancing feet on stone, one tiny pause, faint distant thump. Characters keep their exact reference designs. Nobody on screen speaks. No text, captions or logos in the frame.</w:t>
       </w:r>
     </w:p>
     <w:p>
@@ -566,7 +432,7 @@
         <w:pStyle w:val="Heading1"/>
       </w:pPr>
       <w:r>
-        <w:t>SHOT 05 — Meet Senbi</w:t>
+        <w:t>SHOT 03 — Alexandria reveal</w:t>
       </w:r>
     </w:p>
     <w:p>
@@ -579,12 +445,7 @@
     </w:p>
     <w:p>
       <w:r>
-        <w:t>01_Senbi.jpg</w:t>
-      </w:r>
-    </w:p>
-    <w:p>
-      <w:r>
-        <w:t>10_Noble_House_Wedding_Location.jpg</w:t>
+        <w:t>08_Alexandria_City_Overview.jpg</w:t>
       </w:r>
     </w:p>
     <w:p>
@@ -602,7 +463,7 @@
     </w:p>
     <w:p>
       <w:r>
-        <w:t>Meet Senbi. He's getting married today, and has checked the mirror forty times.</w:t>
+        <w:t>Alexandria, 30 BC. A huge, busy city, about to have a strange evening.</w:t>
       </w:r>
     </w:p>
     <w:p>
@@ -615,7 +476,7 @@
     </w:p>
     <w:p>
       <w:r>
-        <w:t>Senbi proudly checks himself in a mirror, wearing the established white linen, blue-and-gold collar, sash and sandals. All expressions, eye movement and mouth movement are silent nonverbal acting only. No intelligible speech, no lip-sync dialogue.</w:t>
+        <w:t>Wide establishing view: sailboats gliding, gulls crossing the sky, the great lighthouse and white monumental buildings behind, palms in the foreground, bright Mediterranean sky. All expressions and mouth movement are silent acting only; no one on screen speaks.</w:t>
       </w:r>
     </w:p>
     <w:p>
@@ -628,7 +489,7 @@
     </w:p>
     <w:p>
       <w:r>
-        <w:t>Locked camera, extremely slow 5% push-in only: eye-level medium shot of Senbi at the mirror. No tilt, pan or orbit.</w:t>
+        <w:t>Locked camera, extremely slow 5% push-in only: wide establishing shot of the Alexandria harbor and city, horizon level. No tilt, pan or orbit.</w:t>
       </w:r>
     </w:p>
     <w:p>
@@ -641,7 +502,7 @@
     </w:p>
     <w:p>
       <w:r>
-        <w:t>Music: playful ancient-Mediterranean wedding music with frame drums, reed flute and plucked strings, steady upbeat tempo, the same theme in every clip, mixed low under the narrator. SFX: small fabric rustle, soft room tone. All generated inside Flow together with the picture; the narrator stays clearly intelligible.</w:t>
+        <w:t>Music: playful ancient-Mediterranean wedding music with frame drums, reed flute and plucked strings, steady upbeat tempo, the same theme in every clip, mixed low under the narrator. SFX: gulls, harbor water, distant market noise. All generated inside Flow together with the picture; the narrator stays clearly intelligible.</w:t>
       </w:r>
     </w:p>
     <w:p>
@@ -654,7 +515,7 @@
     </w:p>
     <w:p>
       <w:r>
-        <w:t>Locked camera, only an extremely slow subtle push-in. 2D hand-drawn Stickman animation, clean thin black outlines, large expressive heads, simple readable stickman proportions, flat warm colors, historically inspired ancient Alexandria, playful cinematic documentary-comedy tone, 16:9, no 3D, no photorealism, no modern objects, no subtitles, no captions, no logos, no generated text, NO on-screen character dialogue (only the off-screen narrator speaks). Use the selected reference images as strict continuity anchors. Preserve faces, hair, clothing, colors, proportions and accessories exactly. Characters may move their bodies, arms, eyes and mouths for silent nonverbal acting only. VISUAL STYLE LOCK: 2D hand-drawn stickman animation; clean thin black outlines; large expressive heads; simple readable stickman proportions; flat warm colors; historically inspired ancient Alexandria; playful cinematic documentary-comedy tone; no 3D; no photorealism; no modern objects; no subtitles; no captions; no logos; no text inside the generated scene; 16:9. Senbi stands inside the wedding location, proudly checking his appearance before the ceremony. He looks excited and slightly nervous, adjusts his blue-and-gold ceremonial collar and checks his sash. Preserve the exact Senbi character design, hairstyle, face, proportions, clothing and colors from the reference. 2D stickman animation, no subtitles, no text, 16:9. CAMERA: eye-level medium shot of Senbi at the mirror. Locked camera with only an extremely slow, subtle push-in (about 5%) over the whole clip. No tilt, no pan, no orbit, no rising or overhead view; the subject stays in the same position in the frame. AUDIO (generate sound together with the picture): Off-screen male narrator voice-over, warm intelligent British documentary voice with dry comedic timing, the same voice in every clip, begins speaking within the first half second and says exactly: “Meet Senbi. He's getting married today, and has checked the mirror forty times.” The narrator is heard off-screen only; no character lip-syncs to the narrator. Music: playful ancient-Mediterranean wedding music with frame drums, reed flute and plucked strings, steady upbeat tempo, the same theme in every clip, mixed low under the narrator. Sound effects: small fabric rustle, soft room tone. No subtitles or captions.</w:t>
+        <w:t>2D hand-drawn stickman cartoon in the exact style of the reference images: thin black outlines, large expressive heads, thin stick arms, flat warm colors, playful documentary-comedy tone, 16:9. Setting: ancient Alexandria harbor. Wide establishing view: sailboats gliding, gulls crossing the sky, the great lighthouse and white monumental buildings behind, palms in the foreground, bright Mediterranean sky. Camera: wide establishing shot of the Alexandria harbor and city, horizon level; fixed except for an almost imperceptible 5% slow push-in, no tilt or pan. Audio: off-screen British male narrator, warm and dry, begins speaking within half a second and says: “Alexandria, 30 BC. A huge, busy city, about to have a strange evening.” Music: light ancient-Mediterranean wedding music (frame drums, reed flute, plucked strings), same theme in every clip, low under the voice. Sound effects: gulls, harbor water, distant market noise. Characters keep their exact reference designs. Nobody on screen speaks. No text, captions or logos in the frame.</w:t>
       </w:r>
     </w:p>
     <w:p>
@@ -676,7 +537,7 @@
         <w:pStyle w:val="Heading1"/>
       </w:pPr>
       <w:r>
-        <w:t>SHOT 06 — Groom preparation</w:t>
+        <w:t>SHOT 04 — Title joke</w:t>
       </w:r>
     </w:p>
     <w:p>
@@ -689,7 +550,7 @@
     </w:p>
     <w:p>
       <w:r>
-        <w:t>01_Senbi.jpg</w:t>
+        <w:t>11_Wedding_Courtyard_Day.jpg</w:t>
       </w:r>
     </w:p>
     <w:p>
@@ -707,7 +568,7 @@
     </w:p>
     <w:p>
       <w:r>
-        <w:t>Every groom has one job: look incredible, and pretend it took no effort.</w:t>
+        <w:t>“Last day of Ancient Egypt”? Relax. Egypt survived. Its queen, less so.</w:t>
       </w:r>
     </w:p>
     <w:p>
@@ -720,7 +581,7 @@
     </w:p>
     <w:p>
       <w:r>
-        <w:t>Senbi checks a grooming razor, fixes his wig/headwear and adjusts his perfume accessory. Keep grooming implied, not graphic. All expressions, eye movement and mouth movement are silent nonverbal acting only. No intelligible speech, no lip-sync dialogue.</w:t>
+        <w:t>The wedding goes on as if nothing is wrong: guests dance and clap, Senbi and the bride among them. Keep the upper third of the frame calm and uncluttered. All expressions and mouth movement are silent acting only; no one on screen speaks.</w:t>
       </w:r>
     </w:p>
     <w:p>
@@ -733,7 +594,7 @@
     </w:p>
     <w:p>
       <w:r>
-        <w:t>Static, locked-off: eye-level full-body medium shot of Senbi; all three actions happen inside the same frame. No tilt, pan, zoom or orbit.</w:t>
+        <w:t>Static, locked-off: eye-level medium-wide shot of the wedding courtyard. No tilt, pan, zoom or orbit.</w:t>
       </w:r>
     </w:p>
     <w:p>
@@ -746,7 +607,7 @@
     </w:p>
     <w:p>
       <w:r>
-        <w:t>Music: playful comic percussion over the wedding rhythm, mixed low under the narrator. SFX: light razor scrape, one comic boing. All generated inside Flow together with the picture; the narrator stays clearly intelligible.</w:t>
+        <w:t>Music: playful ancient-Mediterranean wedding music with frame drums, reed flute and plucked strings, steady upbeat tempo, the same theme in every clip, mixed low under the narrator. SFX: wedding crowd chatter, one short comic sting. All generated inside Flow together with the picture; the narrator stays clearly intelligible.</w:t>
       </w:r>
     </w:p>
     <w:p>
@@ -759,7 +620,7 @@
     </w:p>
     <w:p>
       <w:r>
-        <w:t>Locked-off static camera, no camera movement. 2D hand-drawn Stickman animation, clean thin black outlines, large expressive heads, simple readable stickman proportions, flat warm colors, historically inspired ancient Alexandria, playful cinematic documentary-comedy tone, 16:9, no 3D, no photorealism, no modern objects, no subtitles, no captions, no logos, no generated text, NO on-screen character dialogue (only the off-screen narrator speaks). Use the selected reference images as strict continuity anchors. Preserve faces, hair, clothing, colors, proportions and accessories exactly. Characters may move their bodies, arms, eyes and mouths for silent nonverbal acting only. VISUAL STYLE LOCK: 2D hand-drawn stickman animation; clean thin black outlines; large expressive heads; simple readable stickman proportions; flat warm colors; historically inspired ancient Alexandria; playful cinematic documentary-comedy tone; no 3D; no photorealism; no modern objects; no subtitles; no captions; no logos; no text inside the generated scene; 16:9. Senbi performs three quick grooming actions: checks a traditional grooming razor, adjusts his ceremonial hair/headwear, then fixes his collar and sash. Keep everything family-friendly and non-graphic. Preserve his exact appearance and costume. 2D hand-drawn stickman animation, clean thin outlines, warm colors, no modern objects, no text, 16:9. Three short readable actions ending with an overconfident pose. CAMERA: locked-off static camera on a tripod, eye-level full-body medium shot of Senbi; all three actions happen inside the same frame. No camera movement of any kind: no tilt, no pan, no zoom, no push, no pull, no orbit, no tracking, no rising or overhead view. The framing stays identical from the first frame to the last frame; all movement comes from the characters. AUDIO (generate sound together with the picture): Off-screen male narrator voice-over, warm intelligent British documentary voice with dry comedic timing, the same voice in every clip, begins speaking within the first half second and says exactly: “Every groom has one job: look incredible, and pretend it took no effort.” The narrator is heard off-screen only; no character lip-syncs to the narrator. Music: playful comic percussion over the wedding rhythm, mixed low under the narrator. Sound effects: light razor scrape, one comic boing. No subtitles or captions.</w:t>
+        <w:t>2D hand-drawn stickman cartoon in the exact style of the reference images: thin black outlines, large expressive heads, thin stick arms, flat warm colors, playful documentary-comedy tone, 16:9. Setting: sunny daytime wedding courtyard in ancient Alexandria, sandstone columns, striped awnings, feast tables along the side walls, an open entrance gate at the back. The wedding goes on as if nothing is wrong: guests dance and clap, Senbi and the bride among them. Keep the upper third of the frame calm and uncluttered. Camera: locked-off and perfectly still, eye-level medium-wide shot of the wedding courtyard; the framing never changes (no tilt, pan, zoom or rising camera). Audio: off-screen British male narrator, warm and dry, begins speaking within half a second and says: ““Last day of Ancient Egypt”? Relax. Egypt survived. Its queen, less so.” Music: light ancient-Mediterranean wedding music (frame drums, reed flute, plucked strings), same theme in every clip, low under the voice. Sound effects: wedding crowd chatter, one short comic sting. Characters keep their exact reference designs. Nobody on screen speaks. No text, captions or logos in the frame.</w:t>
       </w:r>
     </w:p>
     <w:p>
@@ -781,7 +642,7 @@
         <w:pStyle w:val="Heading1"/>
       </w:pPr>
       <w:r>
-        <w:t>SHOT 07 — Bride reveal</w:t>
+        <w:t>SHOT 05 — Meet Senbi</w:t>
       </w:r>
     </w:p>
     <w:p>
@@ -794,7 +655,7 @@
     </w:p>
     <w:p>
       <w:r>
-        <w:t>02_Bride.jpg</w:t>
+        <w:t>01_Senbi.jpg</w:t>
       </w:r>
     </w:p>
     <w:p>
@@ -817,7 +678,7 @@
     </w:p>
     <w:p>
       <w:r>
-        <w:t>His bride had been ready for an hour. She was the calm one.</w:t>
+        <w:t>Meet Senbi. He's getting married today, and has checked the mirror forty times.</w:t>
       </w:r>
     </w:p>
     <w:p>
@@ -830,7 +691,7 @@
     </w:p>
     <w:p>
       <w:r>
-        <w:t>Bride prepares before a mirror, adjusting her headpiece and eye makeup, then gives herself a confident look. All expressions, eye movement and mouth movement are silent nonverbal acting only. No intelligible speech, no lip-sync dialogue.</w:t>
+        <w:t>Senbi stands before a bronze mirror. He straightens his blue-and-gold collar, checks his sash, practices a proud smile, then wipes his forehead with the back of his hand. All expressions and mouth movement are silent acting only; no one on screen speaks.</w:t>
       </w:r>
     </w:p>
     <w:p>
@@ -843,7 +704,7 @@
     </w:p>
     <w:p>
       <w:r>
-        <w:t>Locked camera, extremely slow 5% push-in only: eye-level medium shot of the bride at the mirror. No tilt, pan or orbit.</w:t>
+        <w:t>Locked camera, extremely slow 5% push-in only: eye-level medium shot of Senbi at the mirror. No tilt, pan or orbit.</w:t>
       </w:r>
     </w:p>
     <w:p>
@@ -856,7 +717,7 @@
     </w:p>
     <w:p>
       <w:r>
-        <w:t>Music: playful ancient-Mediterranean wedding music with frame drums, reed flute and plucked strings, steady upbeat tempo, the same theme in every clip, mixed low under the narrator. SFX: soft jewelry jingle. All generated inside Flow together with the picture; the narrator stays clearly intelligible.</w:t>
+        <w:t>Music: playful ancient-Mediterranean wedding music with frame drums, reed flute and plucked strings, steady upbeat tempo, the same theme in every clip, mixed low under the narrator. SFX: small fabric rustle, soft room tone. All generated inside Flow together with the picture; the narrator stays clearly intelligible.</w:t>
       </w:r>
     </w:p>
     <w:p>
@@ -869,7 +730,7 @@
     </w:p>
     <w:p>
       <w:r>
-        <w:t>Locked camera, only an extremely slow subtle push-in. 2D hand-drawn Stickman animation, clean thin black outlines, large expressive heads, simple readable stickman proportions, flat warm colors, historically inspired ancient Alexandria, playful cinematic documentary-comedy tone, 16:9, no 3D, no photorealism, no modern objects, no subtitles, no captions, no logos, no generated text, NO on-screen character dialogue (only the off-screen narrator speaks). Use the selected reference images as strict continuity anchors. Preserve faces, hair, clothing, colors, proportions and accessories exactly. Characters may move their bodies, arms, eyes and mouths for silent nonverbal acting only. VISUAL STYLE LOCK: 2D hand-drawn stickman animation; clean thin black outlines; large expressive heads; simple readable stickman proportions; flat warm colors; historically inspired ancient Alexandria; playful cinematic documentary-comedy tone; no 3D; no photorealism; no modern objects; no subtitles; no captions; no logos; no text inside the generated scene; 16:9. The bride prepares inside the wedding location. She checks herself in a mirror, adjusts her gold-and-black headpiece and jewelry, then gives herself a confident, happy look. Preserve her exact hair, face, white linen dress, gold accessories and proportions from the reference. 2D stickman animation, clean linework, warm Egyptian palette, no text, 16:9. CAMERA: eye-level medium shot of the bride at the mirror. Locked camera with only an extremely slow, subtle push-in (about 5%) over the whole clip. No tilt, no pan, no orbit, no rising or overhead view; the subject stays in the same position in the frame. AUDIO (generate sound together with the picture): Off-screen male narrator voice-over, warm intelligent British documentary voice with dry comedic timing, the same voice in every clip, begins speaking within the first half second and says exactly: “His bride had been ready for an hour. She was the calm one.” The narrator is heard off-screen only; no character lip-syncs to the narrator. Music: playful ancient-Mediterranean wedding music with frame drums, reed flute and plucked strings, steady upbeat tempo, the same theme in every clip, mixed low under the narrator. Sound effects: soft jewelry jingle. No subtitles or captions.</w:t>
+        <w:t>2D hand-drawn stickman cartoon in the exact style of the reference images: thin black outlines, large expressive heads, thin stick arms, flat warm colors, playful documentary-comedy tone, 16:9. Setting: a noble house room in ancient Alexandria with warm sandstone walls. Senbi stands before a bronze mirror. He straightens his blue-and-gold collar, checks his sash, practices a proud smile, then wipes his forehead with the back of his hand. Camera: eye-level medium shot of Senbi at the mirror; fixed except for an almost imperceptible 5% slow push-in, no tilt or pan. Audio: off-screen British male narrator, warm and dry, begins speaking within half a second and says: “Meet Senbi. He's getting married today, and has checked the mirror forty times.” Music: light ancient-Mediterranean wedding music (frame drums, reed flute, plucked strings), same theme in every clip, low under the voice. Sound effects: small fabric rustle, soft room tone. Characters keep their exact reference designs. Nobody on screen speaks. No text, captions or logos in the frame.</w:t>
       </w:r>
     </w:p>
     <w:p>
@@ -891,7 +752,7 @@
         <w:pStyle w:val="Heading1"/>
       </w:pPr>
       <w:r>
-        <w:t>SHOT 08 — Marriage contract</w:t>
+        <w:t>SHOT 06 — Groom preparation</w:t>
       </w:r>
     </w:p>
     <w:p>
@@ -904,17 +765,7 @@
     </w:p>
     <w:p>
       <w:r>
-        <w:t>02_Bride.jpg</w:t>
-      </w:r>
-    </w:p>
-    <w:p>
-      <w:r>
-        <w:t>04_Parents_and_Relatives.jpg</w:t>
-      </w:r>
-    </w:p>
-    <w:p>
-      <w:r>
-        <w:t>10_Noble_House_Wedding_Location.jpg</w:t>
+        <w:t>01_Senbi.jpg</w:t>
       </w:r>
     </w:p>
     <w:p>
@@ -932,7 +783,7 @@
     </w:p>
     <w:p>
       <w:r>
-        <w:t>Then, paperwork. Real contracts survive: property, money, who owes what. Romance, with receipts.</w:t>
+        <w:t>Every groom has one job: look incredible, and pretend it took no effort.</w:t>
       </w:r>
     </w:p>
     <w:p>
@@ -945,7 +796,7 @@
     </w:p>
     <w:p>
       <w:r>
-        <w:t>Close-up of a scribe preparing a papyrus marriage document; bride and family take it seriously. All expressions, eye movement and mouth movement are silent nonverbal acting only. No intelligible speech, no lip-sync dialogue.</w:t>
+        <w:t>Senbi, full body. First he inspects a small bronze razor and runs a hand over his chin. Then he straightens his headband. Finally he adjusts his collar and strikes an overconfident hands-on-hips pose. All expressions and mouth movement are silent acting only; no one on screen speaks.</w:t>
       </w:r>
     </w:p>
     <w:p>
@@ -958,7 +809,7 @@
     </w:p>
     <w:p>
       <w:r>
-        <w:t>Static, locked-off: eye-level medium two-shot: the scribe, the papyrus and the bride all in the same frame. No tilt, pan, zoom or orbit.</w:t>
+        <w:t>Static, locked-off: eye-level full-body medium shot of Senbi; all three actions happen inside the same frame. No tilt, pan, zoom or orbit.</w:t>
       </w:r>
     </w:p>
     <w:p>
@@ -971,7 +822,7 @@
     </w:p>
     <w:p>
       <w:r>
-        <w:t>Music: playful ancient-Mediterranean wedding music with frame drums, reed flute and plucked strings, steady upbeat tempo, the same theme in every clip, mixed low under the narrator. SFX: papyrus rustle, quill scratching. All generated inside Flow together with the picture; the narrator stays clearly intelligible.</w:t>
+        <w:t>Music: playful comic percussion over the wedding rhythm, mixed low under the narrator. SFX: light razor scrape, one comic boing. All generated inside Flow together with the picture; the narrator stays clearly intelligible.</w:t>
       </w:r>
     </w:p>
     <w:p>
@@ -984,7 +835,7 @@
     </w:p>
     <w:p>
       <w:r>
-        <w:t>Locked-off static camera, no camera movement. 2D hand-drawn Stickman animation, clean thin black outlines, large expressive heads, simple readable stickman proportions, flat warm colors, historically inspired ancient Alexandria, playful cinematic documentary-comedy tone, 16:9, no 3D, no photorealism, no modern objects, no subtitles, no captions, no logos, no generated text, NO on-screen character dialogue (only the off-screen narrator speaks). Use the selected reference images as strict continuity anchors. Preserve faces, hair, clothing, colors, proportions and accessories exactly. Characters may move their bodies, arms, eyes and mouths for silent nonverbal acting only. VISUAL STYLE LOCK: 2D hand-drawn stickman animation; clean thin black outlines; large expressive heads; simple readable stickman proportions; flat warm colors; historically inspired ancient Alexandria; playful cinematic documentary-comedy tone; no 3D; no photorealism; no modern objects; no subtitles; no captions; no logos; no text inside the generated scene; 16:9. A family member and bride examine a papyrus marriage document while the groom's side waits nearby. The atmosphere is serious for a moment, contrasting with the party. Do not show readable modern writing. Use historically inspired papyrus and clothing. 2D stickman animation, clean thin outlines, no subtitles, no text, 16:9. CAMERA: locked-off static camera on a tripod, eye-level medium two-shot: the scribe, the papyrus and the bride all in the same frame. No camera movement of any kind: no tilt, no pan, no zoom, no push, no pull, no orbit, no tracking, no rising or overhead view. The framing stays identical from the first frame to the last frame; all movement comes from the characters. AUDIO (generate sound together with the picture): Off-screen male narrator voice-over, warm intelligent British documentary voice with dry comedic timing, the same voice in every clip, begins speaking within the first half second and says exactly: “Then, paperwork. Real contracts survive: property, money, who owes what. Romance, with receipts.” The narrator is heard off-screen only; no character lip-syncs to the narrator. Music: playful ancient-Mediterranean wedding music with frame drums, reed flute and plucked strings, steady upbeat tempo, the same theme in every clip, mixed low under the narrator. Sound effects: papyrus rustle, quill scratching. No subtitles or captions.</w:t>
+        <w:t>2D hand-drawn stickman cartoon in the exact style of the reference images: thin black outlines, large expressive heads, thin stick arms, flat warm colors, playful documentary-comedy tone, 16:9. Setting: a noble house room in ancient Alexandria with warm sandstone walls. Senbi, full body. First he inspects a small bronze razor and runs a hand over his chin. Then he straightens his headband. Finally he adjusts his collar and strikes an overconfident hands-on-hips pose. Camera: locked-off and perfectly still, eye-level full-body medium shot of Senbi; all three actions happen inside the same frame; the framing never changes (no tilt, pan, zoom or rising camera). Audio: off-screen British male narrator, warm and dry, begins speaking within half a second and says: “Every groom has one job: look incredible, and pretend it took no effort.” Music: playful comic percussion over the wedding rhythm, low under the voice. Sound effects: light razor scrape, one comic boing. Characters keep their exact reference designs. Nobody on screen speaks. No text, captions or logos in the frame.</w:t>
       </w:r>
     </w:p>
     <w:p>
@@ -1006,7 +857,7 @@
         <w:pStyle w:val="Heading1"/>
       </w:pPr>
       <w:r>
-        <w:t>SHOT 09 — The feast</w:t>
+        <w:t>SHOT 07 — Bride reveal</w:t>
       </w:r>
     </w:p>
     <w:p>
@@ -1019,17 +870,12 @@
     </w:p>
     <w:p>
       <w:r>
-        <w:t>03_Egyptian_Guests.jpg</w:t>
-      </w:r>
-    </w:p>
-    <w:p>
-      <w:r>
-        <w:t>11_Wedding_Courtyard_Day.jpg</w:t>
-      </w:r>
-    </w:p>
-    <w:p>
-      <w:r>
-        <w:t>12_Interior_Feast_Night.jpg</w:t>
+        <w:t>02_Bride.jpg</w:t>
+      </w:r>
+    </w:p>
+    <w:p>
+      <w:r>
+        <w:t>10_Noble_House_Wedding_Location.jpg</w:t>
       </w:r>
     </w:p>
     <w:p>
@@ -1047,7 +893,7 @@
     </w:p>
     <w:p>
       <w:r>
-        <w:t>Bread, figs, roast goose, and beer, basically a food group. Someone was stealing.</w:t>
+        <w:t>His bride had been ready for an hour. She was the calm one.</w:t>
       </w:r>
     </w:p>
     <w:p>
@@ -1060,7 +906,7 @@
     </w:p>
     <w:p>
       <w:r>
-        <w:t>Long feast table with flatbread, roasted bird, figs, dates, vegetables, bowls and beer vessels. A guest sneaks food. All expressions, eye movement and mouth movement are silent nonverbal acting only. No intelligible speech, no lip-sync dialogue.</w:t>
+        <w:t>The bride stands at a bronze mirror. She adjusts her gold headband, touches her dark eye makeup, then gives herself a calm, confident nod. All expressions and mouth movement are silent acting only; no one on screen speaks.</w:t>
       </w:r>
     </w:p>
     <w:p>
@@ -1073,7 +919,7 @@
     </w:p>
     <w:p>
       <w:r>
-        <w:t>Static, locked-off: eye-level wide-medium shot of the whole feast table; the sneaky guest stays in frame. No tilt, pan, zoom or orbit.</w:t>
+        <w:t>Locked camera, extremely slow 5% push-in only: eye-level medium shot of the bride at the mirror. No tilt, pan or orbit.</w:t>
       </w:r>
     </w:p>
     <w:p>
@@ -1086,7 +932,7 @@
     </w:p>
     <w:p>
       <w:r>
-        <w:t>Music: playful ancient-Mediterranean wedding music with frame drums, reed flute and plucked strings, steady upbeat tempo, the same theme in every clip, mixed low under the narrator. SFX: plates, cups, cheerful chatter. All generated inside Flow together with the picture; the narrator stays clearly intelligible.</w:t>
+        <w:t>Music: playful ancient-Mediterranean wedding music with frame drums, reed flute and plucked strings, steady upbeat tempo, the same theme in every clip, mixed low under the narrator. SFX: soft jewelry jingle. All generated inside Flow together with the picture; the narrator stays clearly intelligible.</w:t>
       </w:r>
     </w:p>
     <w:p>
@@ -1099,7 +945,7 @@
     </w:p>
     <w:p>
       <w:r>
-        <w:t>Locked-off static camera, no camera movement. 2D hand-drawn Stickman animation, clean thin black outlines, large expressive heads, simple readable stickman proportions, flat warm colors, historically inspired ancient Alexandria, playful cinematic documentary-comedy tone, 16:9, no 3D, no photorealism, no modern objects, no subtitles, no captions, no logos, no generated text, NO on-screen character dialogue (only the off-screen narrator speaks). Use the selected reference images as strict continuity anchors. Preserve faces, hair, clothing, colors, proportions and accessories exactly. Characters may move their bodies, arms, eyes and mouths for silent nonverbal acting only. VISUAL STYLE LOCK: 2D hand-drawn stickman animation; clean thin black outlines; large expressive heads; simple readable stickman proportions; flat warm colors; historically inspired ancient Alexandria; playful cinematic documentary-comedy tone; no 3D; no photorealism; no modern objects; no subtitles; no captions; no logos; no text inside the generated scene; 16:9. Show a richly loaded ancient Egyptian wedding feast: flatbread, roasted bird, figs, dates, vegetables, bowls, fruit and traditional beer vessels arranged across a long table. Egyptian guests move around the food and celebrate. Keep food visually abundant but historically inspired. 2D stickman animation, clean thin outlines, warm colors, no modern objects, no text, 16:9. CAMERA: locked-off static camera on a tripod, eye-level wide-medium shot of the whole feast table; the sneaky guest stays in frame. No camera movement of any kind: no tilt, no pan, no zoom, no push, no pull, no orbit, no tracking, no rising or overhead view. The framing stays identical from the first frame to the last frame; all movement comes from the characters. AUDIO (generate sound together with the picture): Off-screen male narrator voice-over, warm intelligent British documentary voice with dry comedic timing, the same voice in every clip, begins speaking within the first half second and says exactly: “Bread, figs, roast goose, and beer, basically a food group. Someone was stealing.” The narrator is heard off-screen only; no character lip-syncs to the narrator. Music: playful ancient-Mediterranean wedding music with frame drums, reed flute and plucked strings, steady upbeat tempo, the same theme in every clip, mixed low under the narrator. Sound effects: plates, cups, cheerful chatter. No subtitles or captions.</w:t>
+        <w:t>2D hand-drawn stickman cartoon in the exact style of the reference images: thin black outlines, large expressive heads, thin stick arms, flat warm colors, playful documentary-comedy tone, 16:9. Setting: a noble house room in ancient Alexandria with warm sandstone walls. The bride stands at a bronze mirror. She adjusts her gold headband, touches her dark eye makeup, then gives herself a calm, confident nod. Camera: eye-level medium shot of the bride at the mirror; fixed except for an almost imperceptible 5% slow push-in, no tilt or pan. Audio: off-screen British male narrator, warm and dry, begins speaking within half a second and says: “His bride had been ready for an hour. She was the calm one.” Music: light ancient-Mediterranean wedding music (frame drums, reed flute, plucked strings), same theme in every clip, low under the voice. Sound effects: soft jewelry jingle. Characters keep their exact reference designs. Nobody on screen speaks. No text, captions or logos in the frame.</w:t>
       </w:r>
     </w:p>
     <w:p>
@@ -1121,7 +967,7 @@
         <w:pStyle w:val="Heading1"/>
       </w:pPr>
       <w:r>
-        <w:t>SHOT 10 — The cat</w:t>
+        <w:t>SHOT 08 — Marriage contract</w:t>
       </w:r>
     </w:p>
     <w:p>
@@ -1134,12 +980,17 @@
     </w:p>
     <w:p>
       <w:r>
-        <w:t>07_Animals.jpg</w:t>
-      </w:r>
-    </w:p>
-    <w:p>
-      <w:r>
-        <w:t>11_Wedding_Courtyard_Day.jpg</w:t>
+        <w:t>02_Bride.jpg</w:t>
+      </w:r>
+    </w:p>
+    <w:p>
+      <w:r>
+        <w:t>04_Parents_and_Relatives.jpg</w:t>
+      </w:r>
+    </w:p>
+    <w:p>
+      <w:r>
+        <w:t>10_Noble_House_Wedding_Location.jpg</w:t>
       </w:r>
     </w:p>
     <w:p>
@@ -1157,7 +1008,7 @@
     </w:p>
     <w:p>
       <w:r>
-        <w:t>Egyptians adored cats. This one knew it. A guest bowed. The cat shrugged.</w:t>
+        <w:t>Then, paperwork. Real contracts survive: property, money, who owes what. Romance, with receipts.</w:t>
       </w:r>
     </w:p>
     <w:p>
@@ -1170,7 +1021,7 @@
     </w:p>
     <w:p>
       <w:r>
-        <w:t>Black cat sits proudly near the feast. A guest bows dramatically. The cat ignores him. All expressions, eye movement and mouth movement are silent nonverbal acting only. No intelligible speech, no lip-sync dialogue.</w:t>
+        <w:t>A scribe unrolls a papyrus on a low table. The bride points at one line while her father nods gravely. She then gives a small, satisfied smile. The papyrus shows only abstract hieroglyph-like marks. All expressions and mouth movement are silent acting only; no one on screen speaks.</w:t>
       </w:r>
     </w:p>
     <w:p>
@@ -1183,7 +1034,7 @@
     </w:p>
     <w:p>
       <w:r>
-        <w:t>Static, locked-off: eye-level medium shot with the cat and the bowing guest both in frame. No tilt, pan, zoom or orbit.</w:t>
+        <w:t>Static, locked-off: eye-level medium two-shot: the scribe, the papyrus and the bride all in the same frame. No tilt, pan, zoom or orbit.</w:t>
       </w:r>
     </w:p>
     <w:p>
@@ -1196,7 +1047,7 @@
     </w:p>
     <w:p>
       <w:r>
-        <w:t>Music: playful comic percussion over the wedding rhythm, mixed low under the narrator. SFX: tiny comic sting, soft cat purr. All generated inside Flow together with the picture; the narrator stays clearly intelligible.</w:t>
+        <w:t>Music: playful ancient-Mediterranean wedding music with frame drums, reed flute and plucked strings, steady upbeat tempo, the same theme in every clip, mixed low under the narrator. SFX: papyrus rustle, quill scratching. All generated inside Flow together with the picture; the narrator stays clearly intelligible.</w:t>
       </w:r>
     </w:p>
     <w:p>
@@ -1209,7 +1060,7 @@
     </w:p>
     <w:p>
       <w:r>
-        <w:t>Locked-off static camera, no camera movement. 2D hand-drawn Stickman animation, clean thin black outlines, large expressive heads, simple readable stickman proportions, flat warm colors, historically inspired ancient Alexandria, playful cinematic documentary-comedy tone, 16:9, no 3D, no photorealism, no modern objects, no subtitles, no captions, no logos, no generated text, NO on-screen character dialogue (only the off-screen narrator speaks). Use the selected reference images as strict continuity anchors. Preserve faces, hair, clothing, colors, proportions and accessories exactly. Characters may move their bodies, arms, eyes and mouths for silent nonverbal acting only. VISUAL STYLE LOCK: 2D hand-drawn stickman animation; clean thin black outlines; large expressive heads; simple readable stickman proportions; flat warm colors; historically inspired ancient Alexandria; playful cinematic documentary-comedy tone; no 3D; no photorealism; no modern objects; no subtitles; no captions; no logos; no text inside the generated scene; 16:9. A calm black Egyptian cat sits proudly beside the wedding feast while a guest treats it with exaggerated respect. The cat barely reacts. Keep the cat design consistent with the animal reference. 2D stickman animation, clean outlines, playful timing, no text, 16:9. CAMERA: locked-off static camera on a tripod, eye-level medium shot with the cat and the bowing guest both in frame. No camera movement of any kind: no tilt, no pan, no zoom, no push, no pull, no orbit, no tracking, no rising or overhead view. The framing stays identical from the first frame to the last frame; all movement comes from the characters. AUDIO (generate sound together with the picture): Off-screen male narrator voice-over, warm intelligent British documentary voice with dry comedic timing, the same voice in every clip, begins speaking within the first half second and says exactly: “Egyptians adored cats. This one knew it. A guest bowed. The cat shrugged.” The narrator is heard off-screen only; no character lip-syncs to the narrator. Music: playful comic percussion over the wedding rhythm, mixed low under the narrator. Sound effects: tiny comic sting, soft cat purr. No subtitles or captions.</w:t>
+        <w:t>2D hand-drawn stickman cartoon in the exact style of the reference images: thin black outlines, large expressive heads, thin stick arms, flat warm colors, playful documentary-comedy tone, 16:9. Setting: a noble house room in ancient Alexandria with warm sandstone walls. A scribe unrolls a papyrus on a low table. The bride points at one line while her father nods gravely. She then gives a small, satisfied smile. The papyrus shows only abstract hieroglyph-like marks. Camera: locked-off and perfectly still, eye-level medium two-shot: the scribe, the papyrus and the bride all in the same frame; the framing never changes (no tilt, pan, zoom or rising camera). Audio: off-screen British male narrator, warm and dry, begins speaking within half a second and says: “Then, paperwork. Real contracts survive: property, money, who owes what. Romance, with receipts.” Music: light ancient-Mediterranean wedding music (frame drums, reed flute, plucked strings), same theme in every clip, low under the voice. Sound effects: papyrus rustle, quill scratching. Characters keep their exact reference designs. Nobody on screen speaks. No text, captions or logos in the frame.</w:t>
       </w:r>
     </w:p>
     <w:p>
@@ -1231,7 +1082,7 @@
         <w:pStyle w:val="Heading1"/>
       </w:pPr>
       <w:r>
-        <w:t>SHOT 11 — Music begins</w:t>
+        <w:t>SHOT 09 — The feast</w:t>
       </w:r>
     </w:p>
     <w:p>
@@ -1254,6 +1105,11 @@
     </w:p>
     <w:p>
       <w:r>
+        <w:t>12_Interior_Feast_Night.jpg</w:t>
+      </w:r>
+    </w:p>
+    <w:p>
+      <w:r>
         <w:t>DURATION: 8 sec (the line needs about 5–6 s of speech; trim the clip in editing)</w:t>
       </w:r>
     </w:p>
@@ -1267,7 +1123,7 @@
     </w:p>
     <w:p>
       <w:r>
-        <w:t>Then the music began, and Senbi decided this was his moment.</w:t>
+        <w:t>Bread, figs, roast goose, and beer, basically a food group. Someone was stealing.</w:t>
       </w:r>
     </w:p>
     <w:p>
@@ -1280,7 +1136,7 @@
     </w:p>
     <w:p>
       <w:r>
-        <w:t>Musicians play harp and percussion while guests dance. Senbi enters the dance area. All expressions, eye movement and mouth movement are silent nonverbal acting only. No intelligible speech, no lip-sync dialogue.</w:t>
+        <w:t>A long feast table in full daylight, loaded with flatbread, roast goose, figs, dates and clay beer jugs, guests eating. At the far end one guest tiptoes up, hides a fig behind his back, and is spotted by an unimpressed aunt. All expressions and mouth movement are silent acting only; no one on screen speaks.</w:t>
       </w:r>
     </w:p>
     <w:p>
@@ -1293,7 +1149,7 @@
     </w:p>
     <w:p>
       <w:r>
-        <w:t>Static, locked-off: eye-level wide shot of the musicians and dancers. No tilt, pan, zoom or orbit.</w:t>
+        <w:t>Static, locked-off: eye-level wide-medium shot of the whole feast table; the sneaky guest stays in frame. No tilt, pan, zoom or orbit.</w:t>
       </w:r>
     </w:p>
     <w:p>
@@ -1306,7 +1162,7 @@
     </w:p>
     <w:p>
       <w:r>
-        <w:t>Music: playful ancient-Mediterranean wedding music with frame drums, reed flute and plucked strings, steady upbeat tempo, the same theme in every clip, mixed low under the narrator. SFX: harp and drums swelling, clapping. All generated inside Flow together with the picture; the narrator stays clearly intelligible.</w:t>
+        <w:t>Music: playful ancient-Mediterranean wedding music with frame drums, reed flute and plucked strings, steady upbeat tempo, the same theme in every clip, mixed low under the narrator. SFX: plates, cups, cheerful chatter. All generated inside Flow together with the picture; the narrator stays clearly intelligible.</w:t>
       </w:r>
     </w:p>
     <w:p>
@@ -1319,7 +1175,7 @@
     </w:p>
     <w:p>
       <w:r>
-        <w:t>Locked-off static camera, no camera movement. 2D hand-drawn Stickman animation, clean thin black outlines, large expressive heads, simple readable stickman proportions, flat warm colors, historically inspired ancient Alexandria, playful cinematic documentary-comedy tone, 16:9, no 3D, no photorealism, no modern objects, no subtitles, no captions, no logos, no generated text, NO on-screen character dialogue (only the off-screen narrator speaks). Use the selected reference images as strict continuity anchors. Preserve faces, hair, clothing, colors, proportions and accessories exactly. Characters may move their bodies, arms, eyes and mouths for silent nonverbal acting only. VISUAL STYLE LOCK: 2D hand-drawn stickman animation; clean thin black outlines; large expressive heads; simple readable stickman proportions; flat warm colors; historically inspired ancient Alexandria; playful cinematic documentary-comedy tone; no 3D; no photorealism; no modern objects; no subtitles; no captions; no logos; no text inside the generated scene; 16:9. Ancient Egyptian musicians play harp/lyre and percussion while wedding guests dance. Keep instruments and clothing consistent with the Egyptian celebration reference. Senbi enters the dancing area with excitement. 2D hand-drawn stickman animation, warm festive palette, no text, 16:9. CAMERA: locked-off static camera on a tripod, eye-level wide shot of the musicians and dancers. No camera movement of any kind: no tilt, no pan, no zoom, no push, no pull, no orbit, no tracking, no rising or overhead view. The framing stays identical from the first frame to the last frame; all movement comes from the characters. AUDIO (generate sound together with the picture): Off-screen male narrator voice-over, warm intelligent British documentary voice with dry comedic timing, the same voice in every clip, begins speaking within the first half second and says exactly: “Then the music began, and Senbi decided this was his moment.” The narrator is heard off-screen only; no character lip-syncs to the narrator. Music: playful ancient-Mediterranean wedding music with frame drums, reed flute and plucked strings, steady upbeat tempo, the same theme in every clip, mixed low under the narrator. Sound effects: harp and drums swelling, clapping. No subtitles or captions.</w:t>
+        <w:t>2D hand-drawn stickman cartoon in the exact style of the reference images: thin black outlines, large expressive heads, thin stick arms, flat warm colors, playful documentary-comedy tone, 16:9. Setting: sunny daytime wedding courtyard in ancient Alexandria, sandstone columns, striped awnings, feast tables along the side walls, an open entrance gate at the back. A long feast table in full daylight, loaded with flatbread, roast goose, figs, dates and clay beer jugs, guests eating. At the far end one guest tiptoes up, hides a fig behind his back, and is spotted by an unimpressed aunt. Camera: locked-off and perfectly still, eye-level wide-medium shot of the whole feast table; the sneaky guest stays in frame; the framing never changes (no tilt, pan, zoom or rising camera). Audio: off-screen British male narrator, warm and dry, begins speaking within half a second and says: “Bread, figs, roast goose, and beer, basically a food group. Someone was stealing.” Music: light ancient-Mediterranean wedding music (frame drums, reed flute, plucked strings), same theme in every clip, low under the voice. Sound effects: plates, cups, cheerful chatter. Characters keep their exact reference designs. Nobody on screen speaks. No text, captions or logos in the frame.</w:t>
       </w:r>
     </w:p>
     <w:p>
@@ -1341,7 +1197,7 @@
         <w:pStyle w:val="Heading1"/>
       </w:pPr>
       <w:r>
-        <w:t>SHOT 12 — Senbi's confidence</w:t>
+        <w:t>SHOT 10 — The cat</w:t>
       </w:r>
     </w:p>
     <w:p>
@@ -1354,7 +1210,7 @@
     </w:p>
     <w:p>
       <w:r>
-        <w:t>01_Senbi.jpg</w:t>
+        <w:t>07_Animals.jpg</w:t>
       </w:r>
     </w:p>
     <w:p>
@@ -1377,7 +1233,7 @@
     </w:p>
     <w:p>
       <w:r>
-        <w:t>Senbi nearly fell, recovered, and pretended that was the choreography. Nobody believed him.</w:t>
+        <w:t>Egyptians adored cats. This one knew it. A guest bowed. The cat shrugged.</w:t>
       </w:r>
     </w:p>
     <w:p>
@@ -1390,7 +1246,7 @@
     </w:p>
     <w:p>
       <w:r>
-        <w:t>Senbi dances with ridiculous confidence, nearly loses balance, recovers and pretends it was intentional. All expressions, eye movement and mouth movement are silent nonverbal acting only. No intelligible speech, no lip-sync dialogue.</w:t>
+        <w:t>A black cat sits upright on a cushion at the head of the feast table. A guest bows deeply in front of it. The cat looks away and licks its paw. All expressions and mouth movement are silent acting only; no one on screen speaks.</w:t>
       </w:r>
     </w:p>
     <w:p>
@@ -1403,7 +1259,7 @@
     </w:p>
     <w:p>
       <w:r>
-        <w:t>Static, locked-off: eye-level medium shot of Senbi, full body in frame. No tilt, pan, zoom or orbit.</w:t>
+        <w:t>Static, locked-off: eye-level medium shot with the cat and the bowing guest both in frame. No tilt, pan, zoom or orbit.</w:t>
       </w:r>
     </w:p>
     <w:p>
@@ -1416,7 +1272,7 @@
     </w:p>
     <w:p>
       <w:r>
-        <w:t>Music: playful comic percussion over the wedding rhythm, mixed low under the narrator. SFX: foot scuff, comic wobble, laughter. All generated inside Flow together with the picture; the narrator stays clearly intelligible.</w:t>
+        <w:t>Music: playful comic percussion over the wedding rhythm, mixed low under the narrator. SFX: tiny comic sting, soft cat purr. All generated inside Flow together with the picture; the narrator stays clearly intelligible.</w:t>
       </w:r>
     </w:p>
     <w:p>
@@ -1429,7 +1285,7 @@
     </w:p>
     <w:p>
       <w:r>
-        <w:t>Locked-off static camera, no camera movement. 2D hand-drawn Stickman animation, clean thin black outlines, large expressive heads, simple readable stickman proportions, flat warm colors, historically inspired ancient Alexandria, playful cinematic documentary-comedy tone, 16:9, no 3D, no photorealism, no modern objects, no subtitles, no captions, no logos, no generated text, NO on-screen character dialogue (only the off-screen narrator speaks). Use the selected reference images as strict continuity anchors. Preserve faces, hair, clothing, colors, proportions and accessories exactly. Characters may move their bodies, arms, eyes and mouths for silent nonverbal acting only. VISUAL STYLE LOCK: 2D hand-drawn stickman animation; clean thin black outlines; large expressive heads; simple readable stickman proportions; flat warm colors; historically inspired ancient Alexandria; playful cinematic documentary-comedy tone; no 3D; no photorealism; no modern objects; no subtitles; no captions; no logos; no text inside the generated scene; 16:9. Senbi performs an overly confident wedding dance. He almost loses his balance for a moment, quickly recovers, then pretends the stumble was intentional and continues dancing proudly. Preserve his exact appearance. 2D stickman animation, expressive body language, clean thin lines, no text, 16:9. CAMERA: locked-off static camera on a tripod, eye-level medium shot of Senbi, full body in frame. No camera movement of any kind: no tilt, no pan, no zoom, no push, no pull, no orbit, no tracking, no rising or overhead view. The framing stays identical from the first frame to the last frame; all movement comes from the characters. AUDIO (generate sound together with the picture): Off-screen male narrator voice-over, warm intelligent British documentary voice with dry comedic timing, the same voice in every clip, begins speaking within the first half second and says exactly: “Senbi nearly fell, recovered, and pretended that was the choreography. Nobody believed him.” The narrator is heard off-screen only; no character lip-syncs to the narrator. Music: playful comic percussion over the wedding rhythm, mixed low under the narrator. Sound effects: foot scuff, comic wobble, laughter. No subtitles or captions.</w:t>
+        <w:t>2D hand-drawn stickman cartoon in the exact style of the reference images: thin black outlines, large expressive heads, thin stick arms, flat warm colors, playful documentary-comedy tone, 16:9. Setting: sunny daytime wedding courtyard in ancient Alexandria, sandstone columns, striped awnings, feast tables along the side walls, an open entrance gate at the back. A black cat sits upright on a cushion at the head of the feast table. A guest bows deeply in front of it. The cat looks away and licks its paw. Camera: locked-off and perfectly still, eye-level medium shot with the cat and the bowing guest both in frame; the framing never changes (no tilt, pan, zoom or rising camera). Audio: off-screen British male narrator, warm and dry, begins speaking within half a second and says: “Egyptians adored cats. This one knew it. A guest bowed. The cat shrugged.” Music: playful comic percussion over the wedding rhythm, low under the voice. Sound effects: tiny comic sting, soft cat purr. Characters keep their exact reference designs. Nobody on screen speaks. No text, captions or logos in the frame.</w:t>
       </w:r>
     </w:p>
     <w:p>
@@ -1451,7 +1307,7 @@
         <w:pStyle w:val="Heading1"/>
       </w:pPr>
       <w:r>
-        <w:t>SHOT 13 — Bride reaction</w:t>
+        <w:t>SHOT 11 — Music begins</w:t>
       </w:r>
     </w:p>
     <w:p>
@@ -1464,7 +1320,7 @@
     </w:p>
     <w:p>
       <w:r>
-        <w:t>02_Bride.jpg</w:t>
+        <w:t>03_Egyptian_Guests.jpg</w:t>
       </w:r>
     </w:p>
     <w:p>
@@ -1487,7 +1343,7 @@
     </w:p>
     <w:p>
       <w:r>
-        <w:t>His bride was trying very hard not to laugh. She loved him. Mostly.</w:t>
+        <w:t>Then the music began, and Senbi decided this was his moment.</w:t>
       </w:r>
     </w:p>
     <w:p>
@@ -1500,7 +1356,7 @@
     </w:p>
     <w:p>
       <w:r>
-        <w:t>Bride watches the dance, amused, then hides a smile. All expressions, eye movement and mouth movement are silent nonverbal acting only. No intelligible speech, no lip-sync dialogue.</w:t>
+        <w:t>Three musicians (harp, frame drum, reed flute) play on the left while guests dance in the center. Senbi steps into the dance area with a confident grin. All expressions and mouth movement are silent acting only; no one on screen speaks.</w:t>
       </w:r>
     </w:p>
     <w:p>
@@ -1513,7 +1369,7 @@
     </w:p>
     <w:p>
       <w:r>
-        <w:t>Static, locked-off: eye-level close-up of the bride's face. No tilt, pan, zoom or orbit.</w:t>
+        <w:t>Static, locked-off: eye-level wide shot of the musicians and dancers. No tilt, pan, zoom or orbit.</w:t>
       </w:r>
     </w:p>
     <w:p>
@@ -1526,7 +1382,7 @@
     </w:p>
     <w:p>
       <w:r>
-        <w:t>Music: playful ancient-Mediterranean wedding music with frame drums, reed flute and plucked strings, steady upbeat tempo, the same theme in every clip, mixed low under the narrator. SFX: suppressed giggle. All generated inside Flow together with the picture; the narrator stays clearly intelligible.</w:t>
+        <w:t>Music: playful ancient-Mediterranean wedding music with frame drums, reed flute and plucked strings, steady upbeat tempo, the same theme in every clip, mixed low under the narrator. SFX: harp and drums swelling, clapping. All generated inside Flow together with the picture; the narrator stays clearly intelligible.</w:t>
       </w:r>
     </w:p>
     <w:p>
@@ -1539,7 +1395,7 @@
     </w:p>
     <w:p>
       <w:r>
-        <w:t>Locked-off static camera, no camera movement. 2D hand-drawn Stickman animation, clean thin black outlines, large expressive heads, simple readable stickman proportions, flat warm colors, historically inspired ancient Alexandria, playful cinematic documentary-comedy tone, 16:9, no 3D, no photorealism, no modern objects, no subtitles, no captions, no logos, no generated text, NO on-screen character dialogue (only the off-screen narrator speaks). Use the selected reference images as strict continuity anchors. Preserve faces, hair, clothing, colors, proportions and accessories exactly. Characters may move their bodies, arms, eyes and mouths for silent nonverbal acting only. VISUAL STYLE LOCK: 2D hand-drawn stickman animation; clean thin black outlines; large expressive heads; simple readable stickman proportions; flat warm colors; historically inspired ancient Alexandria; playful cinematic documentary-comedy tone; no 3D; no photorealism; no modern objects; no subtitles; no captions; no logos; no text inside the generated scene; 16:9. The bride watches Senbi's exaggerated dancing. She is amused, tries not to laugh, then gives a small knowing smile. Preserve exact bride design. 2D stickman animation, clean outlines, no text, 16:9. CAMERA: locked-off static camera on a tripod, eye-level close-up of the bride's face. No camera movement of any kind: no tilt, no pan, no zoom, no push, no pull, no orbit, no tracking, no rising or overhead view. The framing stays identical from the first frame to the last frame; all movement comes from the characters. AUDIO (generate sound together with the picture): Off-screen male narrator voice-over, warm intelligent British documentary voice with dry comedic timing, the same voice in every clip, begins speaking within the first half second and says exactly: “His bride was trying very hard not to laugh. She loved him. Mostly.” The narrator is heard off-screen only; no character lip-syncs to the narrator. Music: playful ancient-Mediterranean wedding music with frame drums, reed flute and plucked strings, steady upbeat tempo, the same theme in every clip, mixed low under the narrator. Sound effects: suppressed giggle. No subtitles or captions.</w:t>
+        <w:t>2D hand-drawn stickman cartoon in the exact style of the reference images: thin black outlines, large expressive heads, thin stick arms, flat warm colors, playful documentary-comedy tone, 16:9. Setting: sunny daytime wedding courtyard in ancient Alexandria, sandstone columns, striped awnings, feast tables along the side walls, an open entrance gate at the back. Three musicians (harp, frame drum, reed flute) play on the left while guests dance in the center. Senbi steps into the dance area with a confident grin. Camera: locked-off and perfectly still, eye-level wide shot of the musicians and dancers; the framing never changes (no tilt, pan, zoom or rising camera). Audio: off-screen British male narrator, warm and dry, begins speaking within half a second and says: “Then the music began, and Senbi decided this was his moment.” Music: light ancient-Mediterranean wedding music (frame drums, reed flute, plucked strings), same theme in every clip, low under the voice. Sound effects: harp and drums swelling, clapping. Characters keep their exact reference designs. Nobody on screen speaks. No text, captions or logos in the frame.</w:t>
       </w:r>
     </w:p>
     <w:p>
@@ -1561,7 +1417,7 @@
         <w:pStyle w:val="Heading1"/>
       </w:pPr>
       <w:r>
-        <w:t>SHOT 14 — Guests celebrate</w:t>
+        <w:t>SHOT 12 — Senbi's confidence</w:t>
       </w:r>
     </w:p>
     <w:p>
@@ -1574,7 +1430,7 @@
     </w:p>
     <w:p>
       <w:r>
-        <w:t>03_Egyptian_Guests.jpg</w:t>
+        <w:t>01_Senbi.jpg</w:t>
       </w:r>
     </w:p>
     <w:p>
@@ -1597,7 +1453,7 @@
     </w:p>
     <w:p>
       <w:r>
-        <w:t>Everyone danced and raised a cup, the one thing every wedding agrees on.</w:t>
+        <w:t>Senbi nearly fell, recovered, and pretended that was the choreography. Nobody believed him.</w:t>
       </w:r>
     </w:p>
     <w:p>
@@ -1610,7 +1466,7 @@
     </w:p>
     <w:p>
       <w:r>
-        <w:t>Young and older Egyptian guests clap, dance and raise cups. All expressions, eye movement and mouth movement are silent nonverbal acting only. No intelligible speech, no lip-sync dialogue.</w:t>
+        <w:t>Senbi dances with huge confidence, loses his balance for a moment, recovers, and freezes in a proud pose as if the stumble was choreography. All expressions and mouth movement are silent acting only; no one on screen speaks.</w:t>
       </w:r>
     </w:p>
     <w:p>
@@ -1623,7 +1479,7 @@
     </w:p>
     <w:p>
       <w:r>
-        <w:t>Static, locked-off: eye-level wide-medium shot with several guests in frame. No tilt, pan, zoom or orbit.</w:t>
+        <w:t>Static, locked-off: eye-level medium shot of Senbi, full body in frame. No tilt, pan, zoom or orbit.</w:t>
       </w:r>
     </w:p>
     <w:p>
@@ -1636,7 +1492,7 @@
     </w:p>
     <w:p>
       <w:r>
-        <w:t>Music: playful ancient-Mediterranean wedding music with frame drums, reed flute and plucked strings, steady upbeat tempo, the same theme in every clip, mixed low under the narrator. SFX: clapping, cups clinking, laughter. All generated inside Flow together with the picture; the narrator stays clearly intelligible.</w:t>
+        <w:t>Music: playful comic percussion over the wedding rhythm, mixed low under the narrator. SFX: foot scuff, comic wobble, laughter. All generated inside Flow together with the picture; the narrator stays clearly intelligible.</w:t>
       </w:r>
     </w:p>
     <w:p>
@@ -1649,7 +1505,7 @@
     </w:p>
     <w:p>
       <w:r>
-        <w:t>Locked-off static camera, no camera movement. 2D hand-drawn Stickman animation, clean thin black outlines, large expressive heads, simple readable stickman proportions, flat warm colors, historically inspired ancient Alexandria, playful cinematic documentary-comedy tone, 16:9, no 3D, no photorealism, no modern objects, no subtitles, no captions, no logos, no generated text, NO on-screen character dialogue (only the off-screen narrator speaks). Use the selected reference images as strict continuity anchors. Preserve faces, hair, clothing, colors, proportions and accessories exactly. Characters may move their bodies, arms, eyes and mouths for silent nonverbal acting only. VISUAL STYLE LOCK: 2D hand-drawn stickman animation; clean thin black outlines; large expressive heads; simple readable stickman proportions; flat warm colors; historically inspired ancient Alexandria; playful cinematic documentary-comedy tone; no 3D; no photorealism; no modern objects; no subtitles; no captions; no logos; no text inside the generated scene; 16:9. Young and older Egyptian wedding guests clap, dance, raise cups and cheer around the courtyard. Maintain variety of ages and costumes from the reference. 2D stickman animation, joyful warm palette, no text, 16:9. CAMERA: locked-off static camera on a tripod, eye-level wide-medium shot with several guests in frame. No camera movement of any kind: no tilt, no pan, no zoom, no push, no pull, no orbit, no tracking, no rising or overhead view. The framing stays identical from the first frame to the last frame; all movement comes from the characters. AUDIO (generate sound together with the picture): Off-screen male narrator voice-over, warm intelligent British documentary voice with dry comedic timing, the same voice in every clip, begins speaking within the first half second and says exactly: “Everyone danced and raised a cup, the one thing every wedding agrees on.” The narrator is heard off-screen only; no character lip-syncs to the narrator. Music: playful ancient-Mediterranean wedding music with frame drums, reed flute and plucked strings, steady upbeat tempo, the same theme in every clip, mixed low under the narrator. Sound effects: clapping, cups clinking, laughter. No subtitles or captions.</w:t>
+        <w:t>2D hand-drawn stickman cartoon in the exact style of the reference images: thin black outlines, large expressive heads, thin stick arms, flat warm colors, playful documentary-comedy tone, 16:9. Setting: sunny daytime wedding courtyard in ancient Alexandria, sandstone columns, striped awnings, feast tables along the side walls, an open entrance gate at the back. Senbi dances with huge confidence, loses his balance for a moment, recovers, and freezes in a proud pose as if the stumble was choreography. Camera: locked-off and perfectly still, eye-level medium shot of Senbi, full body in frame; the framing never changes (no tilt, pan, zoom or rising camera). Audio: off-screen British male narrator, warm and dry, begins speaking within half a second and says: “Senbi nearly fell, recovered, and pretended that was the choreography. Nobody believed him.” Music: playful comic percussion over the wedding rhythm, low under the voice. Sound effects: foot scuff, comic wobble, laughter. Characters keep their exact reference designs. Nobody on screen speaks. No text, captions or logos in the frame.</w:t>
       </w:r>
     </w:p>
     <w:p>
@@ -1671,7 +1527,7 @@
         <w:pStyle w:val="Heading1"/>
       </w:pPr>
       <w:r>
-        <w:t>SHOT 15 — Food judge</w:t>
+        <w:t>SHOT 13 — Bride reaction</w:t>
       </w:r>
     </w:p>
     <w:p>
@@ -1684,7 +1540,7 @@
     </w:p>
     <w:p>
       <w:r>
-        <w:t>03_Egyptian_Guests.jpg</w:t>
+        <w:t>02_Bride.jpg</w:t>
       </w:r>
     </w:p>
     <w:p>
@@ -1707,7 +1563,7 @@
     </w:p>
     <w:p>
       <w:r>
-        <w:t>One aunt inspected the food like a tax auditor. Verdict: suspicious, but edible.</w:t>
+        <w:t>His bride was trying very hard not to laugh. She loved him. Mostly.</w:t>
       </w:r>
     </w:p>
     <w:p>
@@ -1720,7 +1576,7 @@
     </w:p>
     <w:p>
       <w:r>
-        <w:t>A middle-aged woman inspects a dish with exaggerated seriousness, tastes it and gives a suspicious look. All expressions, eye movement and mouth movement are silent nonverbal acting only. No intelligible speech, no lip-sync dialogue.</w:t>
+        <w:t>The bride watches Senbi dance, amused. She tries to stay composed, then hides her smile behind her hand. All expressions and mouth movement are silent acting only; no one on screen speaks.</w:t>
       </w:r>
     </w:p>
     <w:p>
@@ -1733,7 +1589,7 @@
     </w:p>
     <w:p>
       <w:r>
-        <w:t>Static, locked-off: eye-level close-up of the woman's face and the dish. No tilt, pan, zoom or orbit.</w:t>
+        <w:t>Static, locked-off: eye-level close-up of the bride's face. No tilt, pan, zoom or orbit.</w:t>
       </w:r>
     </w:p>
     <w:p>
@@ -1746,7 +1602,7 @@
     </w:p>
     <w:p>
       <w:r>
-        <w:t>Music: playful comic percussion over the wedding rhythm, mixed low under the narrator. SFX: spoon tapping a bowl, suspicious hum. All generated inside Flow together with the picture; the narrator stays clearly intelligible.</w:t>
+        <w:t>Music: playful ancient-Mediterranean wedding music with frame drums, reed flute and plucked strings, steady upbeat tempo, the same theme in every clip, mixed low under the narrator. SFX: suppressed giggle. All generated inside Flow together with the picture; the narrator stays clearly intelligible.</w:t>
       </w:r>
     </w:p>
     <w:p>
@@ -1759,7 +1615,7 @@
     </w:p>
     <w:p>
       <w:r>
-        <w:t>Locked-off static camera, no camera movement. 2D hand-drawn Stickman animation, clean thin black outlines, large expressive heads, simple readable stickman proportions, flat warm colors, historically inspired ancient Alexandria, playful cinematic documentary-comedy tone, 16:9, no 3D, no photorealism, no modern objects, no subtitles, no captions, no logos, no generated text, NO on-screen character dialogue (only the off-screen narrator speaks). Use the selected reference images as strict continuity anchors. Preserve faces, hair, clothing, colors, proportions and accessories exactly. Characters may move their bodies, arms, eyes and mouths for silent nonverbal acting only. VISUAL STYLE LOCK: 2D hand-drawn stickman animation; clean thin black outlines; large expressive heads; simple readable stickman proportions; flat warm colors; historically inspired ancient Alexandria; playful cinematic documentary-comedy tone; no 3D; no photorealism; no modern objects; no subtitles; no captions; no logos; no text inside the generated scene; 16:9. A middle-aged Egyptian woman inspects a dish with exaggerated seriousness, tastes it, pauses, and gives a suspiciously critical expression while nearby guests continue celebrating. 2D stickman animation, clean thin lines, comedic timing, no text, 16:9. CAMERA: locked-off static camera on a tripod, eye-level close-up of the woman's face and the dish. No camera movement of any kind: no tilt, no pan, no zoom, no push, no pull, no orbit, no tracking, no rising or overhead view. The framing stays identical from the first frame to the last frame; all movement comes from the characters. AUDIO (generate sound together with the picture): Off-screen male narrator voice-over, warm intelligent British documentary voice with dry comedic timing, the same voice in every clip, begins speaking within the first half second and says exactly: “One aunt inspected the food like a tax auditor. Verdict: suspicious, but edible.” The narrator is heard off-screen only; no character lip-syncs to the narrator. Music: playful comic percussion over the wedding rhythm, mixed low under the narrator. Sound effects: spoon tapping a bowl, suspicious hum. No subtitles or captions.</w:t>
+        <w:t>2D hand-drawn stickman cartoon in the exact style of the reference images: thin black outlines, large expressive heads, thin stick arms, flat warm colors, playful documentary-comedy tone, 16:9. Setting: sunny daytime wedding courtyard in ancient Alexandria, sandstone columns, striped awnings, feast tables along the side walls, an open entrance gate at the back. The bride watches Senbi dance, amused. She tries to stay composed, then hides her smile behind her hand. Camera: locked-off and perfectly still, eye-level close-up of the bride's face; the framing never changes (no tilt, pan, zoom or rising camera). Audio: off-screen British male narrator, warm and dry, begins speaking within half a second and says: “His bride was trying very hard not to laugh. She loved him. Mostly.” Music: light ancient-Mediterranean wedding music (frame drums, reed flute, plucked strings), same theme in every clip, low under the voice. Sound effects: suppressed giggle. Characters keep their exact reference designs. Nobody on screen speaks. No text, captions or logos in the frame.</w:t>
       </w:r>
     </w:p>
     <w:p>
@@ -1781,7 +1637,7 @@
         <w:pStyle w:val="Heading1"/>
       </w:pPr>
       <w:r>
-        <w:t>SHOT 16 — Headrest gift</w:t>
+        <w:t>SHOT 14 — Guests celebrate</w:t>
       </w:r>
     </w:p>
     <w:p>
@@ -1794,12 +1650,7 @@
     </w:p>
     <w:p>
       <w:r>
-        <w:t>01_Senbi.jpg</w:t>
-      </w:r>
-    </w:p>
-    <w:p>
-      <w:r>
-        <w:t>04_Parents_and_Relatives.jpg</w:t>
+        <w:t>03_Egyptian_Guests.jpg</w:t>
       </w:r>
     </w:p>
     <w:p>
@@ -1822,7 +1673,7 @@
     </w:p>
     <w:p>
       <w:r>
-        <w:t>Then, the gift: a wooden headrest. Egyptians really did sleep on these.</w:t>
+        <w:t>Everyone danced and raised a cup, the one thing every wedding agrees on.</w:t>
       </w:r>
     </w:p>
     <w:p>
@@ -1835,7 +1686,7 @@
     </w:p>
     <w:p>
       <w:r>
-        <w:t>Bride's father proudly presents Senbi with a wooden headrest. Senbi smiles politely, then looks concerned. All expressions, eye movement and mouth movement are silent nonverbal acting only. No intelligible speech, no lip-sync dialogue.</w:t>
+        <w:t>Young and old guests clap, dance and raise clay cups in a joyful crowd. All expressions and mouth movement are silent acting only; no one on screen speaks.</w:t>
       </w:r>
     </w:p>
     <w:p>
@@ -1848,7 +1699,7 @@
     </w:p>
     <w:p>
       <w:r>
-        <w:t>Static, locked-off: eye-level medium two-shot of Senbi and the father. No tilt, pan, zoom or orbit.</w:t>
+        <w:t>Static, locked-off: eye-level wide-medium shot with several guests in frame. No tilt, pan, zoom or orbit.</w:t>
       </w:r>
     </w:p>
     <w:p>
@@ -1861,7 +1712,7 @@
     </w:p>
     <w:p>
       <w:r>
-        <w:t>Music: playful ancient-Mediterranean wedding music with frame drums, reed flute and plucked strings, steady upbeat tempo, the same theme in every clip, mixed low under the narrator. SFX: one wooden knock. All generated inside Flow together with the picture; the narrator stays clearly intelligible.</w:t>
+        <w:t>Music: playful ancient-Mediterranean wedding music with frame drums, reed flute and plucked strings, steady upbeat tempo, the same theme in every clip, mixed low under the narrator. SFX: clapping, cups clinking, laughter. All generated inside Flow together with the picture; the narrator stays clearly intelligible.</w:t>
       </w:r>
     </w:p>
     <w:p>
@@ -1874,7 +1725,7 @@
     </w:p>
     <w:p>
       <w:r>
-        <w:t>Locked-off static camera, no camera movement. 2D hand-drawn Stickman animation, clean thin black outlines, large expressive heads, simple readable stickman proportions, flat warm colors, historically inspired ancient Alexandria, playful cinematic documentary-comedy tone, 16:9, no 3D, no photorealism, no modern objects, no subtitles, no captions, no logos, no generated text, NO on-screen character dialogue (only the off-screen narrator speaks). Use the selected reference images as strict continuity anchors. Preserve faces, hair, clothing, colors, proportions and accessories exactly. Characters may move their bodies, arms, eyes and mouths for silent nonverbal acting only. VISUAL STYLE LOCK: 2D hand-drawn stickman animation; clean thin black outlines; large expressive heads; simple readable stickman proportions; flat warm colors; historically inspired ancient Alexandria; playful cinematic documentary-comedy tone; no 3D; no photorealism; no modern objects; no subtitles; no captions; no logos; no text inside the generated scene; 16:9. An older family member proudly presents Senbi with a traditional wooden headrest as a wedding gift. Senbi smiles politely, but his expression slowly becomes concerned as he realizes what the gift is. Preserve the established characters. 2D stickman animation, no text, 16:9. CAMERA: locked-off static camera on a tripod, eye-level medium two-shot of Senbi and the father. No camera movement of any kind: no tilt, no pan, no zoom, no push, no pull, no orbit, no tracking, no rising or overhead view. The framing stays identical from the first frame to the last frame; all movement comes from the characters. AUDIO (generate sound together with the picture): Off-screen male narrator voice-over, warm intelligent British documentary voice with dry comedic timing, the same voice in every clip, begins speaking within the first half second and says exactly: “Then, the gift: a wooden headrest. Egyptians really did sleep on these.” The narrator is heard off-screen only; no character lip-syncs to the narrator. Music: playful ancient-Mediterranean wedding music with frame drums, reed flute and plucked strings, steady upbeat tempo, the same theme in every clip, mixed low under the narrator. Sound effects: one wooden knock. No subtitles or captions.</w:t>
+        <w:t>2D hand-drawn stickman cartoon in the exact style of the reference images: thin black outlines, large expressive heads, thin stick arms, flat warm colors, playful documentary-comedy tone, 16:9. Setting: sunny daytime wedding courtyard in ancient Alexandria, sandstone columns, striped awnings, feast tables along the side walls, an open entrance gate at the back. Young and old guests clap, dance and raise clay cups in a joyful crowd. Camera: locked-off and perfectly still, eye-level wide-medium shot with several guests in frame; the framing never changes (no tilt, pan, zoom or rising camera). Audio: off-screen British male narrator, warm and dry, begins speaking within half a second and says: “Everyone danced and raised a cup, the one thing every wedding agrees on.” Music: light ancient-Mediterranean wedding music (frame drums, reed flute, plucked strings), same theme in every clip, low under the voice. Sound effects: clapping, cups clinking, laughter. Characters keep their exact reference designs. Nobody on screen speaks. No text, captions or logos in the frame.</w:t>
       </w:r>
     </w:p>
     <w:p>
@@ -1896,7 +1747,7 @@
         <w:pStyle w:val="Heading1"/>
       </w:pPr>
       <w:r>
-        <w:t>SHOT 17 — Trying the headrest</w:t>
+        <w:t>SHOT 15 — Food judge</w:t>
       </w:r>
     </w:p>
     <w:p>
@@ -1909,7 +1760,12 @@
     </w:p>
     <w:p>
       <w:r>
-        <w:t>01_Senbi.jpg</w:t>
+        <w:t>03_Egyptian_Guests.jpg</w:t>
+      </w:r>
+    </w:p>
+    <w:p>
+      <w:r>
+        <w:t>11_Wedding_Courtyard_Day.jpg</w:t>
       </w:r>
     </w:p>
     <w:p>
@@ -1927,7 +1783,7 @@
     </w:p>
     <w:p>
       <w:r>
-        <w:t>Senbi lay down. His neck filed a formal complaint. His thumbs-up said otherwise.</w:t>
+        <w:t>One aunt inspected the food like a tax auditor. Verdict: suspicious, but edible.</w:t>
       </w:r>
     </w:p>
     <w:p>
@@ -1940,7 +1796,7 @@
     </w:p>
     <w:p>
       <w:r>
-        <w:t>Senbi tries to lie down on the wooden headrest. He freezes in discomfort but gives a thumbs-up. All expressions, eye movement and mouth movement are silent nonverbal acting only. No intelligible speech, no lip-sync dialogue.</w:t>
+        <w:t>An older woman at the feast table inspects a dish with exaggerated seriousness, tastes it, narrows her eyes, then gives a reluctant nod. All expressions and mouth movement are silent acting only; no one on screen speaks.</w:t>
       </w:r>
     </w:p>
     <w:p>
@@ -1953,7 +1809,7 @@
     </w:p>
     <w:p>
       <w:r>
-        <w:t>Static, locked-off: eye-level medium shot of Senbi with the headrest. No tilt, pan, zoom or orbit.</w:t>
+        <w:t>Static, locked-off: eye-level close-up of the woman's face and the dish. No tilt, pan, zoom or orbit.</w:t>
       </w:r>
     </w:p>
     <w:p>
@@ -1966,7 +1822,7 @@
     </w:p>
     <w:p>
       <w:r>
-        <w:t>Music: playful comic percussion over the wedding rhythm, mixed low under the narrator. SFX: comic wooden creak. All generated inside Flow together with the picture; the narrator stays clearly intelligible.</w:t>
+        <w:t>Music: playful comic percussion over the wedding rhythm, mixed low under the narrator. SFX: spoon tapping a bowl, suspicious hum. All generated inside Flow together with the picture; the narrator stays clearly intelligible.</w:t>
       </w:r>
     </w:p>
     <w:p>
@@ -1979,7 +1835,7 @@
     </w:p>
     <w:p>
       <w:r>
-        <w:t>Locked-off static camera, no camera movement. 2D hand-drawn Stickman animation, clean thin black outlines, large expressive heads, simple readable stickman proportions, flat warm colors, historically inspired ancient Alexandria, playful cinematic documentary-comedy tone, 16:9, no 3D, no photorealism, no modern objects, no subtitles, no captions, no logos, no generated text, NO on-screen character dialogue (only the off-screen narrator speaks). Use the selected reference images as strict continuity anchors. Preserve faces, hair, clothing, colors, proportions and accessories exactly. Characters may move their bodies, arms, eyes and mouths for silent nonverbal acting only. VISUAL STYLE LOCK: 2D hand-drawn stickman animation; clean thin black outlines; large expressive heads; simple readable stickman proportions; flat warm colors; historically inspired ancient Alexandria; playful cinematic documentary-comedy tone; no 3D; no photorealism; no modern objects; no subtitles; no captions; no logos; no text inside the generated scene; 16:9. Senbi tries to lie down using the wooden headrest. He freezes in obvious discomfort, forces a polite smile, and gives a reluctant thumbs-up. Keep the joke visual and family-friendly. Preserve exact Senbi design. 2D stickman animation, clean outlines, no text, 16:9. Hold the awkward pose long enough for the joke. CAMERA: locked-off static camera on a tripod, eye-level medium shot of Senbi with the headrest. No camera movement of any kind: no tilt, no pan, no zoom, no push, no pull, no orbit, no tracking, no rising or overhead view. The framing stays identical from the first frame to the last frame; all movement comes from the characters. AUDIO (generate sound together with the picture): Off-screen male narrator voice-over, warm intelligent British documentary voice with dry comedic timing, the same voice in every clip, begins speaking within the first half second and says exactly: “Senbi lay down. His neck filed a formal complaint. His thumbs-up said otherwise.” The narrator is heard off-screen only; no character lip-syncs to the narrator. Music: playful comic percussion over the wedding rhythm, mixed low under the narrator. Sound effects: comic wooden creak. No subtitles or captions.</w:t>
+        <w:t>2D hand-drawn stickman cartoon in the exact style of the reference images: thin black outlines, large expressive heads, thin stick arms, flat warm colors, playful documentary-comedy tone, 16:9. Setting: sunny daytime wedding courtyard in ancient Alexandria, sandstone columns, striped awnings, feast tables along the side walls, an open entrance gate at the back. An older woman at the feast table inspects a dish with exaggerated seriousness, tastes it, narrows her eyes, then gives a reluctant nod. Camera: locked-off and perfectly still, eye-level close-up of the woman's face and the dish; the framing never changes (no tilt, pan, zoom or rising camera). Audio: off-screen British male narrator, warm and dry, begins speaking within half a second and says: “One aunt inspected the food like a tax auditor. Verdict: suspicious, but edible.” Music: playful comic percussion over the wedding rhythm, low under the voice. Sound effects: spoon tapping a bowl, suspicious hum. Characters keep their exact reference designs. Nobody on screen speaks. No text, captions or logos in the frame.</w:t>
       </w:r>
     </w:p>
     <w:p>
@@ -2001,7 +1857,7 @@
         <w:pStyle w:val="Heading1"/>
       </w:pPr>
       <w:r>
-        <w:t>SHOT 18 — Wedding peak</w:t>
+        <w:t>SHOT 16 — Headrest gift</w:t>
       </w:r>
     </w:p>
     <w:p>
@@ -2014,21 +1870,16 @@
     </w:p>
     <w:p>
       <w:r>
-        <w:t>03_Egyptian_Guests.jpg</w:t>
-      </w:r>
-    </w:p>
-    <w:p>
-      <w:r>
-        <w:t>02_Bride.jpg</w:t>
-      </w:r>
-    </w:p>
-    <w:p>
-      <w:r>
         <w:t>01_Senbi.jpg</w:t>
       </w:r>
     </w:p>
     <w:p>
       <w:r>
+        <w:t>04_Parents_and_Relatives.jpg</w:t>
+      </w:r>
+    </w:p>
+    <w:p>
+      <w:r>
         <w:t>11_Wedding_Courtyard_Day.jpg</w:t>
       </w:r>
     </w:p>
@@ -2047,7 +1898,7 @@
     </w:p>
     <w:p>
       <w:r>
-        <w:t>For a few perfect minutes, everything was exactly right. Enjoy this part.</w:t>
+        <w:t>Then, the gift: a wooden headrest. Egyptians really did sleep on these.</w:t>
       </w:r>
     </w:p>
     <w:p>
@@ -2060,7 +1911,7 @@
     </w:p>
     <w:p>
       <w:r>
-        <w:t>Wide courtyard: decorations, musicians, dancers, food and family. Everything looks perfect. All expressions, eye movement and mouth movement are silent nonverbal acting only. No intelligible speech, no lip-sync dialogue.</w:t>
+        <w:t>The bride's father proudly presents Senbi with a wooden headrest. Senbi accepts it with a polite smile, glances at it, and his smile tightens with concern. All expressions and mouth movement are silent acting only; no one on screen speaks.</w:t>
       </w:r>
     </w:p>
     <w:p>
@@ -2073,7 +1924,7 @@
     </w:p>
     <w:p>
       <w:r>
-        <w:t>Locked camera, extremely slow 5% push-in only: wide shot of the whole courtyard at eye level. No tilt, pan or orbit.</w:t>
+        <w:t>Static, locked-off: eye-level medium two-shot of Senbi and the father. No tilt, pan, zoom or orbit.</w:t>
       </w:r>
     </w:p>
     <w:p>
@@ -2086,7 +1937,7 @@
     </w:p>
     <w:p>
       <w:r>
-        <w:t>Music: playful ancient-Mediterranean wedding music with frame drums, reed flute and plucked strings, steady upbeat tempo, the same theme in every clip, mixed low under the narrator. SFX: applause, drums, wind in the banners. All generated inside Flow together with the picture; the narrator stays clearly intelligible.</w:t>
+        <w:t>Music: playful ancient-Mediterranean wedding music with frame drums, reed flute and plucked strings, steady upbeat tempo, the same theme in every clip, mixed low under the narrator. SFX: one wooden knock. All generated inside Flow together with the picture; the narrator stays clearly intelligible.</w:t>
       </w:r>
     </w:p>
     <w:p>
@@ -2099,7 +1950,7 @@
     </w:p>
     <w:p>
       <w:r>
-        <w:t>Locked camera, only an extremely slow subtle push-in. 2D hand-drawn Stickman animation, clean thin black outlines, large expressive heads, simple readable stickman proportions, flat warm colors, historically inspired ancient Alexandria, playful cinematic documentary-comedy tone, 16:9, no 3D, no photorealism, no modern objects, no subtitles, no captions, no logos, no generated text, NO on-screen character dialogue (only the off-screen narrator speaks). Use the selected reference images as strict continuity anchors. Preserve faces, hair, clothing, colors, proportions and accessories exactly. Characters may move their bodies, arms, eyes and mouths for silent nonverbal acting only. VISUAL STYLE LOCK: 2D hand-drawn stickman animation; clean thin black outlines; large expressive heads; simple readable stickman proportions; flat warm colors; historically inspired ancient Alexandria; playful cinematic documentary-comedy tone; no 3D; no photorealism; no modern objects; no subtitles; no captions; no logos; no text inside the generated scene; 16:9. Wide view of the wedding at its happiest moment: Senbi and bride together, musicians playing, guests dancing, decorations, food and warm Alexandria light. Everything feels perfect for a brief moment. 2D stickman animation, cinematic wide composition, warm colors, no text, 16:9. CAMERA: wide shot of the whole courtyard at eye level. Locked camera with only an extremely slow, subtle push-in (about 5%) over the whole clip. No tilt, no pan, no orbit, no rising or overhead view; the subject stays in the same position in the frame. AUDIO (generate sound together with the picture): Off-screen male narrator voice-over, warm intelligent British documentary voice with dry comedic timing, the same voice in every clip, begins speaking within the first half second and says exactly: “For a few perfect minutes, everything was exactly right. Enjoy this part.” The narrator is heard off-screen only; no character lip-syncs to the narrator. Music: playful ancient-Mediterranean wedding music with frame drums, reed flute and plucked strings, steady upbeat tempo, the same theme in every clip, mixed low under the narrator. Sound effects: applause, drums, wind in the banners. No subtitles or captions.</w:t>
+        <w:t>2D hand-drawn stickman cartoon in the exact style of the reference images: thin black outlines, large expressive heads, thin stick arms, flat warm colors, playful documentary-comedy tone, 16:9. Setting: sunny daytime wedding courtyard in ancient Alexandria, sandstone columns, striped awnings, feast tables along the side walls, an open entrance gate at the back. The bride's father proudly presents Senbi with a wooden headrest. Senbi accepts it with a polite smile, glances at it, and his smile tightens with concern. Camera: locked-off and perfectly still, eye-level medium two-shot of Senbi and the father; the framing never changes (no tilt, pan, zoom or rising camera). Audio: off-screen British male narrator, warm and dry, begins speaking within half a second and says: “Then, the gift: a wooden headrest. Egyptians really did sleep on these.” Music: light ancient-Mediterranean wedding music (frame drums, reed flute, plucked strings), same theme in every clip, low under the voice. Sound effects: one wooden knock. Characters keep their exact reference designs. Nobody on screen speaks. No text, captions or logos in the frame.</w:t>
       </w:r>
     </w:p>
     <w:p>
@@ -2121,7 +1972,7 @@
         <w:pStyle w:val="Heading1"/>
       </w:pPr>
       <w:r>
-        <w:t>SHOT 19 — First warning</w:t>
+        <w:t>SHOT 17 — Trying the headrest</w:t>
       </w:r>
     </w:p>
     <w:p>
@@ -2134,7 +1985,7 @@
     </w:p>
     <w:p>
       <w:r>
-        <w:t>11_Wedding_Courtyard_Day.jpg</w:t>
+        <w:t>01_Senbi.jpg</w:t>
       </w:r>
     </w:p>
     <w:p>
@@ -2152,7 +2003,7 @@
     </w:p>
     <w:p>
       <w:r>
-        <w:t>Then a small cup on the table began to tremble. Nobody noticed.</w:t>
+        <w:t>Senbi lay down. His neck filed a formal complaint. His thumbs-up said otherwise.</w:t>
       </w:r>
     </w:p>
     <w:p>
@@ -2165,7 +2016,7 @@
     </w:p>
     <w:p>
       <w:r>
-        <w:t>A small ceramic cup on the table vibrates slightly. Nobody notices. All expressions, eye movement and mouth movement are silent nonverbal acting only. No intelligible speech, no lip-sync dialogue.</w:t>
+        <w:t>Senbi sits on a reed mat and tries resting his neck on the wooden headrest. He freezes in discomfort, then gives a stiff thumbs-up. All expressions and mouth movement are silent acting only; no one on screen speaks.</w:t>
       </w:r>
     </w:p>
     <w:p>
@@ -2178,7 +2029,7 @@
     </w:p>
     <w:p>
       <w:r>
-        <w:t>Static, locked-off: extreme close-up of the cup; only the cup vibrates, the camera does not. No tilt, pan, zoom or orbit.</w:t>
+        <w:t>Static, locked-off: eye-level medium shot of Senbi with the headrest. No tilt, pan, zoom or orbit.</w:t>
       </w:r>
     </w:p>
     <w:p>
@@ -2191,7 +2042,7 @@
     </w:p>
     <w:p>
       <w:r>
-        <w:t>Music: playful ancient-Mediterranean wedding music with frame drums, reed flute and plucked strings, steady upbeat tempo, the same theme in every clip, mixed low under the narrator and a faint uneasy undertone. SFX: ceramic cup rattling, faint rumble. All generated inside Flow together with the picture; the narrator stays clearly intelligible.</w:t>
+        <w:t>Music: playful comic percussion over the wedding rhythm, mixed low under the narrator. SFX: comic wooden creak. All generated inside Flow together with the picture; the narrator stays clearly intelligible.</w:t>
       </w:r>
     </w:p>
     <w:p>
@@ -2204,7 +2055,7 @@
     </w:p>
     <w:p>
       <w:r>
-        <w:t>Locked-off static camera, no camera movement. 2D hand-drawn Stickman animation, clean thin black outlines, large expressive heads, simple readable stickman proportions, flat warm colors, historically inspired ancient Alexandria, playful cinematic documentary-comedy tone, 16:9, no 3D, no photorealism, no modern objects, no subtitles, no captions, no logos, no generated text, NO on-screen character dialogue (only the off-screen narrator speaks). Use the selected reference images as strict continuity anchors. Preserve faces, hair, clothing, colors, proportions and accessories exactly. Characters may move their bodies, arms, eyes and mouths for silent nonverbal acting only. VISUAL STYLE LOCK: 2D hand-drawn stickman animation; clean thin black outlines; large expressive heads; simple readable stickman proportions; flat warm colors; historically inspired ancient Alexandria; playful cinematic documentary-comedy tone; no 3D; no photorealism; no modern objects; no subtitles; no captions; no logos; no text inside the generated scene; 16:9. Close-up of a small ceramic cup on a wedding table. It vibrates subtly from a distant disturbance. The guests in the background continue celebrating and do not notice. 2D stickman animation, clean thin outlines, mysterious but playful mood, no text, 16:9. CAMERA: locked-off static camera on a tripod, extreme close-up of the cup; only the cup vibrates, the camera does not. No camera movement of any kind: no tilt, no pan, no zoom, no push, no pull, no orbit, no tracking, no rising or overhead view. The framing stays identical from the first frame to the last frame; all movement comes from the characters. AUDIO (generate sound together with the picture): Off-screen male narrator voice-over, warm intelligent British documentary voice with dry comedic timing, the same voice in every clip, begins speaking within the first half second and says exactly: “Then a small cup on the table began to tremble. Nobody noticed.” The narrator is heard off-screen only; no character lip-syncs to the narrator. Music: playful ancient-Mediterranean wedding music with frame drums, reed flute and plucked strings, steady upbeat tempo, the same theme in every clip, mixed low under the narrator and a faint uneasy undertone. Sound effects: ceramic cup rattling, faint rumble. No subtitles or captions.</w:t>
+        <w:t>2D hand-drawn stickman cartoon in the exact style of the reference images: thin black outlines, large expressive heads, thin stick arms, flat warm colors, playful documentary-comedy tone, 16:9. Setting: sunny daytime wedding courtyard in ancient Alexandria, sandstone columns, striped awnings, feast tables along the side walls, an open entrance gate at the back. Senbi sits on a reed mat and tries resting his neck on the wooden headrest. He freezes in discomfort, then gives a stiff thumbs-up. Camera: locked-off and perfectly still, eye-level medium shot of Senbi with the headrest; the framing never changes (no tilt, pan, zoom or rising camera). Audio: off-screen British male narrator, warm and dry, begins speaking within half a second and says: “Senbi lay down. His neck filed a formal complaint. His thumbs-up said otherwise.” Music: playful comic percussion over the wedding rhythm, low under the voice. Sound effects: comic wooden creak. Characters keep their exact reference designs. Nobody on screen speaks. No text, captions or logos in the frame.</w:t>
       </w:r>
     </w:p>
     <w:p>
@@ -2226,7 +2077,7 @@
         <w:pStyle w:val="Heading1"/>
       </w:pPr>
       <w:r>
-        <w:t>SHOT 20 — Musician hears it</w:t>
+        <w:t>SHOT 18 — Wedding peak</w:t>
       </w:r>
     </w:p>
     <w:p>
@@ -2244,6 +2095,16 @@
     </w:p>
     <w:p>
       <w:r>
+        <w:t>02_Bride.jpg</w:t>
+      </w:r>
+    </w:p>
+    <w:p>
+      <w:r>
+        <w:t>01_Senbi.jpg</w:t>
+      </w:r>
+    </w:p>
+    <w:p>
+      <w:r>
         <w:t>11_Wedding_Courtyard_Day.jpg</w:t>
       </w:r>
     </w:p>
@@ -2262,7 +2123,7 @@
     </w:p>
     <w:p>
       <w:r>
-        <w:t>The musician noticed. He stopped. Everyone else danced one more beat, blissfully unaware.</w:t>
+        <w:t>For a few perfect minutes, everything was exactly right. Enjoy this part.</w:t>
       </w:r>
     </w:p>
     <w:p>
@@ -2275,7 +2136,7 @@
     </w:p>
     <w:p>
       <w:r>
-        <w:t>Musician suddenly stops and looks toward the street. Guests keep dancing for one beat. All expressions, eye movement and mouth movement are silent nonverbal acting only. No intelligible speech, no lip-sync dialogue.</w:t>
+        <w:t>The wedding at its happiest: Senbi and the bride together, musicians playing, guests dancing, banners and flowers swaying lightly in the breeze, warm sunlight. All expressions and mouth movement are silent acting only; no one on screen speaks.</w:t>
       </w:r>
     </w:p>
     <w:p>
@@ -2288,7 +2149,7 @@
     </w:p>
     <w:p>
       <w:r>
-        <w:t>Static, locked-off: eye-level medium shot of the musician with the entrance visible behind him. No tilt, pan, zoom or orbit.</w:t>
+        <w:t>Locked camera, extremely slow 5% push-in only: wide shot of the whole courtyard at eye level. No tilt, pan or orbit.</w:t>
       </w:r>
     </w:p>
     <w:p>
@@ -2301,7 +2162,7 @@
     </w:p>
     <w:p>
       <w:r>
-        <w:t>Music: music nearly silent. SFX: music and drums cut out, one drum stops. All generated inside Flow together with the picture; the narrator stays clearly intelligible.</w:t>
+        <w:t>Music: playful ancient-Mediterranean wedding music with frame drums, reed flute and plucked strings, steady upbeat tempo, the same theme in every clip, mixed low under the narrator. SFX: applause, drums, wind in the banners. All generated inside Flow together with the picture; the narrator stays clearly intelligible.</w:t>
       </w:r>
     </w:p>
     <w:p>
@@ -2314,7 +2175,7 @@
     </w:p>
     <w:p>
       <w:r>
-        <w:t>Locked-off static camera, no camera movement. 2D hand-drawn Stickman animation, clean thin black outlines, large expressive heads, simple readable stickman proportions, flat warm colors, historically inspired ancient Alexandria, playful cinematic documentary-comedy tone, 16:9, no 3D, no photorealism, no modern objects, no subtitles, no captions, no logos, no generated text, NO on-screen character dialogue (only the off-screen narrator speaks). Use the selected reference images as strict continuity anchors. Preserve faces, hair, clothing, colors, proportions and accessories exactly. Characters may move their bodies, arms, eyes and mouths for silent nonverbal acting only. VISUAL STYLE LOCK: 2D hand-drawn stickman animation; clean thin black outlines; large expressive heads; simple readable stickman proportions; flat warm colors; historically inspired ancient Alexandria; playful cinematic documentary-comedy tone; no 3D; no photorealism; no modern objects; no subtitles; no captions; no logos; no text inside the generated scene; 16:9. An Egyptian musician suddenly stops playing and looks toward the entrance, which is visible in the background, while everyone else continues dancing for one more beat. His expression changes from joyful to alert. 2D stickman animation, no text, 16:9. CAMERA: locked-off static camera on a tripod, eye-level medium shot of the musician with the entrance visible behind him. No camera movement of any kind: no tilt, no pan, no zoom, no push, no pull, no orbit, no tracking, no rising or overhead view. The framing stays identical from the first frame to the last frame; all movement comes from the characters. AUDIO (generate sound together with the picture): Off-screen male narrator voice-over, warm intelligent British documentary voice with dry comedic timing, the same voice in every clip, begins speaking within the first half second and says exactly: “The musician noticed. He stopped. Everyone else danced one more beat, blissfully unaware.” The narrator is heard off-screen only; no character lip-syncs to the narrator. Music: music nearly silent. Sound effects: music and drums cut out, one drum stops. No subtitles or captions.</w:t>
+        <w:t>2D hand-drawn stickman cartoon in the exact style of the reference images: thin black outlines, large expressive heads, thin stick arms, flat warm colors, playful documentary-comedy tone, 16:9. Setting: sunny daytime wedding courtyard in ancient Alexandria, sandstone columns, striped awnings, feast tables along the side walls, an open entrance gate at the back. The wedding at its happiest: Senbi and the bride together, musicians playing, guests dancing, banners and flowers swaying lightly in the breeze, warm sunlight. Camera: wide shot of the whole courtyard at eye level; fixed except for an almost imperceptible 5% slow push-in, no tilt or pan. Audio: off-screen British male narrator, warm and dry, begins speaking within half a second and says: “For a few perfect minutes, everything was exactly right. Enjoy this part.” Music: light ancient-Mediterranean wedding music (frame drums, reed flute, plucked strings), same theme in every clip, low under the voice. Sound effects: applause, drums, wind in the banners. Characters keep their exact reference designs. Nobody on screen speaks. No text, captions or logos in the frame.</w:t>
       </w:r>
     </w:p>
     <w:p>
@@ -2336,7 +2197,7 @@
         <w:pStyle w:val="Heading1"/>
       </w:pPr>
       <w:r>
-        <w:t>SHOT 21 — Street empties</w:t>
+        <w:t>SHOT 19 — First warning</w:t>
       </w:r>
     </w:p>
     <w:p>
@@ -2349,7 +2210,7 @@
     </w:p>
     <w:p>
       <w:r>
-        <w:t>09_Alexandria_Streets_and_Market.jpg</w:t>
+        <w:t>11_Wedding_Courtyard_Day.jpg</w:t>
       </w:r>
     </w:p>
     <w:p>
@@ -2367,7 +2228,7 @@
     </w:p>
     <w:p>
       <w:r>
-        <w:t>Outside, the street went quiet. In a busy city, that's never good.</w:t>
+        <w:t>Then a small cup on the table began to tremble. Nobody noticed.</w:t>
       </w:r>
     </w:p>
     <w:p>
@@ -2380,7 +2241,7 @@
     </w:p>
     <w:p>
       <w:r>
-        <w:t>Busy Alexandria street becomes strangely quiet. Civilians look toward the same direction and move aside. All expressions, eye movement and mouth movement are silent nonverbal acting only. No intelligible speech, no lip-sync dialogue.</w:t>
+        <w:t>A small clay cup on a wedding table trembles slightly, as if from distant footsteps. Out-of-focus guests dance behind it, unaware. All expressions and mouth movement are silent acting only; no one on screen speaks.</w:t>
       </w:r>
     </w:p>
     <w:p>
@@ -2393,7 +2254,7 @@
     </w:p>
     <w:p>
       <w:r>
-        <w:t>Static, locked-off: eye-level wide shot of the street. No tilt, pan, zoom or orbit.</w:t>
+        <w:t>Static, locked-off: extreme close-up of the cup; only the cup vibrates, the camera does not. No tilt, pan, zoom or orbit.</w:t>
       </w:r>
     </w:p>
     <w:p>
@@ -2406,7 +2267,7 @@
     </w:p>
     <w:p>
       <w:r>
-        <w:t>Music: music drops to low sustained tension with distant marching drums, almost silent. SFX: street ambience fading, distant boots. All generated inside Flow together with the picture; the narrator stays clearly intelligible.</w:t>
+        <w:t>Music: playful ancient-Mediterranean wedding music with frame drums, reed flute and plucked strings, steady upbeat tempo, the same theme in every clip, mixed low under the narrator and a faint uneasy undertone. SFX: ceramic cup rattling, faint rumble. All generated inside Flow together with the picture; the narrator stays clearly intelligible.</w:t>
       </w:r>
     </w:p>
     <w:p>
@@ -2419,7 +2280,7 @@
     </w:p>
     <w:p>
       <w:r>
-        <w:t>Locked-off static camera, no camera movement. 2D hand-drawn Stickman animation, clean thin black outlines, large expressive heads, simple readable stickman proportions, flat warm colors, historically inspired ancient Alexandria, playful cinematic documentary-comedy tone, 16:9, no 3D, no photorealism, no modern objects, no subtitles, no captions, no logos, no generated text, NO on-screen character dialogue (only the off-screen narrator speaks). Use the selected reference images as strict continuity anchors. Preserve faces, hair, clothing, colors, proportions and accessories exactly. Characters may move their bodies, arms, eyes and mouths for silent nonverbal acting only. VISUAL STYLE LOCK: 2D hand-drawn stickman animation; clean thin black outlines; large expressive heads; simple readable stickman proportions; flat warm colors; historically inspired ancient Alexandria; playful cinematic documentary-comedy tone; no 3D; no photorealism; no modern objects; no subtitles; no captions; no logos; no text inside the generated scene; 16:9. Ancient Alexandria street that was previously busy becomes strangely quiet. Civilians notice something approaching and slowly move to the sides of the street. Keep the Roman figures hidden or extremely distant. 2D stickman animation, historically inspired Alexandria, no modern objects, no text, 16:9. CAMERA: locked-off static camera on a tripod, eye-level wide shot of the street. No camera movement of any kind: no tilt, no pan, no zoom, no push, no pull, no orbit, no tracking, no rising or overhead view. The framing stays identical from the first frame to the last frame; all movement comes from the characters. AUDIO (generate sound together with the picture): Off-screen male narrator voice-over, warm intelligent British documentary voice with dry comedic timing, the same voice in every clip, begins speaking within the first half second and says exactly: “Outside, the street went quiet. In a busy city, that's never good.” The narrator is heard off-screen only; no character lip-syncs to the narrator. Music: music drops to low sustained tension with distant marching drums, almost silent. Sound effects: street ambience fading, distant boots. No subtitles or captions.</w:t>
+        <w:t>2D hand-drawn stickman cartoon in the exact style of the reference images: thin black outlines, large expressive heads, thin stick arms, flat warm colors, playful documentary-comedy tone, 16:9. Setting: sunny daytime wedding courtyard in ancient Alexandria, sandstone columns, striped awnings, feast tables along the side walls, an open entrance gate at the back. A small clay cup on a wedding table trembles slightly, as if from distant footsteps. Out-of-focus guests dance behind it, unaware. Camera: locked-off and perfectly still, extreme close-up of the cup; only the cup vibrates, the camera does not; the framing never changes (no tilt, pan, zoom or rising camera). Audio: off-screen British male narrator, warm and dry, begins speaking within half a second and says: “Then a small cup on the table began to tremble. Nobody noticed.” Music: light ancient-Mediterranean wedding music (frame drums, reed flute, plucked strings) with a faint uneasy undertone, same theme in every clip, low under the voice. Sound effects: ceramic cup rattling, faint rumble. Characters keep their exact reference designs. Nobody on screen speaks. No text, captions or logos in the frame.</w:t>
       </w:r>
     </w:p>
     <w:p>
@@ -2441,7 +2302,7 @@
         <w:pStyle w:val="Heading1"/>
       </w:pPr>
       <w:r>
-        <w:t>SHOT 22 — First Roman step</w:t>
+        <w:t>SHOT 20 — Musician hears it</w:t>
       </w:r>
     </w:p>
     <w:p>
@@ -2454,17 +2315,17 @@
     </w:p>
     <w:p>
       <w:r>
-        <w:t>05_Roman_Soldiers.jpg</w:t>
-      </w:r>
-    </w:p>
-    <w:p>
-      <w:r>
-        <w:t>09_Alexandria_Streets_and_Market.jpg</w:t>
-      </w:r>
-    </w:p>
-    <w:p>
-      <w:r>
-        <w:t>DURATION: 4 sec (sound-effect beat; nothing is spoken)</w:t>
+        <w:t>03_Egyptian_Guests.jpg</w:t>
+      </w:r>
+    </w:p>
+    <w:p>
+      <w:r>
+        <w:t>11_Wedding_Courtyard_Day.jpg</w:t>
+      </w:r>
+    </w:p>
+    <w:p>
+      <w:r>
+        <w:t>DURATION: 8 sec (the line needs about 5–6 s of speech; trim the clip in editing)</w:t>
       </w:r>
     </w:p>
     <w:p>
@@ -2477,7 +2338,7 @@
     </w:p>
     <w:p>
       <w:r>
-        <w:t>(No narration — sound effects only.)</w:t>
+        <w:t>The musician noticed. He stopped. Everyone else danced one more beat, blissfully unaware.</w:t>
       </w:r>
     </w:p>
     <w:p>
@@ -2490,7 +2351,7 @@
     </w:p>
     <w:p>
       <w:r>
-        <w:t>Fixed ground-level frame: first Roman boot enters from the side, then another. The camera never rises. All expressions, eye movement and mouth movement are silent nonverbal acting only. No intelligible speech, no lip-sync dialogue.</w:t>
+        <w:t>An Egyptian musician suddenly stops playing and looks toward the open gate visible behind him; his joy turns to alertness. The dancers behind him keep dancing for one more beat. All expressions and mouth movement are silent acting only; no one on screen speaks.</w:t>
       </w:r>
     </w:p>
     <w:p>
@@ -2503,7 +2364,7 @@
     </w:p>
     <w:p>
       <w:r>
-        <w:t>Static, locked-off: fixed ground-level frame on the street; the boots step into frame from the side and the camera never rises. No tilt, pan, zoom or orbit.</w:t>
+        <w:t>Static, locked-off: eye-level medium shot of the musician with the entrance visible behind him. No tilt, pan, zoom or orbit.</w:t>
       </w:r>
     </w:p>
     <w:p>
@@ -2516,7 +2377,7 @@
     </w:p>
     <w:p>
       <w:r>
-        <w:t>Music: music drops to low sustained tension with distant marching drums, almost silent. SFX: heavy boot steps with metal clank. All generated inside Flow together with the picture; the narrator stays clearly intelligible.</w:t>
+        <w:t>Music: music nearly silent. SFX: music and drums cut out, one drum stops. All generated inside Flow together with the picture; the narrator stays clearly intelligible.</w:t>
       </w:r>
     </w:p>
     <w:p>
@@ -2529,7 +2390,7 @@
     </w:p>
     <w:p>
       <w:r>
-        <w:t>Locked-off static camera, no camera movement. 2D hand-drawn Stickman animation, clean thin black outlines, large expressive heads, simple readable stickman proportions, flat warm colors, historically inspired ancient Alexandria, playful cinematic documentary-comedy tone, 16:9, no 3D, no photorealism, no modern objects, no subtitles, no captions, no logos, no generated text, NO on-screen character dialogue (only the off-screen narrator speaks). Use the selected reference images as strict continuity anchors. Preserve faces, hair, clothing, colors, proportions and accessories exactly. Characters may move their bodies, arms, eyes and mouths for silent nonverbal acting only. VISUAL STYLE LOCK: 2D hand-drawn stickman animation; clean thin black outlines; large expressive heads; simple readable stickman proportions; flat warm colors; historically inspired ancient Alexandria; playful cinematic documentary-comedy tone; no 3D; no photorealism; no modern objects; no subtitles; no captions; no logos; no text inside the generated scene; 16:9. Fixed ground-level frame on the Alexandrian street: a Roman legionary's armored boot steps into frame from the side, followed by a second boot. Show only the lower body at first; keep the reveal mysterious. Preserve the Roman armor and red cloak design from the reference. 2D stickman animation, clean lines, no text, 16:9. Three deliberate marching steps. CAMERA: locked-off static camera on a tripod, fixed ground-level frame on the street; the boots step into frame from the side and the camera never rises. No camera movement of any kind: no tilt, no pan, no zoom, no push, no pull, no orbit, no tracking, no rising or overhead view. The framing stays identical from the first frame to the last frame; all movement comes from the characters. AUDIO (generate sound together with the picture): no narration. Sound effects: heavy boot steps with metal clank. Music: music drops to low sustained tension with distant marching drums, almost silent. No speech of any kind. No subtitles or captions.</w:t>
+        <w:t>2D hand-drawn stickman cartoon in the exact style of the reference images: thin black outlines, large expressive heads, thin stick arms, flat warm colors, playful documentary-comedy tone, 16:9. Setting: sunny daytime wedding courtyard in ancient Alexandria, sandstone columns, striped awnings, feast tables along the side walls, an open entrance gate at the back. An Egyptian musician suddenly stops playing and looks toward the open gate visible behind him; his joy turns to alertness. The dancers behind him keep dancing for one more beat. Camera: locked-off and perfectly still, eye-level medium shot of the musician with the entrance visible behind him; the framing never changes (no tilt, pan, zoom or rising camera). Audio: off-screen British male narrator, warm and dry, begins speaking within half a second and says: “The musician noticed. He stopped. Everyone else danced one more beat, blissfully unaware.” Music: music nearly silent. Sound effects: music and drums cut out, one drum stops. Characters keep their exact reference designs. Nobody on screen speaks. No text, captions or logos in the frame.</w:t>
       </w:r>
     </w:p>
     <w:p>
@@ -2551,7 +2412,7 @@
         <w:pStyle w:val="Heading1"/>
       </w:pPr>
       <w:r>
-        <w:t>SHOT 23 — Roman silhouettes</w:t>
+        <w:t>SHOT 21 — Street empties</w:t>
       </w:r>
     </w:p>
     <w:p>
@@ -2564,17 +2425,12 @@
     </w:p>
     <w:p>
       <w:r>
-        <w:t>05_Roman_Soldiers.jpg</w:t>
-      </w:r>
-    </w:p>
-    <w:p>
-      <w:r>
         <w:t>09_Alexandria_Streets_and_Market.jpg</w:t>
       </w:r>
     </w:p>
     <w:p>
       <w:r>
-        <w:t>DURATION: 6 sec</w:t>
+        <w:t>DURATION: 8 sec (the line needs about 5–6 s of speech; trim the clip in editing)</w:t>
       </w:r>
     </w:p>
     <w:p>
@@ -2587,7 +2443,7 @@
     </w:p>
     <w:p>
       <w:r>
-        <w:t>Clank. Clank. Clank. Marching men. Lots of them.</w:t>
+        <w:t>Outside, the street went quiet. In a busy city, that's never good.</w:t>
       </w:r>
     </w:p>
     <w:p>
@@ -2600,7 +2456,7 @@
     </w:p>
     <w:p>
       <w:r>
-        <w:t>Long street view. Several Roman soldiers appear as distant silhouettes marching toward camera. All expressions, eye movement and mouth movement are silent nonverbal acting only. No intelligible speech, no lip-sync dialogue.</w:t>
+        <w:t>The busy street goes quiet. Civilians notice something at the far end, step aside and clear the road. Nothing is visible yet except settling dust. All expressions and mouth movement are silent acting only; no one on screen speaks.</w:t>
       </w:r>
     </w:p>
     <w:p>
@@ -2613,7 +2469,7 @@
     </w:p>
     <w:p>
       <w:r>
-        <w:t>Locked camera, extremely slow 5% push-in only: eye-level wide street view. No tilt, pan or orbit.</w:t>
+        <w:t>Static, locked-off: eye-level wide shot of the street. No tilt, pan, zoom or orbit.</w:t>
       </w:r>
     </w:p>
     <w:p>
@@ -2626,7 +2482,7 @@
     </w:p>
     <w:p>
       <w:r>
-        <w:t>Music: music drops to low sustained tension with distant marching drums, almost silent. SFX: marching boots in rhythm, metal clinks. All generated inside Flow together with the picture; the narrator stays clearly intelligible.</w:t>
+        <w:t>Music: music drops to low sustained tension with distant marching drums, almost silent. SFX: street ambience fading, distant boots. All generated inside Flow together with the picture; the narrator stays clearly intelligible.</w:t>
       </w:r>
     </w:p>
     <w:p>
@@ -2639,7 +2495,7 @@
     </w:p>
     <w:p>
       <w:r>
-        <w:t>Locked camera, only an extremely slow subtle push-in. 2D hand-drawn Stickman animation, clean thin black outlines, large expressive heads, simple readable stickman proportions, flat warm colors, historically inspired ancient Alexandria, playful cinematic documentary-comedy tone, 16:9, no 3D, no photorealism, no modern objects, no subtitles, no captions, no logos, no generated text, NO on-screen character dialogue (only the off-screen narrator speaks). Use the selected reference images as strict continuity anchors. Preserve faces, hair, clothing, colors, proportions and accessories exactly. Characters may move their bodies, arms, eyes and mouths for silent nonverbal acting only. VISUAL STYLE LOCK: 2D hand-drawn stickman animation; clean thin black outlines; large expressive heads; simple readable stickman proportions; flat warm colors; historically inspired ancient Alexandria; playful cinematic documentary-comedy tone; no 3D; no photorealism; no modern objects; no subtitles; no captions; no logos; no text inside the generated scene; 16:9. Long street view of several Roman soldiers marching toward camera as distant silhouettes. Their shields, helmets and red accents are recognizable but the group remains far away. 2D stickman animation, cinematic mystery, warm Alexandria environment, no text, 16:9. CAMERA: eye-level wide street view. Locked camera with only an extremely slow, subtle push-in (about 5%) over the whole clip. No tilt, no pan, no orbit, no rising or overhead view; the subject stays in the same position in the frame. AUDIO (generate sound together with the picture): Off-screen male narrator voice-over, warm intelligent British documentary voice with dry comedic timing, the same voice in every clip, begins speaking within the first half second and says exactly: “Clank. Clank. Clank. Marching men. Lots of them.” The narrator is heard off-screen only; no character lip-syncs to the narrator. Music: music drops to low sustained tension with distant marching drums, almost silent. Sound effects: marching boots in rhythm, metal clinks. No subtitles or captions.</w:t>
+        <w:t>2D hand-drawn stickman cartoon in the exact style of the reference images: thin black outlines, large expressive heads, thin stick arms, flat warm colors, playful documentary-comedy tone, 16:9. Setting: sunlit street of ancient Alexandria outside the wedding house, sandstone walls and palms. The busy street goes quiet. Civilians notice something at the far end, step aside and clear the road. Nothing is visible yet except settling dust. Camera: locked-off and perfectly still, eye-level wide shot of the street; the framing never changes (no tilt, pan, zoom or rising camera). Audio: off-screen British male narrator, warm and dry, begins speaking within half a second and says: “Outside, the street went quiet. In a busy city, that's never good.” Music: low sustained tension with distant marching drums, almost silent. Sound effects: street ambience fading, distant boots. Characters keep their exact reference designs. Nobody on screen speaks. No text, captions or logos in the frame.</w:t>
       </w:r>
     </w:p>
     <w:p>
@@ -2661,7 +2517,7 @@
         <w:pStyle w:val="Heading1"/>
       </w:pPr>
       <w:r>
-        <w:t>SHOT 24 — Wedding oblivious</w:t>
+        <w:t>SHOT 22 — First Roman step</w:t>
       </w:r>
     </w:p>
     <w:p>
@@ -2674,22 +2530,17 @@
     </w:p>
     <w:p>
       <w:r>
-        <w:t>11_Wedding_Courtyard_Day.jpg</w:t>
-      </w:r>
-    </w:p>
-    <w:p>
-      <w:r>
-        <w:t>01_Senbi.jpg</w:t>
-      </w:r>
-    </w:p>
-    <w:p>
-      <w:r>
-        <w:t>02_Bride.jpg</w:t>
-      </w:r>
-    </w:p>
-    <w:p>
-      <w:r>
-        <w:t>DURATION: 6 sec</w:t>
+        <w:t>05_Roman_Soldiers.jpg</w:t>
+      </w:r>
+    </w:p>
+    <w:p>
+      <w:r>
+        <w:t>09_Alexandria_Streets_and_Market.jpg</w:t>
+      </w:r>
+    </w:p>
+    <w:p>
+      <w:r>
+        <w:t>DURATION: 4 sec (sound-effect beat; nothing is spoken)</w:t>
       </w:r>
     </w:p>
     <w:p>
@@ -2702,7 +2553,7 @@
     </w:p>
     <w:p>
       <w:r>
-        <w:t>Inside, nobody had a clue. Senbi was busy spinning.</w:t>
+        <w:t>(No narration — sound effects only.)</w:t>
       </w:r>
     </w:p>
     <w:p>
@@ -2715,7 +2566,7 @@
     </w:p>
     <w:p>
       <w:r>
-        <w:t>Cut back inside. Guests keep dancing. Senbi is completely unaware. All expressions, eye movement and mouth movement are silent nonverbal acting only. No intelligible speech, no lip-sync dialogue.</w:t>
+        <w:t>At ground level, three heavy Roman boots step into the frame one after another from the side, kicking up a little dust. Only boots and lower legs are visible. All expressions and mouth movement are silent acting only; no one on screen speaks.</w:t>
       </w:r>
     </w:p>
     <w:p>
@@ -2728,7 +2579,7 @@
     </w:p>
     <w:p>
       <w:r>
-        <w:t>Static, locked-off: eye-level medium-wide shot of the courtyard. No tilt, pan, zoom or orbit.</w:t>
+        <w:t>Static, locked-off: fixed ground-level frame on the street; the boots step into frame from the side and the camera never rises. No tilt, pan, zoom or orbit.</w:t>
       </w:r>
     </w:p>
     <w:p>
@@ -2741,7 +2592,7 @@
     </w:p>
     <w:p>
       <w:r>
-        <w:t>Music: playful ancient-Mediterranean wedding music with frame drums, reed flute and plucked strings, steady upbeat tempo, the same theme in every clip, mixed low under the narrator and a faint uneasy undertone. SFX: wedding music muffled, faint thump. All generated inside Flow together with the picture; the narrator stays clearly intelligible.</w:t>
+        <w:t>Music: music drops to low sustained tension with distant marching drums, almost silent. SFX: heavy boot steps with metal clank. All generated inside Flow together with the picture; the narrator stays clearly intelligible.</w:t>
       </w:r>
     </w:p>
     <w:p>
@@ -2754,7 +2605,7 @@
     </w:p>
     <w:p>
       <w:r>
-        <w:t>Locked-off static camera, no camera movement. 2D hand-drawn Stickman animation, clean thin black outlines, large expressive heads, simple readable stickman proportions, flat warm colors, historically inspired ancient Alexandria, playful cinematic documentary-comedy tone, 16:9, no 3D, no photorealism, no modern objects, no subtitles, no captions, no logos, no generated text, NO on-screen character dialogue (only the off-screen narrator speaks). Use the selected reference images as strict continuity anchors. Preserve faces, hair, clothing, colors, proportions and accessories exactly. Characters may move their bodies, arms, eyes and mouths for silent nonverbal acting only. VISUAL STYLE LOCK: 2D hand-drawn stickman animation; clean thin black outlines; large expressive heads; simple readable stickman proportions; flat warm colors; historically inspired ancient Alexandria; playful cinematic documentary-comedy tone; no 3D; no photorealism; no modern objects; no subtitles; no captions; no logos; no text inside the generated scene; 16:9. Cut back inside the wedding. Guests are still dancing and Senbi is still celebrating, completely unaware of the approaching Romans. Bride is also still focused on the celebration. 2D stickman animation, warm colors, no text, 16:9. Hold on the happy celebration for comedic contrast. CAMERA: locked-off static camera on a tripod, eye-level medium-wide shot of the courtyard. No camera movement of any kind: no tilt, no pan, no zoom, no push, no pull, no orbit, no tracking, no rising or overhead view. The framing stays identical from the first frame to the last frame; all movement comes from the characters. AUDIO (generate sound together with the picture): Off-screen male narrator voice-over, warm intelligent British documentary voice with dry comedic timing, the same voice in every clip, begins speaking within the first half second and says exactly: “Inside, nobody had a clue. Senbi was busy spinning.” The narrator is heard off-screen only; no character lip-syncs to the narrator. Music: playful ancient-Mediterranean wedding music with frame drums, reed flute and plucked strings, steady upbeat tempo, the same theme in every clip, mixed low under the narrator and a faint uneasy undertone. Sound effects: wedding music muffled, faint thump. No subtitles or captions.</w:t>
+        <w:t>2D hand-drawn stickman cartoon in the exact style of the reference images: thin black outlines, large expressive heads, thin stick arms, flat warm colors, playful documentary-comedy tone, 16:9. Setting: sunlit street of ancient Alexandria outside the wedding house, sandstone walls and palms. At ground level, three heavy Roman boots step into the frame one after another from the side, kicking up a little dust. Only boots and lower legs are visible. Camera: locked-off and perfectly still, fixed ground-level frame on the street; the boots step into frame from the side and the camera never rises; the framing never changes (no tilt, pan, zoom or rising camera). Audio: no narration and no speech. Sound effects: heavy boot steps with metal clank. Music: low sustained tension with distant marching drums, almost silent. Characters keep their exact reference designs. Nobody on screen speaks. No text, captions or logos in the frame.</w:t>
       </w:r>
     </w:p>
     <w:p>
@@ -2776,7 +2627,7 @@
         <w:pStyle w:val="Heading1"/>
       </w:pPr>
       <w:r>
-        <w:t>SHOT 25 — Roman reveal</w:t>
+        <w:t>SHOT 23 — Roman silhouettes</w:t>
       </w:r>
     </w:p>
     <w:p>
@@ -2799,7 +2650,7 @@
     </w:p>
     <w:p>
       <w:r>
-        <w:t>DURATION: 8 sec (the line needs about 5–6 s of speech; trim the clip in editing)</w:t>
+        <w:t>DURATION: 6 sec</w:t>
       </w:r>
     </w:p>
     <w:p>
@@ -2812,7 +2663,7 @@
     </w:p>
     <w:p>
       <w:r>
-        <w:t>And then Rome arrived. Tired, dusty, and looking for the right address.</w:t>
+        <w:t>Clank. Clank. Clank. Marching men. Lots of them.</w:t>
       </w:r>
     </w:p>
     <w:p>
@@ -2825,7 +2676,7 @@
     </w:p>
     <w:p>
       <w:r>
-        <w:t>Two Roman legionaries clearly enter the street, with historically inspired armor, shields and spears. They look tired and confused. All expressions, eye movement and mouth movement are silent nonverbal acting only. No intelligible speech, no lip-sync dialogue.</w:t>
+        <w:t>Several Roman soldiers appear as small silhouettes far away and march steadily toward the camera in formation; helmets and shields are recognizable but tiny. All expressions and mouth movement are silent acting only; no one on screen speaks.</w:t>
       </w:r>
     </w:p>
     <w:p>
@@ -2838,7 +2689,7 @@
     </w:p>
     <w:p>
       <w:r>
-        <w:t>Static, locked-off: eye-level medium-wide shot of the street; the soldiers walk into the frame. No tilt, pan, zoom or orbit.</w:t>
+        <w:t>Locked camera, extremely slow 5% push-in only: eye-level wide street view. No tilt, pan or orbit.</w:t>
       </w:r>
     </w:p>
     <w:p>
@@ -2851,7 +2702,7 @@
     </w:p>
     <w:p>
       <w:r>
-        <w:t>Music: music drops to low sustained tension with distant marching drums, almost silent. SFX: armor clank, dust, a tired sigh. All generated inside Flow together with the picture; the narrator stays clearly intelligible.</w:t>
+        <w:t>Music: music drops to low sustained tension with distant marching drums, almost silent. SFX: marching boots in rhythm, metal clinks. All generated inside Flow together with the picture; the narrator stays clearly intelligible.</w:t>
       </w:r>
     </w:p>
     <w:p>
@@ -2864,7 +2715,7 @@
     </w:p>
     <w:p>
       <w:r>
-        <w:t>Locked-off static camera, no camera movement. 2D hand-drawn Stickman animation, clean thin black outlines, large expressive heads, simple readable stickman proportions, flat warm colors, historically inspired ancient Alexandria, playful cinematic documentary-comedy tone, 16:9, no 3D, no photorealism, no modern objects, no subtitles, no captions, no logos, no generated text, NO on-screen character dialogue (only the off-screen narrator speaks). Use the selected reference images as strict continuity anchors. Preserve faces, hair, clothing, colors, proportions and accessories exactly. Characters may move their bodies, arms, eyes and mouths for silent nonverbal acting only. VISUAL STYLE LOCK: 2D hand-drawn stickman animation; clean thin black outlines; large expressive heads; simple readable stickman proportions; flat warm colors; historically inspired ancient Alexandria; playful cinematic documentary-comedy tone; no 3D; no photorealism; no modern objects; no subtitles; no captions; no logos; no text inside the generated scene; 16:9. Two Roman legionaries clearly enter the Alexandrian street near the wedding district. They wear historically inspired Roman armor, helmets, red cloaks and carry shields and spears. They look tired and confused rather than cartoonishly evil. 2D stickman animation, exact Roman reference design, no text, 16:9. CAMERA: locked-off static camera on a tripod, eye-level medium-wide shot of the street; the soldiers walk into the frame. No camera movement of any kind: no tilt, no pan, no zoom, no push, no pull, no orbit, no tracking, no rising or overhead view. The framing stays identical from the first frame to the last frame; all movement comes from the characters. AUDIO (generate sound together with the picture): Off-screen male narrator voice-over, warm intelligent British documentary voice with dry comedic timing, the same voice in every clip, begins speaking within the first half second and says exactly: “And then Rome arrived. Tired, dusty, and looking for the right address.” The narrator is heard off-screen only; no character lip-syncs to the narrator. Music: music drops to low sustained tension with distant marching drums, almost silent. Sound effects: armor clank, dust, a tired sigh. No subtitles or captions.</w:t>
+        <w:t>2D hand-drawn stickman cartoon in the exact style of the reference images: thin black outlines, large expressive heads, thin stick arms, flat warm colors, playful documentary-comedy tone, 16:9. Setting: sunlit street of ancient Alexandria outside the wedding house, sandstone walls and palms. Several Roman soldiers appear as small silhouettes far away and march steadily toward the camera in formation; helmets and shields are recognizable but tiny. Camera: eye-level wide street view; fixed except for an almost imperceptible 5% slow push-in, no tilt or pan. Audio: off-screen British male narrator, warm and dry, begins speaking within half a second and says: “Clank. Clank. Clank. Marching men. Lots of them.” Music: low sustained tension with distant marching drums, almost silent. Sound effects: marching boots in rhythm, metal clinks. Characters keep their exact reference designs. Nobody on screen speaks. No text, captions or logos in the frame.</w:t>
       </w:r>
     </w:p>
     <w:p>
@@ -2886,7 +2737,7 @@
         <w:pStyle w:val="Heading1"/>
       </w:pPr>
       <w:r>
-        <w:t>SHOT 26 — Egyptians stare</w:t>
+        <w:t>SHOT 24 — Wedding oblivious</w:t>
       </w:r>
     </w:p>
     <w:p>
@@ -2899,22 +2750,22 @@
     </w:p>
     <w:p>
       <w:r>
-        <w:t>03_Egyptian_Guests.jpg</w:t>
-      </w:r>
-    </w:p>
-    <w:p>
-      <w:r>
-        <w:t>05_Roman_Soldiers.jpg</w:t>
-      </w:r>
-    </w:p>
-    <w:p>
-      <w:r>
         <w:t>11_Wedding_Courtyard_Day.jpg</w:t>
       </w:r>
     </w:p>
     <w:p>
       <w:r>
-        <w:t>DURATION: 8 sec (the line needs about 5–6 s of speech; trim the clip in editing)</w:t>
+        <w:t>01_Senbi.jpg</w:t>
+      </w:r>
+    </w:p>
+    <w:p>
+      <w:r>
+        <w:t>02_Bride.jpg</w:t>
+      </w:r>
+    </w:p>
+    <w:p>
+      <w:r>
+        <w:t>DURATION: 6 sec</w:t>
       </w:r>
     </w:p>
     <w:p>
@@ -2927,7 +2778,7 @@
     </w:p>
     <w:p>
       <w:r>
-        <w:t>The guests peeked out. One terrified. One confused. One assumed it was entertainment.</w:t>
+        <w:t>Inside, nobody had a clue. Senbi was busy spinning.</w:t>
       </w:r>
     </w:p>
     <w:p>
@@ -2940,7 +2791,7 @@
     </w:p>
     <w:p>
       <w:r>
-        <w:t>Egyptian guests peek from the doorway. One is frightened, one confused, one seems to think it is a performance. All expressions, eye movement and mouth movement are silent nonverbal acting only. No intelligible speech, no lip-sync dialogue.</w:t>
+        <w:t>Guests dance and laugh; Senbi spins happily in the center, completely unaware. The open gate at the back stays calm. All expressions and mouth movement are silent acting only; no one on screen speaks.</w:t>
       </w:r>
     </w:p>
     <w:p>
@@ -2953,7 +2804,7 @@
     </w:p>
     <w:p>
       <w:r>
-        <w:t>Static, locked-off: eye-level medium-wide shot of the doorway with all three guests peeking in the same frame. No tilt, pan, zoom or orbit.</w:t>
+        <w:t>Static, locked-off: eye-level medium-wide shot of the courtyard. No tilt, pan, zoom or orbit.</w:t>
       </w:r>
     </w:p>
     <w:p>
@@ -2966,7 +2817,7 @@
     </w:p>
     <w:p>
       <w:r>
-        <w:t>Music: music nearly silent. SFX: murmurs, nervous cough. All generated inside Flow together with the picture; the narrator stays clearly intelligible.</w:t>
+        <w:t>Music: playful ancient-Mediterranean wedding music with frame drums, reed flute and plucked strings, steady upbeat tempo, the same theme in every clip, mixed low under the narrator and a faint uneasy undertone. SFX: wedding music muffled, faint thump. All generated inside Flow together with the picture; the narrator stays clearly intelligible.</w:t>
       </w:r>
     </w:p>
     <w:p>
@@ -2979,7 +2830,7 @@
     </w:p>
     <w:p>
       <w:r>
-        <w:t>Locked-off static camera, no camera movement. 2D hand-drawn Stickman animation, clean thin black outlines, large expressive heads, simple readable stickman proportions, flat warm colors, historically inspired ancient Alexandria, playful cinematic documentary-comedy tone, 16:9, no 3D, no photorealism, no modern objects, no subtitles, no captions, no logos, no generated text, NO on-screen character dialogue (only the off-screen narrator speaks). Use the selected reference images as strict continuity anchors. Preserve faces, hair, clothing, colors, proportions and accessories exactly. Characters may move their bodies, arms, eyes and mouths for silent nonverbal acting only. VISUAL STYLE LOCK: 2D hand-drawn stickman animation; clean thin black outlines; large expressive heads; simple readable stickman proportions; flat warm colors; historically inspired ancient Alexandria; playful cinematic documentary-comedy tone; no 3D; no photorealism; no modern objects; no subtitles; no captions; no logos; no text inside the generated scene; 16:9. Several Egyptian wedding guests peek toward the entrance. One looks frightened, one confused, and one looks as if he thinks the armored newcomers might be performers. Keep reactions readable through body language. 2D stickman animation, no text, 16:9. CAMERA: locked-off static camera on a tripod, eye-level medium-wide shot of the doorway with all three guests peeking in the same frame. No camera movement of any kind: no tilt, no pan, no zoom, no push, no pull, no orbit, no tracking, no rising or overhead view. The framing stays identical from the first frame to the last frame; all movement comes from the characters. AUDIO (generate sound together with the picture): Off-screen male narrator voice-over, warm intelligent British documentary voice with dry comedic timing, the same voice in every clip, begins speaking within the first half second and says exactly: “The guests peeked out. One terrified. One confused. One assumed it was entertainment.” The narrator is heard off-screen only; no character lip-syncs to the narrator. Music: music nearly silent. Sound effects: murmurs, nervous cough. No subtitles or captions.</w:t>
+        <w:t>2D hand-drawn stickman cartoon in the exact style of the reference images: thin black outlines, large expressive heads, thin stick arms, flat warm colors, playful documentary-comedy tone, 16:9. Setting: sunny daytime wedding courtyard in ancient Alexandria, sandstone columns, striped awnings, feast tables along the side walls, an open entrance gate at the back. Guests dance and laugh; Senbi spins happily in the center, completely unaware. The open gate at the back stays calm. Camera: locked-off and perfectly still, eye-level medium-wide shot of the courtyard; the framing never changes (no tilt, pan, zoom or rising camera). Audio: off-screen British male narrator, warm and dry, begins speaking within half a second and says: “Inside, nobody had a clue. Senbi was busy spinning.” Music: light ancient-Mediterranean wedding music (frame drums, reed flute, plucked strings) with a faint uneasy undertone, same theme in every clip, low under the voice. Sound effects: wedding music muffled, faint thump. Characters keep their exact reference designs. Nobody on screen speaks. No text, captions or logos in the frame.</w:t>
       </w:r>
     </w:p>
     <w:p>
@@ -3001,7 +2852,7 @@
         <w:pStyle w:val="Heading1"/>
       </w:pPr>
       <w:r>
-        <w:t>SHOT 27 — Drunk uncle</w:t>
+        <w:t>SHOT 25 — Roman reveal</w:t>
       </w:r>
     </w:p>
     <w:p>
@@ -3014,17 +2865,12 @@
     </w:p>
     <w:p>
       <w:r>
-        <w:t>04_Parents_and_Relatives.jpg</w:t>
-      </w:r>
-    </w:p>
-    <w:p>
-      <w:r>
         <w:t>05_Roman_Soldiers.jpg</w:t>
       </w:r>
     </w:p>
     <w:p>
       <w:r>
-        <w:t>11_Wedding_Courtyard_Day.jpg</w:t>
+        <w:t>09_Alexandria_Streets_and_Market.jpg</w:t>
       </w:r>
     </w:p>
     <w:p>
@@ -3042,7 +2888,7 @@
     </w:p>
     <w:p>
       <w:r>
-        <w:t>Then one uncle, a man with absolutely no fear, grabbed a beer.</w:t>
+        <w:t>And then Rome arrived. Tired, dusty, and looking for the right address.</w:t>
       </w:r>
     </w:p>
     <w:p>
@@ -3055,7 +2901,7 @@
     </w:p>
     <w:p>
       <w:r>
-        <w:t>Cheerful older guest grabs a beer cup and confidently walks toward the Romans. All expressions, eye movement and mouth movement are silent nonverbal acting only. No intelligible speech, no lip-sync dialogue.</w:t>
+        <w:t>Two tired, dusty Roman legionaries walk into the street in front of the wedding house, shields and spears in hand. They stop and look around, confused rather than menacing. All expressions and mouth movement are silent acting only; no one on screen speaks.</w:t>
       </w:r>
     </w:p>
     <w:p>
@@ -3068,7 +2914,7 @@
     </w:p>
     <w:p>
       <w:r>
-        <w:t>Static, locked-off: eye-level medium-wide shot; the uncle walks across the frame. No tilt, pan, zoom or orbit.</w:t>
+        <w:t>Static, locked-off: eye-level medium-wide shot of the street; the soldiers walk into the frame. No tilt, pan, zoom or orbit.</w:t>
       </w:r>
     </w:p>
     <w:p>
@@ -3081,7 +2927,7 @@
     </w:p>
     <w:p>
       <w:r>
-        <w:t>Music: playful comic percussion over the wedding rhythm, mixed low under the narrator. SFX: cup clink. All generated inside Flow together with the picture; the narrator stays clearly intelligible.</w:t>
+        <w:t>Music: music drops to low sustained tension with distant marching drums, almost silent. SFX: armor clank, dust, a tired sigh. All generated inside Flow together with the picture; the narrator stays clearly intelligible.</w:t>
       </w:r>
     </w:p>
     <w:p>
@@ -3094,7 +2940,7 @@
     </w:p>
     <w:p>
       <w:r>
-        <w:t>Locked-off static camera, no camera movement. 2D hand-drawn Stickman animation, clean thin black outlines, large expressive heads, simple readable stickman proportions, flat warm colors, historically inspired ancient Alexandria, playful cinematic documentary-comedy tone, 16:9, no 3D, no photorealism, no modern objects, no subtitles, no captions, no logos, no generated text, NO on-screen character dialogue (only the off-screen narrator speaks). Use the selected reference images as strict continuity anchors. Preserve faces, hair, clothing, colors, proportions and accessories exactly. Characters may move their bodies, arms, eyes and mouths for silent nonverbal acting only. VISUAL STYLE LOCK: 2D hand-drawn stickman animation; clean thin black outlines; large expressive heads; simple readable stickman proportions; flat warm colors; historically inspired ancient Alexandria; playful cinematic documentary-comedy tone; no 3D; no photorealism; no modern objects; no subtitles; no captions; no logos; no text inside the generated scene; 16:9. A cheerful older Egyptian relative grabs a traditional beer cup and confidently walks toward the Roman soldiers as if greeting ordinary wedding guests. He is friendly and slightly tipsy. 2D stickman animation, clean outlines, no text, 16:9. CAMERA: locked-off static camera on a tripod, eye-level medium-wide shot; the uncle walks across the frame. No camera movement of any kind: no tilt, no pan, no zoom, no push, no pull, no orbit, no tracking, no rising or overhead view. The framing stays identical from the first frame to the last frame; all movement comes from the characters. AUDIO (generate sound together with the picture): Off-screen male narrator voice-over, warm intelligent British documentary voice with dry comedic timing, the same voice in every clip, begins speaking within the first half second and says exactly: “Then one uncle, a man with absolutely no fear, grabbed a beer.” The narrator is heard off-screen only; no character lip-syncs to the narrator. Music: playful comic percussion over the wedding rhythm, mixed low under the narrator. Sound effects: cup clink. No subtitles or captions.</w:t>
+        <w:t>2D hand-drawn stickman cartoon in the exact style of the reference images: thin black outlines, large expressive heads, thin stick arms, flat warm colors, playful documentary-comedy tone, 16:9. Setting: sunlit street of ancient Alexandria outside the wedding house, sandstone walls and palms. Two tired, dusty Roman legionaries walk into the street in front of the wedding house, shields and spears in hand. They stop and look around, confused rather than menacing. Camera: locked-off and perfectly still, eye-level medium-wide shot of the street; the soldiers walk into the frame; the framing never changes (no tilt, pan, zoom or rising camera). Audio: off-screen British male narrator, warm and dry, begins speaking within half a second and says: “And then Rome arrived. Tired, dusty, and looking for the right address.” Music: low sustained tension with distant marching drums, almost silent. Sound effects: armor clank, dust, a tired sigh. Characters keep their exact reference designs. Nobody on screen speaks. No text, captions or logos in the frame.</w:t>
       </w:r>
     </w:p>
     <w:p>
@@ -3116,7 +2962,7 @@
         <w:pStyle w:val="Heading1"/>
       </w:pPr>
       <w:r>
-        <w:t>SHOT 28 — Offering beer</w:t>
+        <w:t>SHOT 26 — Egyptians stare</w:t>
       </w:r>
     </w:p>
     <w:p>
@@ -3129,7 +2975,7 @@
     </w:p>
     <w:p>
       <w:r>
-        <w:t>04_Parents_and_Relatives.jpg</w:t>
+        <w:t>03_Egyptian_Guests.jpg</w:t>
       </w:r>
     </w:p>
     <w:p>
@@ -3139,6 +2985,11 @@
     </w:p>
     <w:p>
       <w:r>
+        <w:t>11_Wedding_Courtyard_Day.jpg</w:t>
+      </w:r>
+    </w:p>
+    <w:p>
+      <w:r>
         <w:t>DURATION: 8 sec (the line needs about 5–6 s of speech; trim the clip in editing)</w:t>
       </w:r>
     </w:p>
@@ -3152,7 +3003,7 @@
     </w:p>
     <w:p>
       <w:r>
-        <w:t>He offered it to a Roman. As if it were completely normal.</w:t>
+        <w:t>The guests peeked out. One terrified. One confused. One assumed it was entertainment.</w:t>
       </w:r>
     </w:p>
     <w:p>
@@ -3165,7 +3016,7 @@
     </w:p>
     <w:p>
       <w:r>
-        <w:t>Uncle extends the cup. Roman soldier looks at cup, then at uncle. All expressions, eye movement and mouth movement are silent nonverbal acting only. No intelligible speech, no lip-sync dialogue.</w:t>
+        <w:t>Three guests peek out of the doorway at the same time: one frightened, one confused, one grinning as if the soldiers are the entertainment. All expressions and mouth movement are silent acting only; no one on screen speaks.</w:t>
       </w:r>
     </w:p>
     <w:p>
@@ -3178,7 +3029,7 @@
     </w:p>
     <w:p>
       <w:r>
-        <w:t>Static, locked-off: eye-level medium two-shot. No tilt, pan, zoom or orbit.</w:t>
+        <w:t>Static, locked-off: eye-level medium-wide shot of the doorway with all three guests peeking in the same frame. No tilt, pan, zoom or orbit.</w:t>
       </w:r>
     </w:p>
     <w:p>
@@ -3191,7 +3042,7 @@
     </w:p>
     <w:p>
       <w:r>
-        <w:t>Music: music nearly silent. SFX: cup clink, awkward silence. All generated inside Flow together with the picture; the narrator stays clearly intelligible.</w:t>
+        <w:t>Music: music nearly silent. SFX: murmurs, nervous cough. All generated inside Flow together with the picture; the narrator stays clearly intelligible.</w:t>
       </w:r>
     </w:p>
     <w:p>
@@ -3204,7 +3055,7 @@
     </w:p>
     <w:p>
       <w:r>
-        <w:t>Locked-off static camera, no camera movement. 2D hand-drawn Stickman animation, clean thin black outlines, large expressive heads, simple readable stickman proportions, flat warm colors, historically inspired ancient Alexandria, playful cinematic documentary-comedy tone, 16:9, no 3D, no photorealism, no modern objects, no subtitles, no captions, no logos, no generated text, NO on-screen character dialogue (only the off-screen narrator speaks). Use the selected reference images as strict continuity anchors. Preserve faces, hair, clothing, colors, proportions and accessories exactly. Characters may move their bodies, arms, eyes and mouths for silent nonverbal acting only. VISUAL STYLE LOCK: 2D hand-drawn stickman animation; clean thin black outlines; large expressive heads; simple readable stickman proportions; flat warm colors; historically inspired ancient Alexandria; playful cinematic documentary-comedy tone; no 3D; no photorealism; no modern objects; no subtitles; no captions; no logos; no text inside the generated scene; 16:9. The Egyptian relative extends the beer cup toward a Roman soldier. The Roman soldier stares at the cup, then looks at the man with complete confusion. Preserve both character designs. 2D stickman animation, comedic pause, no text, 16:9. CAMERA: locked-off static camera on a tripod, eye-level medium two-shot. No camera movement of any kind: no tilt, no pan, no zoom, no push, no pull, no orbit, no tracking, no rising or overhead view. The framing stays identical from the first frame to the last frame; all movement comes from the characters. AUDIO (generate sound together with the picture): Off-screen male narrator voice-over, warm intelligent British documentary voice with dry comedic timing, the same voice in every clip, begins speaking within the first half second and says exactly: “He offered it to a Roman. As if it were completely normal.” The narrator is heard off-screen only; no character lip-syncs to the narrator. Music: music nearly silent. Sound effects: cup clink, awkward silence. No subtitles or captions.</w:t>
+        <w:t>2D hand-drawn stickman cartoon in the exact style of the reference images: thin black outlines, large expressive heads, thin stick arms, flat warm colors, playful documentary-comedy tone, 16:9. Setting: sunlit street of ancient Alexandria outside the wedding house, sandstone walls and palms. Three guests peek out of the doorway at the same time: one frightened, one confused, one grinning as if the soldiers are the entertainment. Camera: locked-off and perfectly still, eye-level medium-wide shot of the doorway with all three guests peeking in the same frame; the framing never changes (no tilt, pan, zoom or rising camera). Audio: off-screen British male narrator, warm and dry, begins speaking within half a second and says: “The guests peeked out. One terrified. One confused. One assumed it was entertainment.” Music: music nearly silent. Sound effects: murmurs, nervous cough. Characters keep their exact reference designs. Nobody on screen speaks. No text, captions or logos in the frame.</w:t>
       </w:r>
     </w:p>
     <w:p>
@@ -3226,7 +3077,7 @@
         <w:pStyle w:val="Heading1"/>
       </w:pPr>
       <w:r>
-        <w:t>SHOT 29 — Roman confusion</w:t>
+        <w:t>SHOT 27 — Drunk uncle</w:t>
       </w:r>
     </w:p>
     <w:p>
@@ -3239,11 +3090,21 @@
     </w:p>
     <w:p>
       <w:r>
+        <w:t>04_Parents_and_Relatives.jpg</w:t>
+      </w:r>
+    </w:p>
+    <w:p>
+      <w:r>
         <w:t>05_Roman_Soldiers.jpg</w:t>
       </w:r>
     </w:p>
     <w:p>
       <w:r>
+        <w:t>11_Wedding_Courtyard_Day.jpg</w:t>
+      </w:r>
+    </w:p>
+    <w:p>
+      <w:r>
         <w:t>DURATION: 8 sec (the line needs about 5–6 s of speech; trim the clip in editing)</w:t>
       </w:r>
     </w:p>
@@ -3257,7 +3118,7 @@
     </w:p>
     <w:p>
       <w:r>
-        <w:t>The soldier stared at the cup, then the uncle. A trap? Or hospitality?</w:t>
+        <w:t>Then one uncle, a man with absolutely no fear, grabbed a beer.</w:t>
       </w:r>
     </w:p>
     <w:p>
@@ -3270,7 +3131,7 @@
     </w:p>
     <w:p>
       <w:r>
-        <w:t>Roman soldier looks deeply confused while uncle smiles as if this is normal. All expressions, eye movement and mouth movement are silent nonverbal acting only. No intelligible speech, no lip-sync dialogue.</w:t>
+        <w:t>A cheerful, slightly tipsy older uncle grabs a clay beer cup and walks confidently across the frame toward the Roman soldiers, as if greeting ordinary guests. All expressions and mouth movement are silent acting only; no one on screen speaks.</w:t>
       </w:r>
     </w:p>
     <w:p>
@@ -3283,7 +3144,7 @@
     </w:p>
     <w:p>
       <w:r>
-        <w:t>Locked camera, extremely slow 5% push-in only: eye-level medium close-up of the soldier. No tilt, pan or orbit.</w:t>
+        <w:t>Static, locked-off: eye-level medium-wide shot; the uncle walks across the frame. No tilt, pan, zoom or orbit.</w:t>
       </w:r>
     </w:p>
     <w:p>
@@ -3296,7 +3157,7 @@
     </w:p>
     <w:p>
       <w:r>
-        <w:t>Music: music nearly silent. SFX: tiny gulp, uneasy hum. All generated inside Flow together with the picture; the narrator stays clearly intelligible.</w:t>
+        <w:t>Music: playful comic percussion over the wedding rhythm, mixed low under the narrator. SFX: cup clink. All generated inside Flow together with the picture; the narrator stays clearly intelligible.</w:t>
       </w:r>
     </w:p>
     <w:p>
@@ -3309,7 +3170,7 @@
     </w:p>
     <w:p>
       <w:r>
-        <w:t>Locked camera, only an extremely slow subtle push-in. 2D hand-drawn Stickman animation, clean thin black outlines, large expressive heads, simple readable stickman proportions, flat warm colors, historically inspired ancient Alexandria, playful cinematic documentary-comedy tone, 16:9, no 3D, no photorealism, no modern objects, no subtitles, no captions, no logos, no generated text, NO on-screen character dialogue (only the off-screen narrator speaks). Use the selected reference images as strict continuity anchors. Preserve faces, hair, clothing, colors, proportions and accessories exactly. Characters may move their bodies, arms, eyes and mouths for silent nonverbal acting only. VISUAL STYLE LOCK: 2D hand-drawn stickman animation; clean thin black outlines; large expressive heads; simple readable stickman proportions; flat warm colors; historically inspired ancient Alexandria; playful cinematic documentary-comedy tone; no 3D; no photorealism; no modern objects; no subtitles; no captions; no logos; no text inside the generated scene; 16:9. Close-up of the Roman soldier's confused face as he looks from the beer cup to the smiling Egyptian relative. Keep the helmet, face and armor consistent with the Roman reference. 2D stickman animation, no text, 16:9. CAMERA: eye-level medium close-up of the soldier. Locked camera with only an extremely slow, subtle push-in (about 5%) over the whole clip. No tilt, no pan, no orbit, no rising or overhead view; the subject stays in the same position in the frame. AUDIO (generate sound together with the picture): Off-screen male narrator voice-over, warm intelligent British documentary voice with dry comedic timing, the same voice in every clip, begins speaking within the first half second and says exactly: “The soldier stared at the cup, then the uncle. A trap? Or hospitality?” The narrator is heard off-screen only; no character lip-syncs to the narrator. Music: music nearly silent. Sound effects: tiny gulp, uneasy hum. No subtitles or captions.</w:t>
+        <w:t>2D hand-drawn stickman cartoon in the exact style of the reference images: thin black outlines, large expressive heads, thin stick arms, flat warm colors, playful documentary-comedy tone, 16:9. Setting: sunlit street of ancient Alexandria outside the wedding house, sandstone walls and palms. A cheerful, slightly tipsy older uncle grabs a clay beer cup and walks confidently across the frame toward the Roman soldiers, as if greeting ordinary guests. Camera: locked-off and perfectly still, eye-level medium-wide shot; the uncle walks across the frame; the framing never changes (no tilt, pan, zoom or rising camera). Audio: off-screen British male narrator, warm and dry, begins speaking within half a second and says: “Then one uncle, a man with absolutely no fear, grabbed a beer.” Music: playful comic percussion over the wedding rhythm, low under the voice. Sound effects: cup clink. Characters keep their exact reference designs. Nobody on screen speaks. No text, captions or logos in the frame.</w:t>
       </w:r>
     </w:p>
     <w:p>
@@ -3331,7 +3192,7 @@
         <w:pStyle w:val="Heading1"/>
       </w:pPr>
       <w:r>
-        <w:t>SHOT 30 — Food wins</w:t>
+        <w:t>SHOT 28 — Offering beer</w:t>
       </w:r>
     </w:p>
     <w:p>
@@ -3344,21 +3205,16 @@
     </w:p>
     <w:p>
       <w:r>
+        <w:t>04_Parents_and_Relatives.jpg</w:t>
+      </w:r>
+    </w:p>
+    <w:p>
+      <w:r>
         <w:t>05_Roman_Soldiers.jpg</w:t>
       </w:r>
     </w:p>
     <w:p>
       <w:r>
-        <w:t>12_Interior_Feast_Night.jpg</w:t>
-      </w:r>
-    </w:p>
-    <w:p>
-      <w:r>
-        <w:t>11_Wedding_Courtyard_Day.jpg</w:t>
-      </w:r>
-    </w:p>
-    <w:p>
-      <w:r>
         <w:t>DURATION: 8 sec (the line needs about 5–6 s of speech; trim the clip in editing)</w:t>
       </w:r>
     </w:p>
@@ -3372,7 +3228,7 @@
     </w:p>
     <w:p>
       <w:r>
-        <w:t>Then the Romans saw the food. Military discipline lasted about four seconds.</w:t>
+        <w:t>He offered it to a Roman. As if it were completely normal.</w:t>
       </w:r>
     </w:p>
     <w:p>
@@ -3385,7 +3241,7 @@
     </w:p>
     <w:p>
       <w:r>
-        <w:t>Romans notice the feast. One looks at roasted bird, another at bread. Their military seriousness cracks. All expressions, eye movement and mouth movement are silent nonverbal acting only. No intelligible speech, no lip-sync dialogue.</w:t>
+        <w:t>The uncle offers the cup with a big smile. A Roman soldier looks at the cup, then at the uncle, and does not move. All expressions and mouth movement are silent acting only; no one on screen speaks.</w:t>
       </w:r>
     </w:p>
     <w:p>
@@ -3398,7 +3254,7 @@
     </w:p>
     <w:p>
       <w:r>
-        <w:t>Static, locked-off: eye-level wide-medium shot: the soldiers in the foreground, the feast table behind them; they turn their heads toward it. No tilt, pan, zoom or orbit.</w:t>
+        <w:t>Static, locked-off: eye-level medium two-shot. No tilt, pan, zoom or orbit.</w:t>
       </w:r>
     </w:p>
     <w:p>
@@ -3411,7 +3267,7 @@
     </w:p>
     <w:p>
       <w:r>
-        <w:t>Music: playful comic percussion over the wedding rhythm, mixed low under the narrator. SFX: stomach growl, sniff. All generated inside Flow together with the picture; the narrator stays clearly intelligible.</w:t>
+        <w:t>Music: music nearly silent. SFX: cup clink, awkward silence. All generated inside Flow together with the picture; the narrator stays clearly intelligible.</w:t>
       </w:r>
     </w:p>
     <w:p>
@@ -3424,7 +3280,7 @@
     </w:p>
     <w:p>
       <w:r>
-        <w:t>Locked-off static camera, no camera movement. 2D hand-drawn Stickman animation, clean thin black outlines, large expressive heads, simple readable stickman proportions, flat warm colors, historically inspired ancient Alexandria, playful cinematic documentary-comedy tone, 16:9, no 3D, no photorealism, no modern objects, no subtitles, no captions, no logos, no generated text, NO on-screen character dialogue (only the off-screen narrator speaks). Use the selected reference images as strict continuity anchors. Preserve faces, hair, clothing, colors, proportions and accessories exactly. Characters may move their bodies, arms, eyes and mouths for silent nonverbal acting only. VISUAL STYLE LOCK: 2D hand-drawn stickman animation; clean thin black outlines; large expressive heads; simple readable stickman proportions; flat warm colors; historically inspired ancient Alexandria; playful cinematic documentary-comedy tone; no 3D; no photorealism; no modern objects; no subtitles; no captions; no logos; no text inside the generated scene; 16:9. The Roman soldiers notice the wedding feast. Their serious expressions soften as they look toward roasted food, bread and fruit. One soldier subtly leans toward the feast with obvious interest. 2D stickman animation, no text, 16:9. CAMERA: locked-off static camera on a tripod, eye-level wide-medium shot: the soldiers in the foreground, the feast table behind them; they turn their heads toward it. No camera movement of any kind: no tilt, no pan, no zoom, no push, no pull, no orbit, no tracking, no rising or overhead view. The framing stays identical from the first frame to the last frame; all movement comes from the characters. AUDIO (generate sound together with the picture): Off-screen male narrator voice-over, warm intelligent British documentary voice with dry comedic timing, the same voice in every clip, begins speaking within the first half second and says exactly: “Then the Romans saw the food. Military discipline lasted about four seconds.” The narrator is heard off-screen only; no character lip-syncs to the narrator. Music: playful comic percussion over the wedding rhythm, mixed low under the narrator. Sound effects: stomach growl, sniff. No subtitles or captions.</w:t>
+        <w:t>2D hand-drawn stickman cartoon in the exact style of the reference images: thin black outlines, large expressive heads, thin stick arms, flat warm colors, playful documentary-comedy tone, 16:9. Setting: sunlit street of ancient Alexandria outside the wedding house, sandstone walls and palms. The uncle offers the cup with a big smile. A Roman soldier looks at the cup, then at the uncle, and does not move. Camera: locked-off and perfectly still, eye-level medium two-shot; the framing never changes (no tilt, pan, zoom or rising camera). Audio: off-screen British male narrator, warm and dry, begins speaking within half a second and says: “He offered it to a Roman. As if it were completely normal.” Music: music nearly silent. Sound effects: cup clink, awkward silence. Characters keep their exact reference designs. Nobody on screen speaks. No text, captions or logos in the frame.</w:t>
       </w:r>
     </w:p>
     <w:p>
@@ -3446,7 +3302,7 @@
         <w:pStyle w:val="Heading1"/>
       </w:pPr>
       <w:r>
-        <w:t>SHOT 31 — Accidental party</w:t>
+        <w:t>SHOT 29 — Roman confusion</w:t>
       </w:r>
     </w:p>
     <w:p>
@@ -3464,16 +3320,6 @@
     </w:p>
     <w:p>
       <w:r>
-        <w:t>03_Egyptian_Guests.jpg</w:t>
-      </w:r>
-    </w:p>
-    <w:p>
-      <w:r>
-        <w:t>11_Wedding_Courtyard_Day.jpg</w:t>
-      </w:r>
-    </w:p>
-    <w:p>
-      <w:r>
         <w:t>DURATION: 8 sec (the line needs about 5–6 s of speech; trim the clip in editing)</w:t>
       </w:r>
     </w:p>
@@ -3487,7 +3333,7 @@
     </w:p>
     <w:p>
       <w:r>
-        <w:t>One soldier stepped into the dance. Nobody stopped him. Somehow, it worked.</w:t>
+        <w:t>The soldier stared at the cup, then the uncle. A trap? Or hospitality?</w:t>
       </w:r>
     </w:p>
     <w:p>
@@ -3500,7 +3346,7 @@
     </w:p>
     <w:p>
       <w:r>
-        <w:t>One Roman awkwardly steps into the dance. Egyptians stare. One guest copies him. All expressions, eye movement and mouth movement are silent nonverbal acting only. No intelligible speech, no lip-sync dialogue.</w:t>
+        <w:t>Close-up of the Roman soldier's confused face. He looks from the cup to the smiling uncle, cautiously takes the cup, and his eyes slide sideways toward his comrades. All expressions and mouth movement are silent acting only; no one on screen speaks.</w:t>
       </w:r>
     </w:p>
     <w:p>
@@ -3513,7 +3359,7 @@
     </w:p>
     <w:p>
       <w:r>
-        <w:t>Static, locked-off: eye-level wide shot. No tilt, pan, zoom or orbit.</w:t>
+        <w:t>Locked camera, extremely slow 5% push-in only: eye-level medium close-up of the soldier. No tilt, pan or orbit.</w:t>
       </w:r>
     </w:p>
     <w:p>
@@ -3526,7 +3372,7 @@
     </w:p>
     <w:p>
       <w:r>
-        <w:t>Music: playful comic percussion over the wedding rhythm, mixed low under the narrator. SFX: shield tap blending into the rhythm, clapping. All generated inside Flow together with the picture; the narrator stays clearly intelligible.</w:t>
+        <w:t>Music: music nearly silent. SFX: tiny gulp, uneasy hum. All generated inside Flow together with the picture; the narrator stays clearly intelligible.</w:t>
       </w:r>
     </w:p>
     <w:p>
@@ -3539,7 +3385,7 @@
     </w:p>
     <w:p>
       <w:r>
-        <w:t>Locked-off static camera, no camera movement. 2D hand-drawn Stickman animation, clean thin black outlines, large expressive heads, simple readable stickman proportions, flat warm colors, historically inspired ancient Alexandria, playful cinematic documentary-comedy tone, 16:9, no 3D, no photorealism, no modern objects, no subtitles, no captions, no logos, no generated text, NO on-screen character dialogue (only the off-screen narrator speaks). Use the selected reference images as strict continuity anchors. Preserve faces, hair, clothing, colors, proportions and accessories exactly. Characters may move their bodies, arms, eyes and mouths for silent nonverbal acting only. VISUAL STYLE LOCK: 2D hand-drawn stickman animation; clean thin black outlines; large expressive heads; simple readable stickman proportions; flat warm colors; historically inspired ancient Alexandria; playful cinematic documentary-comedy tone; no 3D; no photorealism; no modern objects; no subtitles; no captions; no logos; no text inside the generated scene; 16:9. One Roman soldier awkwardly steps into the edge of the Egyptian dance. The Egyptians stare, then one guest copies the soldier's stiff movement. The mood changes from tension to absurd comedy. 2D stickman animation, clean thin lines, no text, 16:9. CAMERA: locked-off static camera on a tripod, eye-level wide shot. No camera movement of any kind: no tilt, no pan, no zoom, no push, no pull, no orbit, no tracking, no rising or overhead view. The framing stays identical from the first frame to the last frame; all movement comes from the characters. AUDIO (generate sound together with the picture): Off-screen male narrator voice-over, warm intelligent British documentary voice with dry comedic timing, the same voice in every clip, begins speaking within the first half second and says exactly: “One soldier stepped into the dance. Nobody stopped him. Somehow, it worked.” The narrator is heard off-screen only; no character lip-syncs to the narrator. Music: playful comic percussion over the wedding rhythm, mixed low under the narrator. Sound effects: shield tap blending into the rhythm, clapping. No subtitles or captions.</w:t>
+        <w:t>2D hand-drawn stickman cartoon in the exact style of the reference images: thin black outlines, large expressive heads, thin stick arms, flat warm colors, playful documentary-comedy tone, 16:9. Setting: sunlit street of ancient Alexandria outside the wedding house, sandstone walls and palms. Close-up of the Roman soldier's confused face. He looks from the cup to the smiling uncle, cautiously takes the cup, and his eyes slide sideways toward his comrades. Camera: eye-level medium close-up of the soldier; fixed except for an almost imperceptible 5% slow push-in, no tilt or pan. Audio: off-screen British male narrator, warm and dry, begins speaking within half a second and says: “The soldier stared at the cup, then the uncle. A trap? Or hospitality?” Music: music nearly silent. Sound effects: tiny gulp, uneasy hum. Characters keep their exact reference designs. Nobody on screen speaks. No text, captions or logos in the frame.</w:t>
       </w:r>
     </w:p>
     <w:p>
@@ -3561,7 +3407,7 @@
         <w:pStyle w:val="Heading1"/>
       </w:pPr>
       <w:r>
-        <w:t>SHOT 32 — Armor dance</w:t>
+        <w:t>SHOT 30 — Food wins</w:t>
       </w:r>
     </w:p>
     <w:p>
@@ -3579,7 +3425,7 @@
     </w:p>
     <w:p>
       <w:r>
-        <w:t>03_Egyptian_Guests.jpg</w:t>
+        <w:t>12_Interior_Feast_Night.jpg</w:t>
       </w:r>
     </w:p>
     <w:p>
@@ -3589,7 +3435,7 @@
     </w:p>
     <w:p>
       <w:r>
-        <w:t>DURATION: 6 sec</w:t>
+        <w:t>DURATION: 8 sec (the line needs about 5–6 s of speech; trim the clip in editing)</w:t>
       </w:r>
     </w:p>
     <w:p>
@@ -3602,7 +3448,7 @@
     </w:p>
     <w:p>
       <w:r>
-        <w:t>Roman engineering changed the world. Roman dancing did not.</w:t>
+        <w:t>Then the Romans saw the food. Military discipline lasted about four seconds.</w:t>
       </w:r>
     </w:p>
     <w:p>
@@ -3615,7 +3461,7 @@
     </w:p>
     <w:p>
       <w:r>
-        <w:t>Several Romans attempt the dance in armor; movements are stiff and hilariously synchronized. All expressions, eye movement and mouth movement are silent nonverbal acting only. No intelligible speech, no lip-sync dialogue.</w:t>
+        <w:t>Two Roman soldiers in the foreground, the feast table with roast goose, bread and fruit behind them. Their serious faces soften as they turn their heads toward the food; one leans slightly forward. All expressions and mouth movement are silent acting only; no one on screen speaks.</w:t>
       </w:r>
     </w:p>
     <w:p>
@@ -3628,7 +3474,7 @@
     </w:p>
     <w:p>
       <w:r>
-        <w:t>Static, locked-off: eye-level wide shot of the dancing Romans. No tilt, pan, zoom or orbit.</w:t>
+        <w:t>Static, locked-off: eye-level wide-medium shot: the soldiers in the foreground, the feast table behind them; they turn their heads toward it. No tilt, pan, zoom or orbit.</w:t>
       </w:r>
     </w:p>
     <w:p>
@@ -3641,7 +3487,7 @@
     </w:p>
     <w:p>
       <w:r>
-        <w:t>Music: playful comic percussion over the wedding rhythm, mixed low under the narrator. SFX: armor clanking out of rhythm. All generated inside Flow together with the picture; the narrator stays clearly intelligible.</w:t>
+        <w:t>Music: playful comic percussion over the wedding rhythm, mixed low under the narrator. SFX: stomach growl, sniff. All generated inside Flow together with the picture; the narrator stays clearly intelligible.</w:t>
       </w:r>
     </w:p>
     <w:p>
@@ -3654,7 +3500,7 @@
     </w:p>
     <w:p>
       <w:r>
-        <w:t>Locked-off static camera, no camera movement. 2D hand-drawn Stickman animation, clean thin black outlines, large expressive heads, simple readable stickman proportions, flat warm colors, historically inspired ancient Alexandria, playful cinematic documentary-comedy tone, 16:9, no 3D, no photorealism, no modern objects, no subtitles, no captions, no logos, no generated text, NO on-screen character dialogue (only the off-screen narrator speaks). Use the selected reference images as strict continuity anchors. Preserve faces, hair, clothing, colors, proportions and accessories exactly. Characters may move their bodies, arms, eyes and mouths for silent nonverbal acting only. VISUAL STYLE LOCK: 2D hand-drawn stickman animation; clean thin black outlines; large expressive heads; simple readable stickman proportions; flat warm colors; historically inspired ancient Alexandria; playful cinematic documentary-comedy tone; no 3D; no photorealism; no modern objects; no subtitles; no captions; no logos; no text inside the generated scene; 16:9. Several Roman soldiers attempt the Egyptian wedding dance while wearing heavy armor. Their movements are stiff, synchronized and unintentionally hilarious. Egyptian dancers continue beside them. Preserve Roman armor design. 2D stickman animation, no text, 16:9. CAMERA: locked-off static camera on a tripod, eye-level wide shot of the dancing Romans. No camera movement of any kind: no tilt, no pan, no zoom, no push, no pull, no orbit, no tracking, no rising or overhead view. The framing stays identical from the first frame to the last frame; all movement comes from the characters. AUDIO (generate sound together with the picture): Off-screen male narrator voice-over, warm intelligent British documentary voice with dry comedic timing, the same voice in every clip, begins speaking within the first half second and says exactly: “Roman engineering changed the world. Roman dancing did not.” The narrator is heard off-screen only; no character lip-syncs to the narrator. Music: playful comic percussion over the wedding rhythm, mixed low under the narrator. Sound effects: armor clanking out of rhythm. No subtitles or captions.</w:t>
+        <w:t>2D hand-drawn stickman cartoon in the exact style of the reference images: thin black outlines, large expressive heads, thin stick arms, flat warm colors, playful documentary-comedy tone, 16:9. Setting: sunny daytime wedding courtyard in ancient Alexandria, sandstone columns, striped awnings, feast tables along the side walls, an open entrance gate at the back. Two Roman soldiers in the foreground, the feast table with roast goose, bread and fruit behind them. Their serious faces soften as they turn their heads toward the food; one leans slightly forward. Camera: locked-off and perfectly still, eye-level wide-medium shot: the soldiers in the foreground, the feast table behind them; they turn their heads toward it; the framing never changes (no tilt, pan, zoom or rising camera). Audio: off-screen British male narrator, warm and dry, begins speaking within half a second and says: “Then the Romans saw the food. Military discipline lasted about four seconds.” Music: playful comic percussion over the wedding rhythm, low under the voice. Sound effects: stomach growl, sniff. Characters keep their exact reference designs. Nobody on screen speaks. No text, captions or logos in the frame.</w:t>
       </w:r>
     </w:p>
     <w:p>
@@ -3676,7 +3522,7 @@
         <w:pStyle w:val="Heading1"/>
       </w:pPr>
       <w:r>
-        <w:t>SHOT 33 — Senbi joins</w:t>
+        <w:t>SHOT 31 — Accidental party</w:t>
       </w:r>
     </w:p>
     <w:p>
@@ -3689,16 +3535,16 @@
     </w:p>
     <w:p>
       <w:r>
-        <w:t>01_Senbi.jpg</w:t>
-      </w:r>
-    </w:p>
-    <w:p>
-      <w:r>
         <w:t>05_Roman_Soldiers.jpg</w:t>
       </w:r>
     </w:p>
     <w:p>
       <w:r>
+        <w:t>03_Egyptian_Guests.jpg</w:t>
+      </w:r>
+    </w:p>
+    <w:p>
+      <w:r>
         <w:t>11_Wedding_Courtyard_Day.jpg</w:t>
       </w:r>
     </w:p>
@@ -3717,7 +3563,7 @@
     </w:p>
     <w:p>
       <w:r>
-        <w:t>Senbi, ever the host, invited one to join. Of course he did.</w:t>
+        <w:t>One soldier stepped into the dance. Nobody stopped him. Somehow, it worked.</w:t>
       </w:r>
     </w:p>
     <w:p>
@@ -3730,7 +3576,7 @@
     </w:p>
     <w:p>
       <w:r>
-        <w:t>Senbi proudly dances beside a Roman soldier and gestures for him to follow. All expressions, eye movement and mouth movement are silent nonverbal acting only. No intelligible speech, no lip-sync dialogue.</w:t>
+        <w:t>One Roman soldier steps awkwardly onto the dance floor. The Egyptian guests stare in silence. Then one guest begins to copy his stiff step. All expressions and mouth movement are silent acting only; no one on screen speaks.</w:t>
       </w:r>
     </w:p>
     <w:p>
@@ -3743,7 +3589,7 @@
     </w:p>
     <w:p>
       <w:r>
-        <w:t>Static, locked-off: eye-level medium two-shot. No tilt, pan, zoom or orbit.</w:t>
+        <w:t>Static, locked-off: eye-level wide shot. No tilt, pan, zoom or orbit.</w:t>
       </w:r>
     </w:p>
     <w:p>
@@ -3756,7 +3602,7 @@
     </w:p>
     <w:p>
       <w:r>
-        <w:t>Music: playful comic percussion over the wedding rhythm, mixed low under the narrator. SFX: laughter, hand claps. All generated inside Flow together with the picture; the narrator stays clearly intelligible.</w:t>
+        <w:t>Music: playful comic percussion over the wedding rhythm, mixed low under the narrator. SFX: shield tap blending into the rhythm, clapping. All generated inside Flow together with the picture; the narrator stays clearly intelligible.</w:t>
       </w:r>
     </w:p>
     <w:p>
@@ -3769,7 +3615,7 @@
     </w:p>
     <w:p>
       <w:r>
-        <w:t>Locked-off static camera, no camera movement. 2D hand-drawn Stickman animation, clean thin black outlines, large expressive heads, simple readable stickman proportions, flat warm colors, historically inspired ancient Alexandria, playful cinematic documentary-comedy tone, 16:9, no 3D, no photorealism, no modern objects, no subtitles, no captions, no logos, no generated text, NO on-screen character dialogue (only the off-screen narrator speaks). Use the selected reference images as strict continuity anchors. Preserve faces, hair, clothing, colors, proportions and accessories exactly. Characters may move their bodies, arms, eyes and mouths for silent nonverbal acting only. VISUAL STYLE LOCK: 2D hand-drawn stickman animation; clean thin black outlines; large expressive heads; simple readable stickman proportions; flat warm colors; historically inspired ancient Alexandria; playful cinematic documentary-comedy tone; no 3D; no photorealism; no modern objects; no subtitles; no captions; no logos; no text inside the generated scene; 16:9. Senbi proudly dances beside a Roman soldier and gestures for him to follow the Egyptian dance steps. The Roman tries to imitate him. Preserve exact Senbi and Roman designs. 2D stickman animation, no text, 16:9. CAMERA: locked-off static camera on a tripod, eye-level medium two-shot. No camera movement of any kind: no tilt, no pan, no zoom, no push, no pull, no orbit, no tracking, no rising or overhead view. The framing stays identical from the first frame to the last frame; all movement comes from the characters. AUDIO (generate sound together with the picture): Off-screen male narrator voice-over, warm intelligent British documentary voice with dry comedic timing, the same voice in every clip, begins speaking within the first half second and says exactly: “Senbi, ever the host, invited one to join. Of course he did.” The narrator is heard off-screen only; no character lip-syncs to the narrator. Music: playful comic percussion over the wedding rhythm, mixed low under the narrator. Sound effects: laughter, hand claps. No subtitles or captions.</w:t>
+        <w:t>2D hand-drawn stickman cartoon in the exact style of the reference images: thin black outlines, large expressive heads, thin stick arms, flat warm colors, playful documentary-comedy tone, 16:9. Setting: sunny daytime wedding courtyard in ancient Alexandria, sandstone columns, striped awnings, feast tables along the side walls, an open entrance gate at the back. One Roman soldier steps awkwardly onto the dance floor. The Egyptian guests stare in silence. Then one guest begins to copy his stiff step. Camera: locked-off and perfectly still, eye-level wide shot; the framing never changes (no tilt, pan, zoom or rising camera). Audio: off-screen British male narrator, warm and dry, begins speaking within half a second and says: “One soldier stepped into the dance. Nobody stopped him. Somehow, it worked.” Music: playful comic percussion over the wedding rhythm, low under the voice. Sound effects: shield tap blending into the rhythm, clapping. Characters keep their exact reference designs. Nobody on screen speaks. No text, captions or logos in the frame.</w:t>
       </w:r>
     </w:p>
     <w:p>
@@ -3791,7 +3637,7 @@
         <w:pStyle w:val="Heading1"/>
       </w:pPr>
       <w:r>
-        <w:t>SHOT 34 — Bride disbelief</w:t>
+        <w:t>SHOT 32 — Armor dance</w:t>
       </w:r>
     </w:p>
     <w:p>
@@ -3804,22 +3650,22 @@
     </w:p>
     <w:p>
       <w:r>
-        <w:t>02_Bride.jpg</w:t>
-      </w:r>
-    </w:p>
-    <w:p>
-      <w:r>
-        <w:t>01_Senbi.jpg</w:t>
-      </w:r>
-    </w:p>
-    <w:p>
-      <w:r>
         <w:t>05_Roman_Soldiers.jpg</w:t>
       </w:r>
     </w:p>
     <w:p>
       <w:r>
-        <w:t>DURATION: 8 sec (the line needs about 5–6 s of speech; trim the clip in editing)</w:t>
+        <w:t>03_Egyptian_Guests.jpg</w:t>
+      </w:r>
+    </w:p>
+    <w:p>
+      <w:r>
+        <w:t>11_Wedding_Courtyard_Day.jpg</w:t>
+      </w:r>
+    </w:p>
+    <w:p>
+      <w:r>
+        <w:t>DURATION: 6 sec</w:t>
       </w:r>
     </w:p>
     <w:p>
@@ -3832,7 +3678,7 @@
     </w:p>
     <w:p>
       <w:r>
-        <w:t>His bride slowly covered her face. This was not in the contract.</w:t>
+        <w:t>Roman engineering changed the world. Roman dancing did not.</w:t>
       </w:r>
     </w:p>
     <w:p>
@@ -3845,7 +3691,7 @@
     </w:p>
     <w:p>
       <w:r>
-        <w:t>Bride watches Senbi dancing with Romans and slowly covers her face. All expressions, eye movement and mouth movement are silent nonverbal acting only. No intelligible speech, no lip-sync dialogue.</w:t>
+        <w:t>Three Roman soldiers in full armor attempt the Egyptian dance, stiff but strangely synchronized, capes swaying; Egyptian dancers around them smile and clap. All expressions and mouth movement are silent acting only; no one on screen speaks.</w:t>
       </w:r>
     </w:p>
     <w:p>
@@ -3858,7 +3704,7 @@
     </w:p>
     <w:p>
       <w:r>
-        <w:t>Static, locked-off: eye-level medium close-up of the bride. No tilt, pan, zoom or orbit.</w:t>
+        <w:t>Static, locked-off: eye-level wide shot of the dancing Romans. No tilt, pan, zoom or orbit.</w:t>
       </w:r>
     </w:p>
     <w:p>
@@ -3871,7 +3717,7 @@
     </w:p>
     <w:p>
       <w:r>
-        <w:t>Music: playful comic percussion over the wedding rhythm, mixed low under the narrator. SFX: gasp, muffled laugh. All generated inside Flow together with the picture; the narrator stays clearly intelligible.</w:t>
+        <w:t>Music: playful comic percussion over the wedding rhythm, mixed low under the narrator. SFX: armor clanking out of rhythm. All generated inside Flow together with the picture; the narrator stays clearly intelligible.</w:t>
       </w:r>
     </w:p>
     <w:p>
@@ -3884,7 +3730,7 @@
     </w:p>
     <w:p>
       <w:r>
-        <w:t>Locked-off static camera, no camera movement. 2D hand-drawn Stickman animation, clean thin black outlines, large expressive heads, simple readable stickman proportions, flat warm colors, historically inspired ancient Alexandria, playful cinematic documentary-comedy tone, 16:9, no 3D, no photorealism, no modern objects, no subtitles, no captions, no logos, no generated text, NO on-screen character dialogue (only the off-screen narrator speaks). Use the selected reference images as strict continuity anchors. Preserve faces, hair, clothing, colors, proportions and accessories exactly. Characters may move their bodies, arms, eyes and mouths for silent nonverbal acting only. VISUAL STYLE LOCK: 2D hand-drawn stickman animation; clean thin black outlines; large expressive heads; simple readable stickman proportions; flat warm colors; historically inspired ancient Alexandria; playful cinematic documentary-comedy tone; no 3D; no photorealism; no modern objects; no subtitles; no captions; no logos; no text inside the generated scene; 16:9. The bride watches Senbi happily dancing with Roman soldiers. She slowly raises a hand to her face in disbelief, then looks toward the chaos. 2D stickman animation, clean expressive body language, no text, 16:9. CAMERA: locked-off static camera on a tripod, eye-level medium close-up of the bride. No camera movement of any kind: no tilt, no pan, no zoom, no push, no pull, no orbit, no tracking, no rising or overhead view. The framing stays identical from the first frame to the last frame; all movement comes from the characters. AUDIO (generate sound together with the picture): Off-screen male narrator voice-over, warm intelligent British documentary voice with dry comedic timing, the same voice in every clip, begins speaking within the first half second and says exactly: “His bride slowly covered her face. This was not in the contract.” The narrator is heard off-screen only; no character lip-syncs to the narrator. Music: playful comic percussion over the wedding rhythm, mixed low under the narrator. Sound effects: gasp, muffled laugh. No subtitles or captions.</w:t>
+        <w:t>2D hand-drawn stickman cartoon in the exact style of the reference images: thin black outlines, large expressive heads, thin stick arms, flat warm colors, playful documentary-comedy tone, 16:9. Setting: sunny daytime wedding courtyard in ancient Alexandria, sandstone columns, striped awnings, feast tables along the side walls, an open entrance gate at the back. Three Roman soldiers in full armor attempt the Egyptian dance, stiff but strangely synchronized, capes swaying; Egyptian dancers around them smile and clap. Camera: locked-off and perfectly still, eye-level wide shot of the dancing Romans; the framing never changes (no tilt, pan, zoom or rising camera). Audio: off-screen British male narrator, warm and dry, begins speaking within half a second and says: “Roman engineering changed the world. Roman dancing did not.” Music: playful comic percussion over the wedding rhythm, low under the voice. Sound effects: armor clanking out of rhythm. Characters keep their exact reference designs. Nobody on screen speaks. No text, captions or logos in the frame.</w:t>
       </w:r>
     </w:p>
     <w:p>
@@ -3906,7 +3752,7 @@
         <w:pStyle w:val="Heading1"/>
       </w:pPr>
       <w:r>
-        <w:t>SHOT 35 — Controlled chaos</w:t>
+        <w:t>SHOT 33 — Senbi joins</w:t>
       </w:r>
     </w:p>
     <w:p>
@@ -3924,16 +3770,6 @@
     </w:p>
     <w:p>
       <w:r>
-        <w:t>02_Bride.jpg</w:t>
-      </w:r>
-    </w:p>
-    <w:p>
-      <w:r>
-        <w:t>03_Egyptian_Guests.jpg</w:t>
-      </w:r>
-    </w:p>
-    <w:p>
-      <w:r>
         <w:t>05_Roman_Soldiers.jpg</w:t>
       </w:r>
     </w:p>
@@ -3957,7 +3793,7 @@
     </w:p>
     <w:p>
       <w:r>
-        <w:t>Soon, Egyptians and Romans were passing food and stepping on each other's feet.</w:t>
+        <w:t>Senbi, ever the host, invited one to join. Of course he did.</w:t>
       </w:r>
     </w:p>
     <w:p>
@@ -3970,7 +3806,7 @@
     </w:p>
     <w:p>
       <w:r>
-        <w:t>Wide courtyard: Egyptians and Romans dance, musicians struggle to keep up, food is passed around. All expressions, eye movement and mouth movement are silent nonverbal acting only. No intelligible speech, no lip-sync dialogue.</w:t>
+        <w:t>Senbi dances proudly beside a Roman soldier and gestures for him to follow. The soldier hesitates, then copies Senbi's arm movement. All expressions and mouth movement are silent acting only; no one on screen speaks.</w:t>
       </w:r>
     </w:p>
     <w:p>
@@ -3983,7 +3819,7 @@
     </w:p>
     <w:p>
       <w:r>
-        <w:t>Static, locked-off: eye-level wide shot of the whole courtyard. No tilt, pan, zoom or orbit.</w:t>
+        <w:t>Static, locked-off: eye-level medium two-shot. No tilt, pan, zoom or orbit.</w:t>
       </w:r>
     </w:p>
     <w:p>
@@ -3996,7 +3832,7 @@
     </w:p>
     <w:p>
       <w:r>
-        <w:t>Music: playful comic percussion over the wedding rhythm, mixed low under the narrator. SFX: laughter, plates, music chaos. All generated inside Flow together with the picture; the narrator stays clearly intelligible.</w:t>
+        <w:t>Music: playful comic percussion over the wedding rhythm, mixed low under the narrator. SFX: laughter, hand claps. All generated inside Flow together with the picture; the narrator stays clearly intelligible.</w:t>
       </w:r>
     </w:p>
     <w:p>
@@ -4009,7 +3845,7 @@
     </w:p>
     <w:p>
       <w:r>
-        <w:t>Locked-off static camera, no camera movement. 2D hand-drawn Stickman animation, clean thin black outlines, large expressive heads, simple readable stickman proportions, flat warm colors, historically inspired ancient Alexandria, playful cinematic documentary-comedy tone, 16:9, no 3D, no photorealism, no modern objects, no subtitles, no captions, no logos, no generated text, NO on-screen character dialogue (only the off-screen narrator speaks). Use the selected reference images as strict continuity anchors. Preserve faces, hair, clothing, colors, proportions and accessories exactly. Characters may move their bodies, arms, eyes and mouths for silent nonverbal acting only. VISUAL STYLE LOCK: 2D hand-drawn stickman animation; clean thin black outlines; large expressive heads; simple readable stickman proportions; flat warm colors; historically inspired ancient Alexandria; playful cinematic documentary-comedy tone; no 3D; no photorealism; no modern objects; no subtitles; no captions; no logos; no text inside the generated scene; 16:9. Wide wedding courtyard filled with controlled comedic chaos: Egyptians and Romans dance together, musicians struggle to keep the rhythm, food is passed around, Senbi is delighted and the bride looks overwhelmed. 2D stickman animation, clean thin lines, warm colors, no text, 16:9. CAMERA: locked-off static camera on a tripod, eye-level wide shot of the whole courtyard. No camera movement of any kind: no tilt, no pan, no zoom, no push, no pull, no orbit, no tracking, no rising or overhead view. The framing stays identical from the first frame to the last frame; all movement comes from the characters. AUDIO (generate sound together with the picture): Off-screen male narrator voice-over, warm intelligent British documentary voice with dry comedic timing, the same voice in every clip, begins speaking within the first half second and says exactly: “Soon, Egyptians and Romans were passing food and stepping on each other's feet.” The narrator is heard off-screen only; no character lip-syncs to the narrator. Music: playful comic percussion over the wedding rhythm, mixed low under the narrator. Sound effects: laughter, plates, music chaos. No subtitles or captions.</w:t>
+        <w:t>2D hand-drawn stickman cartoon in the exact style of the reference images: thin black outlines, large expressive heads, thin stick arms, flat warm colors, playful documentary-comedy tone, 16:9. Setting: sunny daytime wedding courtyard in ancient Alexandria, sandstone columns, striped awnings, feast tables along the side walls, an open entrance gate at the back. Senbi dances proudly beside a Roman soldier and gestures for him to follow. The soldier hesitates, then copies Senbi's arm movement. Camera: locked-off and perfectly still, eye-level medium two-shot; the framing never changes (no tilt, pan, zoom or rising camera). Audio: off-screen British male narrator, warm and dry, begins speaking within half a second and says: “Senbi, ever the host, invited one to join. Of course he did.” Music: playful comic percussion over the wedding rhythm, low under the voice. Sound effects: laughter, hand claps. Characters keep their exact reference designs. Nobody on screen speaks. No text, captions or logos in the frame.</w:t>
       </w:r>
     </w:p>
     <w:p>
@@ -4031,7 +3867,7 @@
         <w:pStyle w:val="Heading1"/>
       </w:pPr>
       <w:r>
-        <w:t>SHOT 36 — Music stops</w:t>
+        <w:t>SHOT 34 — Bride disbelief</w:t>
       </w:r>
     </w:p>
     <w:p>
@@ -4044,7 +3880,12 @@
     </w:p>
     <w:p>
       <w:r>
-        <w:t>03_Egyptian_Guests.jpg</w:t>
+        <w:t>02_Bride.jpg</w:t>
+      </w:r>
+    </w:p>
+    <w:p>
+      <w:r>
+        <w:t>01_Senbi.jpg</w:t>
       </w:r>
     </w:p>
     <w:p>
@@ -4054,11 +3895,6 @@
     </w:p>
     <w:p>
       <w:r>
-        <w:t>11_Wedding_Courtyard_Day.jpg</w:t>
-      </w:r>
-    </w:p>
-    <w:p>
-      <w:r>
         <w:t>DURATION: 8 sec (the line needs about 5–6 s of speech; trim the clip in editing)</w:t>
       </w:r>
     </w:p>
@@ -4072,7 +3908,7 @@
     </w:p>
     <w:p>
       <w:r>
-        <w:t>Then a horn cut through the music, and everyone froze mid-step.</w:t>
+        <w:t>His bride slowly covered her face. This was not in the contract.</w:t>
       </w:r>
     </w:p>
     <w:p>
@@ -4085,7 +3921,7 @@
     </w:p>
     <w:p>
       <w:r>
-        <w:t>A sharp military command/horn cuts the wedding. Everyone freezes. All expressions, eye movement and mouth movement are silent nonverbal acting only. No intelligible speech, no lip-sync dialogue.</w:t>
+        <w:t>The bride watches Senbi dancing with the Romans. She slowly covers her face with her hand. All expressions and mouth movement are silent acting only; no one on screen speaks.</w:t>
       </w:r>
     </w:p>
     <w:p>
@@ -4098,7 +3934,7 @@
     </w:p>
     <w:p>
       <w:r>
-        <w:t>Static, locked-off: eye-level wide shot. No tilt, pan, zoom or orbit.</w:t>
+        <w:t>Static, locked-off: eye-level medium close-up of the bride. No tilt, pan, zoom or orbit.</w:t>
       </w:r>
     </w:p>
     <w:p>
@@ -4111,7 +3947,7 @@
     </w:p>
     <w:p>
       <w:r>
-        <w:t>Music: music nearly silent. SFX: sharp military horn, then silence. All generated inside Flow together with the picture; the narrator stays clearly intelligible.</w:t>
+        <w:t>Music: playful comic percussion over the wedding rhythm, mixed low under the narrator. SFX: gasp, muffled laugh. All generated inside Flow together with the picture; the narrator stays clearly intelligible.</w:t>
       </w:r>
     </w:p>
     <w:p>
@@ -4124,7 +3960,7 @@
     </w:p>
     <w:p>
       <w:r>
-        <w:t>Locked-off static camera, no camera movement. 2D hand-drawn Stickman animation, clean thin black outlines, large expressive heads, simple readable stickman proportions, flat warm colors, historically inspired ancient Alexandria, playful cinematic documentary-comedy tone, 16:9, no 3D, no photorealism, no modern objects, no subtitles, no captions, no logos, no generated text, NO on-screen character dialogue (only the off-screen narrator speaks). Use the selected reference images as strict continuity anchors. Preserve faces, hair, clothing, colors, proportions and accessories exactly. Characters may move their bodies, arms, eyes and mouths for silent nonverbal acting only. VISUAL STYLE LOCK: 2D hand-drawn stickman animation; clean thin black outlines; large expressive heads; simple readable stickman proportions; flat warm colors; historically inspired ancient Alexandria; playful cinematic documentary-comedy tone; no 3D; no photorealism; no modern objects; no subtitles; no captions; no logos; no text inside the generated scene; 16:9. A sudden authoritative Roman military signal stops the wedding music. Everyone freezes mid-dance: Egyptians, Romans, Senbi and bride. 2D stickman animation, dramatic comedic freeze, no text, 16:9. CAMERA: locked-off static camera on a tripod, eye-level wide shot. No camera movement of any kind: no tilt, no pan, no zoom, no push, no pull, no orbit, no tracking, no rising or overhead view. The framing stays identical from the first frame to the last frame; all movement comes from the characters. AUDIO (generate sound together with the picture): Off-screen male narrator voice-over, warm intelligent British documentary voice with dry comedic timing, the same voice in every clip, begins speaking within the first half second and says exactly: “Then a horn cut through the music, and everyone froze mid-step.” The narrator is heard off-screen only; no character lip-syncs to the narrator. Music: music nearly silent. Sound effects: sharp military horn, then silence. No subtitles or captions.</w:t>
+        <w:t>2D hand-drawn stickman cartoon in the exact style of the reference images: thin black outlines, large expressive heads, thin stick arms, flat warm colors, playful documentary-comedy tone, 16:9. Setting: sunny daytime wedding courtyard in ancient Alexandria, sandstone columns, striped awnings, feast tables along the side walls, an open entrance gate at the back. The bride watches Senbi dancing with the Romans. She slowly covers her face with her hand. Camera: locked-off and perfectly still, eye-level medium close-up of the bride; the framing never changes (no tilt, pan, zoom or rising camera). Audio: off-screen British male narrator, warm and dry, begins speaking within half a second and says: “His bride slowly covered her face. This was not in the contract.” Music: playful comic percussion over the wedding rhythm, low under the voice. Sound effects: gasp, muffled laugh. Characters keep their exact reference designs. Nobody on screen speaks. No text, captions or logos in the frame.</w:t>
       </w:r>
     </w:p>
     <w:p>
@@ -4146,7 +3982,7 @@
         <w:pStyle w:val="Heading1"/>
       </w:pPr>
       <w:r>
-        <w:t>SHOT 37 — Commander entrance</w:t>
+        <w:t>SHOT 35 — Controlled chaos</w:t>
       </w:r>
     </w:p>
     <w:p>
@@ -4159,7 +3995,17 @@
     </w:p>
     <w:p>
       <w:r>
-        <w:t>06_Roman_Commander.jpg</w:t>
+        <w:t>01_Senbi.jpg</w:t>
+      </w:r>
+    </w:p>
+    <w:p>
+      <w:r>
+        <w:t>02_Bride.jpg</w:t>
+      </w:r>
+    </w:p>
+    <w:p>
+      <w:r>
+        <w:t>03_Egyptian_Guests.jpg</w:t>
       </w:r>
     </w:p>
     <w:p>
@@ -4187,7 +4033,7 @@
     </w:p>
     <w:p>
       <w:r>
-        <w:t>And in walked the commander. The only adult in the building.</w:t>
+        <w:t>Soon, Egyptians and Romans were passing food and stepping on each other's feet.</w:t>
       </w:r>
     </w:p>
     <w:p>
@@ -4200,7 +4046,7 @@
     </w:p>
     <w:p>
       <w:r>
-        <w:t>Roman commander enters calmly with scroll. Everyone parts; wedding chaos remains behind him. All expressions, eye movement and mouth movement are silent nonverbal acting only. No intelligible speech, no lip-sync dialogue.</w:t>
+        <w:t>Joyful chaos: Egyptians and Romans dance together, musicians struggle to keep the rhythm, a plate of food is passed along. Senbi is delighted; the bride looks overwhelmed. Keep no more than eight characters visible. All expressions and mouth movement are silent acting only; no one on screen speaks.</w:t>
       </w:r>
     </w:p>
     <w:p>
@@ -4213,7 +4059,7 @@
     </w:p>
     <w:p>
       <w:r>
-        <w:t>Static, locked-off: fixed, slightly low angle that never tilts, on the commander walking in. No tilt, pan, zoom or orbit.</w:t>
+        <w:t>Static, locked-off: eye-level wide shot of the whole courtyard. No tilt, pan, zoom or orbit.</w:t>
       </w:r>
     </w:p>
     <w:p>
@@ -4226,7 +4072,7 @@
     </w:p>
     <w:p>
       <w:r>
-        <w:t>Music: music drops to low sustained tension with distant marching drums, almost silent. SFX: slow footsteps, cloak rustle. All generated inside Flow together with the picture; the narrator stays clearly intelligible.</w:t>
+        <w:t>Music: playful comic percussion over the wedding rhythm, mixed low under the narrator. SFX: laughter, plates, music chaos. All generated inside Flow together with the picture; the narrator stays clearly intelligible.</w:t>
       </w:r>
     </w:p>
     <w:p>
@@ -4239,7 +4085,7 @@
     </w:p>
     <w:p>
       <w:r>
-        <w:t>Locked-off static camera, no camera movement. 2D hand-drawn Stickman animation, clean thin black outlines, large expressive heads, simple readable stickman proportions, flat warm colors, historically inspired ancient Alexandria, playful cinematic documentary-comedy tone, 16:9, no 3D, no photorealism, no modern objects, no subtitles, no captions, no logos, no generated text, NO on-screen character dialogue (only the off-screen narrator speaks). Use the selected reference images as strict continuity anchors. Preserve faces, hair, clothing, colors, proportions and accessories exactly. Characters may move their bodies, arms, eyes and mouths for silent nonverbal acting only. VISUAL STYLE LOCK: 2D hand-drawn stickman animation; clean thin black outlines; large expressive heads; simple readable stickman proportions; flat warm colors; historically inspired ancient Alexandria; playful cinematic documentary-comedy tone; no 3D; no photorealism; no modern objects; no subtitles; no captions; no logos; no text inside the generated scene; 16:9. Roman commander enters the wedding courtyard calmly holding a scroll. The soldiers part to let him through. Everyone becomes silent. Preserve exact commander armor, red cloak, laurel crown and facial design. 2D stickman animation, no text, 16:9. CAMERA: locked-off static camera on a tripod, fixed, slightly low angle that never tilts, on the commander walking in. No camera movement of any kind: no tilt, no pan, no zoom, no push, no pull, no orbit, no tracking, no rising or overhead view. The framing stays identical from the first frame to the last frame; all movement comes from the characters. AUDIO (generate sound together with the picture): Off-screen male narrator voice-over, warm intelligent British documentary voice with dry comedic timing, the same voice in every clip, begins speaking within the first half second and says exactly: “And in walked the commander. The only adult in the building.” The narrator is heard off-screen only; no character lip-syncs to the narrator. Music: music drops to low sustained tension with distant marching drums, almost silent. Sound effects: slow footsteps, cloak rustle. No subtitles or captions.</w:t>
+        <w:t>2D hand-drawn stickman cartoon in the exact style of the reference images: thin black outlines, large expressive heads, thin stick arms, flat warm colors, playful documentary-comedy tone, 16:9. Setting: sunny daytime wedding courtyard in ancient Alexandria, sandstone columns, striped awnings, feast tables along the side walls, an open entrance gate at the back. Joyful chaos: Egyptians and Romans dance together, musicians struggle to keep the rhythm, a plate of food is passed along. Senbi is delighted; the bride looks overwhelmed. Keep no more than eight characters visible. Camera: locked-off and perfectly still, eye-level wide shot of the whole courtyard; the framing never changes (no tilt, pan, zoom or rising camera). Audio: off-screen British male narrator, warm and dry, begins speaking within half a second and says: “Soon, Egyptians and Romans were passing food and stepping on each other's feet.” Music: playful comic percussion over the wedding rhythm, low under the voice. Sound effects: laughter, plates, music chaos. Characters keep their exact reference designs. Nobody on screen speaks. No text, captions or logos in the frame.</w:t>
       </w:r>
     </w:p>
     <w:p>
@@ -4261,7 +4107,7 @@
         <w:pStyle w:val="Heading1"/>
       </w:pPr>
       <w:r>
-        <w:t>SHOT 38 — Commander scans</w:t>
+        <w:t>SHOT 36 — Music stops</w:t>
       </w:r>
     </w:p>
     <w:p>
@@ -4274,17 +4120,7 @@
     </w:p>
     <w:p>
       <w:r>
-        <w:t>06_Roman_Commander.jpg</w:t>
-      </w:r>
-    </w:p>
-    <w:p>
-      <w:r>
-        <w:t>01_Senbi.jpg</w:t>
-      </w:r>
-    </w:p>
-    <w:p>
-      <w:r>
-        <w:t>02_Bride.jpg</w:t>
+        <w:t>03_Egyptian_Guests.jpg</w:t>
       </w:r>
     </w:p>
     <w:p>
@@ -4312,7 +4148,7 @@
     </w:p>
     <w:p>
       <w:r>
-        <w:t>He saw his soldiers dancing. The food. The bride. The groom. The cat.</w:t>
+        <w:t>Then a horn cut through the music, and everyone froze mid-step.</w:t>
       </w:r>
     </w:p>
     <w:p>
@@ -4325,7 +4161,7 @@
     </w:p>
     <w:p>
       <w:r>
-        <w:t>Commander looks at dancing Romans, food, Senbi, bride and cat; remains completely serious. All expressions, eye movement and mouth movement are silent nonverbal acting only. No intelligible speech, no lip-sync dialogue.</w:t>
+        <w:t>A sharp horn blast: everyone freezes mid-step, Egyptians and Romans together, in a comic tableau. All expressions and mouth movement are silent acting only; no one on screen speaks.</w:t>
       </w:r>
     </w:p>
     <w:p>
@@ -4338,7 +4174,7 @@
     </w:p>
     <w:p>
       <w:r>
-        <w:t>Static, locked-off: eye-level medium shot of the commander; he turns his head, the camera does not pan. No tilt, pan, zoom or orbit.</w:t>
+        <w:t>Static, locked-off: eye-level wide shot. No tilt, pan, zoom or orbit.</w:t>
       </w:r>
     </w:p>
     <w:p>
@@ -4351,7 +4187,7 @@
     </w:p>
     <w:p>
       <w:r>
-        <w:t>Music: music nearly silent. SFX: quiet room tone, fire crackle. All generated inside Flow together with the picture; the narrator stays clearly intelligible.</w:t>
+        <w:t>Music: music nearly silent. SFX: sharp military horn, then silence. All generated inside Flow together with the picture; the narrator stays clearly intelligible.</w:t>
       </w:r>
     </w:p>
     <w:p>
@@ -4364,7 +4200,7 @@
     </w:p>
     <w:p>
       <w:r>
-        <w:t>Locked-off static camera, no camera movement. 2D hand-drawn Stickman animation, clean thin black outlines, large expressive heads, simple readable stickman proportions, flat warm colors, historically inspired ancient Alexandria, playful cinematic documentary-comedy tone, 16:9, no 3D, no photorealism, no modern objects, no subtitles, no captions, no logos, no generated text, NO on-screen character dialogue (only the off-screen narrator speaks). Use the selected reference images as strict continuity anchors. Preserve faces, hair, clothing, colors, proportions and accessories exactly. Characters may move their bodies, arms, eyes and mouths for silent nonverbal acting only. VISUAL STYLE LOCK: 2D hand-drawn stickman animation; clean thin black outlines; large expressive heads; simple readable stickman proportions; flat warm colors; historically inspired ancient Alexandria; playful cinematic documentary-comedy tone; no 3D; no photorealism; no modern objects; no subtitles; no captions; no logos; no text inside the generated scene; 16:9. The Roman commander slowly scans the room: first the soldiers, then the food, then the bride and groom, then the wedding decorations. He remains completely serious while the absurd party surrounds him. 2D stickman animation, no text, 16:9. CAMERA: locked-off static camera on a tripod, eye-level medium shot of the commander; he turns his head, the camera does not pan. No camera movement of any kind: no tilt, no pan, no zoom, no push, no pull, no orbit, no tracking, no rising or overhead view. The framing stays identical from the first frame to the last frame; all movement comes from the characters. AUDIO (generate sound together with the picture): Off-screen male narrator voice-over, warm intelligent British documentary voice with dry comedic timing, the same voice in every clip, begins speaking within the first half second and says exactly: “He saw his soldiers dancing. The food. The bride. The groom. The cat.” The narrator is heard off-screen only; no character lip-syncs to the narrator. Music: music nearly silent. Sound effects: quiet room tone, fire crackle. No subtitles or captions.</w:t>
+        <w:t>2D hand-drawn stickman cartoon in the exact style of the reference images: thin black outlines, large expressive heads, thin stick arms, flat warm colors, playful documentary-comedy tone, 16:9. Setting: sunny daytime wedding courtyard in ancient Alexandria, sandstone columns, striped awnings, feast tables along the side walls, an open entrance gate at the back. A sharp horn blast: everyone freezes mid-step, Egyptians and Romans together, in a comic tableau. Camera: locked-off and perfectly still, eye-level wide shot; the framing never changes (no tilt, pan, zoom or rising camera). Audio: off-screen British male narrator, warm and dry, begins speaking within half a second and says: “Then a horn cut through the music, and everyone froze mid-step.” Music: music nearly silent. Sound effects: sharp military horn, then silence. Characters keep their exact reference designs. Nobody on screen speaks. No text, captions or logos in the frame.</w:t>
       </w:r>
     </w:p>
     <w:p>
@@ -4386,7 +4222,7 @@
         <w:pStyle w:val="Heading1"/>
       </w:pPr>
       <w:r>
-        <w:t>SHOT 39 — Cat stare</w:t>
+        <w:t>SHOT 37 — Commander entrance</w:t>
       </w:r>
     </w:p>
     <w:p>
@@ -4404,7 +4240,12 @@
     </w:p>
     <w:p>
       <w:r>
-        <w:t>07_Animals.jpg</w:t>
+        <w:t>05_Roman_Soldiers.jpg</w:t>
+      </w:r>
+    </w:p>
+    <w:p>
+      <w:r>
+        <w:t>11_Wedding_Courtyard_Day.jpg</w:t>
       </w:r>
     </w:p>
     <w:p>
@@ -4422,7 +4263,7 @@
     </w:p>
     <w:p>
       <w:r>
-        <w:t>The cat looked back. The cat was not impressed by the Roman Empire.</w:t>
+        <w:t>And in walked the commander. The only adult in the building.</w:t>
       </w:r>
     </w:p>
     <w:p>
@@ -4435,7 +4276,7 @@
     </w:p>
     <w:p>
       <w:r>
-        <w:t>Commander's eyes land on the calm black cat. Cat stares back. All expressions, eye movement and mouth movement are silent nonverbal acting only. No intelligible speech, no lip-sync dialogue.</w:t>
+        <w:t>A Roman commander in gold-trimmed armor and red cloak walks calmly through the open gate holding a scroll. The dancing soldiers step aside. The courtyard falls silent. All expressions and mouth movement are silent acting only; no one on screen speaks.</w:t>
       </w:r>
     </w:p>
     <w:p>
@@ -4448,7 +4289,7 @@
     </w:p>
     <w:p>
       <w:r>
-        <w:t>Static, locked-off: eye-level medium two-shot: the commander in the foreground, the cat on the table behind him; no cutting. No tilt, pan, zoom or orbit.</w:t>
+        <w:t>Static, locked-off: fixed, slightly low angle that never tilts, on the commander walking in. No tilt, pan, zoom or orbit.</w:t>
       </w:r>
     </w:p>
     <w:p>
@@ -4461,7 +4302,7 @@
     </w:p>
     <w:p>
       <w:r>
-        <w:t>Music: music nearly silent. SFX: cat meow, tiny sting. All generated inside Flow together with the picture; the narrator stays clearly intelligible.</w:t>
+        <w:t>Music: music drops to low sustained tension with distant marching drums, almost silent. SFX: slow footsteps, cloak rustle. All generated inside Flow together with the picture; the narrator stays clearly intelligible.</w:t>
       </w:r>
     </w:p>
     <w:p>
@@ -4474,7 +4315,7 @@
     </w:p>
     <w:p>
       <w:r>
-        <w:t>Locked-off static camera, no camera movement. 2D hand-drawn Stickman animation, clean thin black outlines, large expressive heads, simple readable stickman proportions, flat warm colors, historically inspired ancient Alexandria, playful cinematic documentary-comedy tone, 16:9, no 3D, no photorealism, no modern objects, no subtitles, no captions, no logos, no generated text, NO on-screen character dialogue (only the off-screen narrator speaks). Use the selected reference images as strict continuity anchors. Preserve faces, hair, clothing, colors, proportions and accessories exactly. Characters may move their bodies, arms, eyes and mouths for silent nonverbal acting only. VISUAL STYLE LOCK: 2D hand-drawn stickman animation; clean thin black outlines; large expressive heads; simple readable stickman proportions; flat warm colors; historically inspired ancient Alexandria; playful cinematic documentary-comedy tone; no 3D; no photorealism; no modern objects; no subtitles; no captions; no logos; no text inside the generated scene; 16:9. The commander's gaze lands on the calm black cat sitting near the feast. The cat stares back without moving. The commander remains serious. 2D stickman animation, clean lines, deadpan comedy, no text, 16:9. CAMERA: locked-off static camera on a tripod, eye-level medium two-shot: the commander in the foreground, the cat on the table behind him; no cutting. No camera movement of any kind: no tilt, no pan, no zoom, no push, no pull, no orbit, no tracking, no rising or overhead view. The framing stays identical from the first frame to the last frame; all movement comes from the characters. AUDIO (generate sound together with the picture): Off-screen male narrator voice-over, warm intelligent British documentary voice with dry comedic timing, the same voice in every clip, begins speaking within the first half second and says exactly: “The cat looked back. The cat was not impressed by the Roman Empire.” The narrator is heard off-screen only; no character lip-syncs to the narrator. Music: music nearly silent. Sound effects: cat meow, tiny sting. No subtitles or captions.</w:t>
+        <w:t>2D hand-drawn stickman cartoon in the exact style of the reference images: thin black outlines, large expressive heads, thin stick arms, flat warm colors, playful documentary-comedy tone, 16:9. Setting: sunny daytime wedding courtyard in ancient Alexandria, sandstone columns, striped awnings, feast tables along the side walls, an open entrance gate at the back. A Roman commander in gold-trimmed armor and red cloak walks calmly through the open gate holding a scroll. The dancing soldiers step aside. The courtyard falls silent. Camera: locked-off and perfectly still, fixed, slightly low angle that never tilts, on the commander walking in; the framing never changes (no tilt, pan, zoom or rising camera). Audio: off-screen British male narrator, warm and dry, begins speaking within half a second and says: “And in walked the commander. The only adult in the building.” Music: low sustained tension with distant marching drums, almost silent. Sound effects: slow footsteps, cloak rustle. Characters keep their exact reference designs. Nobody on screen speaks. No text, captions or logos in the frame.</w:t>
       </w:r>
     </w:p>
     <w:p>
@@ -4496,7 +4337,7 @@
         <w:pStyle w:val="Heading1"/>
       </w:pPr>
       <w:r>
-        <w:t>SHOT 40 — Announcement</w:t>
+        <w:t>SHOT 38 — Commander scans</w:t>
       </w:r>
     </w:p>
     <w:p>
@@ -4514,11 +4355,6 @@
     </w:p>
     <w:p>
       <w:r>
-        <w:t>03_Egyptian_Guests.jpg</w:t>
-      </w:r>
-    </w:p>
-    <w:p>
-      <w:r>
         <w:t>01_Senbi.jpg</w:t>
       </w:r>
     </w:p>
@@ -4529,6 +4365,11 @@
     </w:p>
     <w:p>
       <w:r>
+        <w:t>05_Roman_Soldiers.jpg</w:t>
+      </w:r>
+    </w:p>
+    <w:p>
+      <w:r>
         <w:t>11_Wedding_Courtyard_Day.jpg</w:t>
       </w:r>
     </w:p>
@@ -4547,7 +4388,7 @@
     </w:p>
     <w:p>
       <w:r>
-        <w:t>He unrolled the scroll. Message received: Egypt has new management.</w:t>
+        <w:t>He saw his soldiers dancing. The food. The bride. The groom. The cat.</w:t>
       </w:r>
     </w:p>
     <w:p>
@@ -4560,7 +4401,7 @@
     </w:p>
     <w:p>
       <w:r>
-        <w:t>Commander unrolls scroll; crowd becomes silent. All expressions, eye movement and mouth movement are silent nonverbal acting only. No intelligible speech, no lip-sync dialogue.</w:t>
+        <w:t>The commander stands serious and still. He slowly turns his head: the dancing soldiers, the food, the bride and groom, the decorations. He stays completely serious. All expressions and mouth movement are silent acting only; no one on screen speaks.</w:t>
       </w:r>
     </w:p>
     <w:p>
@@ -4573,7 +4414,7 @@
     </w:p>
     <w:p>
       <w:r>
-        <w:t>Static, locked-off: symmetrical eye-level medium-wide shot. No tilt, pan, zoom or orbit.</w:t>
+        <w:t>Static, locked-off: eye-level medium shot of the commander; he turns his head, the camera does not pan. No tilt, pan, zoom or orbit.</w:t>
       </w:r>
     </w:p>
     <w:p>
@@ -4586,7 +4427,7 @@
     </w:p>
     <w:p>
       <w:r>
-        <w:t>Music: music drops to low sustained tension with distant marching drums, almost silent. SFX: scroll unrolling, one dramatic drum hit. All generated inside Flow together with the picture; the narrator stays clearly intelligible.</w:t>
+        <w:t>Music: music nearly silent. SFX: quiet room tone, fire crackle. All generated inside Flow together with the picture; the narrator stays clearly intelligible.</w:t>
       </w:r>
     </w:p>
     <w:p>
@@ -4599,7 +4440,7 @@
     </w:p>
     <w:p>
       <w:r>
-        <w:t>Locked-off static camera, no camera movement. 2D hand-drawn Stickman animation, clean thin black outlines, large expressive heads, simple readable stickman proportions, flat warm colors, historically inspired ancient Alexandria, playful cinematic documentary-comedy tone, 16:9, no 3D, no photorealism, no modern objects, no subtitles, no captions, no logos, no generated text, NO on-screen character dialogue (only the off-screen narrator speaks). Use the selected reference images as strict continuity anchors. Preserve faces, hair, clothing, colors, proportions and accessories exactly. Characters may move their bodies, arms, eyes and mouths for silent nonverbal acting only. VISUAL STYLE LOCK: 2D hand-drawn stickman animation; clean thin black outlines; large expressive heads; simple readable stickman proportions; flat warm colors; historically inspired ancient Alexandria; playful cinematic documentary-comedy tone; no 3D; no photorealism; no modern objects; no subtitles; no captions; no logos; no text inside the generated scene; 16:9. The Roman commander unrolls a papyrus scroll and addresses the gathered crowd with formal authority. Do not generate readable words or subtitles; the meaning will come through voiceover/editing. 2D stickman animation, , no text, 16:9. CAMERA: locked-off static camera on a tripod, symmetrical eye-level medium-wide shot. No camera movement of any kind: no tilt, no pan, no zoom, no push, no pull, no orbit, no tracking, no rising or overhead view. The framing stays identical from the first frame to the last frame; all movement comes from the characters. AUDIO (generate sound together with the picture): Off-screen male narrator voice-over, warm intelligent British documentary voice with dry comedic timing, the same voice in every clip, begins speaking within the first half second and says exactly: “He unrolled the scroll. Message received: Egypt has new management.” The narrator is heard off-screen only; no character lip-syncs to the narrator. Music: music drops to low sustained tension with distant marching drums, almost silent. Sound effects: scroll unrolling, one dramatic drum hit. No subtitles or captions.</w:t>
+        <w:t>2D hand-drawn stickman cartoon in the exact style of the reference images: thin black outlines, large expressive heads, thin stick arms, flat warm colors, playful documentary-comedy tone, 16:9. Setting: sunny daytime wedding courtyard in ancient Alexandria, sandstone columns, striped awnings, feast tables along the side walls, an open entrance gate at the back. The commander stands serious and still. He slowly turns his head: the dancing soldiers, the food, the bride and groom, the decorations. He stays completely serious. Camera: locked-off and perfectly still, eye-level medium shot of the commander; he turns his head, the camera does not pan; the framing never changes (no tilt, pan, zoom or rising camera). Audio: off-screen British male narrator, warm and dry, begins speaking within half a second and says: “He saw his soldiers dancing. The food. The bride. The groom. The cat.” Music: music nearly silent. Sound effects: quiet room tone, fire crackle. Characters keep their exact reference designs. Nobody on screen speaks. No text, captions or logos in the frame.</w:t>
       </w:r>
     </w:p>
     <w:p>
@@ -4621,7 +4462,7 @@
         <w:pStyle w:val="Heading1"/>
       </w:pPr>
       <w:r>
-        <w:t>SHOT 41 — Senbi and bride</w:t>
+        <w:t>SHOT 39 — Cat stare</w:t>
       </w:r>
     </w:p>
     <w:p>
@@ -4634,17 +4475,12 @@
     </w:p>
     <w:p>
       <w:r>
-        <w:t>01_Senbi.jpg</w:t>
-      </w:r>
-    </w:p>
-    <w:p>
-      <w:r>
-        <w:t>02_Bride.jpg</w:t>
-      </w:r>
-    </w:p>
-    <w:p>
-      <w:r>
-        <w:t>03_Egyptian_Guests.jpg</w:t>
+        <w:t>06_Roman_Commander.jpg</w:t>
+      </w:r>
+    </w:p>
+    <w:p>
+      <w:r>
+        <w:t>07_Animals.jpg</w:t>
       </w:r>
     </w:p>
     <w:p>
@@ -4662,7 +4498,7 @@
     </w:p>
     <w:p>
       <w:r>
-        <w:t>Senbi looked at his bride. Same question, silently: is the wedding still on?</w:t>
+        <w:t>The cat looked back. The cat was not impressed by the Roman Empire.</w:t>
       </w:r>
     </w:p>
     <w:p>
@@ -4675,7 +4511,7 @@
     </w:p>
     <w:p>
       <w:r>
-        <w:t>Everyone looks at each other. Senbi slowly looks at bride; bride looks back. All expressions, eye movement and mouth movement are silent nonverbal acting only. No intelligible speech, no lip-sync dialogue.</w:t>
+        <w:t>The commander stands in the foreground; behind him on the table the black cat stares straight at him, unmoved. The commander's serious face twitches slightly. All expressions and mouth movement are silent acting only; no one on screen speaks.</w:t>
       </w:r>
     </w:p>
     <w:p>
@@ -4688,7 +4524,7 @@
     </w:p>
     <w:p>
       <w:r>
-        <w:t>Static, locked-off: eye-level medium two-shot of Senbi and the bride. No tilt, pan, zoom or orbit.</w:t>
+        <w:t>Static, locked-off: eye-level medium two-shot: the commander in the foreground, the cat on the table behind him; no cutting. No tilt, pan, zoom or orbit.</w:t>
       </w:r>
     </w:p>
     <w:p>
@@ -4701,7 +4537,7 @@
     </w:p>
     <w:p>
       <w:r>
-        <w:t>Music: music drops to low sustained tension with distant marching drums, almost silent. SFX: nervous breath, single drum. All generated inside Flow together with the picture; the narrator stays clearly intelligible.</w:t>
+        <w:t>Music: music nearly silent. SFX: cat meow, tiny sting. All generated inside Flow together with the picture; the narrator stays clearly intelligible.</w:t>
       </w:r>
     </w:p>
     <w:p>
@@ -4714,7 +4550,7 @@
     </w:p>
     <w:p>
       <w:r>
-        <w:t>Locked-off static camera, no camera movement. 2D hand-drawn Stickman animation, clean thin black outlines, large expressive heads, simple readable stickman proportions, flat warm colors, historically inspired ancient Alexandria, playful cinematic documentary-comedy tone, 16:9, no 3D, no photorealism, no modern objects, no subtitles, no captions, no logos, no generated text, NO on-screen character dialogue (only the off-screen narrator speaks). Use the selected reference images as strict continuity anchors. Preserve faces, hair, clothing, colors, proportions and accessories exactly. Characters may move their bodies, arms, eyes and mouths for silent nonverbal acting only. VISUAL STYLE LOCK: 2D hand-drawn stickman animation; clean thin black outlines; large expressive heads; simple readable stickman proportions; flat warm colors; historically inspired ancient Alexandria; playful cinematic documentary-comedy tone; no 3D; no photorealism; no modern objects; no subtitles; no captions; no logos; no text inside the generated scene; 16:9. After the commander's announcement, Senbi slowly turns toward the bride. The bride looks back at him. Both silently realize that the wedding has taken a very strange turn. 2D stickman animation, expressive body language, no text, 16:9. CAMERA: locked-off static camera on a tripod, eye-level medium two-shot of Senbi and the bride. No camera movement of any kind: no tilt, no pan, no zoom, no push, no pull, no orbit, no tracking, no rising or overhead view. The framing stays identical from the first frame to the last frame; all movement comes from the characters. AUDIO (generate sound together with the picture): Off-screen male narrator voice-over, warm intelligent British documentary voice with dry comedic timing, the same voice in every clip, begins speaking within the first half second and says exactly: “Senbi looked at his bride. Same question, silently: is the wedding still on?” The narrator is heard off-screen only; no character lip-syncs to the narrator. Music: music drops to low sustained tension with distant marching drums, almost silent. Sound effects: nervous breath, single drum. No subtitles or captions.</w:t>
+        <w:t>2D hand-drawn stickman cartoon in the exact style of the reference images: thin black outlines, large expressive heads, thin stick arms, flat warm colors, playful documentary-comedy tone, 16:9. Setting: sunny daytime wedding courtyard in ancient Alexandria, sandstone columns, striped awnings, feast tables along the side walls, an open entrance gate at the back. The commander stands in the foreground; behind him on the table the black cat stares straight at him, unmoved. The commander's serious face twitches slightly. Camera: locked-off and perfectly still, eye-level medium two-shot: the commander in the foreground, the cat on the table behind him; no cutting; the framing never changes (no tilt, pan, zoom or rising camera). Audio: off-screen British male narrator, warm and dry, begins speaking within half a second and says: “The cat looked back. The cat was not impressed by the Roman Empire.” Music: music nearly silent. Sound effects: cat meow, tiny sting. Characters keep their exact reference designs. Nobody on screen speaks. No text, captions or logos in the frame.</w:t>
       </w:r>
     </w:p>
     <w:p>
@@ -4736,7 +4572,7 @@
         <w:pStyle w:val="Heading1"/>
       </w:pPr>
       <w:r>
-        <w:t>SHOT 42 — City transition</w:t>
+        <w:t>SHOT 40 — Announcement</w:t>
       </w:r>
     </w:p>
     <w:p>
@@ -4749,12 +4585,27 @@
     </w:p>
     <w:p>
       <w:r>
-        <w:t>08_Alexandria_City_Overview.jpg</w:t>
-      </w:r>
-    </w:p>
-    <w:p>
-      <w:r>
-        <w:t>05_Roman_Soldiers.jpg</w:t>
+        <w:t>06_Roman_Commander.jpg</w:t>
+      </w:r>
+    </w:p>
+    <w:p>
+      <w:r>
+        <w:t>03_Egyptian_Guests.jpg</w:t>
+      </w:r>
+    </w:p>
+    <w:p>
+      <w:r>
+        <w:t>01_Senbi.jpg</w:t>
+      </w:r>
+    </w:p>
+    <w:p>
+      <w:r>
+        <w:t>02_Bride.jpg</w:t>
+      </w:r>
+    </w:p>
+    <w:p>
+      <w:r>
+        <w:t>11_Wedding_Courtyard_Day.jpg</w:t>
       </w:r>
     </w:p>
     <w:p>
@@ -4772,7 +4623,7 @@
     </w:p>
     <w:p>
       <w:r>
-        <w:t>Outside, the city was changing hands. Inside, there was still a wedding.</w:t>
+        <w:t>He unrolled the scroll. Message received: Egypt has new management.</w:t>
       </w:r>
     </w:p>
     <w:p>
@@ -4785,7 +4636,7 @@
     </w:p>
     <w:p>
       <w:r>
-        <w:t>Wide static view of the Alexandria harbor and city. Roman authority is now visibly present. All expressions, eye movement and mouth movement are silent nonverbal acting only. No intelligible speech, no lip-sync dialogue.</w:t>
+        <w:t>Symmetrical composition: the commander at the center unrolls his scroll while Egyptians and Romans stand silent on both sides. All expressions and mouth movement are silent acting only; no one on screen speaks.</w:t>
       </w:r>
     </w:p>
     <w:p>
@@ -4798,7 +4649,7 @@
     </w:p>
     <w:p>
       <w:r>
-        <w:t>Static, locked-off: eye-level wide shot of Alexandria with Roman soldiers in the streets. No tilt, pan, zoom or orbit.</w:t>
+        <w:t>Static, locked-off: symmetrical eye-level medium-wide shot. No tilt, pan, zoom or orbit.</w:t>
       </w:r>
     </w:p>
     <w:p>
@@ -4811,7 +4662,7 @@
     </w:p>
     <w:p>
       <w:r>
-        <w:t>Music: music nearly silent. SFX: harbor ambience, distant boots. All generated inside Flow together with the picture; the narrator stays clearly intelligible.</w:t>
+        <w:t>Music: music drops to low sustained tension with distant marching drums, almost silent. SFX: scroll unrolling, one dramatic drum hit. All generated inside Flow together with the picture; the narrator stays clearly intelligible.</w:t>
       </w:r>
     </w:p>
     <w:p>
@@ -4824,7 +4675,7 @@
     </w:p>
     <w:p>
       <w:r>
-        <w:t>Locked-off static camera, no camera movement. 2D hand-drawn Stickman animation, clean thin black outlines, large expressive heads, simple readable stickman proportions, flat warm colors, historically inspired ancient Alexandria, playful cinematic documentary-comedy tone, 16:9, no 3D, no photorealism, no modern objects, no subtitles, no captions, no logos, no generated text, NO on-screen character dialogue (only the off-screen narrator speaks). Use the selected reference images as strict continuity anchors. Preserve faces, hair, clothing, colors, proportions and accessories exactly. Characters may move their bodies, arms, eyes and mouths for silent nonverbal acting only. VISUAL STYLE LOCK: 2D hand-drawn stickman animation; clean thin black outlines; large expressive heads; simple readable stickman proportions; flat warm colors; historically inspired ancient Alexandria; playful cinematic documentary-comedy tone; no 3D; no photorealism; no modern objects; no subtitles; no captions; no logos; no text inside the generated scene; 16:9. A wide view of Alexandria. Roman soldiers move through the city while Egyptian civilians watch from a distance. The transition should feel more historical and serious for a moment. 2D stickman animation, cinematic wide composition, no text, 16:9. CAMERA: locked-off static camera on a tripod, eye-level wide shot of Alexandria with Roman soldiers in the streets. No camera movement of any kind: no tilt, no pan, no zoom, no push, no pull, no orbit, no tracking, no rising or overhead view. The framing stays identical from the first frame to the last frame; all movement comes from the characters. AUDIO (generate sound together with the picture): Off-screen male narrator voice-over, warm intelligent British documentary voice with dry comedic timing, the same voice in every clip, begins speaking within the first half second and says exactly: “Outside, the city was changing hands. Inside, there was still a wedding.” The narrator is heard off-screen only; no character lip-syncs to the narrator. Music: music nearly silent. Sound effects: harbor ambience, distant boots. No subtitles or captions.</w:t>
+        <w:t>2D hand-drawn stickman cartoon in the exact style of the reference images: thin black outlines, large expressive heads, thin stick arms, flat warm colors, playful documentary-comedy tone, 16:9. Setting: sunny daytime wedding courtyard in ancient Alexandria, sandstone columns, striped awnings, feast tables along the side walls, an open entrance gate at the back. Symmetrical composition: the commander at the center unrolls his scroll while Egyptians and Romans stand silent on both sides. Camera: locked-off and perfectly still, symmetrical eye-level medium-wide shot; the framing never changes (no tilt, pan, zoom or rising camera). Audio: off-screen British male narrator, warm and dry, begins speaking within half a second and says: “He unrolled the scroll. Message received: Egypt has new management.” Music: low sustained tension with distant marching drums, almost silent. Sound effects: scroll unrolling, one dramatic drum hit. Characters keep their exact reference designs. Nobody on screen speaks. No text, captions or logos in the frame.</w:t>
       </w:r>
     </w:p>
     <w:p>
@@ -4846,7 +4697,7 @@
         <w:pStyle w:val="Heading1"/>
       </w:pPr>
       <w:r>
-        <w:t>SHOT 43 — Clarification</w:t>
+        <w:t>SHOT 41 — Senbi and bride</w:t>
       </w:r>
     </w:p>
     <w:p>
@@ -4859,17 +4710,17 @@
     </w:p>
     <w:p>
       <w:r>
-        <w:t>08_Alexandria_City_Overview.jpg</w:t>
-      </w:r>
-    </w:p>
-    <w:p>
-      <w:r>
-        <w:t>09_Alexandria_Streets_and_Market.jpg</w:t>
-      </w:r>
-    </w:p>
-    <w:p>
-      <w:r>
-        <w:t>05_Roman_Soldiers.jpg</w:t>
+        <w:t>01_Senbi.jpg</w:t>
+      </w:r>
+    </w:p>
+    <w:p>
+      <w:r>
+        <w:t>02_Bride.jpg</w:t>
+      </w:r>
+    </w:p>
+    <w:p>
+      <w:r>
+        <w:t>03_Egyptian_Guests.jpg</w:t>
       </w:r>
     </w:p>
     <w:p>
@@ -4887,7 +4738,7 @@
     </w:p>
     <w:p>
       <w:r>
-        <w:t>To be clear: Senbi and his wedding are fiction. The cat, sadly, too.</w:t>
+        <w:t>Senbi looked at his bride. Same question, silently: is the wedding still on?</w:t>
       </w:r>
     </w:p>
     <w:p>
@@ -4900,7 +4751,7 @@
     </w:p>
     <w:p>
       <w:r>
-        <w:t>Calmer documentary-like view of Alexandria, Romans moving through city while Egyptians watch. All expressions, eye movement and mouth movement are silent nonverbal acting only. No intelligible speech, no lip-sync dialogue.</w:t>
+        <w:t>Senbi turns slowly toward the bride; she looks back at him. Both realize the wedding has taken a very strange turn. All expressions and mouth movement are silent acting only; no one on screen speaks.</w:t>
       </w:r>
     </w:p>
     <w:p>
@@ -4913,7 +4764,7 @@
     </w:p>
     <w:p>
       <w:r>
-        <w:t>Static, locked-off: eye-level wide observational shot of Alexandria. No tilt, pan, zoom or orbit.</w:t>
+        <w:t>Static, locked-off: eye-level medium two-shot of Senbi and the bride. No tilt, pan, zoom or orbit.</w:t>
       </w:r>
     </w:p>
     <w:p>
@@ -4926,7 +4777,7 @@
     </w:p>
     <w:p>
       <w:r>
-        <w:t>Music: music nearly silent. SFX: calm city ambience. All generated inside Flow together with the picture; the narrator stays clearly intelligible.</w:t>
+        <w:t>Music: music drops to low sustained tension with distant marching drums, almost silent. SFX: nervous breath, single drum. All generated inside Flow together with the picture; the narrator stays clearly intelligible.</w:t>
       </w:r>
     </w:p>
     <w:p>
@@ -4939,7 +4790,7 @@
     </w:p>
     <w:p>
       <w:r>
-        <w:t>Locked-off static camera, no camera movement. 2D hand-drawn Stickman animation, clean thin black outlines, large expressive heads, simple readable stickman proportions, flat warm colors, historically inspired ancient Alexandria, playful cinematic documentary-comedy tone, 16:9, no 3D, no photorealism, no modern objects, no subtitles, no captions, no logos, no generated text, NO on-screen character dialogue (only the off-screen narrator speaks). Use the selected reference images as strict continuity anchors. Preserve faces, hair, clothing, colors, proportions and accessories exactly. Characters may move their bodies, arms, eyes and mouths for silent nonverbal acting only. VISUAL STYLE LOCK: 2D hand-drawn stickman animation; clean thin black outlines; large expressive heads; simple readable stickman proportions; flat warm colors; historically inspired ancient Alexandria; playful cinematic documentary-comedy tone; no 3D; no photorealism; no modern objects; no subtitles; no captions; no logos; no text inside the generated scene; 16:9. Observational view of Alexandria with Roman military presence becoming visible in the city while Egyptian civilians continue their daily life. Do not depict the wedding as a literal documented historical event. The scene should visually signal the distinction between historical context and the fictional wedding comedy. 2D stickman animation, clean linework, no text, 16:9. CAMERA: locked-off static camera on a tripod, eye-level wide observational shot of Alexandria. No camera movement of any kind: no tilt, no pan, no zoom, no push, no pull, no orbit, no tracking, no rising or overhead view. The framing stays identical from the first frame to the last frame; all movement comes from the characters. AUDIO (generate sound together with the picture): Off-screen male narrator voice-over, warm intelligent British documentary voice with dry comedic timing, the same voice in every clip, begins speaking within the first half second and says exactly: “To be clear: Senbi and his wedding are fiction. The cat, sadly, too.” The narrator is heard off-screen only; no character lip-syncs to the narrator. Music: music nearly silent. Sound effects: calm city ambience. No subtitles or captions.</w:t>
+        <w:t>2D hand-drawn stickman cartoon in the exact style of the reference images: thin black outlines, large expressive heads, thin stick arms, flat warm colors, playful documentary-comedy tone, 16:9. Setting: sunny daytime wedding courtyard in ancient Alexandria, sandstone columns, striped awnings, feast tables along the side walls, an open entrance gate at the back. Senbi turns slowly toward the bride; she looks back at him. Both realize the wedding has taken a very strange turn. Camera: locked-off and perfectly still, eye-level medium two-shot of Senbi and the bride; the framing never changes (no tilt, pan, zoom or rising camera). Audio: off-screen British male narrator, warm and dry, begins speaking within half a second and says: “Senbi looked at his bride. Same question, silently: is the wedding still on?” Music: low sustained tension with distant marching drums, almost silent. Sound effects: nervous breath, single drum. Characters keep their exact reference designs. Nobody on screen speaks. No text, captions or logos in the frame.</w:t>
       </w:r>
     </w:p>
     <w:p>
@@ -4961,15 +4812,7 @@
         <w:pStyle w:val="Heading1"/>
       </w:pPr>
       <w:r>
-        <w:t>SHOT 44 — Historical anchor</w:t>
-      </w:r>
-    </w:p>
-    <w:p>
-      <w:r>
-        <w:rPr>
-          <w:b/>
-        </w:rPr>
-        <w:t>EDIT NOTE: in the final edit, place this clip right after Shot 25 (before Shot 26) so the audience knows why the Romans are there before the dancing. The shot number stays 44; do not regenerate.</w:t>
+        <w:t>SHOT 42 — City transition</w:t>
       </w:r>
     </w:p>
     <w:p>
@@ -4987,11 +4830,6 @@
     </w:p>
     <w:p>
       <w:r>
-        <w:t>09_Alexandria_Streets_and_Market.jpg</w:t>
-      </w:r>
-    </w:p>
-    <w:p>
-      <w:r>
         <w:t>05_Roman_Soldiers.jpg</w:t>
       </w:r>
     </w:p>
@@ -5010,7 +4848,7 @@
     </w:p>
     <w:p>
       <w:r>
-        <w:t>The setting is real: in 30 BC, Octavian took Alexandria. Egypt became Roman.</w:t>
+        <w:t>Outside, the city was changing hands. Inside, there was still a wedding.</w:t>
       </w:r>
     </w:p>
     <w:p>
@@ -5023,7 +4861,7 @@
     </w:p>
     <w:p>
       <w:r>
-        <w:t>Stylized historical tableau of Alexandria at the moment Roman authority takes control, without inventing a specific street event. All expressions, eye movement and mouth movement are silent nonverbal acting only. No intelligible speech, no lip-sync dialogue.</w:t>
+        <w:t>Roman soldiers walk through the streets of Alexandria while Egyptian civilians watch from the sides. The mood turns briefly serious. All expressions and mouth movement are silent acting only; no one on screen speaks.</w:t>
       </w:r>
     </w:p>
     <w:p>
@@ -5036,7 +4874,7 @@
     </w:p>
     <w:p>
       <w:r>
-        <w:t>Locked camera, extremely slow 5% push-in only: wide shot of the Alexandria harbor and city, horizon level. No tilt, pan or orbit.</w:t>
+        <w:t>Static, locked-off: eye-level wide shot of Alexandria with Roman soldiers in the streets. No tilt, pan, zoom or orbit.</w:t>
       </w:r>
     </w:p>
     <w:p>
@@ -5049,7 +4887,7 @@
     </w:p>
     <w:p>
       <w:r>
-        <w:t>Music: music nearly silent. SFX: calm city ambience. All generated inside Flow together with the picture; the narrator stays clearly intelligible.</w:t>
+        <w:t>Music: music nearly silent. SFX: harbor ambience, distant boots. All generated inside Flow together with the picture; the narrator stays clearly intelligible.</w:t>
       </w:r>
     </w:p>
     <w:p>
@@ -5062,7 +4900,7 @@
     </w:p>
     <w:p>
       <w:r>
-        <w:t>Locked camera, only an extremely slow subtle push-in. 2D hand-drawn Stickman animation, clean thin black outlines, large expressive heads, simple readable stickman proportions, flat warm colors, historically inspired ancient Alexandria, playful cinematic documentary-comedy tone, 16:9, no 3D, no photorealism, no modern objects, no subtitles, no captions, no logos, no generated text, NO on-screen character dialogue (only the off-screen narrator speaks). Use the selected reference images as strict continuity anchors. Preserve faces, hair, clothing, colors, proportions and accessories exactly. Characters may move their bodies, arms, eyes and mouths for silent nonverbal acting only. VISUAL STYLE LOCK: 2D hand-drawn stickman animation; clean thin black outlines; large expressive heads; simple readable stickman proportions; flat warm colors; historically inspired ancient Alexandria; playful cinematic documentary-comedy tone; no 3D; no photorealism; no modern objects; no subtitles; no captions; no logos; no text inside the generated scene; 16:9. Cinematic historical tableau of Alexandria in 30 BC during the major political transition associated with Octavian. Roman authority is visible in the city while Egyptian life continues around it. Avoid inventing a specific documented street event. 2D stickman animation, historically inspired, no text, 16:9. CAMERA: wide shot of the Alexandria harbor and city, horizon level. Locked camera with only an extremely slow, subtle push-in (about 5%) over the whole clip. No tilt, no pan, no orbit, no rising or overhead view; the subject stays in the same position in the frame. AUDIO (generate sound together with the picture): Off-screen male narrator voice-over, warm intelligent British documentary voice with dry comedic timing, the same voice in every clip, begins speaking within the first half second and says exactly: “The setting is real: in 30 BC, Octavian took Alexandria. Egypt became Roman.” The narrator is heard off-screen only; no character lip-syncs to the narrator. Music: music nearly silent. Sound effects: calm city ambience. No subtitles or captions.</w:t>
+        <w:t>2D hand-drawn stickman cartoon in the exact style of the reference images: thin black outlines, large expressive heads, thin stick arms, flat warm colors, playful documentary-comedy tone, 16:9. Setting: sunlit street of ancient Alexandria outside the wedding house, sandstone walls and palms. Roman soldiers walk through the streets of Alexandria while Egyptian civilians watch from the sides. The mood turns briefly serious. Camera: locked-off and perfectly still, eye-level wide shot of Alexandria with Roman soldiers in the streets; the framing never changes (no tilt, pan, zoom or rising camera). Audio: off-screen British male narrator, warm and dry, begins speaking within half a second and says: “Outside, the city was changing hands. Inside, there was still a wedding.” Music: music nearly silent. Sound effects: harbor ambience, distant boots. Characters keep their exact reference designs. Nobody on screen speaks. No text, captions or logos in the frame.</w:t>
       </w:r>
     </w:p>
     <w:p>
@@ -5084,7 +4922,7 @@
         <w:pStyle w:val="Heading1"/>
       </w:pPr>
       <w:r>
-        <w:t>SHOT 45 — Headrest callback</w:t>
+        <w:t>SHOT 43 — Clarification</w:t>
       </w:r>
     </w:p>
     <w:p>
@@ -5097,17 +4935,22 @@
     </w:p>
     <w:p>
       <w:r>
-        <w:t>01_Senbi.jpg</w:t>
-      </w:r>
-    </w:p>
-    <w:p>
-      <w:r>
-        <w:t>04_Parents_and_Relatives.jpg</w:t>
-      </w:r>
-    </w:p>
-    <w:p>
-      <w:r>
-        <w:t>DURATION: 6 sec</w:t>
+        <w:t>08_Alexandria_City_Overview.jpg</w:t>
+      </w:r>
+    </w:p>
+    <w:p>
+      <w:r>
+        <w:t>09_Alexandria_Streets_and_Market.jpg</w:t>
+      </w:r>
+    </w:p>
+    <w:p>
+      <w:r>
+        <w:t>05_Roman_Soldiers.jpg</w:t>
+      </w:r>
+    </w:p>
+    <w:p>
+      <w:r>
+        <w:t>DURATION: 8 sec (the line needs about 5–6 s of speech; trim the clip in editing)</w:t>
       </w:r>
     </w:p>
     <w:p>
@@ -5120,7 +4963,7 @@
     </w:p>
     <w:p>
       <w:r>
-        <w:t>Headrest, then commander. Neither came with a return policy.</w:t>
+        <w:t>To be clear: Senbi and his wedding are fiction. The cat, sadly, too.</w:t>
       </w:r>
     </w:p>
     <w:p>
@@ -5133,7 +4976,7 @@
     </w:p>
     <w:p>
       <w:r>
-        <w:t>Senbi looks at the wooden headrest gift, then at the Roman commander. All expressions, eye movement and mouth movement are silent nonverbal acting only. No intelligible speech, no lip-sync dialogue.</w:t>
+        <w:t>A few Roman soldiers pass through while ordinary Egyptians keep going about their day: carrying baskets, bargaining, hauling jars. The scene signals real history around the fictional wedding. All expressions and mouth movement are silent acting only; no one on screen speaks.</w:t>
       </w:r>
     </w:p>
     <w:p>
@@ -5146,7 +4989,7 @@
     </w:p>
     <w:p>
       <w:r>
-        <w:t>Static, locked-off: eye-level medium close-up with the headrest in Senbi's hands and his face both in frame. No tilt, pan, zoom or orbit.</w:t>
+        <w:t>Static, locked-off: eye-level wide observational shot of Alexandria. No tilt, pan, zoom or orbit.</w:t>
       </w:r>
     </w:p>
     <w:p>
@@ -5159,7 +5002,7 @@
     </w:p>
     <w:p>
       <w:r>
-        <w:t>Music: playful comic percussion over the wedding rhythm, mixed low under the narrator. SFX: wood knock, comic sting. All generated inside Flow together with the picture; the narrator stays clearly intelligible.</w:t>
+        <w:t>Music: music nearly silent. SFX: calm city ambience. All generated inside Flow together with the picture; the narrator stays clearly intelligible.</w:t>
       </w:r>
     </w:p>
     <w:p>
@@ -5172,7 +5015,7 @@
     </w:p>
     <w:p>
       <w:r>
-        <w:t>Locked-off static camera, no camera movement. 2D hand-drawn Stickman animation, clean thin black outlines, large expressive heads, simple readable stickman proportions, flat warm colors, historically inspired ancient Alexandria, playful cinematic documentary-comedy tone, 16:9, no 3D, no photorealism, no modern objects, no subtitles, no captions, no logos, no generated text, NO on-screen character dialogue (only the off-screen narrator speaks). Use the selected reference images as strict continuity anchors. Preserve faces, hair, clothing, colors, proportions and accessories exactly. Characters may move their bodies, arms, eyes and mouths for silent nonverbal acting only. VISUAL STYLE LOCK: 2D hand-drawn stickman animation; clean thin black outlines; large expressive heads; simple readable stickman proportions; flat warm colors; historically inspired ancient Alexandria; playful cinematic documentary-comedy tone; no 3D; no photorealism; no modern objects; no subtitles; no captions; no logos; no text inside the generated scene; 16:9. Senbi looks down at the wooden headrest wedding gift, then slowly looks toward the Roman commander with a tired expression, as if reconsidering every decision that brought him here. Preserve exact Senbi design. 2D stickman animation, no text, 16:9. CAMERA: locked-off static camera on a tripod, eye-level medium close-up with the headrest in Senbi's hands and his face both in frame. No camera movement of any kind: no tilt, no pan, no zoom, no push, no pull, no orbit, no tracking, no rising or overhead view. The framing stays identical from the first frame to the last frame; all movement comes from the characters. AUDIO (generate sound together with the picture): Off-screen male narrator voice-over, warm intelligent British documentary voice with dry comedic timing, the same voice in every clip, begins speaking within the first half second and says exactly: “Headrest, then commander. Neither came with a return policy.” The narrator is heard off-screen only; no character lip-syncs to the narrator. Music: playful comic percussion over the wedding rhythm, mixed low under the narrator. Sound effects: wood knock, comic sting. No subtitles or captions.</w:t>
+        <w:t>2D hand-drawn stickman cartoon in the exact style of the reference images: thin black outlines, large expressive heads, thin stick arms, flat warm colors, playful documentary-comedy tone, 16:9. Setting: sunlit street of ancient Alexandria outside the wedding house, sandstone walls and palms. A few Roman soldiers pass through while ordinary Egyptians keep going about their day: carrying baskets, bargaining, hauling jars. The scene signals real history around the fictional wedding. Camera: locked-off and perfectly still, eye-level wide observational shot of Alexandria; the framing never changes (no tilt, pan, zoom or rising camera). Audio: off-screen British male narrator, warm and dry, begins speaking within half a second and says: “To be clear: Senbi and his wedding are fiction. The cat, sadly, too.” Music: music nearly silent. Sound effects: calm city ambience. Characters keep their exact reference designs. Nobody on screen speaks. No text, captions or logos in the frame.</w:t>
       </w:r>
     </w:p>
     <w:p>
@@ -5194,7 +5037,15 @@
         <w:pStyle w:val="Heading1"/>
       </w:pPr>
       <w:r>
-        <w:t>SHOT 46 — Bride laughs</w:t>
+        <w:t>SHOT 44 — Historical anchor</w:t>
+      </w:r>
+    </w:p>
+    <w:p>
+      <w:r>
+        <w:rPr>
+          <w:b/>
+        </w:rPr>
+        <w:t>EDIT NOTE: in the final edit, place this clip right after Shot 25 (before Shot 26) so the audience knows why the Romans are there before the dancing. The shot number stays 44; do not regenerate.</w:t>
       </w:r>
     </w:p>
     <w:p>
@@ -5207,22 +5058,22 @@
     </w:p>
     <w:p>
       <w:r>
-        <w:t>02_Bride.jpg</w:t>
-      </w:r>
-    </w:p>
-    <w:p>
-      <w:r>
-        <w:t>01_Senbi.jpg</w:t>
-      </w:r>
-    </w:p>
-    <w:p>
-      <w:r>
-        <w:t>11_Wedding_Courtyard_Day.jpg</w:t>
-      </w:r>
-    </w:p>
-    <w:p>
-      <w:r>
-        <w:t>DURATION: 6 sec</w:t>
+        <w:t>08_Alexandria_City_Overview.jpg</w:t>
+      </w:r>
+    </w:p>
+    <w:p>
+      <w:r>
+        <w:t>09_Alexandria_Streets_and_Market.jpg</w:t>
+      </w:r>
+    </w:p>
+    <w:p>
+      <w:r>
+        <w:t>05_Roman_Soldiers.jpg</w:t>
+      </w:r>
+    </w:p>
+    <w:p>
+      <w:r>
+        <w:t>DURATION: 8 sec (the line needs about 5–6 s of speech; trim the clip in editing)</w:t>
       </w:r>
     </w:p>
     <w:p>
@@ -5235,7 +5086,7 @@
     </w:p>
     <w:p>
       <w:r>
-        <w:t>Senbi thought he was getting married.</w:t>
+        <w:t>The setting is real: in 30 BC, Octavian took Alexandria. Egypt became Roman.</w:t>
       </w:r>
     </w:p>
     <w:p>
@@ -5248,7 +5099,7 @@
     </w:p>
     <w:p>
       <w:r>
-        <w:t>Bride laughs despite the chaos. Senbi finally laughs too. All expressions, eye movement and mouth movement are silent nonverbal acting only. No intelligible speech, no lip-sync dialogue.</w:t>
+        <w:t>Stylized historical tableau at the moment Roman authority takes over: Roman ships entering the harbor, soldiers on the quay, civilians watching. Do not depict the wedding. All expressions and mouth movement are silent acting only; no one on screen speaks.</w:t>
       </w:r>
     </w:p>
     <w:p>
@@ -5261,7 +5112,7 @@
     </w:p>
     <w:p>
       <w:r>
-        <w:t>Static, locked-off: eye-level medium two-shot of Senbi and the bride. No tilt, pan, zoom or orbit.</w:t>
+        <w:t>Locked camera, extremely slow 5% push-in only: wide shot of the Alexandria harbor and city, horizon level. No tilt, pan or orbit.</w:t>
       </w:r>
     </w:p>
     <w:p>
@@ -5274,7 +5125,7 @@
     </w:p>
     <w:p>
       <w:r>
-        <w:t>Music: warm gentle resolution with the same flute and strings, mixed low under the narrator. SFX: bride laughter, Senbi laughter. All generated inside Flow together with the picture; the narrator stays clearly intelligible.</w:t>
+        <w:t>Music: music nearly silent. SFX: calm city ambience. All generated inside Flow together with the picture; the narrator stays clearly intelligible.</w:t>
       </w:r>
     </w:p>
     <w:p>
@@ -5287,7 +5138,7 @@
     </w:p>
     <w:p>
       <w:r>
-        <w:t>Locked-off static camera, no camera movement. 2D hand-drawn Stickman animation, clean thin black outlines, large expressive heads, simple readable stickman proportions, flat warm colors, historically inspired ancient Alexandria, playful cinematic documentary-comedy tone, 16:9, no 3D, no photorealism, no modern objects, no subtitles, no captions, no logos, no generated text, NO on-screen character dialogue (only the off-screen narrator speaks). Use the selected reference images as strict continuity anchors. Preserve faces, hair, clothing, colors, proportions and accessories exactly. Characters may move their bodies, arms, eyes and mouths for silent nonverbal acting only. VISUAL STYLE LOCK: 2D hand-drawn stickman animation; clean thin black outlines; large expressive heads; simple readable stickman proportions; flat warm colors; historically inspired ancient Alexandria; playful cinematic documentary-comedy tone; no 3D; no photorealism; no modern objects; no subtitles; no captions; no logos; no text inside the generated scene; 16:9. The bride finally laughs at the absurdity of the situation. Senbi looks at her, then starts laughing too. The tension releases for a warm comedic moment. 2D stickman animation, warm colors, no text, 16:9. CAMERA: locked-off static camera on a tripod, eye-level medium two-shot of Senbi and the bride. No camera movement of any kind: no tilt, no pan, no zoom, no push, no pull, no orbit, no tracking, no rising or overhead view. The framing stays identical from the first frame to the last frame; all movement comes from the characters. AUDIO (generate sound together with the picture): Off-screen male narrator voice-over, warm intelligent British documentary voice with dry comedic timing, the same voice in every clip, begins speaking within the first half second and says exactly: “Senbi thought he was getting married.” The narrator is heard off-screen only; no character lip-syncs to the narrator. Music: warm gentle resolution with the same flute and strings, mixed low under the narrator. Sound effects: bride laughter, Senbi laughter. No subtitles or captions.</w:t>
+        <w:t>2D hand-drawn stickman cartoon in the exact style of the reference images: thin black outlines, large expressive heads, thin stick arms, flat warm colors, playful documentary-comedy tone, 16:9. Setting: ancient Alexandria harbor. Stylized historical tableau at the moment Roman authority takes over: Roman ships entering the harbor, soldiers on the quay, civilians watching. Do not depict the wedding. Camera: wide shot of the Alexandria harbor and city, horizon level; fixed except for an almost imperceptible 5% slow push-in, no tilt or pan. Audio: off-screen British male narrator, warm and dry, begins speaking within half a second and says: “The setting is real: in 30 BC, Octavian took Alexandria. Egypt became Roman.” Music: music nearly silent. Sound effects: calm city ambience. Characters keep their exact reference designs. Nobody on screen speaks. No text, captions or logos in the frame.</w:t>
       </w:r>
     </w:p>
     <w:p>
@@ -5309,7 +5160,7 @@
         <w:pStyle w:val="Heading1"/>
       </w:pPr>
       <w:r>
-        <w:t>SHOT 47 — Final punchline</w:t>
+        <w:t>SHOT 45 — Headrest callback</w:t>
       </w:r>
     </w:p>
     <w:p>
@@ -5332,7 +5183,7 @@
     </w:p>
     <w:p>
       <w:r>
-        <w:t>DURATION: 4 sec (short beat; leave a pause before and after)</w:t>
+        <w:t>DURATION: 6 sec</w:t>
       </w:r>
     </w:p>
     <w:p>
@@ -5345,7 +5196,7 @@
     </w:p>
     <w:p>
       <w:r>
-        <w:t>He was.</w:t>
+        <w:t>Headrest, then commander. Neither came with a return policy.</w:t>
       </w:r>
     </w:p>
     <w:p>
@@ -5358,7 +5209,7 @@
     </w:p>
     <w:p>
       <w:r>
-        <w:t>Senbi sleeps awkwardly on the wooden headrest. He opens one eye at distant marching, then closes it. All expressions, eye movement and mouth movement are silent nonverbal acting only. No intelligible speech, no lip-sync dialogue.</w:t>
+        <w:t>Senbi holds the wooden headrest in his hands and looks down at it, then slowly looks off to the side toward the Roman commander with a tired, deadpan expression. All expressions and mouth movement are silent acting only; no one on screen speaks.</w:t>
       </w:r>
     </w:p>
     <w:p>
@@ -5371,7 +5222,7 @@
     </w:p>
     <w:p>
       <w:r>
-        <w:t>Locked camera, extremely slow 5% push-in only: eye-level medium close-up of Senbi's face. No tilt, pan or orbit.</w:t>
+        <w:t>Static, locked-off: eye-level medium close-up with the headrest in Senbi's hands and his face both in frame. No tilt, pan, zoom or orbit.</w:t>
       </w:r>
     </w:p>
     <w:p>
@@ -5384,7 +5235,7 @@
     </w:p>
     <w:p>
       <w:r>
-        <w:t>Music: warm gentle resolution with the same flute and strings, mixed low under the narrator. SFX: distant marching, soft snore. All generated inside Flow together with the picture; the narrator stays clearly intelligible.</w:t>
+        <w:t>Music: playful comic percussion over the wedding rhythm, mixed low under the narrator. SFX: wood knock, comic sting. All generated inside Flow together with the picture; the narrator stays clearly intelligible.</w:t>
       </w:r>
     </w:p>
     <w:p>
@@ -5397,7 +5248,7 @@
     </w:p>
     <w:p>
       <w:r>
-        <w:t>Locked camera, only an extremely slow subtle push-in. 2D hand-drawn Stickman animation, clean thin black outlines, large expressive heads, simple readable stickman proportions, flat warm colors, historically inspired ancient Alexandria, playful cinematic documentary-comedy tone, 16:9, no 3D, no photorealism, no modern objects, no subtitles, no captions, no logos, no generated text, NO on-screen character dialogue (only the off-screen narrator speaks). Use the selected reference images as strict continuity anchors. Preserve faces, hair, clothing, colors, proportions and accessories exactly. Characters may move their bodies, arms, eyes and mouths for silent nonverbal acting only. VISUAL STYLE LOCK: 2D hand-drawn stickman animation; clean thin black outlines; large expressive heads; simple readable stickman proportions; flat warm colors; historically inspired ancient Alexandria; playful cinematic documentary-comedy tone; no 3D; no photorealism; no modern objects; no subtitles; no captions; no logos; no text inside the generated scene; 16:9. Senbi tries to sleep awkwardly using the wooden headrest. He opens one eye when distant Roman marching sounds are implied visually by his reaction, then closes it again in exhausted resignation. 2D stickman animation, clean thin lines, deadpan comedy, no text, 16:9. CAMERA: eye-level medium close-up of Senbi's face. Locked camera with only an extremely slow, subtle push-in (about 5%) over the whole clip. No tilt, no pan, no orbit, no rising or overhead view; the subject stays in the same position in the frame. AUDIO (generate sound together with the picture): Off-screen male narrator voice-over, warm intelligent British documentary voice with dry comedic timing, the same voice in every clip, begins speaking within the first half second and says exactly: “He was.” The narrator is heard off-screen only; no character lip-syncs to the narrator. Music: warm gentle resolution with the same flute and strings, mixed low under the narrator. Sound effects: distant marching, soft snore. No subtitles or captions.</w:t>
+        <w:t>2D hand-drawn stickman cartoon in the exact style of the reference images: thin black outlines, large expressive heads, thin stick arms, flat warm colors, playful documentary-comedy tone, 16:9. Setting: sunny daytime wedding courtyard in ancient Alexandria, sandstone columns, striped awnings, feast tables along the side walls, an open entrance gate at the back. Senbi holds the wooden headrest in his hands and looks down at it, then slowly looks off to the side toward the Roman commander with a tired, deadpan expression. Camera: locked-off and perfectly still, eye-level medium close-up with the headrest in Senbi's hands and his face both in frame; the framing never changes (no tilt, pan, zoom or rising camera). Audio: off-screen British male narrator, warm and dry, begins speaking within half a second and says: “Headrest, then commander. Neither came with a return policy.” Music: playful comic percussion over the wedding rhythm, low under the voice. Sound effects: wood knock, comic sting. Characters keep their exact reference designs. Nobody on screen speaks. No text, captions or logos in the frame.</w:t>
       </w:r>
     </w:p>
     <w:p>
@@ -5419,6 +5270,231 @@
         <w:pStyle w:val="Heading1"/>
       </w:pPr>
       <w:r>
+        <w:t>SHOT 46 — Bride laughs</w:t>
+      </w:r>
+    </w:p>
+    <w:p>
+      <w:r>
+        <w:rPr>
+          <w:b/>
+        </w:rPr>
+        <w:t>REFERENCE IMAGES TO SELECT IN GOOGLE FLOW</w:t>
+      </w:r>
+    </w:p>
+    <w:p>
+      <w:r>
+        <w:t>02_Bride.jpg</w:t>
+      </w:r>
+    </w:p>
+    <w:p>
+      <w:r>
+        <w:t>01_Senbi.jpg</w:t>
+      </w:r>
+    </w:p>
+    <w:p>
+      <w:r>
+        <w:t>11_Wedding_Courtyard_Day.jpg</w:t>
+      </w:r>
+    </w:p>
+    <w:p>
+      <w:r>
+        <w:t>DURATION: 6 sec</w:t>
+      </w:r>
+    </w:p>
+    <w:p>
+      <w:r>
+        <w:rPr>
+          <w:b/>
+        </w:rPr>
+        <w:t>VOICEOVER — NARRATOR ONLY</w:t>
+      </w:r>
+    </w:p>
+    <w:p>
+      <w:r>
+        <w:t>Senbi thought he was getting married.</w:t>
+      </w:r>
+    </w:p>
+    <w:p>
+      <w:r>
+        <w:rPr>
+          <w:b/>
+        </w:rPr>
+        <w:t>CHARACTER ACTION / SILENT ACTING</w:t>
+      </w:r>
+    </w:p>
+    <w:p>
+      <w:r>
+        <w:t>The bride finally laughs at the absurdity. Senbi looks at her, then starts laughing too. The tension releases. All expressions and mouth movement are silent acting only; no one on screen speaks.</w:t>
+      </w:r>
+    </w:p>
+    <w:p>
+      <w:r>
+        <w:rPr>
+          <w:b/>
+        </w:rPr>
+        <w:t>CAMERA / MOTION</w:t>
+      </w:r>
+    </w:p>
+    <w:p>
+      <w:r>
+        <w:t>Static, locked-off: eye-level medium two-shot of Senbi and the bride. No tilt, pan, zoom or orbit.</w:t>
+      </w:r>
+    </w:p>
+    <w:p>
+      <w:r>
+        <w:rPr>
+          <w:b/>
+        </w:rPr>
+        <w:t>MUSIC + SFX</w:t>
+      </w:r>
+    </w:p>
+    <w:p>
+      <w:r>
+        <w:t>Music: warm gentle resolution with the same flute and strings, mixed low under the narrator. SFX: bride laughter, Senbi laughter. All generated inside Flow together with the picture; the narrator stays clearly intelligible.</w:t>
+      </w:r>
+    </w:p>
+    <w:p>
+      <w:r>
+        <w:rPr>
+          <w:b/>
+        </w:rPr>
+        <w:t>GOOGLE FLOW VIDEO PROMPT</w:t>
+      </w:r>
+    </w:p>
+    <w:p>
+      <w:r>
+        <w:t>2D hand-drawn stickman cartoon in the exact style of the reference images: thin black outlines, large expressive heads, thin stick arms, flat warm colors, playful documentary-comedy tone, 16:9. Setting: sunny daytime wedding courtyard in ancient Alexandria, sandstone columns, striped awnings, feast tables along the side walls, an open entrance gate at the back. The bride finally laughs at the absurdity. Senbi looks at her, then starts laughing too. The tension releases. Camera: locked-off and perfectly still, eye-level medium two-shot of Senbi and the bride; the framing never changes (no tilt, pan, zoom or rising camera). Audio: off-screen British male narrator, warm and dry, begins speaking within half a second and says: “Senbi thought he was getting married.” Music: warm gentle resolution with the same flute and strings, low under the voice. Sound effects: bride laughter, Senbi laughter. Characters keep their exact reference designs. Nobody on screen speaks. No text, captions or logos in the frame.</w:t>
+      </w:r>
+    </w:p>
+    <w:p>
+      <w:r>
+        <w:rPr>
+          <w:b/>
+        </w:rPr>
+        <w:t>CONTINUITY / NEGATIVE LOCK</w:t>
+      </w:r>
+    </w:p>
+    <w:p>
+      <w:r>
+        <w:t>16:9. Keep exact approved character design, clothing, colors, proportions and environment. No modern objects, modern clothing, modern signs, modern architecture, subtitles, captions, logos, watermarks or written text inside the generated footage. No character dialogue. Do not introduce new character designs. If Flow changes a face, costume, proportions or key prop, regenerate.</w:t>
+      </w:r>
+    </w:p>
+    <w:p/>
+    <w:p>
+      <w:pPr>
+        <w:pStyle w:val="Heading1"/>
+      </w:pPr>
+      <w:r>
+        <w:t>SHOT 47 — Final punchline</w:t>
+      </w:r>
+    </w:p>
+    <w:p>
+      <w:r>
+        <w:rPr>
+          <w:b/>
+        </w:rPr>
+        <w:t>REFERENCE IMAGES TO SELECT IN GOOGLE FLOW</w:t>
+      </w:r>
+    </w:p>
+    <w:p>
+      <w:r>
+        <w:t>01_Senbi.jpg</w:t>
+      </w:r>
+    </w:p>
+    <w:p>
+      <w:r>
+        <w:t>04_Parents_and_Relatives.jpg</w:t>
+      </w:r>
+    </w:p>
+    <w:p>
+      <w:r>
+        <w:t>DURATION: 4 sec (short beat; leave a pause before and after)</w:t>
+      </w:r>
+    </w:p>
+    <w:p>
+      <w:r>
+        <w:rPr>
+          <w:b/>
+        </w:rPr>
+        <w:t>VOICEOVER — NARRATOR ONLY</w:t>
+      </w:r>
+    </w:p>
+    <w:p>
+      <w:r>
+        <w:t>He was.</w:t>
+      </w:r>
+    </w:p>
+    <w:p>
+      <w:r>
+        <w:rPr>
+          <w:b/>
+        </w:rPr>
+        <w:t>CHARACTER ACTION / SILENT ACTING</w:t>
+      </w:r>
+    </w:p>
+    <w:p>
+      <w:r>
+        <w:t>Senbi lies awkwardly asleep with his neck on the wooden headrest. Distant marching is heard; he opens one eye, listens, and closes it again. All expressions and mouth movement are silent acting only; no one on screen speaks.</w:t>
+      </w:r>
+    </w:p>
+    <w:p>
+      <w:r>
+        <w:rPr>
+          <w:b/>
+        </w:rPr>
+        <w:t>CAMERA / MOTION</w:t>
+      </w:r>
+    </w:p>
+    <w:p>
+      <w:r>
+        <w:t>Locked camera, extremely slow 5% push-in only: eye-level medium close-up of Senbi's face. No tilt, pan or orbit.</w:t>
+      </w:r>
+    </w:p>
+    <w:p>
+      <w:r>
+        <w:rPr>
+          <w:b/>
+        </w:rPr>
+        <w:t>MUSIC + SFX</w:t>
+      </w:r>
+    </w:p>
+    <w:p>
+      <w:r>
+        <w:t>Music: warm gentle resolution with the same flute and strings, mixed low under the narrator. SFX: distant marching, soft snore. All generated inside Flow together with the picture; the narrator stays clearly intelligible.</w:t>
+      </w:r>
+    </w:p>
+    <w:p>
+      <w:r>
+        <w:rPr>
+          <w:b/>
+        </w:rPr>
+        <w:t>GOOGLE FLOW VIDEO PROMPT</w:t>
+      </w:r>
+    </w:p>
+    <w:p>
+      <w:r>
+        <w:t>2D hand-drawn stickman cartoon in the exact style of the reference images: thin black outlines, large expressive heads, thin stick arms, flat warm colors, playful documentary-comedy tone, 16:9. Setting: a noble house room in ancient Alexandria with warm sandstone walls. Senbi lies awkwardly asleep with his neck on the wooden headrest. Distant marching is heard; he opens one eye, listens, and closes it again. Camera: eye-level medium close-up of Senbi's face; fixed except for an almost imperceptible 5% slow push-in, no tilt or pan. Audio: off-screen British male narrator, warm and dry, begins speaking within half a second and says: “He was.” Music: warm gentle resolution with the same flute and strings, low under the voice. Sound effects: distant marching, soft snore. Characters keep their exact reference designs. Nobody on screen speaks. No text, captions or logos in the frame.</w:t>
+      </w:r>
+    </w:p>
+    <w:p>
+      <w:r>
+        <w:rPr>
+          <w:b/>
+        </w:rPr>
+        <w:t>CONTINUITY / NEGATIVE LOCK</w:t>
+      </w:r>
+    </w:p>
+    <w:p>
+      <w:r>
+        <w:t>16:9. Keep exact approved character design, clothing, colors, proportions and environment. No modern objects, modern clothing, modern signs, modern architecture, subtitles, captions, logos, watermarks or written text inside the generated footage. No character dialogue. Do not introduce new character designs. If Flow changes a face, costume, proportions or key prop, regenerate.</w:t>
+      </w:r>
+    </w:p>
+    <w:p/>
+    <w:p>
+      <w:pPr>
+        <w:pStyle w:val="Heading1"/>
+      </w:pPr>
+      <w:r>
         <w:t>SHOT 48 — Closing curiosity</w:t>
       </w:r>
     </w:p>
@@ -5478,7 +5554,7 @@
     </w:p>
     <w:p>
       <w:r>
-        <w:t>Senbi and bride in foreground; Roman city silhouette behind. Hold on a mysterious transition into the future. All expressions, eye movement and mouth movement are silent nonverbal acting only. No intelligible speech, no lip-sync dialogue.</w:t>
+        <w:t>Final composition in warm evening light: Senbi and the bride in the foreground, Alexandria behind them, Roman soldiers as small figures in the distance. All expressions and mouth movement are silent acting only; no one on screen speaks.</w:t>
       </w:r>
     </w:p>
     <w:p>
@@ -5517,7 +5593,7 @@
     </w:p>
     <w:p>
       <w:r>
-        <w:t>Locked-off static camera, no camera movement. 2D hand-drawn Stickman animation, clean thin black outlines, large expressive heads, simple readable stickman proportions, flat warm colors, historically inspired ancient Alexandria, playful cinematic documentary-comedy tone, 16:9, no 3D, no photorealism, no modern objects, no subtitles, no captions, no logos, no generated text, NO on-screen character dialogue (only the off-screen narrator speaks). Use the selected reference images as strict continuity anchors. Preserve faces, hair, clothing, colors, proportions and accessories exactly. Characters may move their bodies, arms, eyes and mouths for silent nonverbal acting only. VISUAL STYLE LOCK: 2D hand-drawn stickman animation; clean thin black outlines; large expressive heads; simple readable stickman proportions; flat warm colors; historically inspired ancient Alexandria; playful cinematic documentary-comedy tone; no 3D; no photorealism; no modern objects; no subtitles; no captions; no logos; no text inside the generated scene; 16:9. Final cinematic composition: Senbi and bride in the foreground, Alexandria behind them, Roman soldiers visible as small figures in the distant city. The scene should feel like the beginning of a much larger story. 2D hand-drawn stickman animation, warm cinematic palette, clean thin black outlines, no subtitles, no text, 16:9. CAMERA: locked-off static camera on a tripod, wide shot of Senbi and the bride in the foreground with Alexandria behind them. No camera movement of any kind: no tilt, no pan, no zoom, no push, no pull, no orbit, no tracking, no rising or overhead view. The framing stays identical from the first frame to the last frame; all movement comes from the characters. AUDIO (generate sound together with the picture): Off-screen male narrator voice-over, warm intelligent British documentary voice with dry comedic timing, the same voice in every clip, begins speaking within the first half second and says exactly: “He just hadn't noticed he was also getting a new government.” The narrator is heard off-screen only; no character lip-syncs to the narrator. Music: warm gentle resolution with the same flute and strings, mixed low under the narrator. Sound effects: gentle music, silence at the very end. No subtitles or captions.</w:t>
+        <w:t>2D hand-drawn stickman cartoon in the exact style of the reference images: thin black outlines, large expressive heads, thin stick arms, flat warm colors, playful documentary-comedy tone, 16:9. Setting: sunny daytime wedding courtyard in ancient Alexandria, sandstone columns, striped awnings, feast tables along the side walls, an open entrance gate at the back. Final composition in warm evening light: Senbi and the bride in the foreground, Alexandria behind them, Roman soldiers as small figures in the distance. Camera: locked-off and perfectly still, wide shot of Senbi and the bride in the foreground with Alexandria behind them; the framing never changes (no tilt, pan, zoom or rising camera). Audio: off-screen British male narrator, warm and dry, begins speaking within half a second and says: “He just hadn't noticed he was also getting a new government.” Music: warm gentle resolution with the same flute and strings, low under the voice. Sound effects: gentle music, silence at the very end. Characters keep their exact reference designs. Nobody on screen speaks. No text, captions or logos in the frame.</w:t>
       </w:r>
     </w:p>
     <w:p>

</xml_diff>

<commit_message>
Episode 1 script: use Shot 1 frames as character/location canon, fix settings, casting and details
Co-Authored-By: Claude Sonnet 5.5 <noreply@anthropic.com>
Claude-Session: https://claude.ai/code/session_01S29WeDgsXUpbHNWdisiPFj
</commit_message>
<xml_diff>
--- a/The_Last_Day_of_Ancient_Egypt_Episode_1_GOOGLE_FLOW_FINAL_SCRIPT.docx
+++ b/The_Last_Day_of_Ancient_Egypt_Episode_1_GOOGLE_FLOW_FINAL_SCRIPT.docx
@@ -141,12 +141,12 @@
     </w:p>
     <w:p>
       <w:r>
-        <w:t>• Palette: Egyptians in warm white, gold and turquoise; sandstone and ochre architecture; Alexandria sea blue; Romans in crimson and steel grey; the commander adds gold. The whole wedding is in bright daylight (Shot 48 is warm evening). Reference 12 (interior feast, night) is used for food and props only.</w:t>
-      </w:r>
-    </w:p>
-    <w:p>
-      <w:r>
-        <w:t>• Geography: the courtyard has an open entrance gate at the back-center, feast tables along the side walls, musicians on the left, the dance floor in the center. The gate is the danger: wedding shots face the gate, with no reverse angles, and Romans always come from the gate toward the camera.</w:t>
+        <w:t>• Palette: Egyptians in warm white, gold and turquoise; sandstone and ochre architecture; Alexandria sea blue; Romans in crimson and steel grey; the commander adds gold. The whole wedding is in bright daylight (Shot 48 is warm evening, Shot 47 is a quiet torch-lit night).</w:t>
+      </w:r>
+    </w:p>
+    <w:p>
+      <w:r>
+        <w:t>• Geography (matches the approved Shot 1): painted columns left and right, long white-cloth tables and low stools along both sides, the dance floor in the center, and a tall wooden gate at the back-center that opens onto the street. In Shot 1 the Roman silhouettes are already standing in that gate. Wedding shots face the gate with no reverse angles, and Romans always come through the gate toward the camera.</w:t>
       </w:r>
     </w:p>
     <w:p>
@@ -167,6 +167,31 @@
     <w:p>
       <w:r>
         <w:t>• Continuity: Senbi, the bride, the Romans and the commander look exactly like the reference images in every clip. If a face, costume or prop changes, regenerate.</w:t>
+      </w:r>
+    </w:p>
+    <w:p>
+      <w:r>
+        <w:t>• REFERENCE CANON: the approved Shot 1 is the master. Its Senbi (straight black bowl-cut hair, gold headband with a cobra, bare chest, blue-and-gold collar and sash) and its bride (black bob with bangs, gold headband with a red gem, white dress) differ from the sheets 01_Senbi and 02_Bride, and its courtyard (painted blue-and-gold columns, plain tables, wooden gate) differs from sheets 10 and 11 (flower garlands, lotus pool, white drapes). For continuity use Senbi_from_Shot1.png, Bride_from_Shot1.png and Courtyard_from_Shot1.png, which are frames taken from Shot 1, in place of those sheets.</w:t>
+      </w:r>
+    </w:p>
+    <w:p>
+      <w:r>
+        <w:t>• Clean references: upload single clean images, never the full sheets. Sheets with several views and captions can make Flow draw duplicate characters or print the labels.</w:t>
+      </w:r>
+    </w:p>
+    <w:p>
+      <w:r>
+        <w:t>• Casting from the civilians sheet (04): father of the bride is #3 (bearded middle-aged man), the drunk uncle is #9 (bearded craftsman in plain linen, no hammer), the aunt who judges the food is #4 (market woman), the scribe is #5 (scholar with scroll, no leopard skin). Guests come from sheet 03; leave out priests, children and the horse.</w:t>
+      </w:r>
+    </w:p>
+    <w:p>
+      <w:r>
+        <w:t>• The cat is black with a small gold collar. The commander has a gold laurel wreath, bronze-and-gold armor and a red cloak. His sheet shows a banner with lettering: do not use the banner, because the frame must contain no readable text.</w:t>
+      </w:r>
+    </w:p>
+    <w:p>
+      <w:r>
+        <w:t>• Still missing: sheets 05_Roman_Soldiers and 07_Animals were not reviewed.</w:t>
       </w:r>
     </w:p>
     <w:p>
@@ -335,7 +360,7 @@
     </w:p>
     <w:p>
       <w:r>
-        <w:t>11_Wedding_Courtyard_Day.jpg</w:t>
+        <w:t>Courtyard_from_Shot1.png</w:t>
       </w:r>
     </w:p>
     <w:p>
@@ -410,7 +435,7 @@
     </w:p>
     <w:p>
       <w:r>
-        <w:t>2D hand-drawn stickman cartoon in the exact style of the reference images: thin black outlines, large expressive heads, thin stick arms, flat warm colors, playful documentary-comedy tone, 16:9. Setting: sunny daytime wedding courtyard in ancient Alexandria, sandstone columns, striped awnings, feast tables along the side walls, an open entrance gate at the back. Dancers fill the floor, fully visible from feet to heads, clapping and spinning. At about 2 seconds every dancer pauses for half a beat. One guest turns his head toward the open gate at the back; the others resume dancing a moment later. Camera: locked-off and perfectly still, eye-level medium-wide shot, the dancers fully visible from feet to heads (NOT a feet close-up); the framing never changes (no tilt, pan, zoom or rising camera). Audio: off-screen British male narrator, warm and dry, begins speaking within half a second and says: “Then, for half a beat, the dancing stopped. Nobody noticed. Except one guest.” Music: light ancient-Mediterranean wedding music (frame drums, reed flute, plucked strings) with a faint uneasy undertone, same theme in every clip, low under the voice. Sound effects: dancing feet on stone, one tiny pause, faint distant thump. Characters keep their exact reference designs. Nobody on screen speaks. No text, captions or logos in the frame.</w:t>
+        <w:t>2D hand-drawn stickman cartoon in the exact style of the reference images: thin black outlines, large expressive heads, thin stick arms, flat warm colors, playful documentary-comedy tone, 16:9. Setting: sunny daytime wedding courtyard in ancient Alexandria, sandstone columns with painted blue-and-gold bands, long tables with white cloths and clay jars, orange cloth awnings, and a tall wooden entrance gate at the back-center that opens onto the street. Dancers fill the floor, fully visible from feet to heads, clapping and spinning. At about 2 seconds every dancer pauses for half a beat. One guest turns his head toward the open gate at the back; the others resume dancing a moment later. Camera: locked-off and perfectly still, eye-level medium-wide shot, the dancers fully visible from feet to heads (NOT a feet close-up); the framing never changes (no tilt, pan, zoom or rising camera). Audio: off-screen British male narrator, warm and dry, begins speaking within half a second and says: “Then, for half a beat, the dancing stopped. Nobody noticed. Except one guest.” Music: light ancient-Mediterranean wedding music (frame drums, reed flute, plucked strings) with a faint uneasy undertone, same theme in every clip, low under the voice. Sound effects: dancing feet on stone, one tiny pause, faint distant thump. Characters keep their exact reference designs. Nobody on screen speaks. No text, captions or logos in the frame.</w:t>
       </w:r>
     </w:p>
     <w:p>
@@ -550,7 +575,7 @@
     </w:p>
     <w:p>
       <w:r>
-        <w:t>11_Wedding_Courtyard_Day.jpg</w:t>
+        <w:t>Courtyard_from_Shot1.png</w:t>
       </w:r>
     </w:p>
     <w:p>
@@ -620,7 +645,7 @@
     </w:p>
     <w:p>
       <w:r>
-        <w:t>2D hand-drawn stickman cartoon in the exact style of the reference images: thin black outlines, large expressive heads, thin stick arms, flat warm colors, playful documentary-comedy tone, 16:9. Setting: sunny daytime wedding courtyard in ancient Alexandria, sandstone columns, striped awnings, feast tables along the side walls, an open entrance gate at the back. The wedding goes on as if nothing is wrong: guests dance and clap, Senbi and the bride among them. Keep the upper third of the frame calm and uncluttered. Camera: locked-off and perfectly still, eye-level medium-wide shot of the wedding courtyard; the framing never changes (no tilt, pan, zoom or rising camera). Audio: off-screen British male narrator, warm and dry, begins speaking within half a second and says: ““Last day of Ancient Egypt”? Relax. Egypt survived. Its queen, less so.” Music: light ancient-Mediterranean wedding music (frame drums, reed flute, plucked strings), same theme in every clip, low under the voice. Sound effects: wedding crowd chatter, one short comic sting. Characters keep their exact reference designs. Nobody on screen speaks. No text, captions or logos in the frame.</w:t>
+        <w:t>2D hand-drawn stickman cartoon in the exact style of the reference images: thin black outlines, large expressive heads, thin stick arms, flat warm colors, playful documentary-comedy tone, 16:9. Setting: sunny daytime wedding courtyard in ancient Alexandria, sandstone columns with painted blue-and-gold bands, long tables with white cloths and clay jars, orange cloth awnings, and a tall wooden entrance gate at the back-center that opens onto the street. The wedding goes on as if nothing is wrong: guests dance and clap, Senbi and the bride among them. Keep the upper third of the frame calm and uncluttered. Camera: locked-off and perfectly still, eye-level medium-wide shot of the wedding courtyard; the framing never changes (no tilt, pan, zoom or rising camera). Audio: off-screen British male narrator, warm and dry, begins speaking within half a second and says: ““Last day of Ancient Egypt”? Relax. Egypt survived. Its queen, less so.” Music: light ancient-Mediterranean wedding music (frame drums, reed flute, plucked strings), same theme in every clip, low under the voice. Sound effects: wedding crowd chatter, one short comic sting. Characters keep their exact reference designs. Nobody on screen speaks. No text, captions or logos in the frame.</w:t>
       </w:r>
     </w:p>
     <w:p>
@@ -655,12 +680,12 @@
     </w:p>
     <w:p>
       <w:r>
-        <w:t>01_Senbi.jpg</w:t>
-      </w:r>
-    </w:p>
-    <w:p>
-      <w:r>
-        <w:t>10_Noble_House_Wedding_Location.jpg</w:t>
+        <w:t>Senbi_from_Shot1.png</w:t>
+      </w:r>
+    </w:p>
+    <w:p>
+      <w:r>
+        <w:t>Courtyard_from_Shot1.png</w:t>
       </w:r>
     </w:p>
     <w:p>
@@ -730,7 +755,7 @@
     </w:p>
     <w:p>
       <w:r>
-        <w:t>2D hand-drawn stickman cartoon in the exact style of the reference images: thin black outlines, large expressive heads, thin stick arms, flat warm colors, playful documentary-comedy tone, 16:9. Setting: a noble house room in ancient Alexandria with warm sandstone walls. Senbi stands before a bronze mirror. He straightens his blue-and-gold collar, checks his sash, practices a proud smile, then wipes his forehead with the back of his hand. Camera: eye-level medium shot of Senbi at the mirror; fixed except for an almost imperceptible 5% slow push-in, no tilt or pan. Audio: off-screen British male narrator, warm and dry, begins speaking within half a second and says: “Meet Senbi. He's getting married today, and has checked the mirror forty times.” Music: light ancient-Mediterranean wedding music (frame drums, reed flute, plucked strings), same theme in every clip, low under the voice. Sound effects: small fabric rustle, soft room tone. Characters keep their exact reference designs. Nobody on screen speaks. No text, captions or logos in the frame.</w:t>
+        <w:t>2D hand-drawn stickman cartoon in the exact style of the reference images: thin black outlines, large expressive heads, thin stick arms, flat warm colors, playful documentary-comedy tone, 16:9. Setting: a shaded sandstone alcove beside the wedding courtyard, painted columns, warm daylight. Senbi stands before a bronze mirror. He straightens his blue-and-gold collar, checks his sash, practices a proud smile, then wipes his forehead with the back of his hand. Camera: eye-level medium shot of Senbi at the mirror; fixed except for an almost imperceptible 5% slow push-in, no tilt or pan. Audio: off-screen British male narrator, warm and dry, begins speaking within half a second and says: “Meet Senbi. He's getting married today, and has checked the mirror forty times.” Music: light ancient-Mediterranean wedding music (frame drums, reed flute, plucked strings), same theme in every clip, low under the voice. Sound effects: small fabric rustle, soft room tone. Characters keep their exact reference designs. Nobody on screen speaks. No text, captions or logos in the frame.</w:t>
       </w:r>
     </w:p>
     <w:p>
@@ -765,7 +790,7 @@
     </w:p>
     <w:p>
       <w:r>
-        <w:t>01_Senbi.jpg</w:t>
+        <w:t>Senbi_from_Shot1.png</w:t>
       </w:r>
     </w:p>
     <w:p>
@@ -835,7 +860,7 @@
     </w:p>
     <w:p>
       <w:r>
-        <w:t>2D hand-drawn stickman cartoon in the exact style of the reference images: thin black outlines, large expressive heads, thin stick arms, flat warm colors, playful documentary-comedy tone, 16:9. Setting: a noble house room in ancient Alexandria with warm sandstone walls. Senbi, full body. First he inspects a small bronze razor and runs a hand over his chin. Then he straightens his headband. Finally he adjusts his collar and strikes an overconfident hands-on-hips pose. Camera: locked-off and perfectly still, eye-level full-body medium shot of Senbi; all three actions happen inside the same frame; the framing never changes (no tilt, pan, zoom or rising camera). Audio: off-screen British male narrator, warm and dry, begins speaking within half a second and says: “Every groom has one job: look incredible, and pretend it took no effort.” Music: playful comic percussion over the wedding rhythm, low under the voice. Sound effects: light razor scrape, one comic boing. Characters keep their exact reference designs. Nobody on screen speaks. No text, captions or logos in the frame.</w:t>
+        <w:t>2D hand-drawn stickman cartoon in the exact style of the reference images: thin black outlines, large expressive heads, thin stick arms, flat warm colors, playful documentary-comedy tone, 16:9. Setting: a shaded sandstone alcove beside the wedding courtyard, painted columns, warm daylight. Senbi, full body. First he inspects a small bronze razor and runs a hand over his chin. Then he straightens his headband. Finally he adjusts his collar and strikes an overconfident hands-on-hips pose. Camera: locked-off and perfectly still, eye-level full-body medium shot of Senbi; all three actions happen inside the same frame; the framing never changes (no tilt, pan, zoom or rising camera). Audio: off-screen British male narrator, warm and dry, begins speaking within half a second and says: “Every groom has one job: look incredible, and pretend it took no effort.” Music: playful comic percussion over the wedding rhythm, low under the voice. Sound effects: light razor scrape, one comic boing. Characters keep their exact reference designs. Nobody on screen speaks. No text, captions or logos in the frame.</w:t>
       </w:r>
     </w:p>
     <w:p>
@@ -870,12 +895,12 @@
     </w:p>
     <w:p>
       <w:r>
-        <w:t>02_Bride.jpg</w:t>
-      </w:r>
-    </w:p>
-    <w:p>
-      <w:r>
-        <w:t>10_Noble_House_Wedding_Location.jpg</w:t>
+        <w:t>Bride_from_Shot1.png</w:t>
+      </w:r>
+    </w:p>
+    <w:p>
+      <w:r>
+        <w:t>Courtyard_from_Shot1.png</w:t>
       </w:r>
     </w:p>
     <w:p>
@@ -945,7 +970,7 @@
     </w:p>
     <w:p>
       <w:r>
-        <w:t>2D hand-drawn stickman cartoon in the exact style of the reference images: thin black outlines, large expressive heads, thin stick arms, flat warm colors, playful documentary-comedy tone, 16:9. Setting: a noble house room in ancient Alexandria with warm sandstone walls. The bride stands at a bronze mirror. She adjusts her gold headband, touches her dark eye makeup, then gives herself a calm, confident nod. Camera: eye-level medium shot of the bride at the mirror; fixed except for an almost imperceptible 5% slow push-in, no tilt or pan. Audio: off-screen British male narrator, warm and dry, begins speaking within half a second and says: “His bride had been ready for an hour. She was the calm one.” Music: light ancient-Mediterranean wedding music (frame drums, reed flute, plucked strings), same theme in every clip, low under the voice. Sound effects: soft jewelry jingle. Characters keep their exact reference designs. Nobody on screen speaks. No text, captions or logos in the frame.</w:t>
+        <w:t>2D hand-drawn stickman cartoon in the exact style of the reference images: thin black outlines, large expressive heads, thin stick arms, flat warm colors, playful documentary-comedy tone, 16:9. Setting: a shaded sandstone alcove beside the wedding courtyard, painted columns, warm daylight. The bride stands at a bronze mirror. She adjusts her gold headband, touches her dark eye makeup, then gives herself a calm, confident nod. Camera: eye-level medium shot of the bride at the mirror; fixed except for an almost imperceptible 5% slow push-in, no tilt or pan. Audio: off-screen British male narrator, warm and dry, begins speaking within half a second and says: “His bride had been ready for an hour. She was the calm one.” Music: light ancient-Mediterranean wedding music (frame drums, reed flute, plucked strings), same theme in every clip, low under the voice. Sound effects: soft jewelry jingle. Characters keep their exact reference designs. Nobody on screen speaks. No text, captions or logos in the frame.</w:t>
       </w:r>
     </w:p>
     <w:p>
@@ -980,7 +1005,7 @@
     </w:p>
     <w:p>
       <w:r>
-        <w:t>02_Bride.jpg</w:t>
+        <w:t>Bride_from_Shot1.png</w:t>
       </w:r>
     </w:p>
     <w:p>
@@ -990,7 +1015,7 @@
     </w:p>
     <w:p>
       <w:r>
-        <w:t>10_Noble_House_Wedding_Location.jpg</w:t>
+        <w:t>Courtyard_from_Shot1.png</w:t>
       </w:r>
     </w:p>
     <w:p>
@@ -1060,7 +1085,7 @@
     </w:p>
     <w:p>
       <w:r>
-        <w:t>2D hand-drawn stickman cartoon in the exact style of the reference images: thin black outlines, large expressive heads, thin stick arms, flat warm colors, playful documentary-comedy tone, 16:9. Setting: a noble house room in ancient Alexandria with warm sandstone walls. A scribe unrolls a papyrus on a low table. The bride points at one line while her father nods gravely. She then gives a small, satisfied smile. The papyrus shows only abstract hieroglyph-like marks. Camera: locked-off and perfectly still, eye-level medium two-shot: the scribe, the papyrus and the bride all in the same frame; the framing never changes (no tilt, pan, zoom or rising camera). Audio: off-screen British male narrator, warm and dry, begins speaking within half a second and says: “Then, paperwork. Real contracts survive: property, money, who owes what. Romance, with receipts.” Music: light ancient-Mediterranean wedding music (frame drums, reed flute, plucked strings), same theme in every clip, low under the voice. Sound effects: papyrus rustle, quill scratching. Characters keep their exact reference designs. Nobody on screen speaks. No text, captions or logos in the frame.</w:t>
+        <w:t>2D hand-drawn stickman cartoon in the exact style of the reference images: thin black outlines, large expressive heads, thin stick arms, flat warm colors, playful documentary-comedy tone, 16:9. Setting: a shaded sandstone alcove beside the wedding courtyard, painted columns, warm daylight. A scribe unrolls a papyrus on a low table. The bride points at one line while her father nods gravely. She then gives a small, satisfied smile. The papyrus shows only abstract hieroglyph-like marks. Camera: locked-off and perfectly still, eye-level medium two-shot: the scribe, the papyrus and the bride all in the same frame; the framing never changes (no tilt, pan, zoom or rising camera). Audio: off-screen British male narrator, warm and dry, begins speaking within half a second and says: “Then, paperwork. Real contracts survive: property, money, who owes what. Romance, with receipts.” Music: light ancient-Mediterranean wedding music (frame drums, reed flute, plucked strings), same theme in every clip, low under the voice. Sound effects: papyrus rustle, quill scratching. Characters keep their exact reference designs. Nobody on screen speaks. No text, captions or logos in the frame.</w:t>
       </w:r>
     </w:p>
     <w:p>
@@ -1100,12 +1125,7 @@
     </w:p>
     <w:p>
       <w:r>
-        <w:t>11_Wedding_Courtyard_Day.jpg</w:t>
-      </w:r>
-    </w:p>
-    <w:p>
-      <w:r>
-        <w:t>12_Interior_Feast_Night.jpg</w:t>
+        <w:t>Courtyard_from_Shot1.png</w:t>
       </w:r>
     </w:p>
     <w:p>
@@ -1175,7 +1195,7 @@
     </w:p>
     <w:p>
       <w:r>
-        <w:t>2D hand-drawn stickman cartoon in the exact style of the reference images: thin black outlines, large expressive heads, thin stick arms, flat warm colors, playful documentary-comedy tone, 16:9. Setting: sunny daytime wedding courtyard in ancient Alexandria, sandstone columns, striped awnings, feast tables along the side walls, an open entrance gate at the back. A long feast table in full daylight, loaded with flatbread, roast goose, figs, dates and clay beer jugs, guests eating. At the far end one guest tiptoes up, hides a fig behind his back, and is spotted by an unimpressed aunt. Camera: locked-off and perfectly still, eye-level wide-medium shot of the whole feast table; the sneaky guest stays in frame; the framing never changes (no tilt, pan, zoom or rising camera). Audio: off-screen British male narrator, warm and dry, begins speaking within half a second and says: “Bread, figs, roast goose, and beer, basically a food group. Someone was stealing.” Music: light ancient-Mediterranean wedding music (frame drums, reed flute, plucked strings), same theme in every clip, low under the voice. Sound effects: plates, cups, cheerful chatter. Characters keep their exact reference designs. Nobody on screen speaks. No text, captions or logos in the frame.</w:t>
+        <w:t>2D hand-drawn stickman cartoon in the exact style of the reference images: thin black outlines, large expressive heads, thin stick arms, flat warm colors, playful documentary-comedy tone, 16:9. Setting: sunny daytime wedding courtyard in ancient Alexandria, sandstone columns with painted blue-and-gold bands, long tables with white cloths and clay jars, orange cloth awnings, and a tall wooden entrance gate at the back-center that opens onto the street. A long feast table in full daylight, loaded with flatbread, roast goose, figs, dates and clay beer jugs, guests eating. At the far end one guest tiptoes up, hides a fig behind his back, and is spotted by an unimpressed aunt. Camera: locked-off and perfectly still, eye-level wide-medium shot of the whole feast table; the sneaky guest stays in frame; the framing never changes (no tilt, pan, zoom or rising camera). Audio: off-screen British male narrator, warm and dry, begins speaking within half a second and says: “Bread, figs, roast goose, and beer, basically a food group. Someone was stealing.” Music: light ancient-Mediterranean wedding music (frame drums, reed flute, plucked strings), same theme in every clip, low under the voice. Sound effects: plates, cups, cheerful chatter. Characters keep their exact reference designs. Nobody on screen speaks. No text, captions or logos in the frame.</w:t>
       </w:r>
     </w:p>
     <w:p>
@@ -1215,7 +1235,7 @@
     </w:p>
     <w:p>
       <w:r>
-        <w:t>11_Wedding_Courtyard_Day.jpg</w:t>
+        <w:t>Courtyard_from_Shot1.png</w:t>
       </w:r>
     </w:p>
     <w:p>
@@ -1246,7 +1266,7 @@
     </w:p>
     <w:p>
       <w:r>
-        <w:t>A black cat sits upright on a cushion at the head of the feast table. A guest bows deeply in front of it. The cat looks away and licks its paw. All expressions and mouth movement are silent acting only; no one on screen speaks.</w:t>
+        <w:t>A black cat with a small gold collar sits upright on a cushion at the head of the feast table. A guest bows deeply in front of it. The cat looks away and licks its paw. All expressions and mouth movement are silent acting only; no one on screen speaks.</w:t>
       </w:r>
     </w:p>
     <w:p>
@@ -1285,7 +1305,7 @@
     </w:p>
     <w:p>
       <w:r>
-        <w:t>2D hand-drawn stickman cartoon in the exact style of the reference images: thin black outlines, large expressive heads, thin stick arms, flat warm colors, playful documentary-comedy tone, 16:9. Setting: sunny daytime wedding courtyard in ancient Alexandria, sandstone columns, striped awnings, feast tables along the side walls, an open entrance gate at the back. A black cat sits upright on a cushion at the head of the feast table. A guest bows deeply in front of it. The cat looks away and licks its paw. Camera: locked-off and perfectly still, eye-level medium shot with the cat and the bowing guest both in frame; the framing never changes (no tilt, pan, zoom or rising camera). Audio: off-screen British male narrator, warm and dry, begins speaking within half a second and says: “Egyptians adored cats. This one knew it. A guest bowed. The cat shrugged.” Music: playful comic percussion over the wedding rhythm, low under the voice. Sound effects: tiny comic sting, soft cat purr. Characters keep their exact reference designs. Nobody on screen speaks. No text, captions or logos in the frame.</w:t>
+        <w:t>2D hand-drawn stickman cartoon in the exact style of the reference images: thin black outlines, large expressive heads, thin stick arms, flat warm colors, playful documentary-comedy tone, 16:9. Setting: sunny daytime wedding courtyard in ancient Alexandria, sandstone columns with painted blue-and-gold bands, long tables with white cloths and clay jars, orange cloth awnings, and a tall wooden entrance gate at the back-center that opens onto the street. A black cat with a small gold collar sits upright on a cushion at the head of the feast table. A guest bows deeply in front of it. The cat looks away and licks its paw. Camera: locked-off and perfectly still, eye-level medium shot with the cat and the bowing guest both in frame; the framing never changes (no tilt, pan, zoom or rising camera). Audio: off-screen British male narrator, warm and dry, begins speaking within half a second and says: “Egyptians adored cats. This one knew it. A guest bowed. The cat shrugged.” Music: playful comic percussion over the wedding rhythm, low under the voice. Sound effects: tiny comic sting, soft cat purr. Characters keep their exact reference designs. Nobody on screen speaks. No text, captions or logos in the frame.</w:t>
       </w:r>
     </w:p>
     <w:p>
@@ -1325,7 +1345,7 @@
     </w:p>
     <w:p>
       <w:r>
-        <w:t>11_Wedding_Courtyard_Day.jpg</w:t>
+        <w:t>Courtyard_from_Shot1.png</w:t>
       </w:r>
     </w:p>
     <w:p>
@@ -1356,7 +1376,7 @@
     </w:p>
     <w:p>
       <w:r>
-        <w:t>Three musicians (harp, frame drum, reed flute) play on the left while guests dance in the center. Senbi steps into the dance area with a confident grin. All expressions and mouth movement are silent acting only; no one on screen speaks.</w:t>
+        <w:t>Musicians seated at the side tables play harp, frame drum and reed flute while guests dance in the center. Senbi steps into the dance area with a confident grin. All expressions and mouth movement are silent acting only; no one on screen speaks.</w:t>
       </w:r>
     </w:p>
     <w:p>
@@ -1395,7 +1415,7 @@
     </w:p>
     <w:p>
       <w:r>
-        <w:t>2D hand-drawn stickman cartoon in the exact style of the reference images: thin black outlines, large expressive heads, thin stick arms, flat warm colors, playful documentary-comedy tone, 16:9. Setting: sunny daytime wedding courtyard in ancient Alexandria, sandstone columns, striped awnings, feast tables along the side walls, an open entrance gate at the back. Three musicians (harp, frame drum, reed flute) play on the left while guests dance in the center. Senbi steps into the dance area with a confident grin. Camera: locked-off and perfectly still, eye-level wide shot of the musicians and dancers; the framing never changes (no tilt, pan, zoom or rising camera). Audio: off-screen British male narrator, warm and dry, begins speaking within half a second and says: “Then the music began, and Senbi decided this was his moment.” Music: light ancient-Mediterranean wedding music (frame drums, reed flute, plucked strings), same theme in every clip, low under the voice. Sound effects: harp and drums swelling, clapping. Characters keep their exact reference designs. Nobody on screen speaks. No text, captions or logos in the frame.</w:t>
+        <w:t>2D hand-drawn stickman cartoon in the exact style of the reference images: thin black outlines, large expressive heads, thin stick arms, flat warm colors, playful documentary-comedy tone, 16:9. Setting: sunny daytime wedding courtyard in ancient Alexandria, sandstone columns with painted blue-and-gold bands, long tables with white cloths and clay jars, orange cloth awnings, and a tall wooden entrance gate at the back-center that opens onto the street. Musicians seated at the side tables play harp, frame drum and reed flute while guests dance in the center. Senbi steps into the dance area with a confident grin. Camera: locked-off and perfectly still, eye-level wide shot of the musicians and dancers; the framing never changes (no tilt, pan, zoom or rising camera). Audio: off-screen British male narrator, warm and dry, begins speaking within half a second and says: “Then the music began, and Senbi decided this was his moment.” Music: light ancient-Mediterranean wedding music (frame drums, reed flute, plucked strings), same theme in every clip, low under the voice. Sound effects: harp and drums swelling, clapping. Characters keep their exact reference designs. Nobody on screen speaks. No text, captions or logos in the frame.</w:t>
       </w:r>
     </w:p>
     <w:p>
@@ -1430,12 +1450,12 @@
     </w:p>
     <w:p>
       <w:r>
-        <w:t>01_Senbi.jpg</w:t>
-      </w:r>
-    </w:p>
-    <w:p>
-      <w:r>
-        <w:t>11_Wedding_Courtyard_Day.jpg</w:t>
+        <w:t>Senbi_from_Shot1.png</w:t>
+      </w:r>
+    </w:p>
+    <w:p>
+      <w:r>
+        <w:t>Courtyard_from_Shot1.png</w:t>
       </w:r>
     </w:p>
     <w:p>
@@ -1505,7 +1525,7 @@
     </w:p>
     <w:p>
       <w:r>
-        <w:t>2D hand-drawn stickman cartoon in the exact style of the reference images: thin black outlines, large expressive heads, thin stick arms, flat warm colors, playful documentary-comedy tone, 16:9. Setting: sunny daytime wedding courtyard in ancient Alexandria, sandstone columns, striped awnings, feast tables along the side walls, an open entrance gate at the back. Senbi dances with huge confidence, loses his balance for a moment, recovers, and freezes in a proud pose as if the stumble was choreography. Camera: locked-off and perfectly still, eye-level medium shot of Senbi, full body in frame; the framing never changes (no tilt, pan, zoom or rising camera). Audio: off-screen British male narrator, warm and dry, begins speaking within half a second and says: “Senbi nearly fell, recovered, and pretended that was the choreography. Nobody believed him.” Music: playful comic percussion over the wedding rhythm, low under the voice. Sound effects: foot scuff, comic wobble, laughter. Characters keep their exact reference designs. Nobody on screen speaks. No text, captions or logos in the frame.</w:t>
+        <w:t>2D hand-drawn stickman cartoon in the exact style of the reference images: thin black outlines, large expressive heads, thin stick arms, flat warm colors, playful documentary-comedy tone, 16:9. Setting: sunny daytime wedding courtyard in ancient Alexandria, sandstone columns with painted blue-and-gold bands, long tables with white cloths and clay jars, orange cloth awnings, and a tall wooden entrance gate at the back-center that opens onto the street. Senbi dances with huge confidence, loses his balance for a moment, recovers, and freezes in a proud pose as if the stumble was choreography. Camera: locked-off and perfectly still, eye-level medium shot of Senbi, full body in frame; the framing never changes (no tilt, pan, zoom or rising camera). Audio: off-screen British male narrator, warm and dry, begins speaking within half a second and says: “Senbi nearly fell, recovered, and pretended that was the choreography. Nobody believed him.” Music: playful comic percussion over the wedding rhythm, low under the voice. Sound effects: foot scuff, comic wobble, laughter. Characters keep their exact reference designs. Nobody on screen speaks. No text, captions or logos in the frame.</w:t>
       </w:r>
     </w:p>
     <w:p>
@@ -1540,12 +1560,12 @@
     </w:p>
     <w:p>
       <w:r>
-        <w:t>02_Bride.jpg</w:t>
-      </w:r>
-    </w:p>
-    <w:p>
-      <w:r>
-        <w:t>11_Wedding_Courtyard_Day.jpg</w:t>
+        <w:t>Bride_from_Shot1.png</w:t>
+      </w:r>
+    </w:p>
+    <w:p>
+      <w:r>
+        <w:t>Courtyard_from_Shot1.png</w:t>
       </w:r>
     </w:p>
     <w:p>
@@ -1615,7 +1635,7 @@
     </w:p>
     <w:p>
       <w:r>
-        <w:t>2D hand-drawn stickman cartoon in the exact style of the reference images: thin black outlines, large expressive heads, thin stick arms, flat warm colors, playful documentary-comedy tone, 16:9. Setting: sunny daytime wedding courtyard in ancient Alexandria, sandstone columns, striped awnings, feast tables along the side walls, an open entrance gate at the back. The bride watches Senbi dance, amused. She tries to stay composed, then hides her smile behind her hand. Camera: locked-off and perfectly still, eye-level close-up of the bride's face; the framing never changes (no tilt, pan, zoom or rising camera). Audio: off-screen British male narrator, warm and dry, begins speaking within half a second and says: “His bride was trying very hard not to laugh. She loved him. Mostly.” Music: light ancient-Mediterranean wedding music (frame drums, reed flute, plucked strings), same theme in every clip, low under the voice. Sound effects: suppressed giggle. Characters keep their exact reference designs. Nobody on screen speaks. No text, captions or logos in the frame.</w:t>
+        <w:t>2D hand-drawn stickman cartoon in the exact style of the reference images: thin black outlines, large expressive heads, thin stick arms, flat warm colors, playful documentary-comedy tone, 16:9. Setting: sunny daytime wedding courtyard in ancient Alexandria, sandstone columns with painted blue-and-gold bands, long tables with white cloths and clay jars, orange cloth awnings, and a tall wooden entrance gate at the back-center that opens onto the street. The bride watches Senbi dance, amused. She tries to stay composed, then hides her smile behind her hand. Camera: locked-off and perfectly still, eye-level close-up of the bride's face; the framing never changes (no tilt, pan, zoom or rising camera). Audio: off-screen British male narrator, warm and dry, begins speaking within half a second and says: “His bride was trying very hard not to laugh. She loved him. Mostly.” Music: light ancient-Mediterranean wedding music (frame drums, reed flute, plucked strings), same theme in every clip, low under the voice. Sound effects: suppressed giggle. Characters keep their exact reference designs. Nobody on screen speaks. No text, captions or logos in the frame.</w:t>
       </w:r>
     </w:p>
     <w:p>
@@ -1655,7 +1675,7 @@
     </w:p>
     <w:p>
       <w:r>
-        <w:t>11_Wedding_Courtyard_Day.jpg</w:t>
+        <w:t>Courtyard_from_Shot1.png</w:t>
       </w:r>
     </w:p>
     <w:p>
@@ -1725,7 +1745,7 @@
     </w:p>
     <w:p>
       <w:r>
-        <w:t>2D hand-drawn stickman cartoon in the exact style of the reference images: thin black outlines, large expressive heads, thin stick arms, flat warm colors, playful documentary-comedy tone, 16:9. Setting: sunny daytime wedding courtyard in ancient Alexandria, sandstone columns, striped awnings, feast tables along the side walls, an open entrance gate at the back. Young and old guests clap, dance and raise clay cups in a joyful crowd. Camera: locked-off and perfectly still, eye-level wide-medium shot with several guests in frame; the framing never changes (no tilt, pan, zoom or rising camera). Audio: off-screen British male narrator, warm and dry, begins speaking within half a second and says: “Everyone danced and raised a cup, the one thing every wedding agrees on.” Music: light ancient-Mediterranean wedding music (frame drums, reed flute, plucked strings), same theme in every clip, low under the voice. Sound effects: clapping, cups clinking, laughter. Characters keep their exact reference designs. Nobody on screen speaks. No text, captions or logos in the frame.</w:t>
+        <w:t>2D hand-drawn stickman cartoon in the exact style of the reference images: thin black outlines, large expressive heads, thin stick arms, flat warm colors, playful documentary-comedy tone, 16:9. Setting: sunny daytime wedding courtyard in ancient Alexandria, sandstone columns with painted blue-and-gold bands, long tables with white cloths and clay jars, orange cloth awnings, and a tall wooden entrance gate at the back-center that opens onto the street. Young and old guests clap, dance and raise clay cups in a joyful crowd. Camera: locked-off and perfectly still, eye-level wide-medium shot with several guests in frame; the framing never changes (no tilt, pan, zoom or rising camera). Audio: off-screen British male narrator, warm and dry, begins speaking within half a second and says: “Everyone danced and raised a cup, the one thing every wedding agrees on.” Music: light ancient-Mediterranean wedding music (frame drums, reed flute, plucked strings), same theme in every clip, low under the voice. Sound effects: clapping, cups clinking, laughter. Characters keep their exact reference designs. Nobody on screen speaks. No text, captions or logos in the frame.</w:t>
       </w:r>
     </w:p>
     <w:p>
@@ -1765,7 +1785,7 @@
     </w:p>
     <w:p>
       <w:r>
-        <w:t>11_Wedding_Courtyard_Day.jpg</w:t>
+        <w:t>Courtyard_from_Shot1.png</w:t>
       </w:r>
     </w:p>
     <w:p>
@@ -1835,7 +1855,7 @@
     </w:p>
     <w:p>
       <w:r>
-        <w:t>2D hand-drawn stickman cartoon in the exact style of the reference images: thin black outlines, large expressive heads, thin stick arms, flat warm colors, playful documentary-comedy tone, 16:9. Setting: sunny daytime wedding courtyard in ancient Alexandria, sandstone columns, striped awnings, feast tables along the side walls, an open entrance gate at the back. An older woman at the feast table inspects a dish with exaggerated seriousness, tastes it, narrows her eyes, then gives a reluctant nod. Camera: locked-off and perfectly still, eye-level close-up of the woman's face and the dish; the framing never changes (no tilt, pan, zoom or rising camera). Audio: off-screen British male narrator, warm and dry, begins speaking within half a second and says: “One aunt inspected the food like a tax auditor. Verdict: suspicious, but edible.” Music: playful comic percussion over the wedding rhythm, low under the voice. Sound effects: spoon tapping a bowl, suspicious hum. Characters keep their exact reference designs. Nobody on screen speaks. No text, captions or logos in the frame.</w:t>
+        <w:t>2D hand-drawn stickman cartoon in the exact style of the reference images: thin black outlines, large expressive heads, thin stick arms, flat warm colors, playful documentary-comedy tone, 16:9. Setting: sunny daytime wedding courtyard in ancient Alexandria, sandstone columns with painted blue-and-gold bands, long tables with white cloths and clay jars, orange cloth awnings, and a tall wooden entrance gate at the back-center that opens onto the street. An older woman at the feast table inspects a dish with exaggerated seriousness, tastes it, narrows her eyes, then gives a reluctant nod. Camera: locked-off and perfectly still, eye-level close-up of the woman's face and the dish; the framing never changes (no tilt, pan, zoom or rising camera). Audio: off-screen British male narrator, warm and dry, begins speaking within half a second and says: “One aunt inspected the food like a tax auditor. Verdict: suspicious, but edible.” Music: playful comic percussion over the wedding rhythm, low under the voice. Sound effects: spoon tapping a bowl, suspicious hum. Characters keep their exact reference designs. Nobody on screen speaks. No text, captions or logos in the frame.</w:t>
       </w:r>
     </w:p>
     <w:p>
@@ -1870,7 +1890,7 @@
     </w:p>
     <w:p>
       <w:r>
-        <w:t>01_Senbi.jpg</w:t>
+        <w:t>Senbi_from_Shot1.png</w:t>
       </w:r>
     </w:p>
     <w:p>
@@ -1880,7 +1900,7 @@
     </w:p>
     <w:p>
       <w:r>
-        <w:t>11_Wedding_Courtyard_Day.jpg</w:t>
+        <w:t>Courtyard_from_Shot1.png</w:t>
       </w:r>
     </w:p>
     <w:p>
@@ -1950,7 +1970,7 @@
     </w:p>
     <w:p>
       <w:r>
-        <w:t>2D hand-drawn stickman cartoon in the exact style of the reference images: thin black outlines, large expressive heads, thin stick arms, flat warm colors, playful documentary-comedy tone, 16:9. Setting: sunny daytime wedding courtyard in ancient Alexandria, sandstone columns, striped awnings, feast tables along the side walls, an open entrance gate at the back. The bride's father proudly presents Senbi with a wooden headrest. Senbi accepts it with a polite smile, glances at it, and his smile tightens with concern. Camera: locked-off and perfectly still, eye-level medium two-shot of Senbi and the father; the framing never changes (no tilt, pan, zoom or rising camera). Audio: off-screen British male narrator, warm and dry, begins speaking within half a second and says: “Then, the gift: a wooden headrest. Egyptians really did sleep on these.” Music: light ancient-Mediterranean wedding music (frame drums, reed flute, plucked strings), same theme in every clip, low under the voice. Sound effects: one wooden knock. Characters keep their exact reference designs. Nobody on screen speaks. No text, captions or logos in the frame.</w:t>
+        <w:t>2D hand-drawn stickman cartoon in the exact style of the reference images: thin black outlines, large expressive heads, thin stick arms, flat warm colors, playful documentary-comedy tone, 16:9. Setting: sunny daytime wedding courtyard in ancient Alexandria, sandstone columns with painted blue-and-gold bands, long tables with white cloths and clay jars, orange cloth awnings, and a tall wooden entrance gate at the back-center that opens onto the street. The bride's father proudly presents Senbi with a wooden headrest. Senbi accepts it with a polite smile, glances at it, and his smile tightens with concern. Camera: locked-off and perfectly still, eye-level medium two-shot of Senbi and the father; the framing never changes (no tilt, pan, zoom or rising camera). Audio: off-screen British male narrator, warm and dry, begins speaking within half a second and says: “Then, the gift: a wooden headrest. Egyptians really did sleep on these.” Music: light ancient-Mediterranean wedding music (frame drums, reed flute, plucked strings), same theme in every clip, low under the voice. Sound effects: one wooden knock. Characters keep their exact reference designs. Nobody on screen speaks. No text, captions or logos in the frame.</w:t>
       </w:r>
     </w:p>
     <w:p>
@@ -1985,7 +2005,7 @@
     </w:p>
     <w:p>
       <w:r>
-        <w:t>01_Senbi.jpg</w:t>
+        <w:t>Senbi_from_Shot1.png</w:t>
       </w:r>
     </w:p>
     <w:p>
@@ -2055,7 +2075,7 @@
     </w:p>
     <w:p>
       <w:r>
-        <w:t>2D hand-drawn stickman cartoon in the exact style of the reference images: thin black outlines, large expressive heads, thin stick arms, flat warm colors, playful documentary-comedy tone, 16:9. Setting: sunny daytime wedding courtyard in ancient Alexandria, sandstone columns, striped awnings, feast tables along the side walls, an open entrance gate at the back. Senbi sits on a reed mat and tries resting his neck on the wooden headrest. He freezes in discomfort, then gives a stiff thumbs-up. Camera: locked-off and perfectly still, eye-level medium shot of Senbi with the headrest; the framing never changes (no tilt, pan, zoom or rising camera). Audio: off-screen British male narrator, warm and dry, begins speaking within half a second and says: “Senbi lay down. His neck filed a formal complaint. His thumbs-up said otherwise.” Music: playful comic percussion over the wedding rhythm, low under the voice. Sound effects: comic wooden creak. Characters keep their exact reference designs. Nobody on screen speaks. No text, captions or logos in the frame.</w:t>
+        <w:t>2D hand-drawn stickman cartoon in the exact style of the reference images: thin black outlines, large expressive heads, thin stick arms, flat warm colors, playful documentary-comedy tone, 16:9. Setting: sunny daytime wedding courtyard in ancient Alexandria, sandstone columns with painted blue-and-gold bands, long tables with white cloths and clay jars, orange cloth awnings, and a tall wooden entrance gate at the back-center that opens onto the street. Senbi sits on a reed mat and tries resting his neck on the wooden headrest. He freezes in discomfort, then gives a stiff thumbs-up. Camera: locked-off and perfectly still, eye-level medium shot of Senbi with the headrest; the framing never changes (no tilt, pan, zoom or rising camera). Audio: off-screen British male narrator, warm and dry, begins speaking within half a second and says: “Senbi lay down. His neck filed a formal complaint. His thumbs-up said otherwise.” Music: playful comic percussion over the wedding rhythm, low under the voice. Sound effects: comic wooden creak. Characters keep their exact reference designs. Nobody on screen speaks. No text, captions or logos in the frame.</w:t>
       </w:r>
     </w:p>
     <w:p>
@@ -2095,17 +2115,12 @@
     </w:p>
     <w:p>
       <w:r>
-        <w:t>02_Bride.jpg</w:t>
-      </w:r>
-    </w:p>
-    <w:p>
-      <w:r>
-        <w:t>01_Senbi.jpg</w:t>
-      </w:r>
-    </w:p>
-    <w:p>
-      <w:r>
-        <w:t>11_Wedding_Courtyard_Day.jpg</w:t>
+        <w:t>Bride_from_Shot1.png</w:t>
+      </w:r>
+    </w:p>
+    <w:p>
+      <w:r>
+        <w:t>Senbi_from_Shot1.png</w:t>
       </w:r>
     </w:p>
     <w:p>
@@ -2175,7 +2190,7 @@
     </w:p>
     <w:p>
       <w:r>
-        <w:t>2D hand-drawn stickman cartoon in the exact style of the reference images: thin black outlines, large expressive heads, thin stick arms, flat warm colors, playful documentary-comedy tone, 16:9. Setting: sunny daytime wedding courtyard in ancient Alexandria, sandstone columns, striped awnings, feast tables along the side walls, an open entrance gate at the back. The wedding at its happiest: Senbi and the bride together, musicians playing, guests dancing, banners and flowers swaying lightly in the breeze, warm sunlight. Camera: wide shot of the whole courtyard at eye level; fixed except for an almost imperceptible 5% slow push-in, no tilt or pan. Audio: off-screen British male narrator, warm and dry, begins speaking within half a second and says: “For a few perfect minutes, everything was exactly right. Enjoy this part.” Music: light ancient-Mediterranean wedding music (frame drums, reed flute, plucked strings), same theme in every clip, low under the voice. Sound effects: applause, drums, wind in the banners. Characters keep their exact reference designs. Nobody on screen speaks. No text, captions or logos in the frame.</w:t>
+        <w:t>2D hand-drawn stickman cartoon in the exact style of the reference images: thin black outlines, large expressive heads, thin stick arms, flat warm colors, playful documentary-comedy tone, 16:9. Setting: sunny daytime wedding courtyard in ancient Alexandria, sandstone columns with painted blue-and-gold bands, long tables with white cloths and clay jars, orange cloth awnings, and a tall wooden entrance gate at the back-center that opens onto the street. The wedding at its happiest: Senbi and the bride together, musicians playing, guests dancing, banners and flowers swaying lightly in the breeze, warm sunlight. Camera: wide shot of the whole courtyard at eye level; fixed except for an almost imperceptible 5% slow push-in, no tilt or pan. Audio: off-screen British male narrator, warm and dry, begins speaking within half a second and says: “For a few perfect minutes, everything was exactly right. Enjoy this part.” Music: light ancient-Mediterranean wedding music (frame drums, reed flute, plucked strings), same theme in every clip, low under the voice. Sound effects: applause, drums, wind in the banners. Characters keep their exact reference designs. Nobody on screen speaks. No text, captions or logos in the frame.</w:t>
       </w:r>
     </w:p>
     <w:p>
@@ -2210,7 +2225,7 @@
     </w:p>
     <w:p>
       <w:r>
-        <w:t>11_Wedding_Courtyard_Day.jpg</w:t>
+        <w:t>Courtyard_from_Shot1.png</w:t>
       </w:r>
     </w:p>
     <w:p>
@@ -2280,7 +2295,7 @@
     </w:p>
     <w:p>
       <w:r>
-        <w:t>2D hand-drawn stickman cartoon in the exact style of the reference images: thin black outlines, large expressive heads, thin stick arms, flat warm colors, playful documentary-comedy tone, 16:9. Setting: sunny daytime wedding courtyard in ancient Alexandria, sandstone columns, striped awnings, feast tables along the side walls, an open entrance gate at the back. A small clay cup on a wedding table trembles slightly, as if from distant footsteps. Out-of-focus guests dance behind it, unaware. Camera: locked-off and perfectly still, extreme close-up of the cup; only the cup vibrates, the camera does not; the framing never changes (no tilt, pan, zoom or rising camera). Audio: off-screen British male narrator, warm and dry, begins speaking within half a second and says: “Then a small cup on the table began to tremble. Nobody noticed.” Music: light ancient-Mediterranean wedding music (frame drums, reed flute, plucked strings) with a faint uneasy undertone, same theme in every clip, low under the voice. Sound effects: ceramic cup rattling, faint rumble. Characters keep their exact reference designs. Nobody on screen speaks. No text, captions or logos in the frame.</w:t>
+        <w:t>2D hand-drawn stickman cartoon in the exact style of the reference images: thin black outlines, large expressive heads, thin stick arms, flat warm colors, playful documentary-comedy tone, 16:9. Setting: sunny daytime wedding courtyard in ancient Alexandria, sandstone columns with painted blue-and-gold bands, long tables with white cloths and clay jars, orange cloth awnings, and a tall wooden entrance gate at the back-center that opens onto the street. A small clay cup on a wedding table trembles slightly, as if from distant footsteps. Out-of-focus guests dance behind it, unaware. Camera: locked-off and perfectly still, extreme close-up of the cup; only the cup vibrates, the camera does not; the framing never changes (no tilt, pan, zoom or rising camera). Audio: off-screen British male narrator, warm and dry, begins speaking within half a second and says: “Then a small cup on the table began to tremble. Nobody noticed.” Music: light ancient-Mediterranean wedding music (frame drums, reed flute, plucked strings) with a faint uneasy undertone, same theme in every clip, low under the voice. Sound effects: ceramic cup rattling, faint rumble. Characters keep their exact reference designs. Nobody on screen speaks. No text, captions or logos in the frame.</w:t>
       </w:r>
     </w:p>
     <w:p>
@@ -2320,7 +2335,7 @@
     </w:p>
     <w:p>
       <w:r>
-        <w:t>11_Wedding_Courtyard_Day.jpg</w:t>
+        <w:t>Courtyard_from_Shot1.png</w:t>
       </w:r>
     </w:p>
     <w:p>
@@ -2390,7 +2405,7 @@
     </w:p>
     <w:p>
       <w:r>
-        <w:t>2D hand-drawn stickman cartoon in the exact style of the reference images: thin black outlines, large expressive heads, thin stick arms, flat warm colors, playful documentary-comedy tone, 16:9. Setting: sunny daytime wedding courtyard in ancient Alexandria, sandstone columns, striped awnings, feast tables along the side walls, an open entrance gate at the back. An Egyptian musician suddenly stops playing and looks toward the open gate visible behind him; his joy turns to alertness. The dancers behind him keep dancing for one more beat. Camera: locked-off and perfectly still, eye-level medium shot of the musician with the entrance visible behind him; the framing never changes (no tilt, pan, zoom or rising camera). Audio: off-screen British male narrator, warm and dry, begins speaking within half a second and says: “The musician noticed. He stopped. Everyone else danced one more beat, blissfully unaware.” Music: music nearly silent. Sound effects: music and drums cut out, one drum stops. Characters keep their exact reference designs. Nobody on screen speaks. No text, captions or logos in the frame.</w:t>
+        <w:t>2D hand-drawn stickman cartoon in the exact style of the reference images: thin black outlines, large expressive heads, thin stick arms, flat warm colors, playful documentary-comedy tone, 16:9. Setting: sunny daytime wedding courtyard in ancient Alexandria, sandstone columns with painted blue-and-gold bands, long tables with white cloths and clay jars, orange cloth awnings, and a tall wooden entrance gate at the back-center that opens onto the street. An Egyptian musician suddenly stops playing and looks toward the open gate visible behind him; his joy turns to alertness. The dancers behind him keep dancing for one more beat. Camera: locked-off and perfectly still, eye-level medium shot of the musician with the entrance visible behind him; the framing never changes (no tilt, pan, zoom or rising camera). Audio: off-screen British male narrator, warm and dry, begins speaking within half a second and says: “The musician noticed. He stopped. Everyone else danced one more beat, blissfully unaware.” Music: music nearly silent. Sound effects: music and drums cut out, one drum stops. Characters keep their exact reference designs. Nobody on screen speaks. No text, captions or logos in the frame.</w:t>
       </w:r>
     </w:p>
     <w:p>
@@ -2456,7 +2471,7 @@
     </w:p>
     <w:p>
       <w:r>
-        <w:t>The busy street goes quiet. Civilians notice something at the far end, step aside and clear the road. Nothing is visible yet except settling dust. All expressions and mouth movement are silent acting only; no one on screen speaks.</w:t>
+        <w:t>The busy street goes quiet. Civilians notice something at the far end, step aside and clear the road. Nothing is visible yet except settling dust; show no soldiers even if the reference image contains some. All expressions and mouth movement are silent acting only; no one on screen speaks.</w:t>
       </w:r>
     </w:p>
     <w:p>
@@ -2495,7 +2510,7 @@
     </w:p>
     <w:p>
       <w:r>
-        <w:t>2D hand-drawn stickman cartoon in the exact style of the reference images: thin black outlines, large expressive heads, thin stick arms, flat warm colors, playful documentary-comedy tone, 16:9. Setting: sunlit street of ancient Alexandria outside the wedding house, sandstone walls and palms. The busy street goes quiet. Civilians notice something at the far end, step aside and clear the road. Nothing is visible yet except settling dust. Camera: locked-off and perfectly still, eye-level wide shot of the street; the framing never changes (no tilt, pan, zoom or rising camera). Audio: off-screen British male narrator, warm and dry, begins speaking within half a second and says: “Outside, the street went quiet. In a busy city, that's never good.” Music: low sustained tension with distant marching drums, almost silent. Sound effects: street ambience fading, distant boots. Characters keep their exact reference designs. Nobody on screen speaks. No text, captions or logos in the frame.</w:t>
+        <w:t>2D hand-drawn stickman cartoon in the exact style of the reference images: thin black outlines, large expressive heads, thin stick arms, flat warm colors, playful documentary-comedy tone, 16:9. Setting: sunlit street of ancient Alexandria outside the wedding house, sandstone walls and palms. The busy street goes quiet. Civilians notice something at the far end, step aside and clear the road. Nothing is visible yet except settling dust; show no soldiers even if the reference image contains some. Camera: locked-off and perfectly still, eye-level wide shot of the street; the framing never changes (no tilt, pan, zoom or rising camera). Audio: off-screen British male narrator, warm and dry, begins speaking within half a second and says: “Outside, the street went quiet. In a busy city, that's never good.” Music: low sustained tension with distant marching drums, almost silent. Sound effects: street ambience fading, distant boots. Characters keep their exact reference designs. Nobody on screen speaks. No text, captions or logos in the frame.</w:t>
       </w:r>
     </w:p>
     <w:p>
@@ -2750,17 +2765,17 @@
     </w:p>
     <w:p>
       <w:r>
-        <w:t>11_Wedding_Courtyard_Day.jpg</w:t>
-      </w:r>
-    </w:p>
-    <w:p>
-      <w:r>
-        <w:t>01_Senbi.jpg</w:t>
-      </w:r>
-    </w:p>
-    <w:p>
-      <w:r>
-        <w:t>02_Bride.jpg</w:t>
+        <w:t>Courtyard_from_Shot1.png</w:t>
+      </w:r>
+    </w:p>
+    <w:p>
+      <w:r>
+        <w:t>Senbi_from_Shot1.png</w:t>
+      </w:r>
+    </w:p>
+    <w:p>
+      <w:r>
+        <w:t>Bride_from_Shot1.png</w:t>
       </w:r>
     </w:p>
     <w:p>
@@ -2830,7 +2845,7 @@
     </w:p>
     <w:p>
       <w:r>
-        <w:t>2D hand-drawn stickman cartoon in the exact style of the reference images: thin black outlines, large expressive heads, thin stick arms, flat warm colors, playful documentary-comedy tone, 16:9. Setting: sunny daytime wedding courtyard in ancient Alexandria, sandstone columns, striped awnings, feast tables along the side walls, an open entrance gate at the back. Guests dance and laugh; Senbi spins happily in the center, completely unaware. The open gate at the back stays calm. Camera: locked-off and perfectly still, eye-level medium-wide shot of the courtyard; the framing never changes (no tilt, pan, zoom or rising camera). Audio: off-screen British male narrator, warm and dry, begins speaking within half a second and says: “Inside, nobody had a clue. Senbi was busy spinning.” Music: light ancient-Mediterranean wedding music (frame drums, reed flute, plucked strings) with a faint uneasy undertone, same theme in every clip, low under the voice. Sound effects: wedding music muffled, faint thump. Characters keep their exact reference designs. Nobody on screen speaks. No text, captions or logos in the frame.</w:t>
+        <w:t>2D hand-drawn stickman cartoon in the exact style of the reference images: thin black outlines, large expressive heads, thin stick arms, flat warm colors, playful documentary-comedy tone, 16:9. Setting: sunny daytime wedding courtyard in ancient Alexandria, sandstone columns with painted blue-and-gold bands, long tables with white cloths and clay jars, orange cloth awnings, and a tall wooden entrance gate at the back-center that opens onto the street. Guests dance and laugh; Senbi spins happily in the center, completely unaware. The open gate at the back stays calm. Camera: locked-off and perfectly still, eye-level medium-wide shot of the courtyard; the framing never changes (no tilt, pan, zoom or rising camera). Audio: off-screen British male narrator, warm and dry, begins speaking within half a second and says: “Inside, nobody had a clue. Senbi was busy spinning.” Music: light ancient-Mediterranean wedding music (frame drums, reed flute, plucked strings) with a faint uneasy undertone, same theme in every clip, low under the voice. Sound effects: wedding music muffled, faint thump. Characters keep their exact reference designs. Nobody on screen speaks. No text, captions or logos in the frame.</w:t>
       </w:r>
     </w:p>
     <w:p>
@@ -2985,7 +3000,7 @@
     </w:p>
     <w:p>
       <w:r>
-        <w:t>11_Wedding_Courtyard_Day.jpg</w:t>
+        <w:t>Courtyard_from_Shot1.png</w:t>
       </w:r>
     </w:p>
     <w:p>
@@ -3100,7 +3115,7 @@
     </w:p>
     <w:p>
       <w:r>
-        <w:t>11_Wedding_Courtyard_Day.jpg</w:t>
+        <w:t>Courtyard_from_Shot1.png</w:t>
       </w:r>
     </w:p>
     <w:p>
@@ -3425,12 +3440,7 @@
     </w:p>
     <w:p>
       <w:r>
-        <w:t>12_Interior_Feast_Night.jpg</w:t>
-      </w:r>
-    </w:p>
-    <w:p>
-      <w:r>
-        <w:t>11_Wedding_Courtyard_Day.jpg</w:t>
+        <w:t>Courtyard_from_Shot1.png</w:t>
       </w:r>
     </w:p>
     <w:p>
@@ -3500,7 +3510,7 @@
     </w:p>
     <w:p>
       <w:r>
-        <w:t>2D hand-drawn stickman cartoon in the exact style of the reference images: thin black outlines, large expressive heads, thin stick arms, flat warm colors, playful documentary-comedy tone, 16:9. Setting: sunny daytime wedding courtyard in ancient Alexandria, sandstone columns, striped awnings, feast tables along the side walls, an open entrance gate at the back. Two Roman soldiers in the foreground, the feast table with roast goose, bread and fruit behind them. Their serious faces soften as they turn their heads toward the food; one leans slightly forward. Camera: locked-off and perfectly still, eye-level wide-medium shot: the soldiers in the foreground, the feast table behind them; they turn their heads toward it; the framing never changes (no tilt, pan, zoom or rising camera). Audio: off-screen British male narrator, warm and dry, begins speaking within half a second and says: “Then the Romans saw the food. Military discipline lasted about four seconds.” Music: playful comic percussion over the wedding rhythm, low under the voice. Sound effects: stomach growl, sniff. Characters keep their exact reference designs. Nobody on screen speaks. No text, captions or logos in the frame.</w:t>
+        <w:t>2D hand-drawn stickman cartoon in the exact style of the reference images: thin black outlines, large expressive heads, thin stick arms, flat warm colors, playful documentary-comedy tone, 16:9. Setting: sunny daytime wedding courtyard in ancient Alexandria, sandstone columns with painted blue-and-gold bands, long tables with white cloths and clay jars, orange cloth awnings, and a tall wooden entrance gate at the back-center that opens onto the street. Two Roman soldiers in the foreground, the feast table with roast goose, bread and fruit behind them. Their serious faces soften as they turn their heads toward the food; one leans slightly forward. Camera: locked-off and perfectly still, eye-level wide-medium shot: the soldiers in the foreground, the feast table behind them; they turn their heads toward it; the framing never changes (no tilt, pan, zoom or rising camera). Audio: off-screen British male narrator, warm and dry, begins speaking within half a second and says: “Then the Romans saw the food. Military discipline lasted about four seconds.” Music: playful comic percussion over the wedding rhythm, low under the voice. Sound effects: stomach growl, sniff. Characters keep their exact reference designs. Nobody on screen speaks. No text, captions or logos in the frame.</w:t>
       </w:r>
     </w:p>
     <w:p>
@@ -3545,7 +3555,7 @@
     </w:p>
     <w:p>
       <w:r>
-        <w:t>11_Wedding_Courtyard_Day.jpg</w:t>
+        <w:t>Courtyard_from_Shot1.png</w:t>
       </w:r>
     </w:p>
     <w:p>
@@ -3615,7 +3625,7 @@
     </w:p>
     <w:p>
       <w:r>
-        <w:t>2D hand-drawn stickman cartoon in the exact style of the reference images: thin black outlines, large expressive heads, thin stick arms, flat warm colors, playful documentary-comedy tone, 16:9. Setting: sunny daytime wedding courtyard in ancient Alexandria, sandstone columns, striped awnings, feast tables along the side walls, an open entrance gate at the back. One Roman soldier steps awkwardly onto the dance floor. The Egyptian guests stare in silence. Then one guest begins to copy his stiff step. Camera: locked-off and perfectly still, eye-level wide shot; the framing never changes (no tilt, pan, zoom or rising camera). Audio: off-screen British male narrator, warm and dry, begins speaking within half a second and says: “One soldier stepped into the dance. Nobody stopped him. Somehow, it worked.” Music: playful comic percussion over the wedding rhythm, low under the voice. Sound effects: shield tap blending into the rhythm, clapping. Characters keep their exact reference designs. Nobody on screen speaks. No text, captions or logos in the frame.</w:t>
+        <w:t>2D hand-drawn stickman cartoon in the exact style of the reference images: thin black outlines, large expressive heads, thin stick arms, flat warm colors, playful documentary-comedy tone, 16:9. Setting: sunny daytime wedding courtyard in ancient Alexandria, sandstone columns with painted blue-and-gold bands, long tables with white cloths and clay jars, orange cloth awnings, and a tall wooden entrance gate at the back-center that opens onto the street. One Roman soldier steps awkwardly onto the dance floor. The Egyptian guests stare in silence. Then one guest begins to copy his stiff step. Camera: locked-off and perfectly still, eye-level wide shot; the framing never changes (no tilt, pan, zoom or rising camera). Audio: off-screen British male narrator, warm and dry, begins speaking within half a second and says: “One soldier stepped into the dance. Nobody stopped him. Somehow, it worked.” Music: playful comic percussion over the wedding rhythm, low under the voice. Sound effects: shield tap blending into the rhythm, clapping. Characters keep their exact reference designs. Nobody on screen speaks. No text, captions or logos in the frame.</w:t>
       </w:r>
     </w:p>
     <w:p>
@@ -3660,7 +3670,7 @@
     </w:p>
     <w:p>
       <w:r>
-        <w:t>11_Wedding_Courtyard_Day.jpg</w:t>
+        <w:t>Courtyard_from_Shot1.png</w:t>
       </w:r>
     </w:p>
     <w:p>
@@ -3730,7 +3740,7 @@
     </w:p>
     <w:p>
       <w:r>
-        <w:t>2D hand-drawn stickman cartoon in the exact style of the reference images: thin black outlines, large expressive heads, thin stick arms, flat warm colors, playful documentary-comedy tone, 16:9. Setting: sunny daytime wedding courtyard in ancient Alexandria, sandstone columns, striped awnings, feast tables along the side walls, an open entrance gate at the back. Three Roman soldiers in full armor attempt the Egyptian dance, stiff but strangely synchronized, capes swaying; Egyptian dancers around them smile and clap. Camera: locked-off and perfectly still, eye-level wide shot of the dancing Romans; the framing never changes (no tilt, pan, zoom or rising camera). Audio: off-screen British male narrator, warm and dry, begins speaking within half a second and says: “Roman engineering changed the world. Roman dancing did not.” Music: playful comic percussion over the wedding rhythm, low under the voice. Sound effects: armor clanking out of rhythm. Characters keep their exact reference designs. Nobody on screen speaks. No text, captions or logos in the frame.</w:t>
+        <w:t>2D hand-drawn stickman cartoon in the exact style of the reference images: thin black outlines, large expressive heads, thin stick arms, flat warm colors, playful documentary-comedy tone, 16:9. Setting: sunny daytime wedding courtyard in ancient Alexandria, sandstone columns with painted blue-and-gold bands, long tables with white cloths and clay jars, orange cloth awnings, and a tall wooden entrance gate at the back-center that opens onto the street. Three Roman soldiers in full armor attempt the Egyptian dance, stiff but strangely synchronized, capes swaying; Egyptian dancers around them smile and clap. Camera: locked-off and perfectly still, eye-level wide shot of the dancing Romans; the framing never changes (no tilt, pan, zoom or rising camera). Audio: off-screen British male narrator, warm and dry, begins speaking within half a second and says: “Roman engineering changed the world. Roman dancing did not.” Music: playful comic percussion over the wedding rhythm, low under the voice. Sound effects: armor clanking out of rhythm. Characters keep their exact reference designs. Nobody on screen speaks. No text, captions or logos in the frame.</w:t>
       </w:r>
     </w:p>
     <w:p>
@@ -3765,7 +3775,7 @@
     </w:p>
     <w:p>
       <w:r>
-        <w:t>01_Senbi.jpg</w:t>
+        <w:t>Senbi_from_Shot1.png</w:t>
       </w:r>
     </w:p>
     <w:p>
@@ -3775,7 +3785,7 @@
     </w:p>
     <w:p>
       <w:r>
-        <w:t>11_Wedding_Courtyard_Day.jpg</w:t>
+        <w:t>Courtyard_from_Shot1.png</w:t>
       </w:r>
     </w:p>
     <w:p>
@@ -3845,7 +3855,7 @@
     </w:p>
     <w:p>
       <w:r>
-        <w:t>2D hand-drawn stickman cartoon in the exact style of the reference images: thin black outlines, large expressive heads, thin stick arms, flat warm colors, playful documentary-comedy tone, 16:9. Setting: sunny daytime wedding courtyard in ancient Alexandria, sandstone columns, striped awnings, feast tables along the side walls, an open entrance gate at the back. Senbi dances proudly beside a Roman soldier and gestures for him to follow. The soldier hesitates, then copies Senbi's arm movement. Camera: locked-off and perfectly still, eye-level medium two-shot; the framing never changes (no tilt, pan, zoom or rising camera). Audio: off-screen British male narrator, warm and dry, begins speaking within half a second and says: “Senbi, ever the host, invited one to join. Of course he did.” Music: playful comic percussion over the wedding rhythm, low under the voice. Sound effects: laughter, hand claps. Characters keep their exact reference designs. Nobody on screen speaks. No text, captions or logos in the frame.</w:t>
+        <w:t>2D hand-drawn stickman cartoon in the exact style of the reference images: thin black outlines, large expressive heads, thin stick arms, flat warm colors, playful documentary-comedy tone, 16:9. Setting: sunny daytime wedding courtyard in ancient Alexandria, sandstone columns with painted blue-and-gold bands, long tables with white cloths and clay jars, orange cloth awnings, and a tall wooden entrance gate at the back-center that opens onto the street. Senbi dances proudly beside a Roman soldier and gestures for him to follow. The soldier hesitates, then copies Senbi's arm movement. Camera: locked-off and perfectly still, eye-level medium two-shot; the framing never changes (no tilt, pan, zoom or rising camera). Audio: off-screen British male narrator, warm and dry, begins speaking within half a second and says: “Senbi, ever the host, invited one to join. Of course he did.” Music: playful comic percussion over the wedding rhythm, low under the voice. Sound effects: laughter, hand claps. Characters keep their exact reference designs. Nobody on screen speaks. No text, captions or logos in the frame.</w:t>
       </w:r>
     </w:p>
     <w:p>
@@ -3880,12 +3890,12 @@
     </w:p>
     <w:p>
       <w:r>
-        <w:t>02_Bride.jpg</w:t>
-      </w:r>
-    </w:p>
-    <w:p>
-      <w:r>
-        <w:t>01_Senbi.jpg</w:t>
+        <w:t>Bride_from_Shot1.png</w:t>
+      </w:r>
+    </w:p>
+    <w:p>
+      <w:r>
+        <w:t>Senbi_from_Shot1.png</w:t>
       </w:r>
     </w:p>
     <w:p>
@@ -3960,7 +3970,7 @@
     </w:p>
     <w:p>
       <w:r>
-        <w:t>2D hand-drawn stickman cartoon in the exact style of the reference images: thin black outlines, large expressive heads, thin stick arms, flat warm colors, playful documentary-comedy tone, 16:9. Setting: sunny daytime wedding courtyard in ancient Alexandria, sandstone columns, striped awnings, feast tables along the side walls, an open entrance gate at the back. The bride watches Senbi dancing with the Romans. She slowly covers her face with her hand. Camera: locked-off and perfectly still, eye-level medium close-up of the bride; the framing never changes (no tilt, pan, zoom or rising camera). Audio: off-screen British male narrator, warm and dry, begins speaking within half a second and says: “His bride slowly covered her face. This was not in the contract.” Music: playful comic percussion over the wedding rhythm, low under the voice. Sound effects: gasp, muffled laugh. Characters keep their exact reference designs. Nobody on screen speaks. No text, captions or logos in the frame.</w:t>
+        <w:t>2D hand-drawn stickman cartoon in the exact style of the reference images: thin black outlines, large expressive heads, thin stick arms, flat warm colors, playful documentary-comedy tone, 16:9. Setting: sunny daytime wedding courtyard in ancient Alexandria, sandstone columns with painted blue-and-gold bands, long tables with white cloths and clay jars, orange cloth awnings, and a tall wooden entrance gate at the back-center that opens onto the street. The bride watches Senbi dancing with the Romans. She slowly covers her face with her hand. Camera: locked-off and perfectly still, eye-level medium close-up of the bride; the framing never changes (no tilt, pan, zoom or rising camera). Audio: off-screen British male narrator, warm and dry, begins speaking within half a second and says: “His bride slowly covered her face. This was not in the contract.” Music: playful comic percussion over the wedding rhythm, low under the voice. Sound effects: gasp, muffled laugh. Characters keep their exact reference designs. Nobody on screen speaks. No text, captions or logos in the frame.</w:t>
       </w:r>
     </w:p>
     <w:p>
@@ -3995,12 +4005,12 @@
     </w:p>
     <w:p>
       <w:r>
-        <w:t>01_Senbi.jpg</w:t>
-      </w:r>
-    </w:p>
-    <w:p>
-      <w:r>
-        <w:t>02_Bride.jpg</w:t>
+        <w:t>Senbi_from_Shot1.png</w:t>
+      </w:r>
+    </w:p>
+    <w:p>
+      <w:r>
+        <w:t>Bride_from_Shot1.png</w:t>
       </w:r>
     </w:p>
     <w:p>
@@ -4010,16 +4020,6 @@
     </w:p>
     <w:p>
       <w:r>
-        <w:t>05_Roman_Soldiers.jpg</w:t>
-      </w:r>
-    </w:p>
-    <w:p>
-      <w:r>
-        <w:t>11_Wedding_Courtyard_Day.jpg</w:t>
-      </w:r>
-    </w:p>
-    <w:p>
-      <w:r>
         <w:t>DURATION: 8 sec (the line needs about 5–6 s of speech; trim the clip in editing)</w:t>
       </w:r>
     </w:p>
@@ -4085,7 +4085,7 @@
     </w:p>
     <w:p>
       <w:r>
-        <w:t>2D hand-drawn stickman cartoon in the exact style of the reference images: thin black outlines, large expressive heads, thin stick arms, flat warm colors, playful documentary-comedy tone, 16:9. Setting: sunny daytime wedding courtyard in ancient Alexandria, sandstone columns, striped awnings, feast tables along the side walls, an open entrance gate at the back. Joyful chaos: Egyptians and Romans dance together, musicians struggle to keep the rhythm, a plate of food is passed along. Senbi is delighted; the bride looks overwhelmed. Keep no more than eight characters visible. Camera: locked-off and perfectly still, eye-level wide shot of the whole courtyard; the framing never changes (no tilt, pan, zoom or rising camera). Audio: off-screen British male narrator, warm and dry, begins speaking within half a second and says: “Soon, Egyptians and Romans were passing food and stepping on each other's feet.” Music: playful comic percussion over the wedding rhythm, low under the voice. Sound effects: laughter, plates, music chaos. Characters keep their exact reference designs. Nobody on screen speaks. No text, captions or logos in the frame.</w:t>
+        <w:t>2D hand-drawn stickman cartoon in the exact style of the reference images: thin black outlines, large expressive heads, thin stick arms, flat warm colors, playful documentary-comedy tone, 16:9. Setting: sunny daytime wedding courtyard in ancient Alexandria, sandstone columns with painted blue-and-gold bands, long tables with white cloths and clay jars, orange cloth awnings, and a tall wooden entrance gate at the back-center that opens onto the street. Joyful chaos: Egyptians and Romans dance together, musicians struggle to keep the rhythm, a plate of food is passed along. Senbi is delighted; the bride looks overwhelmed. Keep no more than eight characters visible. Camera: locked-off and perfectly still, eye-level wide shot of the whole courtyard; the framing never changes (no tilt, pan, zoom or rising camera). Audio: off-screen British male narrator, warm and dry, begins speaking within half a second and says: “Soon, Egyptians and Romans were passing food and stepping on each other's feet.” Music: playful comic percussion over the wedding rhythm, low under the voice. Sound effects: laughter, plates, music chaos. Characters keep their exact reference designs. Nobody on screen speaks. No text, captions or logos in the frame.</w:t>
       </w:r>
     </w:p>
     <w:p>
@@ -4130,7 +4130,7 @@
     </w:p>
     <w:p>
       <w:r>
-        <w:t>11_Wedding_Courtyard_Day.jpg</w:t>
+        <w:t>Courtyard_from_Shot1.png</w:t>
       </w:r>
     </w:p>
     <w:p>
@@ -4200,7 +4200,7 @@
     </w:p>
     <w:p>
       <w:r>
-        <w:t>2D hand-drawn stickman cartoon in the exact style of the reference images: thin black outlines, large expressive heads, thin stick arms, flat warm colors, playful documentary-comedy tone, 16:9. Setting: sunny daytime wedding courtyard in ancient Alexandria, sandstone columns, striped awnings, feast tables along the side walls, an open entrance gate at the back. A sharp horn blast: everyone freezes mid-step, Egyptians and Romans together, in a comic tableau. Camera: locked-off and perfectly still, eye-level wide shot; the framing never changes (no tilt, pan, zoom or rising camera). Audio: off-screen British male narrator, warm and dry, begins speaking within half a second and says: “Then a horn cut through the music, and everyone froze mid-step.” Music: music nearly silent. Sound effects: sharp military horn, then silence. Characters keep their exact reference designs. Nobody on screen speaks. No text, captions or logos in the frame.</w:t>
+        <w:t>2D hand-drawn stickman cartoon in the exact style of the reference images: thin black outlines, large expressive heads, thin stick arms, flat warm colors, playful documentary-comedy tone, 16:9. Setting: sunny daytime wedding courtyard in ancient Alexandria, sandstone columns with painted blue-and-gold bands, long tables with white cloths and clay jars, orange cloth awnings, and a tall wooden entrance gate at the back-center that opens onto the street. A sharp horn blast: everyone freezes mid-step, Egyptians and Romans together, in a comic tableau. Camera: locked-off and perfectly still, eye-level wide shot; the framing never changes (no tilt, pan, zoom or rising camera). Audio: off-screen British male narrator, warm and dry, begins speaking within half a second and says: “Then a horn cut through the music, and everyone froze mid-step.” Music: music nearly silent. Sound effects: sharp military horn, then silence. Characters keep their exact reference designs. Nobody on screen speaks. No text, captions or logos in the frame.</w:t>
       </w:r>
     </w:p>
     <w:p>
@@ -4245,7 +4245,7 @@
     </w:p>
     <w:p>
       <w:r>
-        <w:t>11_Wedding_Courtyard_Day.jpg</w:t>
+        <w:t>Courtyard_from_Shot1.png</w:t>
       </w:r>
     </w:p>
     <w:p>
@@ -4276,7 +4276,7 @@
     </w:p>
     <w:p>
       <w:r>
-        <w:t>A Roman commander in gold-trimmed armor and red cloak walks calmly through the open gate holding a scroll. The dancing soldiers step aside. The courtyard falls silent. All expressions and mouth movement are silent acting only; no one on screen speaks.</w:t>
+        <w:t>A Roman commander in bronze-and-gold armor walks calmly through the open gate holding a scroll. The dancing soldiers step aside. The courtyard falls silent. All expressions and mouth movement are silent acting only; no one on screen speaks.</w:t>
       </w:r>
     </w:p>
     <w:p>
@@ -4315,7 +4315,7 @@
     </w:p>
     <w:p>
       <w:r>
-        <w:t>2D hand-drawn stickman cartoon in the exact style of the reference images: thin black outlines, large expressive heads, thin stick arms, flat warm colors, playful documentary-comedy tone, 16:9. Setting: sunny daytime wedding courtyard in ancient Alexandria, sandstone columns, striped awnings, feast tables along the side walls, an open entrance gate at the back. A Roman commander in gold-trimmed armor and red cloak walks calmly through the open gate holding a scroll. The dancing soldiers step aside. The courtyard falls silent. Camera: locked-off and perfectly still, fixed, slightly low angle that never tilts, on the commander walking in; the framing never changes (no tilt, pan, zoom or rising camera). Audio: off-screen British male narrator, warm and dry, begins speaking within half a second and says: “And in walked the commander. The only adult in the building.” Music: low sustained tension with distant marching drums, almost silent. Sound effects: slow footsteps, cloak rustle. Characters keep their exact reference designs. Nobody on screen speaks. No text, captions or logos in the frame.</w:t>
+        <w:t>2D hand-drawn stickman cartoon in the exact style of the reference images: thin black outlines, large expressive heads, thin stick arms, flat warm colors, playful documentary-comedy tone, 16:9. Setting: sunny daytime wedding courtyard in ancient Alexandria, sandstone columns with painted blue-and-gold bands, long tables with white cloths and clay jars, orange cloth awnings, and a tall wooden entrance gate at the back-center that opens onto the street. A Roman commander in bronze-and-gold armor walks calmly through the open gate holding a scroll. The dancing soldiers step aside. The courtyard falls silent. The commander wears a gold laurel wreath and a red cloak; no banner, no lettering. Camera: locked-off and perfectly still, fixed, slightly low angle that never tilts, on the commander walking in; the framing never changes (no tilt, pan, zoom or rising camera). Audio: off-screen British male narrator, warm and dry, begins speaking within half a second and says: “And in walked the commander. The only adult in the building.” Music: low sustained tension with distant marching drums, almost silent. Sound effects: slow footsteps, cloak rustle. Characters keep their exact reference designs. Nobody on screen speaks. No text, captions or logos in the frame.</w:t>
       </w:r>
     </w:p>
     <w:p>
@@ -4355,22 +4355,12 @@
     </w:p>
     <w:p>
       <w:r>
-        <w:t>01_Senbi.jpg</w:t>
-      </w:r>
-    </w:p>
-    <w:p>
-      <w:r>
-        <w:t>02_Bride.jpg</w:t>
-      </w:r>
-    </w:p>
-    <w:p>
-      <w:r>
-        <w:t>05_Roman_Soldiers.jpg</w:t>
-      </w:r>
-    </w:p>
-    <w:p>
-      <w:r>
-        <w:t>11_Wedding_Courtyard_Day.jpg</w:t>
+        <w:t>Senbi_from_Shot1.png</w:t>
+      </w:r>
+    </w:p>
+    <w:p>
+      <w:r>
+        <w:t>Bride_from_Shot1.png</w:t>
       </w:r>
     </w:p>
     <w:p>
@@ -4440,7 +4430,7 @@
     </w:p>
     <w:p>
       <w:r>
-        <w:t>2D hand-drawn stickman cartoon in the exact style of the reference images: thin black outlines, large expressive heads, thin stick arms, flat warm colors, playful documentary-comedy tone, 16:9. Setting: sunny daytime wedding courtyard in ancient Alexandria, sandstone columns, striped awnings, feast tables along the side walls, an open entrance gate at the back. The commander stands serious and still. He slowly turns his head: the dancing soldiers, the food, the bride and groom, the decorations. He stays completely serious. Camera: locked-off and perfectly still, eye-level medium shot of the commander; he turns his head, the camera does not pan; the framing never changes (no tilt, pan, zoom or rising camera). Audio: off-screen British male narrator, warm and dry, begins speaking within half a second and says: “He saw his soldiers dancing. The food. The bride. The groom. The cat.” Music: music nearly silent. Sound effects: quiet room tone, fire crackle. Characters keep their exact reference designs. Nobody on screen speaks. No text, captions or logos in the frame.</w:t>
+        <w:t>2D hand-drawn stickman cartoon in the exact style of the reference images: thin black outlines, large expressive heads, thin stick arms, flat warm colors, playful documentary-comedy tone, 16:9. Setting: sunny daytime wedding courtyard in ancient Alexandria, sandstone columns with painted blue-and-gold bands, long tables with white cloths and clay jars, orange cloth awnings, and a tall wooden entrance gate at the back-center that opens onto the street. The commander stands serious and still. He slowly turns his head: the dancing soldiers, the food, the bride and groom, the decorations. He stays completely serious. The commander wears a gold laurel wreath and a red cloak; no banner, no lettering. Camera: locked-off and perfectly still, eye-level medium shot of the commander; he turns his head, the camera does not pan; the framing never changes (no tilt, pan, zoom or rising camera). Audio: off-screen British male narrator, warm and dry, begins speaking within half a second and says: “He saw his soldiers dancing. The food. The bride. The groom. The cat.” Music: music nearly silent. Sound effects: quiet room tone, fire crackle. Characters keep their exact reference designs. Nobody on screen speaks. No text, captions or logos in the frame.</w:t>
       </w:r>
     </w:p>
     <w:p>
@@ -4511,7 +4501,7 @@
     </w:p>
     <w:p>
       <w:r>
-        <w:t>The commander stands in the foreground; behind him on the table the black cat stares straight at him, unmoved. The commander's serious face twitches slightly. All expressions and mouth movement are silent acting only; no one on screen speaks.</w:t>
+        <w:t>The commander stands in the foreground; behind him on the table the black cat with a small gold collar stares straight at him, unmoved. The commander's serious face twitches slightly. All expressions and mouth movement are silent acting only; no one on screen speaks.</w:t>
       </w:r>
     </w:p>
     <w:p>
@@ -4550,7 +4540,7 @@
     </w:p>
     <w:p>
       <w:r>
-        <w:t>2D hand-drawn stickman cartoon in the exact style of the reference images: thin black outlines, large expressive heads, thin stick arms, flat warm colors, playful documentary-comedy tone, 16:9. Setting: sunny daytime wedding courtyard in ancient Alexandria, sandstone columns, striped awnings, feast tables along the side walls, an open entrance gate at the back. The commander stands in the foreground; behind him on the table the black cat stares straight at him, unmoved. The commander's serious face twitches slightly. Camera: locked-off and perfectly still, eye-level medium two-shot: the commander in the foreground, the cat on the table behind him; no cutting; the framing never changes (no tilt, pan, zoom or rising camera). Audio: off-screen British male narrator, warm and dry, begins speaking within half a second and says: “The cat looked back. The cat was not impressed by the Roman Empire.” Music: music nearly silent. Sound effects: cat meow, tiny sting. Characters keep their exact reference designs. Nobody on screen speaks. No text, captions or logos in the frame.</w:t>
+        <w:t>2D hand-drawn stickman cartoon in the exact style of the reference images: thin black outlines, large expressive heads, thin stick arms, flat warm colors, playful documentary-comedy tone, 16:9. Setting: sunny daytime wedding courtyard in ancient Alexandria, sandstone columns with painted blue-and-gold bands, long tables with white cloths and clay jars, orange cloth awnings, and a tall wooden entrance gate at the back-center that opens onto the street. The commander stands in the foreground; behind him on the table the black cat with a small gold collar stares straight at him, unmoved. The commander's serious face twitches slightly. The commander wears a gold laurel wreath and a red cloak; no banner, no lettering. Camera: locked-off and perfectly still, eye-level medium two-shot: the commander in the foreground, the cat on the table behind him; no cutting; the framing never changes (no tilt, pan, zoom or rising camera). Audio: off-screen British male narrator, warm and dry, begins speaking within half a second and says: “The cat looked back. The cat was not impressed by the Roman Empire.” Music: music nearly silent. Sound effects: cat meow, tiny sting. Characters keep their exact reference designs. Nobody on screen speaks. No text, captions or logos in the frame.</w:t>
       </w:r>
     </w:p>
     <w:p>
@@ -4595,17 +4585,7 @@
     </w:p>
     <w:p>
       <w:r>
-        <w:t>01_Senbi.jpg</w:t>
-      </w:r>
-    </w:p>
-    <w:p>
-      <w:r>
-        <w:t>02_Bride.jpg</w:t>
-      </w:r>
-    </w:p>
-    <w:p>
-      <w:r>
-        <w:t>11_Wedding_Courtyard_Day.jpg</w:t>
+        <w:t>Senbi_from_Shot1.png</w:t>
       </w:r>
     </w:p>
     <w:p>
@@ -4675,7 +4655,7 @@
     </w:p>
     <w:p>
       <w:r>
-        <w:t>2D hand-drawn stickman cartoon in the exact style of the reference images: thin black outlines, large expressive heads, thin stick arms, flat warm colors, playful documentary-comedy tone, 16:9. Setting: sunny daytime wedding courtyard in ancient Alexandria, sandstone columns, striped awnings, feast tables along the side walls, an open entrance gate at the back. Symmetrical composition: the commander at the center unrolls his scroll while Egyptians and Romans stand silent on both sides. Camera: locked-off and perfectly still, symmetrical eye-level medium-wide shot; the framing never changes (no tilt, pan, zoom or rising camera). Audio: off-screen British male narrator, warm and dry, begins speaking within half a second and says: “He unrolled the scroll. Message received: Egypt has new management.” Music: low sustained tension with distant marching drums, almost silent. Sound effects: scroll unrolling, one dramatic drum hit. Characters keep their exact reference designs. Nobody on screen speaks. No text, captions or logos in the frame.</w:t>
+        <w:t>2D hand-drawn stickman cartoon in the exact style of the reference images: thin black outlines, large expressive heads, thin stick arms, flat warm colors, playful documentary-comedy tone, 16:9. Setting: sunny daytime wedding courtyard in ancient Alexandria, sandstone columns with painted blue-and-gold bands, long tables with white cloths and clay jars, orange cloth awnings, and a tall wooden entrance gate at the back-center that opens onto the street. Symmetrical composition: the commander at the center unrolls his scroll while Egyptians and Romans stand silent on both sides. The commander wears a gold laurel wreath and a red cloak; no banner, no lettering. Camera: locked-off and perfectly still, symmetrical eye-level medium-wide shot; the framing never changes (no tilt, pan, zoom or rising camera). Audio: off-screen British male narrator, warm and dry, begins speaking within half a second and says: “He unrolled the scroll. Message received: Egypt has new management.” Music: low sustained tension with distant marching drums, almost silent. Sound effects: scroll unrolling, one dramatic drum hit. Characters keep their exact reference designs. Nobody on screen speaks. No text, captions or logos in the frame.</w:t>
       </w:r>
     </w:p>
     <w:p>
@@ -4710,12 +4690,12 @@
     </w:p>
     <w:p>
       <w:r>
-        <w:t>01_Senbi.jpg</w:t>
-      </w:r>
-    </w:p>
-    <w:p>
-      <w:r>
-        <w:t>02_Bride.jpg</w:t>
+        <w:t>Senbi_from_Shot1.png</w:t>
+      </w:r>
+    </w:p>
+    <w:p>
+      <w:r>
+        <w:t>Bride_from_Shot1.png</w:t>
       </w:r>
     </w:p>
     <w:p>
@@ -4790,7 +4770,7 @@
     </w:p>
     <w:p>
       <w:r>
-        <w:t>2D hand-drawn stickman cartoon in the exact style of the reference images: thin black outlines, large expressive heads, thin stick arms, flat warm colors, playful documentary-comedy tone, 16:9. Setting: sunny daytime wedding courtyard in ancient Alexandria, sandstone columns, striped awnings, feast tables along the side walls, an open entrance gate at the back. Senbi turns slowly toward the bride; she looks back at him. Both realize the wedding has taken a very strange turn. Camera: locked-off and perfectly still, eye-level medium two-shot of Senbi and the bride; the framing never changes (no tilt, pan, zoom or rising camera). Audio: off-screen British male narrator, warm and dry, begins speaking within half a second and says: “Senbi looked at his bride. Same question, silently: is the wedding still on?” Music: low sustained tension with distant marching drums, almost silent. Sound effects: nervous breath, single drum. Characters keep their exact reference designs. Nobody on screen speaks. No text, captions or logos in the frame.</w:t>
+        <w:t>2D hand-drawn stickman cartoon in the exact style of the reference images: thin black outlines, large expressive heads, thin stick arms, flat warm colors, playful documentary-comedy tone, 16:9. Setting: sunny daytime wedding courtyard in ancient Alexandria, sandstone columns with painted blue-and-gold bands, long tables with white cloths and clay jars, orange cloth awnings, and a tall wooden entrance gate at the back-center that opens onto the street. Senbi turns slowly toward the bride; she looks back at him. Both realize the wedding has taken a very strange turn. Camera: locked-off and perfectly still, eye-level medium two-shot of Senbi and the bride; the framing never changes (no tilt, pan, zoom or rising camera). Audio: off-screen British male narrator, warm and dry, begins speaking within half a second and says: “Senbi looked at his bride. Same question, silently: is the wedding still on?” Music: low sustained tension with distant marching drums, almost silent. Sound effects: nervous breath, single drum. Characters keep their exact reference designs. Nobody on screen speaks. No text, captions or logos in the frame.</w:t>
       </w:r>
     </w:p>
     <w:p>
@@ -5173,7 +5153,7 @@
     </w:p>
     <w:p>
       <w:r>
-        <w:t>01_Senbi.jpg</w:t>
+        <w:t>Senbi_from_Shot1.png</w:t>
       </w:r>
     </w:p>
     <w:p>
@@ -5248,7 +5228,7 @@
     </w:p>
     <w:p>
       <w:r>
-        <w:t>2D hand-drawn stickman cartoon in the exact style of the reference images: thin black outlines, large expressive heads, thin stick arms, flat warm colors, playful documentary-comedy tone, 16:9. Setting: sunny daytime wedding courtyard in ancient Alexandria, sandstone columns, striped awnings, feast tables along the side walls, an open entrance gate at the back. Senbi holds the wooden headrest in his hands and looks down at it, then slowly looks off to the side toward the Roman commander with a tired, deadpan expression. Camera: locked-off and perfectly still, eye-level medium close-up with the headrest in Senbi's hands and his face both in frame; the framing never changes (no tilt, pan, zoom or rising camera). Audio: off-screen British male narrator, warm and dry, begins speaking within half a second and says: “Headrest, then commander. Neither came with a return policy.” Music: playful comic percussion over the wedding rhythm, low under the voice. Sound effects: wood knock, comic sting. Characters keep their exact reference designs. Nobody on screen speaks. No text, captions or logos in the frame.</w:t>
+        <w:t>2D hand-drawn stickman cartoon in the exact style of the reference images: thin black outlines, large expressive heads, thin stick arms, flat warm colors, playful documentary-comedy tone, 16:9. Setting: sunny daytime wedding courtyard in ancient Alexandria, sandstone columns with painted blue-and-gold bands, long tables with white cloths and clay jars, orange cloth awnings, and a tall wooden entrance gate at the back-center that opens onto the street. Senbi holds the wooden headrest in his hands and looks down at it, then slowly looks off to the side toward the Roman commander with a tired, deadpan expression. Camera: locked-off and perfectly still, eye-level medium close-up with the headrest in Senbi's hands and his face both in frame; the framing never changes (no tilt, pan, zoom or rising camera). Audio: off-screen British male narrator, warm and dry, begins speaking within half a second and says: “Headrest, then commander. Neither came with a return policy.” Music: playful comic percussion over the wedding rhythm, low under the voice. Sound effects: wood knock, comic sting. Characters keep their exact reference designs. Nobody on screen speaks. No text, captions or logos in the frame.</w:t>
       </w:r>
     </w:p>
     <w:p>
@@ -5283,17 +5263,17 @@
     </w:p>
     <w:p>
       <w:r>
-        <w:t>02_Bride.jpg</w:t>
-      </w:r>
-    </w:p>
-    <w:p>
-      <w:r>
-        <w:t>01_Senbi.jpg</w:t>
-      </w:r>
-    </w:p>
-    <w:p>
-      <w:r>
-        <w:t>11_Wedding_Courtyard_Day.jpg</w:t>
+        <w:t>Bride_from_Shot1.png</w:t>
+      </w:r>
+    </w:p>
+    <w:p>
+      <w:r>
+        <w:t>Senbi_from_Shot1.png</w:t>
+      </w:r>
+    </w:p>
+    <w:p>
+      <w:r>
+        <w:t>Courtyard_from_Shot1.png</w:t>
       </w:r>
     </w:p>
     <w:p>
@@ -5363,7 +5343,7 @@
     </w:p>
     <w:p>
       <w:r>
-        <w:t>2D hand-drawn stickman cartoon in the exact style of the reference images: thin black outlines, large expressive heads, thin stick arms, flat warm colors, playful documentary-comedy tone, 16:9. Setting: sunny daytime wedding courtyard in ancient Alexandria, sandstone columns, striped awnings, feast tables along the side walls, an open entrance gate at the back. The bride finally laughs at the absurdity. Senbi looks at her, then starts laughing too. The tension releases. Camera: locked-off and perfectly still, eye-level medium two-shot of Senbi and the bride; the framing never changes (no tilt, pan, zoom or rising camera). Audio: off-screen British male narrator, warm and dry, begins speaking within half a second and says: “Senbi thought he was getting married.” Music: warm gentle resolution with the same flute and strings, low under the voice. Sound effects: bride laughter, Senbi laughter. Characters keep their exact reference designs. Nobody on screen speaks. No text, captions or logos in the frame.</w:t>
+        <w:t>2D hand-drawn stickman cartoon in the exact style of the reference images: thin black outlines, large expressive heads, thin stick arms, flat warm colors, playful documentary-comedy tone, 16:9. Setting: sunny daytime wedding courtyard in ancient Alexandria, sandstone columns with painted blue-and-gold bands, long tables with white cloths and clay jars, orange cloth awnings, and a tall wooden entrance gate at the back-center that opens onto the street. The bride finally laughs at the absurdity. Senbi looks at her, then starts laughing too. The tension releases. Camera: locked-off and perfectly still, eye-level medium two-shot of Senbi and the bride; the framing never changes (no tilt, pan, zoom or rising camera). Audio: off-screen British male narrator, warm and dry, begins speaking within half a second and says: “Senbi thought he was getting married.” Music: warm gentle resolution with the same flute and strings, low under the voice. Sound effects: bride laughter, Senbi laughter. Characters keep their exact reference designs. Nobody on screen speaks. No text, captions or logos in the frame.</w:t>
       </w:r>
     </w:p>
     <w:p>
@@ -5398,12 +5378,12 @@
     </w:p>
     <w:p>
       <w:r>
-        <w:t>01_Senbi.jpg</w:t>
-      </w:r>
-    </w:p>
-    <w:p>
-      <w:r>
-        <w:t>04_Parents_and_Relatives.jpg</w:t>
+        <w:t>Senbi_from_Shot1.png</w:t>
+      </w:r>
+    </w:p>
+    <w:p>
+      <w:r>
+        <w:t>12_Interior_Feast_Night.jpg</w:t>
       </w:r>
     </w:p>
     <w:p>
@@ -5473,7 +5453,7 @@
     </w:p>
     <w:p>
       <w:r>
-        <w:t>2D hand-drawn stickman cartoon in the exact style of the reference images: thin black outlines, large expressive heads, thin stick arms, flat warm colors, playful documentary-comedy tone, 16:9. Setting: a noble house room in ancient Alexandria with warm sandstone walls. Senbi lies awkwardly asleep with his neck on the wooden headrest. Distant marching is heard; he opens one eye, listens, and closes it again. Camera: eye-level medium close-up of Senbi's face; fixed except for an almost imperceptible 5% slow push-in, no tilt or pan. Audio: off-screen British male narrator, warm and dry, begins speaking within half a second and says: “He was.” Music: warm gentle resolution with the same flute and strings, low under the voice. Sound effects: distant marching, soft snore. Characters keep their exact reference designs. Nobody on screen speaks. No text, captions or logos in the frame.</w:t>
+        <w:t>2D hand-drawn stickman cartoon in the exact style of the reference images: thin black outlines, large expressive heads, thin stick arms, flat warm colors, playful documentary-comedy tone, 16:9. Setting: a quiet room of the wedding house at night, warm torchlight, painted columns, cushions on the floor. Senbi lies awkwardly asleep with his neck on the wooden headrest. Distant marching is heard; he opens one eye, listens, and closes it again. Camera: eye-level medium close-up of Senbi's face; fixed except for an almost imperceptible 5% slow push-in, no tilt or pan. Audio: off-screen British male narrator, warm and dry, begins speaking within half a second and says: “He was.” Music: warm gentle resolution with the same flute and strings, low under the voice. Sound effects: distant marching, soft snore. Characters keep their exact reference designs. Nobody on screen speaks. No text, captions or logos in the frame.</w:t>
       </w:r>
     </w:p>
     <w:p>
@@ -5508,12 +5488,12 @@
     </w:p>
     <w:p>
       <w:r>
-        <w:t>01_Senbi.jpg</w:t>
-      </w:r>
-    </w:p>
-    <w:p>
-      <w:r>
-        <w:t>02_Bride.jpg</w:t>
+        <w:t>Senbi_from_Shot1.png</w:t>
+      </w:r>
+    </w:p>
+    <w:p>
+      <w:r>
+        <w:t>Bride_from_Shot1.png</w:t>
       </w:r>
     </w:p>
     <w:p>
@@ -5523,11 +5503,6 @@
     </w:p>
     <w:p>
       <w:r>
-        <w:t>05_Roman_Soldiers.jpg</w:t>
-      </w:r>
-    </w:p>
-    <w:p>
-      <w:r>
         <w:t>DURATION: 8 sec (the line needs about 5–6 s of speech; trim the clip in editing)</w:t>
       </w:r>
     </w:p>
@@ -5593,7 +5568,7 @@
     </w:p>
     <w:p>
       <w:r>
-        <w:t>2D hand-drawn stickman cartoon in the exact style of the reference images: thin black outlines, large expressive heads, thin stick arms, flat warm colors, playful documentary-comedy tone, 16:9. Setting: sunny daytime wedding courtyard in ancient Alexandria, sandstone columns, striped awnings, feast tables along the side walls, an open entrance gate at the back. Final composition in warm evening light: Senbi and the bride in the foreground, Alexandria behind them, Roman soldiers as small figures in the distance. Camera: locked-off and perfectly still, wide shot of Senbi and the bride in the foreground with Alexandria behind them; the framing never changes (no tilt, pan, zoom or rising camera). Audio: off-screen British male narrator, warm and dry, begins speaking within half a second and says: “He just hadn't noticed he was also getting a new government.” Music: warm gentle resolution with the same flute and strings, low under the voice. Sound effects: gentle music, silence at the very end. Characters keep their exact reference designs. Nobody on screen speaks. No text, captions or logos in the frame.</w:t>
+        <w:t>2D hand-drawn stickman cartoon in the exact style of the reference images: thin black outlines, large expressive heads, thin stick arms, flat warm colors, playful documentary-comedy tone, 16:9. Setting: sunny daytime wedding courtyard in ancient Alexandria, sandstone columns with painted blue-and-gold bands, long tables with white cloths and clay jars, orange cloth awnings, and a tall wooden entrance gate at the back-center that opens onto the street. Final composition in warm evening light: Senbi and the bride in the foreground, Alexandria behind them, Roman soldiers as small figures in the distance. Camera: locked-off and perfectly still, wide shot of Senbi and the bride in the foreground with Alexandria behind them; the framing never changes (no tilt, pan, zoom or rising camera). Audio: off-screen British male narrator, warm and dry, begins speaking within half a second and says: “He just hadn't noticed he was also getting a new government.” Music: warm gentle resolution with the same flute and strings, low under the voice. Sound effects: gentle music, silence at the very end. Characters keep their exact reference designs. Nobody on screen speaks. No text, captions or logos in the frame.</w:t>
       </w:r>
     </w:p>
     <w:p>

</xml_diff>

<commit_message>
Episode 1 script: clean up shot 3 (no characters, clean harbor reference)
Co-Authored-By: Claude Sonnet 5.5 <noreply@anthropic.com>
Claude-Session: https://claude.ai/code/session_01S29WeDgsXUpbHNWdisiPFj
</commit_message>
<xml_diff>
--- a/The_Last_Day_of_Ancient_Egypt_Episode_1_GOOGLE_FLOW_FINAL_SCRIPT.docx
+++ b/The_Last_Day_of_Ancient_Egypt_Episode_1_GOOGLE_FLOW_FINAL_SCRIPT.docx
@@ -470,7 +470,7 @@
     </w:p>
     <w:p>
       <w:r>
-        <w:t>08_Alexandria_City_Overview.jpg</w:t>
+        <w:t>Alexandria_Harbor_from_ref08.png</w:t>
       </w:r>
     </w:p>
     <w:p>
@@ -496,12 +496,12 @@
         <w:rPr>
           <w:b/>
         </w:rPr>
-        <w:t>CHARACTER ACTION / SILENT ACTING</w:t>
-      </w:r>
-    </w:p>
-    <w:p>
-      <w:r>
-        <w:t>Wide establishing view: sailboats gliding, gulls crossing the sky, the great lighthouse and white monumental buildings behind, palms in the foreground, bright Mediterranean sky. All expressions and mouth movement are silent acting only; no one on screen speaks.</w:t>
+        <w:t>ON SCREEN (no characters)</w:t>
+      </w:r>
+    </w:p>
+    <w:p>
+      <w:r>
+        <w:t>Wide establishing view of the harbor and city: sailboats gliding on blue water, gulls crossing the sky, the great lighthouse and white monumental buildings behind, palms at the edge of the frame, bright daylight. Only tiny distant figures on the quays.</w:t>
       </w:r>
     </w:p>
     <w:p>
@@ -540,7 +540,7 @@
     </w:p>
     <w:p>
       <w:r>
-        <w:t>2D hand-drawn stickman cartoon in the exact style of the reference images: thin black outlines, large expressive heads, thin stick arms, flat warm colors, playful documentary-comedy tone, 16:9. Setting: ancient Alexandria harbor. Wide establishing view: sailboats gliding, gulls crossing the sky, the great lighthouse and white monumental buildings behind, palms in the foreground, bright Mediterranean sky. Camera: wide establishing shot of the Alexandria harbor and city, horizon level; fixed except for an almost imperceptible 5% slow push-in, no tilt or pan. Audio: off-screen British male narrator, warm and dry, begins speaking within half a second and says: “Alexandria, 30 BC. A huge, busy city, about to have a strange evening.” Music: light ancient-Mediterranean wedding music (frame drums, reed flute, plucked strings), same theme in every clip, low under the voice. Sound effects: gulls, harbor water, distant market noise. Characters keep their exact reference designs. Nobody on screen speaks. No text, captions or logos in the frame.</w:t>
+        <w:t>2D hand-drawn cartoon in the exact style of the reference image: flat warm colors, soft cel shading, playful documentary-comedy tone, 16:9. Setting: ancient Alexandria harbor in bright daylight. Wide establishing view of the harbor and city: sailboats gliding on blue water, gulls crossing the sky, the great lighthouse and white monumental buildings behind, palms at the edge of the frame. Only tiny distant figures on the quays. Camera: wide establishing shot, horizon level; fixed except for an almost imperceptible 5% slow push-in, no tilt or pan. Audio: off-screen British male narrator, warm and dry, begins speaking within half a second and says: “Alexandria, 30 BC. A huge, busy city, about to have a strange evening.” Music: light ancient-Mediterranean wedding music (frame drums, reed flute, plucked strings), same theme in every clip, low under the voice. Sound effects: gulls, harbor water, distant market noise. No text, captions or logos in the frame.</w:t>
       </w:r>
     </w:p>
     <w:p>
@@ -553,7 +553,7 @@
     </w:p>
     <w:p>
       <w:r>
-        <w:t>16:9. Keep exact approved character design, clothing, colors, proportions and environment. No modern objects, modern clothing, modern signs, modern architecture, subtitles, captions, logos, watermarks or written text inside the generated footage. No character dialogue. Do not introduce new character designs. If Flow changes a face, costume, proportions or key prop, regenerate.</w:t>
+        <w:t>16:9. Keep the harbor, lighthouse and color language of the reference image. No modern objects, no text.</w:t>
       </w:r>
     </w:p>
     <w:p/>

</xml_diff>